<commit_message>
Remove Thota 2026 citation; update data availability for private repo
- Drop thota2026 from refs.bib and the Introduction (tex, md, docx); rewrite the
  knowledge-based decision-support sentence around Bag et al. 2025; renumber
  Markdown refs [23]-[29] -> [22]-[28]. 28 references, all cited.
- Data availability: NSL-KDD public (CIC/UNB, cited); code and results held in a
  GitHub repository to be made public on acceptance, available to the editor and
  reviewers on reasonable request. AI declaration unchanged.
- Regenerate manuscript.docx (pandoc) and recompile the PDF (tectonic).
- CHECKLIST: record changes; mark Thota citation and private-repo issues resolved.
</commit_message>
<xml_diff>
--- a/paper/elsevier/manuscript.docx
+++ b/paper/elsevier/manuscript.docx
@@ -74,7 +74,7 @@
         <w:t xml:space="preserve"> </w:t>
       </w:r>
       <w:r>
-        <w:t xml:space="preserve">https://github.com/nithin427/fuzzy-neural-cyber-triage</w:t>
+        <w:t xml:space="preserve">GitHub repository, to be made public on acceptance; available to the editor and reviewers on reasonable request</w:t>
       </w:r>
     </w:p>
     <w:bookmarkStart w:id="9" w:name="abstract"/>
@@ -240,7 +240,7 @@
         <w:pStyle w:val="BodyText"/>
       </w:pPr>
       <w:r>
-        <w:t xml:space="preserve">Fuzzy and neuro-fuzzy systems are a natural vehicle for this step because they express learned evidence in linguistic terms that operators can audit [10–12]. In intrusion detection, however, fuzzy–neural hybrids have mainly been used to raise detection rates [13–15]; cost-sensitive learning has been applied to the classifier rather than to the action [16,17]; and explainable-AI work explains scores without choosing actions [18–20]. Knowledge-based decision support for cyber risk, such as knowledge-graph risk assessment [21] and rule-based knowledge layers in other high-stakes domains [22], shows the value of explicit rule representations, but a learned-score-to-action rule base for alert triage that is evaluated with decision metrics, paired tests and ablations is still missing.</w:t>
+        <w:t xml:space="preserve">Fuzzy and neuro-fuzzy systems are a natural vehicle for this step because they express learned evidence in linguistic terms that operators can audit [10–12]. In intrusion detection, however, fuzzy–neural hybrids have mainly been used to raise detection rates [13–15]; cost-sensitive learning has been applied to the classifier rather than to the action [16,17]; and explainable-AI work explains scores without choosing actions [18–20]. Knowledge-based decision support for cyber risk, such as explainable knowledge-graph risk assessment [21], shows the value of explicit knowledge representations, but a learned-score-to-action rule base for alert triage that is evaluated with decision metrics, paired tests and ablations is still missing.</w:t>
       </w:r>
     </w:p>
     <w:p>
@@ -248,7 +248,7 @@
         <w:pStyle w:val="BodyText"/>
       </w:pPr>
       <w:r>
-        <w:t xml:space="preserve">This Short Communication closes that gap with three contributions: (i) a compact knowledge-based triage layer that converts neural propensity into fuzzy risk bands and then into SOC actions through a stated production-rule base (Section 2); (ii) a decision-centric evaluation protocol, comprising mean triage cost, attack coverage and unnecessary escalations, with paired bootstrap confidence intervals, Wilcoxon tests, a 10-seed repetition, and cost-ratio and membership sweeps (Sections 3–4); and (iii) an ablation that locates where the gain comes from and how far the rule base is from a cost-optimal reference. The design differs structurally from the strongest baseline, gradient boosting [23]: boosting is a detector whose output still requires a threshold, whereas the proposed layer is detector-agnostic and acts on any propensity score. Section 4 demonstrates this by applying the same rules to boosting scores.</w:t>
+        <w:t xml:space="preserve">This Short Communication closes that gap with three contributions: (i) a compact knowledge-based triage layer that converts neural propensity into fuzzy risk bands and then into SOC actions through a stated production-rule base (Section 2); (ii) a decision-centric evaluation protocol, comprising mean triage cost, attack coverage and unnecessary escalations, with paired bootstrap confidence intervals, Wilcoxon tests, a 10-seed repetition, and cost-ratio and membership sweeps (Sections 3–4); and (iii) an ablation that locates where the gain comes from and how far the rule base is from a cost-optimal reference. The design differs structurally from the strongest baseline, gradient boosting [22]: boosting is a detector whose output still requires a threshold, whereas the proposed layer is detector-agnostic and acts on any propensity score. Section 4 demonstrates this by applying the same rules to boosting scores.</w:t>
       </w:r>
     </w:p>
     <w:bookmarkEnd w:id="11"/>
@@ -545,7 +545,7 @@
         <w:t xml:space="preserve"> </w:t>
       </w:r>
       <w:r>
-        <w:t xml:space="preserve">with ReLU layers of width 128 and 64, dropout 0.2 and one logit output [24] gives the attack propensity</w:t>
+        <w:t xml:space="preserve">with ReLU layers of width 128 and 64, dropout 0.2 and one logit output [23] gives the attack propensity</w:t>
       </w:r>
     </w:p>
     <w:p>
@@ -4204,7 +4204,7 @@
         <w:t xml:space="preserve"> </w:t>
       </w:r>
       <w:r>
-        <w:t xml:space="preserve">We use NSL-KDD [25], a public benchmark of labelled network-connection records, with labels binarised as normal versus attack. For CPU-scale reproducibility, 40,000 training records are sampled (34,000 for training and 6,000 for validation) and the test set is capped at 20,000 records (test attack rate 0.568). The test file contains attack types absent from training, so a train/test distribution shift is part of the task.</w:t>
+        <w:t xml:space="preserve">We use NSL-KDD [24], a public benchmark of labelled network-connection records, with labels binarised as normal versus attack. For CPU-scale reproducibility, 40,000 training records are sampled (34,000 for training and 6,000 for validation) and the test set is capped at 20,000 records (test attack rate 0.568). The test file contains attack types absent from training, so a train/test distribution shift is part of the task.</w:t>
       </w:r>
     </w:p>
     <w:p>
@@ -4222,7 +4222,7 @@
         <w:t xml:space="preserve"> </w:t>
       </w:r>
       <w:r>
-        <w:t xml:space="preserve">Detectors are logistic regression (class-balanced), gradient boosting [23] (scikit-learn defaults), and the MLP without the rule layer (neural ablation). The proposed system shares the neural propensity, so it has the same predictive metrics by construction, and its contribution must show at the decision level. Decision baselines on the same neural scores are a Monitor/Escalate threshold at 0.5, the same threshold tuned on validation data to minimise cost, and escalation of the top 20% of scores (a fixed analyst-capacity rule). The Bayes rule of Eq. (7) is a reference, not a competitor, because it requires the cost matrix and calibrated probabilities at run time. Learned triage policies (e.g., reinforcement learning [3]) are excluded because they need interaction data and a matched reward protocol.</w:t>
+        <w:t xml:space="preserve">Detectors are logistic regression (class-balanced), gradient boosting [22] (scikit-learn defaults), and the MLP without the rule layer (neural ablation). The proposed system shares the neural propensity, so it has the same predictive metrics by construction, and its contribution must show at the decision level. Decision baselines on the same neural scores are a Monitor/Escalate threshold at 0.5, the same threshold tuned on validation data to minimise cost, and escalation of the top 20% of scores (a fixed analyst-capacity rule). The Bayes rule of Eq. (7) is a reference, not a competitor, because it requires the cost matrix and calibrated probabilities at run time. Learned triage policies (e.g., reinforcement learning [3]) are excluded because they need interaction data and a matched reward protocol.</w:t>
       </w:r>
     </w:p>
     <w:p>
@@ -4240,7 +4240,7 @@
         <w:t xml:space="preserve"> </w:t>
       </w:r>
       <w:r>
-        <w:t xml:space="preserve">On the seed-42 test set we report percentile 95% confidence intervals from 2,000 paired bootstrap resamples of alerts [26] and two-sided Wilcoxon signed-rank tests on per-alert cost differences [27]. The full pipeline (subsample, split, initialisation and training) is then repeated for seeds 42–51 and compared with a paired Wilcoxon test across seeds. Sensitivity is examined by sweeping</w:t>
+        <w:t xml:space="preserve">On the seed-42 test set we report percentile 95% confidence intervals from 2,000 paired bootstrap resamples of alerts [25] and two-sided Wilcoxon signed-rank tests on per-alert cost differences [26]. The full pipeline (subsample, split, initialisation and training) is then repeated for seeds 42–51 and compared with a paired Wilcoxon test across seeds. Sensitivity is examined by sweeping</w:t>
       </w:r>
       <w:r>
         <w:t xml:space="preserve"> </w:t>
@@ -7150,7 +7150,7 @@
         <w:t xml:space="preserve"> </w:t>
       </w:r>
       <w:r>
-        <w:t xml:space="preserve">NSL-KDD (2009) is a dated laboratory benchmark whose traffic does not reflect modern enterprise, cloud or IoT telemetry [28,29]. The training data were subsampled to 40,000 records and the test set was capped at 20,000 for CPU-scale reproducibility, and a single train/test protocol is used. The cost matrix is illustrative, not elicited from a SOC, and coverage counts automatic containment as covering an attack. No live SOC deployment, concept-drift analysis or user study was performed, so the operational value for analysts remains to be validated.</w:t>
+        <w:t xml:space="preserve">NSL-KDD (2009) is a dated laboratory benchmark whose traffic does not reflect modern enterprise, cloud or IoT telemetry [27,28]. The training data were subsampled to 40,000 records and the test set was capped at 20,000 for CPU-scale reproducibility, and a single train/test protocol is used. The cost matrix is illustrative, not elicited from a SOC, and coverage counts automatic containment as covering an attack. No live SOC deployment, concept-drift analysis or user study was performed, so the operational value for analysts remains to be validated.</w:t>
       </w:r>
     </w:p>
     <w:bookmarkEnd w:id="24"/>
@@ -7172,7 +7172,7 @@
       </w:r>
     </w:p>
     <w:bookmarkEnd w:id="25"/>
-    <w:bookmarkStart w:id="27" w:name="data-availability"/>
+    <w:bookmarkStart w:id="26" w:name="data-availability"/>
     <w:p>
       <w:pPr>
         <w:pStyle w:val="Heading1"/>
@@ -7186,31 +7186,35 @@
         <w:pStyle w:val="FirstParagraph"/>
       </w:pPr>
       <w:r>
-        <w:t xml:space="preserve">NSL-KDD is publicly available from the Canadian Institute for Cybersecurity, University of New Brunswick. The experiment script, result tables (CSV/JSON) and figure-generation code are available at</w:t>
-      </w:r>
-      <w:r>
-        <w:t xml:space="preserve"> </w:t>
-      </w:r>
-      <w:hyperlink r:id="rId26">
-        <w:r>
-          <w:rPr>
-            <w:rStyle w:val="Hyperlink"/>
-          </w:rPr>
-          <w:t xml:space="preserve">https://github.com/nithin427/fuzzy-neural-cyber-triage</w:t>
-        </w:r>
-      </w:hyperlink>
-      <w:r>
-        <w:t xml:space="preserve">. The repository will be public no later than acceptance and is available to the editor and reviewers on request.</w:t>
+        <w:t xml:space="preserve">The NSL-KDD dataset is publicly available from the Canadian Institute for Cybersecurity, University of New Brunswick [24]. The code and results (experiment script, result tables in CSV/JSON and figure-generation code) are held in a GitHub repository that will be made public on acceptance; until then they are available to the editor and reviewers on reasonable request.</w:t>
+      </w:r>
+    </w:p>
+    <w:bookmarkEnd w:id="26"/>
+    <w:bookmarkStart w:id="27" w:name="declaration-of-competing-interest"/>
+    <w:p>
+      <w:pPr>
+        <w:pStyle w:val="Heading1"/>
+      </w:pPr>
+      <w:r>
+        <w:t xml:space="preserve">Declaration of competing interest</w:t>
+      </w:r>
+    </w:p>
+    <w:p>
+      <w:pPr>
+        <w:pStyle w:val="FirstParagraph"/>
+      </w:pPr>
+      <w:r>
+        <w:t xml:space="preserve">The author declares no known competing financial interests or personal relationships that could have appeared to influence the work reported in this paper.</w:t>
       </w:r>
     </w:p>
     <w:bookmarkEnd w:id="27"/>
-    <w:bookmarkStart w:id="28" w:name="declaration-of-competing-interest"/>
+    <w:bookmarkStart w:id="28" w:name="X1f74eb43af444059c7518034463b6c89b1cacf4"/>
     <w:p>
       <w:pPr>
         <w:pStyle w:val="Heading1"/>
       </w:pPr>
       <w:r>
-        <w:t xml:space="preserve">Declaration of competing interest</w:t>
+        <w:t xml:space="preserve">Declaration of generative AI and AI-assisted technologies in the manuscript preparation process</w:t>
       </w:r>
     </w:p>
     <w:p>
@@ -7218,17 +7222,17 @@
         <w:pStyle w:val="FirstParagraph"/>
       </w:pPr>
       <w:r>
-        <w:t xml:space="preserve">The author declares no known competing financial interests or personal relationships that could have appeared to influence the work reported in this paper.</w:t>
+        <w:t xml:space="preserve">During the preparation of this work the author used Grok Bot, an AI-assisted writing and coding tool, to help with language editing, code refactoring, reference checking and formatting. After using this tool, the author reviewed and edited the content as needed and takes full responsibility for the content of the published article. All results, tables and figures were generated by the author’s executable code from the public dataset; no figure was created with generative AI.</w:t>
       </w:r>
     </w:p>
     <w:bookmarkEnd w:id="28"/>
-    <w:bookmarkStart w:id="29" w:name="X1f74eb43af444059c7518034463b6c89b1cacf4"/>
+    <w:bookmarkStart w:id="29" w:name="funding"/>
     <w:p>
       <w:pPr>
         <w:pStyle w:val="Heading1"/>
       </w:pPr>
       <w:r>
-        <w:t xml:space="preserve">Declaration of generative AI and AI-assisted technologies in the manuscript preparation process</w:t>
+        <w:t xml:space="preserve">Funding</w:t>
       </w:r>
     </w:p>
     <w:p>
@@ -7236,29 +7240,11 @@
         <w:pStyle w:val="FirstParagraph"/>
       </w:pPr>
       <w:r>
-        <w:t xml:space="preserve">During the preparation of this work the author used Grok Bot, an AI-assisted writing and coding tool, to help with language editing, code refactoring, reference checking and formatting. After using this tool, the author reviewed and edited the content as needed and takes full responsibility for the content of the published article. All results, tables and figures were generated by the author’s executable code from the public dataset; no figure was created with generative AI.</w:t>
+        <w:t xml:space="preserve">This research did not receive any specific grant from funding agencies in the public, commercial, or not-for-profit sectors.</w:t>
       </w:r>
     </w:p>
     <w:bookmarkEnd w:id="29"/>
-    <w:bookmarkStart w:id="30" w:name="funding"/>
-    <w:p>
-      <w:pPr>
-        <w:pStyle w:val="Heading1"/>
-      </w:pPr>
-      <w:r>
-        <w:t xml:space="preserve">Funding</w:t>
-      </w:r>
-    </w:p>
-    <w:p>
-      <w:pPr>
-        <w:pStyle w:val="FirstParagraph"/>
-      </w:pPr>
-      <w:r>
-        <w:t xml:space="preserve">This research did not receive any specific grant from funding agencies in the public, commercial, or not-for-profit sectors.</w:t>
-      </w:r>
-    </w:p>
-    <w:bookmarkEnd w:id="30"/>
-    <w:bookmarkStart w:id="31" w:name="credit-authorship-contribution-statement"/>
+    <w:bookmarkStart w:id="30" w:name="credit-authorship-contribution-statement"/>
     <w:p>
       <w:pPr>
         <w:pStyle w:val="Heading1"/>
@@ -7285,249 +7271,241 @@
         <w:t xml:space="preserve">Conceptualization, Methodology, Software, Validation, Formal analysis, Investigation, Data curation, Visualization, Writing – original draft, Writing – review &amp; editing.</w:t>
       </w:r>
     </w:p>
+    <w:bookmarkEnd w:id="30"/>
+    <w:bookmarkStart w:id="31" w:name="references"/>
+    <w:p>
+      <w:pPr>
+        <w:pStyle w:val="Heading1"/>
+      </w:pPr>
+      <w:r>
+        <w:t xml:space="preserve">References</w:t>
+      </w:r>
+    </w:p>
+    <w:p>
+      <w:pPr>
+        <w:pStyle w:val="FirstParagraph"/>
+      </w:pPr>
+      <w:r>
+        <w:t xml:space="preserve">[1] S. Tariq, M. Baruwal Chhetri, S. Nepal, C. Paris, Alert fatigue in security operations centres: Research challenges and opportunities, ACM Computing Surveys 57 (2025) 1–38. https://doi.org/10.1145/3723158.</w:t>
+      </w:r>
+    </w:p>
+    <w:p>
+      <w:pPr>
+        <w:pStyle w:val="BodyText"/>
+      </w:pPr>
+      <w:r>
+        <w:t xml:space="preserve">[2] M. Baruwal Chhetri, S. Tariq, R. Singh, F. Jalalvand, C. Paris, S. Nepal, Towards human–AI teaming to mitigate alert fatigue in security operations centres, ACM Transactions on Internet Technology 24 (2024) 1–22. https://doi.org/10.1145/3670009.</w:t>
+      </w:r>
+    </w:p>
+    <w:p>
+      <w:pPr>
+        <w:pStyle w:val="BodyText"/>
+      </w:pPr>
+      <w:r>
+        <w:t xml:space="preserve">[3] X. Wang, X. Yang, X. Liang, X. Zhang, W. Zhang, X. Gong, Combating alert fatigue with AlertPro: Context-aware alert prioritization using reinforcement learning for multi-step attack detection, Computers &amp; Security 137 (2024) 103583. https://doi.org/10.1016/j.cose.2023.103583.</w:t>
+      </w:r>
+    </w:p>
+    <w:p>
+      <w:pPr>
+        <w:pStyle w:val="BodyText"/>
+      </w:pPr>
+      <w:r>
+        <w:t xml:space="preserve">[4] A.L. Buczak, E. Guven, A survey of data mining and machine learning methods for cyber security intrusion detection, IEEE Communications Surveys &amp; Tutorials 18 (2016) 1153–1176. https://doi.org/10.1109/COMST.2015.2494502.</w:t>
+      </w:r>
+    </w:p>
+    <w:p>
+      <w:pPr>
+        <w:pStyle w:val="BodyText"/>
+      </w:pPr>
+      <w:r>
+        <w:t xml:space="preserve">[5] A. Khraisat, I. Gondal, P. Vamplew, J. Kamruzzaman, Survey of intrusion detection systems: Techniques, datasets and challenges, Cybersecurity 2 (2019) 20. https://doi.org/10.1186/s42400-019-0038-7.</w:t>
+      </w:r>
+    </w:p>
+    <w:p>
+      <w:pPr>
+        <w:pStyle w:val="BodyText"/>
+      </w:pPr>
+      <w:r>
+        <w:t xml:space="preserve">[6] T. Su, H. Sun, J. Zhu, S. Wang, Y. Li, BAT: Deep learning methods on network intrusion detection using NSL-KDD dataset, IEEE Access 8 (2020) 29575–29585. https://doi.org/10.1109/ACCESS.2020.2972627.</w:t>
+      </w:r>
+    </w:p>
+    <w:p>
+      <w:pPr>
+        <w:pStyle w:val="BodyText"/>
+      </w:pPr>
+      <w:r>
+        <w:t xml:space="preserve">[7] N. Sun, J. Zhang, P. Rimba, S. Gao, L.Y. Zhang, Y. Xiang, Data-driven cybersecurity incident prediction: A survey, IEEE Communications Surveys &amp; Tutorials 21 (2019) 1744–1772. https://doi.org/10.1109/COMST.2018.2885561.</w:t>
+      </w:r>
+    </w:p>
+    <w:p>
+      <w:pPr>
+        <w:pStyle w:val="BodyText"/>
+      </w:pPr>
+      <w:r>
+        <w:t xml:space="preserve">[8] G. Vial, Understanding digital transformation: A review and a research agenda, The Journal of Strategic Information Systems 28 (2019) 118–144. https://doi.org/10.1016/j.jsis.2019.01.003.</w:t>
+      </w:r>
+    </w:p>
+    <w:p>
+      <w:pPr>
+        <w:pStyle w:val="BodyText"/>
+      </w:pPr>
+      <w:r>
+        <w:t xml:space="preserve">[9] F. Provost, T. Fawcett, Data science and its relationship to big data and data-driven decision making, Big Data 1 (2013) 51–59. https://doi.org/10.1089/big.2013.1508.</w:t>
+      </w:r>
+    </w:p>
+    <w:p>
+      <w:pPr>
+        <w:pStyle w:val="BodyText"/>
+      </w:pPr>
+      <w:r>
+        <w:t xml:space="preserve">[10] L.A. Zadeh, Fuzzy sets, Information and Control 8 (1965) 338–353. https://doi.org/10.1016/S0019-9958(65)90241-X90241-X).</w:t>
+      </w:r>
+    </w:p>
+    <w:p>
+      <w:pPr>
+        <w:pStyle w:val="BodyText"/>
+      </w:pPr>
+      <w:r>
+        <w:t xml:space="preserve">[11] J.-S.R. Jang, ANFIS: Adaptive-network-based fuzzy inference system, IEEE Transactions on Systems, Man, and Cybernetics 23 (1993) 665–685. https://doi.org/10.1109/21.256541.</w:t>
+      </w:r>
+    </w:p>
+    <w:p>
+      <w:pPr>
+        <w:pStyle w:val="BodyText"/>
+      </w:pPr>
+      <w:r>
+        <w:t xml:space="preserve">[12] P.V. de Campos Souza, Fuzzy neural networks and neuro-fuzzy networks: A review the main techniques and applications used in the literature, Applied Soft Computing 92 (2020) 106275. https://doi.org/10.1016/j.asoc.2020.106275.</w:t>
+      </w:r>
+    </w:p>
+    <w:p>
+      <w:pPr>
+        <w:pStyle w:val="BodyText"/>
+      </w:pPr>
+      <w:r>
+        <w:t xml:space="preserve">[13] D. Srilatha, G.K. Shyam, Cloud-based intrusion detection using kernel fuzzy clustering and optimal type-2 fuzzy neural network, Cluster Computing 24 (2021) 2657–2672. https://doi.org/10.1007/s10586-021-03281-9.</w:t>
+      </w:r>
+    </w:p>
+    <w:p>
+      <w:pPr>
+        <w:pStyle w:val="BodyText"/>
+      </w:pPr>
+      <w:r>
+        <w:t xml:space="preserve">[14] J. Liu, W. Yinchai, T.C. Siong, X. Li, L. Zhao, F. Wei, On the combination of adaptive neuro-fuzzy inference system and deep residual network for improving detection rates on intrusion detection, PLOS ONE 17 (2022) e0278819. https://doi.org/10.1371/journal.pone.0278819.</w:t>
+      </w:r>
+    </w:p>
+    <w:p>
+      <w:pPr>
+        <w:pStyle w:val="BodyText"/>
+      </w:pPr>
+      <w:r>
+        <w:t xml:space="preserve">[15] J. Liu, W. Yinchai, T.C. Siong, X. Li, L. Zhao, F. Wei, A hybrid interpretable deep structure based on adaptive neuro-fuzzy inference system, decision tree, and K-means for intrusion detection, Scientific Reports 12 (2022) 20770. https://doi.org/10.1038/s41598-022-23765-x.</w:t>
+      </w:r>
+    </w:p>
+    <w:p>
+      <w:pPr>
+        <w:pStyle w:val="BodyText"/>
+      </w:pPr>
+      <w:r>
+        <w:t xml:space="preserve">[16] C. Elkan, The foundations of cost-sensitive learning, in: Proceedings of the 17th International Joint Conference on Artificial Intelligence (IJCAI), 2001: pp. 973–978.</w:t>
+      </w:r>
+    </w:p>
+    <w:p>
+      <w:pPr>
+        <w:pStyle w:val="BodyText"/>
+      </w:pPr>
+      <w:r>
+        <w:t xml:space="preserve">[17] A. Telikani, N.E. Rudbardeh, S. Soleymanpour, A. Shahbahrami, J. Shen, G. Gaydadjiev, R. Hassanpour, A cost-sensitive machine learning model with multitask learning for intrusion detection in IoT, IEEE Transactions on Industrial Informatics 20 (2024) 3880–3890. https://doi.org/10.1109/TII.2023.3314208.</w:t>
+      </w:r>
+    </w:p>
+    <w:p>
+      <w:pPr>
+        <w:pStyle w:val="BodyText"/>
+      </w:pPr>
+      <w:r>
+        <w:t xml:space="preserve">[18] S.M. Lundberg, S.-I. Lee, A unified approach to interpreting model predictions, Advances in Neural Information Processing Systems 30 (2017). https://doi.org/10.48550/arXiv.1705.07874.</w:t>
+      </w:r>
+    </w:p>
+    <w:p>
+      <w:pPr>
+        <w:pStyle w:val="BodyText"/>
+      </w:pPr>
+      <w:r>
+        <w:t xml:space="preserve">[19] V.Z. Mohale, I.C. Obagbuwa, A systematic review on the integration of explainable artificial intelligence in intrusion detection systems to enhancing transparency and interpretability in cybersecurity, Frontiers in Artificial Intelligence 8 (2025) 1526221. https://doi.org/10.3389/frai.2025.1526221.</w:t>
+      </w:r>
+    </w:p>
+    <w:p>
+      <w:pPr>
+        <w:pStyle w:val="BodyText"/>
+      </w:pPr>
+      <w:r>
+        <w:t xml:space="preserve">[20] S. AL, S. Sagiroglu, Explainable artificial intelligence models in intrusion detection systems, Engineering Applications of Artificial Intelligence 144 (2025) 110145. https://doi.org/10.1016/j.engappai.2025.110145.</w:t>
+      </w:r>
+    </w:p>
+    <w:p>
+      <w:pPr>
+        <w:pStyle w:val="BodyText"/>
+      </w:pPr>
+      <w:r>
+        <w:t xml:space="preserve">[21] S. Bag, S. Sarkar, I. Bose, Enhancing cybersecurity risk assessment using temporal knowledge graph-based explainable decision support system, Decision Support Systems 198 (2025) 114526. https://doi.org/10.1016/j.dss.2025.114526.</w:t>
+      </w:r>
+    </w:p>
+    <w:p>
+      <w:pPr>
+        <w:pStyle w:val="BodyText"/>
+      </w:pPr>
+      <w:r>
+        <w:t xml:space="preserve">[22] J.H. Friedman, Greedy function approximation: A gradient boosting machine, The Annals of Statistics 29 (2001) 1189–1232. https://doi.org/10.1214/aos/1013203451.</w:t>
+      </w:r>
+    </w:p>
+    <w:p>
+      <w:pPr>
+        <w:pStyle w:val="BodyText"/>
+      </w:pPr>
+      <w:r>
+        <w:t xml:space="preserve">[23] I. Goodfellow, Y. Bengio, A. Courville, Deep learning, MIT Press, Cambridge, MA, 2016.</w:t>
+      </w:r>
+    </w:p>
+    <w:p>
+      <w:pPr>
+        <w:pStyle w:val="BodyText"/>
+      </w:pPr>
+      <w:r>
+        <w:t xml:space="preserve">[24] M. Tavallaee, E. Bagheri, W. Lu, A.A. Ghorbani, A detailed analysis of the KDD CUP 99 data set, in: Proceedings of the 2009 IEEE Symposium on Computational Intelligence for Security and Defense Applications (CISDA), 2009: pp. 1–6. https://doi.org/10.1109/CISDA.2009.5356528.</w:t>
+      </w:r>
+    </w:p>
+    <w:p>
+      <w:pPr>
+        <w:pStyle w:val="BodyText"/>
+      </w:pPr>
+      <w:r>
+        <w:t xml:space="preserve">[25] B. Efron, R.J. Tibshirani, An introduction to the bootstrap, Chapman &amp; Hall/CRC, New York, 1994. https://doi.org/10.1201/9780429246593.</w:t>
+      </w:r>
+    </w:p>
+    <w:p>
+      <w:pPr>
+        <w:pStyle w:val="BodyText"/>
+      </w:pPr>
+      <w:r>
+        <w:t xml:space="preserve">[26] F. Wilcoxon, Individual comparisons by ranking methods, Biometrics Bulletin 1 (1945) 80–83. https://doi.org/10.2307/3001968.</w:t>
+      </w:r>
+    </w:p>
+    <w:p>
+      <w:pPr>
+        <w:pStyle w:val="BodyText"/>
+      </w:pPr>
+      <w:r>
+        <w:t xml:space="preserve">[27] M. Ring, S. Wunderlich, D. Scheuring, D. Landes, A. Hotho, A survey of network-based intrusion detection data sets, Computers &amp; Security 86 (2019) 147–167. https://doi.org/10.1016/j.cose.2019.06.005.</w:t>
+      </w:r>
+    </w:p>
+    <w:p>
+      <w:pPr>
+        <w:pStyle w:val="BodyText"/>
+      </w:pPr>
+      <w:r>
+        <w:t xml:space="preserve">[28] M.A. Al-Garadi, A. Mohamed, A.K. Al-Ali, X. Du, I. Ali, M. Guizani, A survey of machine and deep learning methods for Internet of Things (IoT) security, IEEE Communications Surveys &amp; Tutorials 22 (2020) 1646–1685. https://doi.org/10.1109/COMST.2020.2988293.</w:t>
+      </w:r>
+    </w:p>
     <w:bookmarkEnd w:id="31"/>
-    <w:bookmarkStart w:id="32" w:name="references"/>
-    <w:p>
-      <w:pPr>
-        <w:pStyle w:val="Heading1"/>
-      </w:pPr>
-      <w:r>
-        <w:t xml:space="preserve">References</w:t>
-      </w:r>
-    </w:p>
-    <w:p>
-      <w:pPr>
-        <w:pStyle w:val="FirstParagraph"/>
-      </w:pPr>
-      <w:r>
-        <w:t xml:space="preserve">[1] S. Tariq, M. Baruwal Chhetri, S. Nepal, C. Paris, Alert fatigue in security operations centres: Research challenges and opportunities, ACM Computing Surveys 57 (2025) 1–38. https://doi.org/10.1145/3723158.</w:t>
-      </w:r>
-    </w:p>
-    <w:p>
-      <w:pPr>
-        <w:pStyle w:val="BodyText"/>
-      </w:pPr>
-      <w:r>
-        <w:t xml:space="preserve">[2] M. Baruwal Chhetri, S. Tariq, R. Singh, F. Jalalvand, C. Paris, S. Nepal, Towards human–AI teaming to mitigate alert fatigue in security operations centres, ACM Transactions on Internet Technology 24 (2024) 1–22. https://doi.org/10.1145/3670009.</w:t>
-      </w:r>
-    </w:p>
-    <w:p>
-      <w:pPr>
-        <w:pStyle w:val="BodyText"/>
-      </w:pPr>
-      <w:r>
-        <w:t xml:space="preserve">[3] X. Wang, X. Yang, X. Liang, X. Zhang, W. Zhang, X. Gong, Combating alert fatigue with AlertPro: Context-aware alert prioritization using reinforcement learning for multi-step attack detection, Computers &amp; Security 137 (2024) 103583. https://doi.org/10.1016/j.cose.2023.103583.</w:t>
-      </w:r>
-    </w:p>
-    <w:p>
-      <w:pPr>
-        <w:pStyle w:val="BodyText"/>
-      </w:pPr>
-      <w:r>
-        <w:t xml:space="preserve">[4] A.L. Buczak, E. Guven, A survey of data mining and machine learning methods for cyber security intrusion detection, IEEE Communications Surveys &amp; Tutorials 18 (2016) 1153–1176. https://doi.org/10.1109/COMST.2015.2494502.</w:t>
-      </w:r>
-    </w:p>
-    <w:p>
-      <w:pPr>
-        <w:pStyle w:val="BodyText"/>
-      </w:pPr>
-      <w:r>
-        <w:t xml:space="preserve">[5] A. Khraisat, I. Gondal, P. Vamplew, J. Kamruzzaman, Survey of intrusion detection systems: Techniques, datasets and challenges, Cybersecurity 2 (2019) 20. https://doi.org/10.1186/s42400-019-0038-7.</w:t>
-      </w:r>
-    </w:p>
-    <w:p>
-      <w:pPr>
-        <w:pStyle w:val="BodyText"/>
-      </w:pPr>
-      <w:r>
-        <w:t xml:space="preserve">[6] T. Su, H. Sun, J. Zhu, S. Wang, Y. Li, BAT: Deep learning methods on network intrusion detection using NSL-KDD dataset, IEEE Access 8 (2020) 29575–29585. https://doi.org/10.1109/ACCESS.2020.2972627.</w:t>
-      </w:r>
-    </w:p>
-    <w:p>
-      <w:pPr>
-        <w:pStyle w:val="BodyText"/>
-      </w:pPr>
-      <w:r>
-        <w:t xml:space="preserve">[7] N. Sun, J. Zhang, P. Rimba, S. Gao, L.Y. Zhang, Y. Xiang, Data-driven cybersecurity incident prediction: A survey, IEEE Communications Surveys &amp; Tutorials 21 (2019) 1744–1772. https://doi.org/10.1109/COMST.2018.2885561.</w:t>
-      </w:r>
-    </w:p>
-    <w:p>
-      <w:pPr>
-        <w:pStyle w:val="BodyText"/>
-      </w:pPr>
-      <w:r>
-        <w:t xml:space="preserve">[8] G. Vial, Understanding digital transformation: A review and a research agenda, The Journal of Strategic Information Systems 28 (2019) 118–144. https://doi.org/10.1016/j.jsis.2019.01.003.</w:t>
-      </w:r>
-    </w:p>
-    <w:p>
-      <w:pPr>
-        <w:pStyle w:val="BodyText"/>
-      </w:pPr>
-      <w:r>
-        <w:t xml:space="preserve">[9] F. Provost, T. Fawcett, Data science and its relationship to big data and data-driven decision making, Big Data 1 (2013) 51–59. https://doi.org/10.1089/big.2013.1508.</w:t>
-      </w:r>
-    </w:p>
-    <w:p>
-      <w:pPr>
-        <w:pStyle w:val="BodyText"/>
-      </w:pPr>
-      <w:r>
-        <w:t xml:space="preserve">[10] L.A. Zadeh, Fuzzy sets, Information and Control 8 (1965) 338–353. https://doi.org/10.1016/S0019-9958(65)90241-X90241-X).</w:t>
-      </w:r>
-    </w:p>
-    <w:p>
-      <w:pPr>
-        <w:pStyle w:val="BodyText"/>
-      </w:pPr>
-      <w:r>
-        <w:t xml:space="preserve">[11] J.-S.R. Jang, ANFIS: Adaptive-network-based fuzzy inference system, IEEE Transactions on Systems, Man, and Cybernetics 23 (1993) 665–685. https://doi.org/10.1109/21.256541.</w:t>
-      </w:r>
-    </w:p>
-    <w:p>
-      <w:pPr>
-        <w:pStyle w:val="BodyText"/>
-      </w:pPr>
-      <w:r>
-        <w:t xml:space="preserve">[12] P.V. de Campos Souza, Fuzzy neural networks and neuro-fuzzy networks: A review the main techniques and applications used in the literature, Applied Soft Computing 92 (2020) 106275. https://doi.org/10.1016/j.asoc.2020.106275.</w:t>
-      </w:r>
-    </w:p>
-    <w:p>
-      <w:pPr>
-        <w:pStyle w:val="BodyText"/>
-      </w:pPr>
-      <w:r>
-        <w:t xml:space="preserve">[13] D. Srilatha, G.K. Shyam, Cloud-based intrusion detection using kernel fuzzy clustering and optimal type-2 fuzzy neural network, Cluster Computing 24 (2021) 2657–2672. https://doi.org/10.1007/s10586-021-03281-9.</w:t>
-      </w:r>
-    </w:p>
-    <w:p>
-      <w:pPr>
-        <w:pStyle w:val="BodyText"/>
-      </w:pPr>
-      <w:r>
-        <w:t xml:space="preserve">[14] J. Liu, W. Yinchai, T.C. Siong, X. Li, L. Zhao, F. Wei, On the combination of adaptive neuro-fuzzy inference system and deep residual network for improving detection rates on intrusion detection, PLOS ONE 17 (2022) e0278819. https://doi.org/10.1371/journal.pone.0278819.</w:t>
-      </w:r>
-    </w:p>
-    <w:p>
-      <w:pPr>
-        <w:pStyle w:val="BodyText"/>
-      </w:pPr>
-      <w:r>
-        <w:t xml:space="preserve">[15] J. Liu, W. Yinchai, T.C. Siong, X. Li, L. Zhao, F. Wei, A hybrid interpretable deep structure based on adaptive neuro-fuzzy inference system, decision tree, and K-means for intrusion detection, Scientific Reports 12 (2022) 20770. https://doi.org/10.1038/s41598-022-23765-x.</w:t>
-      </w:r>
-    </w:p>
-    <w:p>
-      <w:pPr>
-        <w:pStyle w:val="BodyText"/>
-      </w:pPr>
-      <w:r>
-        <w:t xml:space="preserve">[16] C. Elkan, The foundations of cost-sensitive learning, in: Proceedings of the 17th International Joint Conference on Artificial Intelligence (IJCAI), 2001: pp. 973–978.</w:t>
-      </w:r>
-    </w:p>
-    <w:p>
-      <w:pPr>
-        <w:pStyle w:val="BodyText"/>
-      </w:pPr>
-      <w:r>
-        <w:t xml:space="preserve">[17] A. Telikani, N.E. Rudbardeh, S. Soleymanpour, A. Shahbahrami, J. Shen, G. Gaydadjiev, R. Hassanpour, A cost-sensitive machine learning model with multitask learning for intrusion detection in IoT, IEEE Transactions on Industrial Informatics 20 (2024) 3880–3890. https://doi.org/10.1109/TII.2023.3314208.</w:t>
-      </w:r>
-    </w:p>
-    <w:p>
-      <w:pPr>
-        <w:pStyle w:val="BodyText"/>
-      </w:pPr>
-      <w:r>
-        <w:t xml:space="preserve">[18] S.M. Lundberg, S.-I. Lee, A unified approach to interpreting model predictions, Advances in Neural Information Processing Systems 30 (2017). https://doi.org/10.48550/arXiv.1705.07874.</w:t>
-      </w:r>
-    </w:p>
-    <w:p>
-      <w:pPr>
-        <w:pStyle w:val="BodyText"/>
-      </w:pPr>
-      <w:r>
-        <w:t xml:space="preserve">[19] V.Z. Mohale, I.C. Obagbuwa, A systematic review on the integration of explainable artificial intelligence in intrusion detection systems to enhancing transparency and interpretability in cybersecurity, Frontiers in Artificial Intelligence 8 (2025) 1526221. https://doi.org/10.3389/frai.2025.1526221.</w:t>
-      </w:r>
-    </w:p>
-    <w:p>
-      <w:pPr>
-        <w:pStyle w:val="BodyText"/>
-      </w:pPr>
-      <w:r>
-        <w:t xml:space="preserve">[20] S. AL, S. Sagiroglu, Explainable artificial intelligence models in intrusion detection systems, Engineering Applications of Artificial Intelligence 144 (2025) 110145. https://doi.org/10.1016/j.engappai.2025.110145.</w:t>
-      </w:r>
-    </w:p>
-    <w:p>
-      <w:pPr>
-        <w:pStyle w:val="BodyText"/>
-      </w:pPr>
-      <w:r>
-        <w:t xml:space="preserve">[21] S. Bag, S. Sarkar, I. Bose, Enhancing cybersecurity risk assessment using temporal knowledge graph-based explainable decision support system, Decision Support Systems 198 (2025) 114526. https://doi.org/10.1016/j.dss.2025.114526.</w:t>
-      </w:r>
-    </w:p>
-    <w:p>
-      <w:pPr>
-        <w:pStyle w:val="BodyText"/>
-      </w:pPr>
-      <w:r>
-        <w:t xml:space="preserve">[22] S.K. Thota, Quantum-inspired knowledge-guided decision support for risk-aware UAV mission planning in contested environments, Knowledge-Based Systems 351 (2026) 116815. https://doi.org/10.1016/j.knosys.2026.116815.</w:t>
-      </w:r>
-    </w:p>
-    <w:p>
-      <w:pPr>
-        <w:pStyle w:val="BodyText"/>
-      </w:pPr>
-      <w:r>
-        <w:t xml:space="preserve">[23] J.H. Friedman, Greedy function approximation: A gradient boosting machine, The Annals of Statistics 29 (2001) 1189–1232. https://doi.org/10.1214/aos/1013203451.</w:t>
-      </w:r>
-    </w:p>
-    <w:p>
-      <w:pPr>
-        <w:pStyle w:val="BodyText"/>
-      </w:pPr>
-      <w:r>
-        <w:t xml:space="preserve">[24] I. Goodfellow, Y. Bengio, A. Courville, Deep learning, MIT Press, Cambridge, MA, 2016.</w:t>
-      </w:r>
-    </w:p>
-    <w:p>
-      <w:pPr>
-        <w:pStyle w:val="BodyText"/>
-      </w:pPr>
-      <w:r>
-        <w:t xml:space="preserve">[25] M. Tavallaee, E. Bagheri, W. Lu, A.A. Ghorbani, A detailed analysis of the KDD CUP 99 data set, in: Proceedings of the 2009 IEEE Symposium on Computational Intelligence for Security and Defense Applications (CISDA), 2009: pp. 1–6. https://doi.org/10.1109/CISDA.2009.5356528.</w:t>
-      </w:r>
-    </w:p>
-    <w:p>
-      <w:pPr>
-        <w:pStyle w:val="BodyText"/>
-      </w:pPr>
-      <w:r>
-        <w:t xml:space="preserve">[26] B. Efron, R.J. Tibshirani, An introduction to the bootstrap, Chapman &amp; Hall/CRC, New York, 1994. https://doi.org/10.1201/9780429246593.</w:t>
-      </w:r>
-    </w:p>
-    <w:p>
-      <w:pPr>
-        <w:pStyle w:val="BodyText"/>
-      </w:pPr>
-      <w:r>
-        <w:t xml:space="preserve">[27] F. Wilcoxon, Individual comparisons by ranking methods, Biometrics Bulletin 1 (1945) 80–83. https://doi.org/10.2307/3001968.</w:t>
-      </w:r>
-    </w:p>
-    <w:p>
-      <w:pPr>
-        <w:pStyle w:val="BodyText"/>
-      </w:pPr>
-      <w:r>
-        <w:t xml:space="preserve">[28] M. Ring, S. Wunderlich, D. Scheuring, D. Landes, A. Hotho, A survey of network-based intrusion detection data sets, Computers &amp; Security 86 (2019) 147–167. https://doi.org/10.1016/j.cose.2019.06.005.</w:t>
-      </w:r>
-    </w:p>
-    <w:p>
-      <w:pPr>
-        <w:pStyle w:val="BodyText"/>
-      </w:pPr>
-      <w:r>
-        <w:t xml:space="preserve">[29] M.A. Al-Garadi, A. Mohamed, A.K. Al-Ali, X. Du, I. Ali, M. Guizani, A survey of machine and deep learning methods for Internet of Things (IoT) security, IEEE Communications Surveys &amp; Tutorials 22 (2020) 1646–1685. https://doi.org/10.1109/COMST.2020.2988293.</w:t>
-      </w:r>
-    </w:p>
-    <w:bookmarkEnd w:id="32"/>
     <w:sectPr>
       <w:footnotePr>
         <w:numRestart w:val="eachSect"/>

</xml_diff>

<commit_message>
Trim KBS short communication to 10 pages without changing results
Remove Algorithm 1 (method is defined by Eqs. 1-7 and R1-R3), tighten the
Introduction, Discussion and managerial points, drop prose that repeats
table values, and shorten captions. Mirror the trim in manuscript.md and
the pandoc-built docx; recompile PDF (10 pp, 28 refs). Mark the page-limit
issue resolved in CHECKLIST.md.
</commit_message>
<xml_diff>
--- a/paper/elsevier/manuscript.docx
+++ b/paper/elsevier/manuscript.docx
@@ -232,7 +232,7 @@
         <w:pStyle w:val="FirstParagraph"/>
       </w:pPr>
       <w:r>
-        <w:t xml:space="preserve">SOC analysts face far more alerts than they can investigate, and alert fatigue is now recognised as a central operational risk of security operations [1,2]. Recent work prioritises alerts with reinforcement learning or human–AI teaming [2,3], but most intrusion-detection research still ends at a score or a label and is judged by accuracy or ROC-AUC [4–7]. For a SOC manager the business question is different: given finite analyst capacity and asymmetric costs of missed attacks and needless escalations, which alerts should be monitored, contained automatically, or escalated? Answering it explicitly is part of the digital transformation of security operations from tool-centric to data-driven decision processes [8,9].</w:t>
+        <w:t xml:space="preserve">SOC analysts face far more alerts than they can investigate, and alert fatigue is a central operational risk [1,2]. Recent work prioritises alerts by reinforcement learning or human–AI teaming [2,3], but most intrusion-detection research stops at a score judged by accuracy or ROC-AUC [4–7]. A SOC manager must instead decide, under finite analyst capacity and asymmetric error costs, which alerts to monitor, contain or escalate, a step in the data-driven transformation of security operations [8,9].</w:t>
       </w:r>
     </w:p>
     <w:p>
@@ -240,7 +240,7 @@
         <w:pStyle w:val="BodyText"/>
       </w:pPr>
       <w:r>
-        <w:t xml:space="preserve">Fuzzy and neuro-fuzzy systems are a natural vehicle for this step because they express learned evidence in linguistic terms that operators can audit [10–12]. In intrusion detection, however, fuzzy–neural hybrids have mainly been used to raise detection rates [13–15]; cost-sensitive learning has been applied to the classifier rather than to the action [16,17]; and explainable-AI work explains scores without choosing actions [18–20]. Knowledge-based decision support for cyber risk, such as explainable knowledge-graph risk assessment [21], shows the value of explicit knowledge representations, but a learned-score-to-action rule base for alert triage that is evaluated with decision metrics, paired tests and ablations is still missing.</w:t>
+        <w:t xml:space="preserve">Fuzzy and neuro-fuzzy systems suit this step because they express learned evidence in linguistic terms that operators can audit [10–12]. In intrusion detection, however, fuzzy–neural hybrids mainly raise detection rates [13–15], cost-sensitive learning targets the classifier rather than the action [16,17], and explainable AI explains scores without choosing actions [18–20]. Knowledge-based cyber-risk decision support, such as explainable knowledge-graph risk assessment [21], shows the value of explicit knowledge representations, but a score-to-action rule base for alert triage, evaluated with decision metrics, is still missing.</w:t>
       </w:r>
     </w:p>
     <w:p>
@@ -248,7 +248,7 @@
         <w:pStyle w:val="BodyText"/>
       </w:pPr>
       <w:r>
-        <w:t xml:space="preserve">This Short Communication closes that gap with three contributions: (i) a compact knowledge-based triage layer that converts neural propensity into fuzzy risk bands and then into SOC actions through a stated production-rule base (Section 2); (ii) a decision-centric evaluation protocol, comprising mean triage cost, attack coverage and unnecessary escalations, with paired bootstrap confidence intervals, Wilcoxon tests, a 10-seed repetition, and cost-ratio and membership sweeps (Sections 3–4); and (iii) an ablation that locates where the gain comes from and how far the rule base is from a cost-optimal reference. The design differs structurally from the strongest baseline, gradient boosting [22]: boosting is a detector whose output still requires a threshold, whereas the proposed layer is detector-agnostic and acts on any propensity score. Section 4 demonstrates this by applying the same rules to boosting scores.</w:t>
+        <w:t xml:space="preserve">This Short Communication contributes (i) a knowledge-based layer that maps neural propensity to fuzzy risk bands and then to SOC actions through a stated production-rule base (Section 2); (ii) a decision-centric evaluation with paired tests, re-runs and sensitivity sweeps (Sections 3–4); and (iii) ablations that locate the gain. Unlike gradient boosting [22], the strongest baseline, whose output still needs a threshold, the layer is detector-agnostic.</w:t>
       </w:r>
     </w:p>
     <w:bookmarkEnd w:id="11"/>
@@ -270,7 +270,7 @@
           <wp:inline>
             <wp:extent cx="5334000" cy="3517518"/>
             <wp:effectExtent b="0" l="0" r="0" t="0"/>
-            <wp:docPr descr="Fig. 1. Proposed framework. (a) Pipeline from alert features to neural propensity, fuzzy risk bands and the production-rule base R_1–R_3. (b) Membership functions of Eqs. (2)–(4); dotted lines mark the dominant-band switch points p=9/32 and 23/32 that separate Monitor, Soft-block and Escalate." title="" id="13" name="Picture"/>
+            <wp:docPr descr="Fig. 1. Proposed framework. (a) Pipeline from alert features to neural propensity, fuzzy risk bands and rules R_1–R_3. (b) Membership functions, Eqs. (2)–(4); dotted lines mark the switch points p=9/32 and 23/32 between Monitor, Soft-block and Escalate." title="" id="13" name="Picture"/>
             <a:graphic>
               <a:graphicData uri="http://schemas.openxmlformats.org/drawingml/2006/picture">
                 <pic:pic>
@@ -323,7 +323,7 @@
         <w:t xml:space="preserve"> </w:t>
       </w:r>
       <w:r>
-        <w:t xml:space="preserve">Proposed framework. (a) Pipeline from alert features to neural propensity, fuzzy risk bands and the production-rule base</w:t>
+        <w:t xml:space="preserve">Proposed framework. (a) Pipeline from alert features to neural propensity, fuzzy risk bands and rules</w:t>
       </w:r>
       <w:r>
         <w:t xml:space="preserve"> </w:t>
@@ -360,7 +360,7 @@
         </m:sSub>
       </m:oMath>
       <w:r>
-        <w:t xml:space="preserve">. (b) Membership functions of Eqs. (2)–(4); dotted lines mark the dominant-band switch points</w:t>
+        <w:t xml:space="preserve">. (b) Membership functions, Eqs. (2)–(4); dotted lines mark the switch points</w:t>
       </w:r>
       <w:r>
         <w:t xml:space="preserve"> </w:t>
@@ -415,7 +415,7 @@
         <w:t xml:space="preserve"> </w:t>
       </w:r>
       <w:r>
-        <w:t xml:space="preserve">that separate Monitor, Soft-block and Escalate.</w:t>
+        <w:t xml:space="preserve">between Monitor, Soft-block and Escalate.</w:t>
       </w:r>
     </w:p>
     <w:bookmarkStart w:id="15" w:name="neural-propensity-model"/>
@@ -2229,7 +2229,7 @@
         <w:t xml:space="preserve"> </w:t>
       </w:r>
       <w:r>
-        <w:t xml:space="preserve">to (Monitor, Soft-block, Escalate). The firing strengths are kept with every decision as its explanation (e.g., “</w:t>
+        <w:t xml:space="preserve">to (Monitor, Soft-block, Escalate). Firing strengths are logged with every decision as its explanation (e.g., “</w:t>
       </w:r>
       <m:oMath>
         <m:r>
@@ -2486,381 +2486,20 @@
         <w:pStyle w:val="FirstParagraph"/>
       </w:pPr>
       <w:r>
-        <w:t xml:space="preserve">Actions are scored with a relative cost matrix</w:t>
-      </w:r>
-      <w:r>
-        <w:t xml:space="preserve"> </w:t>
-      </w:r>
-      <m:oMath>
-        <m:r>
-          <m:t>C</m:t>
-        </m:r>
-        <m:r>
-          <m:rPr>
-            <m:sty m:val="p"/>
-          </m:rPr>
-          <m:t>(</m:t>
-        </m:r>
-        <m:r>
-          <m:t>a</m:t>
-        </m:r>
-        <m:r>
-          <m:rPr>
-            <m:sty m:val="p"/>
-          </m:rPr>
-          <m:t>,</m:t>
-        </m:r>
-        <m:r>
-          <m:t>y</m:t>
-        </m:r>
-        <m:r>
-          <m:rPr>
-            <m:sty m:val="p"/>
-          </m:rPr>
-          <m:t>)</m:t>
-        </m:r>
-      </m:oMath>
-      <w:r>
-        <w:t xml:space="preserve"> </w:t>
-      </w:r>
-      <w:r>
-        <w:t xml:space="preserve">that charges a missed attack</w:t>
-      </w:r>
-      <w:r>
-        <w:t xml:space="preserve"> </w:t>
-      </w:r>
-      <m:oMath>
-        <m:sSub>
-          <m:e>
-            <m:r>
-              <m:t>C</m:t>
-            </m:r>
-          </m:e>
-          <m:sub>
-            <m:r>
-              <m:t>F</m:t>
-            </m:r>
-            <m:r>
-              <m:t>N</m:t>
-            </m:r>
-          </m:sub>
-        </m:sSub>
-        <m:r>
-          <m:rPr>
-            <m:sty m:val="p"/>
-          </m:rPr>
-          <m:t>=</m:t>
-        </m:r>
-        <m:r>
-          <m:t>10</m:t>
-        </m:r>
-      </m:oMath>
-      <w:r>
-        <w:t xml:space="preserve">, an analyst escalation 3 units (plus 3 if the alert is benign), and a soft-block 1 unit (plus 1 if benign):</w:t>
+        <w:t xml:space="preserve">Actions are scored with the relative cost matrix</w:t>
       </w:r>
     </w:p>
     <w:p>
       <w:pPr>
         <w:pStyle w:val="BodyText"/>
       </w:pPr>
-      <m:oMathPara>
-        <m:oMathParaPr>
-          <m:jc m:val="center"/>
-        </m:oMathParaPr>
-        <m:oMath>
-          <m:eqArr>
-            <m:e>
-              <m:r>
-                <m:t>C</m:t>
-              </m:r>
-              <m:r>
-                <m:rPr>
-                  <m:sty m:val="p"/>
-                </m:rPr>
-                <m:t>(</m:t>
-              </m:r>
-              <m:r>
-                <m:rPr>
-                  <m:nor/>
-                  <m:sty m:val="p"/>
-                </m:rPr>
-                <m:t>Monitor</m:t>
-              </m:r>
-              <m:r>
-                <m:rPr>
-                  <m:sty m:val="p"/>
-                </m:rPr>
-                <m:t>,</m:t>
-              </m:r>
-              <m:r>
-                <m:t>y</m:t>
-              </m:r>
-              <m:r>
-                <m:rPr>
-                  <m:sty m:val="p"/>
-                </m:rPr>
-                <m:t>)</m:t>
-              </m:r>
-              <m:r>
-                <m:t>&amp;</m:t>
-              </m:r>
-              <m:r>
-                <m:rPr>
-                  <m:sty m:val="p"/>
-                </m:rPr>
-                <m:t>=</m:t>
-              </m:r>
-              <m:sSub>
-                <m:e>
-                  <m:r>
-                    <m:t>C</m:t>
-                  </m:r>
-                </m:e>
-                <m:sub>
-                  <m:r>
-                    <m:t>F</m:t>
-                  </m:r>
-                  <m:r>
-                    <m:t>N</m:t>
-                  </m:r>
-                </m:sub>
-              </m:sSub>
-              <m:r>
-                <m:t> </m:t>
-              </m:r>
-              <m:r>
-                <m:t>y</m:t>
-              </m:r>
-              <m:r>
-                <m:rPr>
-                  <m:sty m:val="p"/>
-                </m:rPr>
-                <m:t>,</m:t>
-              </m:r>
-              <m:r>
-                <m:t>&amp;</m:t>
-              </m:r>
-              <m:r>
-                <m:t>C</m:t>
-              </m:r>
-              <m:r>
-                <m:rPr>
-                  <m:sty m:val="p"/>
-                </m:rPr>
-                <m:t>(</m:t>
-              </m:r>
-              <m:r>
-                <m:rPr>
-                  <m:nor/>
-                  <m:sty m:val="p"/>
-                </m:rPr>
-                <m:t>Soft-block</m:t>
-              </m:r>
-              <m:r>
-                <m:rPr>
-                  <m:sty m:val="p"/>
-                </m:rPr>
-                <m:t>,</m:t>
-              </m:r>
-              <m:r>
-                <m:t>y</m:t>
-              </m:r>
-              <m:r>
-                <m:rPr>
-                  <m:sty m:val="p"/>
-                </m:rPr>
-                <m:t>)</m:t>
-              </m:r>
-              <m:r>
-                <m:t>&amp;</m:t>
-              </m:r>
-              <m:r>
-                <m:rPr>
-                  <m:sty m:val="p"/>
-                </m:rPr>
-                <m:t>=</m:t>
-              </m:r>
-              <m:r>
-                <m:t>1</m:t>
-              </m:r>
-              <m:r>
-                <m:rPr>
-                  <m:sty m:val="p"/>
-                </m:rPr>
-                <m:t>+</m:t>
-              </m:r>
-              <m:r>
-                <m:rPr>
-                  <m:sty m:val="p"/>
-                </m:rPr>
-                <m:t>(</m:t>
-              </m:r>
-              <m:r>
-                <m:t>1</m:t>
-              </m:r>
-              <m:r>
-                <m:rPr>
-                  <m:sty m:val="p"/>
-                </m:rPr>
-                <m:t>−</m:t>
-              </m:r>
-              <m:r>
-                <m:t>y</m:t>
-              </m:r>
-              <m:r>
-                <m:rPr>
-                  <m:sty m:val="p"/>
-                </m:rPr>
-                <m:t>)</m:t>
-              </m:r>
-              <m:r>
-                <m:rPr>
-                  <m:sty m:val="p"/>
-                </m:rPr>
-                <m:t>,</m:t>
-              </m:r>
-            </m:e>
-            <m:e>
-              <m:r>
-                <m:t>C</m:t>
-              </m:r>
-              <m:r>
-                <m:rPr>
-                  <m:sty m:val="p"/>
-                </m:rPr>
-                <m:t>(</m:t>
-              </m:r>
-              <m:r>
-                <m:rPr>
-                  <m:nor/>
-                  <m:sty m:val="p"/>
-                </m:rPr>
-                <m:t>Escalate</m:t>
-              </m:r>
-              <m:r>
-                <m:rPr>
-                  <m:sty m:val="p"/>
-                </m:rPr>
-                <m:t>,</m:t>
-              </m:r>
-              <m:r>
-                <m:t>y</m:t>
-              </m:r>
-              <m:r>
-                <m:rPr>
-                  <m:sty m:val="p"/>
-                </m:rPr>
-                <m:t>)</m:t>
-              </m:r>
-              <m:r>
-                <m:t>&amp;</m:t>
-              </m:r>
-              <m:r>
-                <m:rPr>
-                  <m:sty m:val="p"/>
-                </m:rPr>
-                <m:t>=</m:t>
-              </m:r>
-              <m:r>
-                <m:t>3</m:t>
-              </m:r>
-              <m:r>
-                <m:rPr>
-                  <m:sty m:val="p"/>
-                </m:rPr>
-                <m:t>+</m:t>
-              </m:r>
-              <m:r>
-                <m:t>3</m:t>
-              </m:r>
-              <m:r>
-                <m:rPr>
-                  <m:sty m:val="p"/>
-                </m:rPr>
-                <m:t>(</m:t>
-              </m:r>
-              <m:r>
-                <m:t>1</m:t>
-              </m:r>
-              <m:r>
-                <m:rPr>
-                  <m:sty m:val="p"/>
-                </m:rPr>
-                <m:t>−</m:t>
-              </m:r>
-              <m:r>
-                <m:t>y</m:t>
-              </m:r>
-              <m:r>
-                <m:rPr>
-                  <m:sty m:val="p"/>
-                </m:rPr>
-                <m:t>)</m:t>
-              </m:r>
-              <m:r>
-                <m:rPr>
-                  <m:sty m:val="p"/>
-                </m:rPr>
-                <m:t>,</m:t>
-              </m:r>
-              <m:r>
-                <m:t>&amp;</m:t>
-              </m:r>
-              <m:sSub>
-                <m:e>
-                  <m:r>
-                    <m:t>C</m:t>
-                  </m:r>
-                </m:e>
-                <m:sub>
-                  <m:r>
-                    <m:t>F</m:t>
-                  </m:r>
-                  <m:r>
-                    <m:t>N</m:t>
-                  </m:r>
-                </m:sub>
-              </m:sSub>
-              <m:r>
-                <m:t>&amp;</m:t>
-              </m:r>
-              <m:r>
-                <m:rPr>
-                  <m:sty m:val="p"/>
-                </m:rPr>
-                <m:t>=</m:t>
-              </m:r>
-              <m:r>
-                <m:t>10</m:t>
-              </m:r>
-              <m:r>
-                <m:rPr>
-                  <m:sty m:val="p"/>
-                </m:rPr>
-                <m:t>.</m:t>
-              </m:r>
-            </m:e>
-          </m:eqArr>
-          <m:r>
-            <m:t>  </m:t>
-          </m:r>
-          <m:r>
-            <m:rPr>
-              <m:sty m:val="p"/>
-            </m:rPr>
-            <m:t>(</m:t>
-          </m:r>
-          <m:r>
-            <m:t>6</m:t>
-          </m:r>
-          <m:r>
-            <m:rPr>
-              <m:sty m:val="p"/>
-            </m:rPr>
-            <m:t>)</m:t>
-          </m:r>
-        </m:oMath>
-      </m:oMathPara>
+      <w:r>
+        <w:t xml:space="preserve">$$egin{aligned}
+    C(\text{Monitor},y)&amp;=C_{FN}\,y, &amp; C(\text{Soft-block},y)&amp;=1+(1-y),\\
+    C(\text{Escalate},y)&amp;=3+3(1-y), &amp; C_{FN}&amp;=10.
+    \end{aligned}
+    \qquad(6)$$</w:t>
+      </w:r>
     </w:p>
     <w:p>
       <w:pPr>
@@ -3095,7 +2734,7 @@
         </m:nary>
       </m:oMath>
       <w:r>
-        <w:t xml:space="preserve">, and the count of unnecessary escalations (benign alerts that are escalated). As an analytical reference we also report the plug-in Bayes rule</w:t>
+        <w:t xml:space="preserve">, and unnecessary escalations (escalated benign alerts). As a reference we also report the plug-in Bayes rule</w:t>
       </w:r>
     </w:p>
     <w:p>
@@ -3447,736 +3086,8 @@
         </m:r>
       </m:oMath>
       <w:r>
-        <w:t xml:space="preserve">. Algorithm 1 summarises the pipeline.</w:t>
-      </w:r>
-    </w:p>
-    <w:p>
-      <w:pPr>
-        <w:pStyle w:val="BodyText"/>
-      </w:pPr>
-      <w:r>
-        <w:rPr>
-          <w:b/>
-          <w:bCs/>
-        </w:rPr>
-        <w:t xml:space="preserve">Algorithm 1.</w:t>
-      </w:r>
-      <w:r>
-        <w:t xml:space="preserve"> </w:t>
-      </w:r>
-      <w:r>
-        <w:t xml:space="preserve">Fuzzy–neural cost-aware alert triage</w:t>
-      </w:r>
-    </w:p>
-    <w:p>
-      <w:pPr>
-        <w:pStyle w:val="BodyText"/>
-      </w:pPr>
-      <w:r>
-        <w:rPr>
-          <w:b/>
-          <w:bCs/>
-        </w:rPr>
-        <w:t xml:space="preserve">Input:</w:t>
-      </w:r>
-      <w:r>
-        <w:t xml:space="preserve"> </w:t>
-      </w:r>
-      <w:r>
-        <w:t xml:space="preserve">labelled alerts</w:t>
-      </w:r>
-      <w:r>
-        <w:t xml:space="preserve"> </w:t>
-      </w:r>
-      <m:oMath>
-        <m:r>
-          <m:rPr>
-            <m:scr m:val="script"/>
-            <m:sty m:val="p"/>
-          </m:rPr>
-          <m:t>D</m:t>
-        </m:r>
-      </m:oMath>
-      <w:r>
-        <w:t xml:space="preserve">; alert stream</w:t>
-      </w:r>
-      <w:r>
-        <w:t xml:space="preserve"> </w:t>
-      </w:r>
-      <m:oMath>
-        <m:r>
-          <m:rPr>
-            <m:scr m:val="script"/>
-            <m:sty m:val="p"/>
-          </m:rPr>
-          <m:t>S</m:t>
-        </m:r>
-      </m:oMath>
-      <w:r>
-        <w:t xml:space="preserve">; breakpoints of Eqs. (2)–(4); cost matrix</w:t>
-      </w:r>
-      <w:r>
-        <w:t xml:space="preserve"> </w:t>
-      </w:r>
-      <m:oMath>
-        <m:r>
-          <m:t>C</m:t>
-        </m:r>
-      </m:oMath>
-      <w:r>
-        <w:t xml:space="preserve">, Eq. (6)</w:t>
-      </w:r>
-    </w:p>
-    <w:p>
-      <w:pPr>
-        <w:pStyle w:val="BodyText"/>
-      </w:pPr>
-      <w:r>
-        <w:rPr>
-          <w:b/>
-          <w:bCs/>
-        </w:rPr>
-        <w:t xml:space="preserve">Output:</w:t>
-      </w:r>
-      <w:r>
-        <w:t xml:space="preserve"> </w:t>
-      </w:r>
-      <w:r>
-        <w:t xml:space="preserve">action</w:t>
-      </w:r>
-      <w:r>
-        <w:t xml:space="preserve"> </w:t>
-      </w:r>
-      <m:oMath>
-        <m:sSub>
-          <m:e>
-            <m:r>
-              <m:t>a</m:t>
-            </m:r>
-          </m:e>
-          <m:sub>
-            <m:r>
-              <m:t>i</m:t>
-            </m:r>
-          </m:sub>
-        </m:sSub>
-        <m:r>
-          <m:rPr>
-            <m:sty m:val="p"/>
-          </m:rPr>
-          <m:t>∈</m:t>
-        </m:r>
-        <m:r>
-          <m:rPr>
-            <m:sty m:val="p"/>
-          </m:rPr>
-          <m:t>{</m:t>
-        </m:r>
-      </m:oMath>
-      <w:r>
-        <w:t xml:space="preserve">Monitor, Soft-block, Escalate</w:t>
-      </w:r>
-      <m:oMath>
-        <m:r>
-          <m:rPr>
-            <m:sty m:val="p"/>
-          </m:rPr>
-          <m:t>}</m:t>
-        </m:r>
-      </m:oMath>
-      <w:r>
-        <w:t xml:space="preserve"> </w:t>
-      </w:r>
-      <w:r>
-        <w:t xml:space="preserve">and firing strengths for every</w:t>
-      </w:r>
-      <w:r>
-        <w:t xml:space="preserve"> </w:t>
-      </w:r>
-      <m:oMath>
-        <m:r>
-          <m:t>i</m:t>
-        </m:r>
-        <m:r>
-          <m:rPr>
-            <m:sty m:val="p"/>
-          </m:rPr>
-          <m:t>∈</m:t>
-        </m:r>
-        <m:r>
-          <m:rPr>
-            <m:scr m:val="script"/>
-            <m:sty m:val="p"/>
-          </m:rPr>
-          <m:t>S</m:t>
-        </m:r>
-      </m:oMath>
-    </w:p>
-    <w:p>
-      <w:pPr>
-        <w:pStyle w:val="BodyText"/>
-      </w:pPr>
-      <w:r>
-        <w:t xml:space="preserve">Step 1: Split</w:t>
-      </w:r>
-      <w:r>
-        <w:t xml:space="preserve"> </w:t>
-      </w:r>
-      <m:oMath>
-        <m:r>
-          <m:rPr>
-            <m:scr m:val="script"/>
-            <m:sty m:val="p"/>
-          </m:rPr>
-          <m:t>D</m:t>
-        </m:r>
-      </m:oMath>
-      <w:r>
-        <w:t xml:space="preserve"> </w:t>
-      </w:r>
-      <w:r>
-        <w:t xml:space="preserve">into training and validation sets (85/15, stratified); fit scaler and one-hot encoder on training data only</w:t>
-      </w:r>
-    </w:p>
-    <w:p>
-      <w:pPr>
-        <w:pStyle w:val="BodyText"/>
-      </w:pPr>
-      <w:r>
-        <w:t xml:space="preserve">Step 2: Train</w:t>
-      </w:r>
-      <w:r>
-        <w:t xml:space="preserve"> </w:t>
-      </w:r>
-      <m:oMath>
-        <m:sSub>
-          <m:e>
-            <m:r>
-              <m:t>g</m:t>
-            </m:r>
-          </m:e>
-          <m:sub>
-            <m:r>
-              <m:t>θ</m:t>
-            </m:r>
-          </m:sub>
-        </m:sSub>
-      </m:oMath>
-      <w:r>
-        <w:t xml:space="preserve"> </w:t>
-      </w:r>
-      <w:r>
-        <w:t xml:space="preserve">with the weighted loss of Eq. (1); keep the epoch with the best validation ROC-AUC</w:t>
-      </w:r>
-    </w:p>
-    <w:p>
-      <w:pPr>
-        <w:pStyle w:val="BodyText"/>
-      </w:pPr>
-      <w:r>
-        <w:t xml:space="preserve">Step 3: for each alert</w:t>
-      </w:r>
-      <w:r>
-        <w:t xml:space="preserve"> </w:t>
-      </w:r>
-      <m:oMath>
-        <m:r>
-          <m:t>i</m:t>
-        </m:r>
-        <m:r>
-          <m:rPr>
-            <m:sty m:val="p"/>
-          </m:rPr>
-          <m:t>∈</m:t>
-        </m:r>
-        <m:r>
-          <m:rPr>
-            <m:scr m:val="script"/>
-            <m:sty m:val="p"/>
-          </m:rPr>
-          <m:t>S</m:t>
-        </m:r>
-      </m:oMath>
-      <w:r>
-        <w:t xml:space="preserve"> </w:t>
-      </w:r>
-      <w:r>
-        <w:t xml:space="preserve">do</w:t>
-      </w:r>
-    </w:p>
-    <w:p>
-      <w:pPr>
-        <w:pStyle w:val="BodyText"/>
-      </w:pPr>
-      <w:r>
-        <w:t xml:space="preserve">Step 4:</w:t>
-      </w:r>
-      <w:r>
-        <w:t xml:space="preserve"> </w:t>
-      </w:r>
-      <m:oMath>
-        <m:sSub>
-          <m:e>
-            <m:r>
-              <m:t>p</m:t>
-            </m:r>
-          </m:e>
-          <m:sub>
-            <m:r>
-              <m:t>i</m:t>
-            </m:r>
-          </m:sub>
-        </m:sSub>
-        <m:r>
-          <m:rPr>
-            <m:sty m:val="p"/>
-          </m:rPr>
-          <m:t>←</m:t>
-        </m:r>
-        <m:r>
-          <m:t>σ</m:t>
-        </m:r>
-        <m:r>
-          <m:rPr>
-            <m:sty m:val="p"/>
-          </m:rPr>
-          <m:t>(</m:t>
-        </m:r>
-        <m:sSub>
-          <m:e>
-            <m:r>
-              <m:t>g</m:t>
-            </m:r>
-          </m:e>
-          <m:sub>
-            <m:r>
-              <m:t>θ</m:t>
-            </m:r>
-          </m:sub>
-        </m:sSub>
-        <m:r>
-          <m:rPr>
-            <m:sty m:val="p"/>
-          </m:rPr>
-          <m:t>(</m:t>
-        </m:r>
-        <m:sSub>
-          <m:e>
-            <m:r>
-              <m:t>x</m:t>
-            </m:r>
-          </m:e>
-          <m:sub>
-            <m:r>
-              <m:t>i</m:t>
-            </m:r>
-          </m:sub>
-        </m:sSub>
-        <m:r>
-          <m:rPr>
-            <m:sty m:val="p"/>
-          </m:rPr>
-          <m:t>)</m:t>
-        </m:r>
-        <m:r>
-          <m:rPr>
-            <m:sty m:val="p"/>
-          </m:rPr>
-          <m:t>)</m:t>
-        </m:r>
-      </m:oMath>
-      <w:r>
-        <w:t xml:space="preserve"> </w:t>
-      </w:r>
-      <w:r>
-        <w:t xml:space="preserve">(neural propensity)</w:t>
-      </w:r>
-    </w:p>
-    <w:p>
-      <w:pPr>
-        <w:pStyle w:val="BodyText"/>
-      </w:pPr>
-      <w:r>
-        <w:t xml:space="preserve">Step 5: compute</w:t>
-      </w:r>
-      <w:r>
-        <w:t xml:space="preserve"> </w:t>
-      </w:r>
-      <m:oMath>
-        <m:sSub>
-          <m:e>
-            <m:r>
-              <m:t>μ</m:t>
-            </m:r>
-          </m:e>
-          <m:sub>
-            <m:r>
-              <m:t>L</m:t>
-            </m:r>
-          </m:sub>
-        </m:sSub>
-        <m:r>
-          <m:rPr>
-            <m:sty m:val="p"/>
-          </m:rPr>
-          <m:t>(</m:t>
-        </m:r>
-        <m:sSub>
-          <m:e>
-            <m:r>
-              <m:t>p</m:t>
-            </m:r>
-          </m:e>
-          <m:sub>
-            <m:r>
-              <m:t>i</m:t>
-            </m:r>
-          </m:sub>
-        </m:sSub>
-        <m:r>
-          <m:rPr>
-            <m:sty m:val="p"/>
-          </m:rPr>
-          <m:t>)</m:t>
-        </m:r>
-        <m:r>
-          <m:rPr>
-            <m:sty m:val="p"/>
-          </m:rPr>
-          <m:t>,</m:t>
-        </m:r>
-        <m:sSub>
-          <m:e>
-            <m:r>
-              <m:t>μ</m:t>
-            </m:r>
-          </m:e>
-          <m:sub>
-            <m:r>
-              <m:t>M</m:t>
-            </m:r>
-          </m:sub>
-        </m:sSub>
-        <m:r>
-          <m:rPr>
-            <m:sty m:val="p"/>
-          </m:rPr>
-          <m:t>(</m:t>
-        </m:r>
-        <m:sSub>
-          <m:e>
-            <m:r>
-              <m:t>p</m:t>
-            </m:r>
-          </m:e>
-          <m:sub>
-            <m:r>
-              <m:t>i</m:t>
-            </m:r>
-          </m:sub>
-        </m:sSub>
-        <m:r>
-          <m:rPr>
-            <m:sty m:val="p"/>
-          </m:rPr>
-          <m:t>)</m:t>
-        </m:r>
-        <m:r>
-          <m:rPr>
-            <m:sty m:val="p"/>
-          </m:rPr>
-          <m:t>,</m:t>
-        </m:r>
-        <m:sSub>
-          <m:e>
-            <m:r>
-              <m:t>μ</m:t>
-            </m:r>
-          </m:e>
-          <m:sub>
-            <m:r>
-              <m:t>H</m:t>
-            </m:r>
-          </m:sub>
-        </m:sSub>
-        <m:r>
-          <m:rPr>
-            <m:sty m:val="p"/>
-          </m:rPr>
-          <m:t>(</m:t>
-        </m:r>
-        <m:sSub>
-          <m:e>
-            <m:r>
-              <m:t>p</m:t>
-            </m:r>
-          </m:e>
-          <m:sub>
-            <m:r>
-              <m:t>i</m:t>
-            </m:r>
-          </m:sub>
-        </m:sSub>
-        <m:r>
-          <m:rPr>
-            <m:sty m:val="p"/>
-          </m:rPr>
-          <m:t>)</m:t>
-        </m:r>
-      </m:oMath>
-      <w:r>
-        <w:t xml:space="preserve"> </w:t>
-      </w:r>
-      <w:r>
-        <w:t xml:space="preserve">(Eqs. (2)–(4))</w:t>
-      </w:r>
-    </w:p>
-    <w:p>
-      <w:pPr>
-        <w:pStyle w:val="BodyText"/>
-      </w:pPr>
-      <w:r>
-        <w:t xml:space="preserve">Step 6: fire</w:t>
-      </w:r>
-      <w:r>
-        <w:t xml:space="preserve"> </w:t>
-      </w:r>
-      <m:oMath>
-        <m:sSub>
-          <m:e>
-            <m:r>
-              <m:t>R</m:t>
-            </m:r>
-          </m:e>
-          <m:sub>
-            <m:r>
-              <m:t>1</m:t>
-            </m:r>
-          </m:sub>
-        </m:sSub>
-      </m:oMath>
-      <w:r>
-        <w:t xml:space="preserve">–</w:t>
-      </w:r>
-      <m:oMath>
-        <m:sSub>
-          <m:e>
-            <m:r>
-              <m:t>R</m:t>
-            </m:r>
-          </m:e>
-          <m:sub>
-            <m:r>
-              <m:t>3</m:t>
-            </m:r>
-          </m:sub>
-        </m:sSub>
-      </m:oMath>
-      <w:r>
-        <w:t xml:space="preserve">;</w:t>
-      </w:r>
-      <w:r>
-        <w:t xml:space="preserve"> </w:t>
-      </w:r>
-      <m:oMath>
-        <m:sSub>
-          <m:e>
-            <m:r>
-              <m:t>a</m:t>
-            </m:r>
-          </m:e>
-          <m:sub>
-            <m:r>
-              <m:t>i</m:t>
-            </m:r>
-          </m:sub>
-        </m:sSub>
-        <m:r>
-          <m:rPr>
-            <m:sty m:val="p"/>
-          </m:rPr>
-          <m:t>←</m:t>
-        </m:r>
-      </m:oMath>
-      <w:r>
-        <w:t xml:space="preserve"> </w:t>
-      </w:r>
-      <w:r>
-        <w:t xml:space="preserve">action of the strongest rule (Eq. (5))</w:t>
-      </w:r>
-    </w:p>
-    <w:p>
-      <w:pPr>
-        <w:pStyle w:val="BodyText"/>
-      </w:pPr>
-      <w:r>
-        <w:t xml:space="preserve">Step 7: log</w:t>
-      </w:r>
-      <w:r>
-        <w:t xml:space="preserve"> </w:t>
-      </w:r>
-      <m:oMath>
-        <m:r>
-          <m:rPr>
-            <m:sty m:val="p"/>
-          </m:rPr>
-          <m:t>(</m:t>
-        </m:r>
-        <m:sSub>
-          <m:e>
-            <m:r>
-              <m:t>p</m:t>
-            </m:r>
-          </m:e>
-          <m:sub>
-            <m:r>
-              <m:t>i</m:t>
-            </m:r>
-          </m:sub>
-        </m:sSub>
-        <m:r>
-          <m:rPr>
-            <m:sty m:val="p"/>
-          </m:rPr>
-          <m:t>,</m:t>
-        </m:r>
-        <m:sSub>
-          <m:e>
-            <m:r>
-              <m:t>μ</m:t>
-            </m:r>
-          </m:e>
-          <m:sub>
-            <m:r>
-              <m:t>L</m:t>
-            </m:r>
-          </m:sub>
-        </m:sSub>
-        <m:r>
-          <m:rPr>
-            <m:sty m:val="p"/>
-          </m:rPr>
-          <m:t>,</m:t>
-        </m:r>
-        <m:sSub>
-          <m:e>
-            <m:r>
-              <m:t>μ</m:t>
-            </m:r>
-          </m:e>
-          <m:sub>
-            <m:r>
-              <m:t>M</m:t>
-            </m:r>
-          </m:sub>
-        </m:sSub>
-        <m:r>
-          <m:rPr>
-            <m:sty m:val="p"/>
-          </m:rPr>
-          <m:t>,</m:t>
-        </m:r>
-        <m:sSub>
-          <m:e>
-            <m:r>
-              <m:t>μ</m:t>
-            </m:r>
-          </m:e>
-          <m:sub>
-            <m:r>
-              <m:t>H</m:t>
-            </m:r>
-          </m:sub>
-        </m:sSub>
-        <m:r>
-          <m:rPr>
-            <m:sty m:val="p"/>
-          </m:rPr>
-          <m:t>,</m:t>
-        </m:r>
-        <m:sSub>
-          <m:e>
-            <m:r>
-              <m:t>a</m:t>
-            </m:r>
-          </m:e>
-          <m:sub>
-            <m:r>
-              <m:t>i</m:t>
-            </m:r>
-          </m:sub>
-        </m:sSub>
-        <m:r>
-          <m:rPr>
-            <m:sty m:val="p"/>
-          </m:rPr>
-          <m:t>)</m:t>
-        </m:r>
-      </m:oMath>
-      <w:r>
-        <w:t xml:space="preserve"> </w:t>
-      </w:r>
-      <w:r>
-        <w:t xml:space="preserve">for analyst audit</w:t>
-      </w:r>
-    </w:p>
-    <w:p>
-      <w:pPr>
-        <w:pStyle w:val="BodyText"/>
-      </w:pPr>
-      <w:r>
-        <w:t xml:space="preserve">Step 8: end for</w:t>
-      </w:r>
-    </w:p>
-    <w:p>
-      <w:pPr>
-        <w:pStyle w:val="BodyText"/>
-      </w:pPr>
-      <w:r>
-        <w:t xml:space="preserve">Step 9:</w:t>
-      </w:r>
-      <w:r>
-        <w:t xml:space="preserve"> </w:t>
-      </w:r>
-      <w:r>
-        <w:rPr>
-          <w:b/>
-          <w:bCs/>
-        </w:rPr>
-        <w:t xml:space="preserve">evaluation only:</w:t>
-      </w:r>
-      <w:r>
-        <w:t xml:space="preserve"> </w:t>
-      </w:r>
-      <w:r>
-        <w:t xml:space="preserve">report</w:t>
-      </w:r>
-      <w:r>
-        <w:t xml:space="preserve"> </w:t>
-      </w:r>
-      <m:oMath>
-        <m:acc>
-          <m:accPr>
-            <m:chr m:val="‾"/>
-          </m:accPr>
-          <m:e>
-            <m:r>
-              <m:t>C</m:t>
-            </m:r>
-          </m:e>
-        </m:acc>
-      </m:oMath>
-      <w:r>
-        <w:t xml:space="preserve">, coverage and unnecessary escalations under</w:t>
-      </w:r>
-      <w:r>
-        <w:t xml:space="preserve"> </w:t>
-      </w:r>
-      <m:oMath>
-        <m:r>
-          <m:t>C</m:t>
-        </m:r>
-      </m:oMath>
+        <w:t xml:space="preserve">.</w:t>
+      </w:r>
     </w:p>
     <w:bookmarkEnd w:id="17"/>
     <w:bookmarkEnd w:id="18"/>
@@ -4204,7 +3115,7 @@
         <w:t xml:space="preserve"> </w:t>
       </w:r>
       <w:r>
-        <w:t xml:space="preserve">We use NSL-KDD [24], a public benchmark of labelled network-connection records, with labels binarised as normal versus attack. For CPU-scale reproducibility, 40,000 training records are sampled (34,000 for training and 6,000 for validation) and the test set is capped at 20,000 records (test attack rate 0.568). The test file contains attack types absent from training, so a train/test distribution shift is part of the task.</w:t>
+        <w:t xml:space="preserve">We use the NSL-KDD benchmark [24]. For CPU-scale reproducibility, 40,000 training records are sampled and split 85/15 (stratified) into 34,000 for training and 6,000 for validation, with the scaler and one-hot encoder fitted on the training split only; the test set is capped at 20,000 records (attack rate 0.568). The test file contains attack types absent from training, so train/test shift is part of the task.</w:t>
       </w:r>
     </w:p>
     <w:p>
@@ -4222,7 +3133,7 @@
         <w:t xml:space="preserve"> </w:t>
       </w:r>
       <w:r>
-        <w:t xml:space="preserve">Detectors are logistic regression (class-balanced), gradient boosting [22] (scikit-learn defaults), and the MLP without the rule layer (neural ablation). The proposed system shares the neural propensity, so it has the same predictive metrics by construction, and its contribution must show at the decision level. Decision baselines on the same neural scores are a Monitor/Escalate threshold at 0.5, the same threshold tuned on validation data to minimise cost, and escalation of the top 20% of scores (a fixed analyst-capacity rule). The Bayes rule of Eq. (7) is a reference, not a competitor, because it requires the cost matrix and calibrated probabilities at run time. Learned triage policies (e.g., reinforcement learning [3]) are excluded because they need interaction data and a matched reward protocol.</w:t>
+        <w:t xml:space="preserve">The detectors are class-balanced logistic regression, gradient boosting [22] (scikit-learn defaults) and the MLP alone (neural ablation); the proposed system shares the MLP propensity, so its contribution must show in decisions. Decision baselines on the same scores are a Monitor/Escalate threshold at 0.5, the same threshold tuned on validation data to minimise cost, and escalation of the top 20% of scores (a fixed analyst-capacity rule). The Bayes rule, Eq. (7), is a reference, not a competitor, as it needs the cost matrix and calibrated probabilities at run time. Learned policies (e.g., reinforcement learning [3]) need interaction data and are excluded.</w:t>
       </w:r>
     </w:p>
     <w:p>
@@ -4240,7 +3151,7 @@
         <w:t xml:space="preserve"> </w:t>
       </w:r>
       <w:r>
-        <w:t xml:space="preserve">On the seed-42 test set we report percentile 95% confidence intervals from 2,000 paired bootstrap resamples of alerts [25] and two-sided Wilcoxon signed-rank tests on per-alert cost differences [26]. The full pipeline (subsample, split, initialisation and training) is then repeated for seeds 42–51 and compared with a paired Wilcoxon test across seeds. Sensitivity is examined by sweeping</w:t>
+        <w:t xml:space="preserve">On the seed-42 test set we report percentile 95% confidence intervals from 2,000 paired bootstrap resamples of alerts [25] and two-sided Wilcoxon signed-rank tests on per-alert cost differences [26]. The full pipeline is repeated for seeds 42–51 (paired Wilcoxon test across seeds), and</w:t>
       </w:r>
       <w:r>
         <w:t xml:space="preserve"> </w:t>
@@ -4296,7 +3207,7 @@
         <w:t xml:space="preserve"> </w:t>
       </w:r>
       <w:r>
-        <w:t xml:space="preserve">and the half-width of the Medium band (0.25–0.45). All numbers are produced by a single script (Data Availability), run with one PyTorch thread so that results are bit-identical between runs.</w:t>
+        <w:t xml:space="preserve">and the Medium-band half-width (0.25–0.45) are swept. One deterministic script (one PyTorch thread) produces every number.</w:t>
       </w:r>
     </w:p>
     <w:bookmarkEnd w:id="19"/>
@@ -4314,7 +3225,7 @@
         <w:pStyle w:val="TableCaption"/>
       </w:pPr>
       <w:r>
-        <w:t xml:space="preserve">Predictive performance on the NSL-KDD test sample. Point estimates are for seed 42; the last column gives the mean</w:t>
+        <w:t xml:space="preserve">Predictive performance on the NSL-KDD test sample (seed 42; last column: mean</w:t>
       </w:r>
       <w:r>
         <w:t xml:space="preserve"> </w:t>
@@ -4331,7 +3242,7 @@
         <w:t xml:space="preserve"> </w:t>
       </w:r>
       <w:r>
-        <w:t xml:space="preserve">SD of ROC-AUC over seeds 42–51. The proposed system uses the same propensity as the neural ablation (its rule layer changes actions, not scores), so its predictive metrics are identical by construction.</w:t>
+        <w:t xml:space="preserve">SD of ROC-AUC over seeds 42–51). The proposed system uses the neural propensity, so its predictive metrics are identical by construction.</w:t>
       </w:r>
     </w:p>
     <w:tbl>
@@ -4340,7 +3251,7 @@
         <w:tblW w:type="pct" w:w="5000"/>
         <w:tblLayout w:type="fixed"/>
         <w:tblLook w:firstRow="1" w:lastRow="0" w:firstColumn="0" w:lastColumn="0" w:noHBand="0" w:noVBand="0" w:val="0020"/>
-        <w:tblCaption w:val="Predictive performance on the NSL-KDD test sample. Point estimates are for seed 42; the last column gives the mean \pm SD of ROC-AUC over seeds 42–51. The proposed system uses the same propensity as the neural ablation (its rule layer changes actions, not scores), so its predictive metrics are identical by construction."/>
+        <w:tblCaption w:val="Predictive performance on the NSL-KDD test sample (seed 42; last column: mean \pm SD of ROC-AUC over seeds 42–51). The proposed system uses the neural propensity, so its predictive metrics are identical by construction."/>
       </w:tblPr>
       <w:tblGrid>
         <w:gridCol w:w="1320"/>
@@ -4822,7 +3733,7 @@
         </m:r>
       </m:oMath>
       <w:r>
-        <w:t xml:space="preserve">). Brackets give paired bootstrap 95% CIs;</w:t>
+        <w:t xml:space="preserve">). Brackets: paired bootstrap 95% CIs;</w:t>
       </w:r>
       <w:r>
         <w:t xml:space="preserve"> </w:t>
@@ -4846,10 +3757,7 @@
         </m:acc>
       </m:oMath>
       <w:r>
-        <w:t xml:space="preserve"> </w:t>
-      </w:r>
-      <w:r>
-        <w:t xml:space="preserve">is the mean cost relative to the proposed policy (positive values mean the alternative is more expensive);</w:t>
+        <w:t xml:space="preserve">: mean cost relative to the proposed policy (positive = alternative more expensive);</w:t>
       </w:r>
       <w:r>
         <w:t xml:space="preserve"> </w:t>
@@ -4860,10 +3768,7 @@
         </m:r>
       </m:oMath>
       <w:r>
-        <w:t xml:space="preserve"> </w:t>
-      </w:r>
-      <w:r>
-        <w:t xml:space="preserve">is the two-sided Wilcoxon signed-rank test on per-alert costs; the last column gives the mean</w:t>
+        <w:t xml:space="preserve">: two-sided Wilcoxon signed-rank test on per-alert costs; last column: mean</w:t>
       </w:r>
       <w:r>
         <w:t xml:space="preserve"> </w:t>
@@ -4901,7 +3806,7 @@
         <w:t xml:space="preserve"> </w:t>
       </w:r>
       <w:r>
-        <w:t xml:space="preserve">over seeds 42–51. UE = unnecessary escalations; NN = neural propensity, GB = gradient-boosting propensity.</w:t>
+        <w:t xml:space="preserve">over seeds 42–51. UE = unnecessary escalations; NN/GB = neural/gradient-boosting propensity.</w:t>
       </w:r>
       <w:r>
         <w:t xml:space="preserve"> </w:t>
@@ -5034,7 +3939,7 @@
         <w:tblW w:type="pct" w:w="5000"/>
         <w:tblLayout w:type="fixed"/>
         <w:tblLook w:firstRow="1" w:lastRow="0" w:firstColumn="0" w:lastColumn="0" w:noHBand="0" w:noVBand="0" w:val="0020"/>
-        <w:tblCaption w:val="Decision quality on the seed-42 test sample (N=20{,}000). Brackets give paired bootstrap 95% CIs; \Delta\bar C is the mean cost relative to the proposed policy (positive values mean the alternative is more expensive); p is the two-sided Wilcoxon signed-rank test on per-alert costs; the last column gives the mean \pm SD of \bar C over seeds 42–51. UE = unnecessary escalations; NN = neural propensity, GB = gradient-boosting propensity. ^{b}Reference only: soft-blocks every alert with p&gt;2/11 (8,631 of 20,000) and never escalates. ^{c}Crisp cut-points at p=9/32 and 23/32; actions identical to the proposed policy."/>
+        <w:tblCaption w:val="Decision quality on the seed-42 test sample (N=20{,}000). Brackets: paired bootstrap 95% CIs; \Delta\bar C: mean cost relative to the proposed policy (positive = alternative more expensive); p: two-sided Wilcoxon signed-rank test on per-alert costs; last column: mean \pm SD of \bar C over seeds 42–51. UE = unnecessary escalations; NN/GB = neural/gradient-boosting propensity. ^{b}Reference only: soft-blocks every alert with p&gt;2/11 (8,631 of 20,000) and never escalates. ^{c}Crisp cut-points at p=9/32 and 23/32; actions identical to the proposed policy."/>
       </w:tblPr>
       <w:tblGrid>
         <w:gridCol w:w="990"/>
@@ -6442,7 +5347,7 @@
           <wp:inline>
             <wp:extent cx="5334000" cy="4415974"/>
             <wp:effectExtent b="0" l="0" r="0" t="0"/>
-            <wp:docPr descr="Fig. 2. Predictive and decision evidence. (a) ROC curves (seed 42). (b) Mean triage cost of a Monitor/Escalate threshold policy as the threshold varies, with the proposed, top-20% and Bayes-rule costs shown as horizontal lines. (c) Cost-ratio sensitivity as the missed-attack cost C_{FN} varies (the paper default, 10, is dotted). (d) Paired per-seed costs for seeds 42–51; black markers show the mean \pm SD." title="" id="21" name="Picture"/>
+            <wp:docPr descr="Fig. 2. Predictive and decision evidence. (a) ROC curves (seed 42). (b) Mean triage cost of a Monitor/Escalate threshold policy versus threshold; horizontal lines: proposed, top-20% and Bayes-rule costs. (c) Sensitivity to the missed-attack cost C_{FN} (default 10, dotted). (d) Paired per-seed costs for seeds 42–51; black markers: mean \pm SD." title="" id="21" name="Picture"/>
             <a:graphic>
               <a:graphicData uri="http://schemas.openxmlformats.org/drawingml/2006/picture">
                 <pic:pic>
@@ -6495,7 +5400,7 @@
         <w:t xml:space="preserve"> </w:t>
       </w:r>
       <w:r>
-        <w:t xml:space="preserve">Predictive and decision evidence. (a) ROC curves (seed 42). (b) Mean triage cost of a Monitor/Escalate threshold policy as the threshold varies, with the proposed, top-20% and Bayes-rule costs shown as horizontal lines. (c) Cost-ratio sensitivity as the missed-attack cost</w:t>
+        <w:t xml:space="preserve">Predictive and decision evidence. (a) ROC curves (seed 42). (b) Mean triage cost of a Monitor/Escalate threshold policy versus threshold; horizontal lines: proposed, top-20% and Bayes-rule costs. (c) Sensitivity to the missed-attack cost</w:t>
       </w:r>
       <w:r>
         <w:t xml:space="preserve"> </w:t>
@@ -6521,7 +5426,7 @@
         <w:t xml:space="preserve"> </w:t>
       </w:r>
       <w:r>
-        <w:t xml:space="preserve">varies (the paper default, 10, is dotted). (d) Paired per-seed costs for seeds 42–51; black markers show the mean</w:t>
+        <w:t xml:space="preserve">(default 10, dotted). (d) Paired per-seed costs for seeds 42–51; black markers: mean</w:t>
       </w:r>
       <w:r>
         <w:t xml:space="preserve"> </w:t>
@@ -6556,221 +5461,47 @@
         <w:t xml:space="preserve"> </w:t>
       </w:r>
       <w:r>
-        <w:t xml:space="preserve">Table 1 and Fig. 2a confirm that gradient boosting is the best detector: it has a higher ROC-AUC than the MLP in all ten seeds (</w:t>
+        <w:t xml:space="preserve">Gradient boosting is the best detector (Table 1, Fig. 2a), with a higher ROC-AUC than the MLP in all ten seeds; we make no detection claim. On identical neural scores, however, the rule base lowers the mean triage cost by 0.196 units per alert relative to the 0.5 threshold and by 1.242 relative to top-20% escalation (Table 2), and raises attack coverage by 0.031 (CI 0.028–0.034). The policies differ only on the 776 Medium-band alerts; a cost-tuned threshold (</w:t>
       </w:r>
       <m:oMath>
         <m:r>
-          <m:t>0.936</m:t>
-        </m:r>
-        <m:r>
-          <m:rPr>
-            <m:sty m:val="p"/>
-          </m:rPr>
-          <m:t>±</m:t>
-        </m:r>
-        <m:r>
-          <m:t>0.010</m:t>
+          <m:t>t</m:t>
+        </m:r>
+        <m:r>
+          <m:rPr>
+            <m:sty m:val="p"/>
+          </m:rPr>
+          <m:t>=</m:t>
+        </m:r>
+        <m:r>
+          <m:t>0.53</m:t>
         </m:r>
       </m:oMath>
       <w:r>
-        <w:t xml:space="preserve"> </w:t>
-      </w:r>
-      <w:r>
-        <w:t xml:space="preserve">versus</w:t>
+        <w:t xml:space="preserve">) does no better. It is cheaper than both crisp rules in all ten re-runs (Fig. 2d; Wilcoxon</w:t>
       </w:r>
       <w:r>
         <w:t xml:space="preserve"> </w:t>
       </w:r>
       <m:oMath>
         <m:r>
-          <m:t>0.900</m:t>
-        </m:r>
-        <m:r>
-          <m:rPr>
-            <m:sty m:val="p"/>
-          </m:rPr>
-          <m:t>±</m:t>
-        </m:r>
-        <m:r>
-          <m:t>0.007</m:t>
+          <m:t>p</m:t>
+        </m:r>
+        <m:r>
+          <m:rPr>
+            <m:sty m:val="p"/>
+          </m:rPr>
+          <m:t>=</m:t>
+        </m:r>
+        <m:r>
+          <m:t>0.002</m:t>
         </m:r>
       </m:oMath>
       <w:r>
-        <w:t xml:space="preserve">). We make no detection claim for the proposed system.</w:t>
-      </w:r>
-    </w:p>
-    <w:p>
-      <w:pPr>
-        <w:pStyle w:val="BodyText"/>
-      </w:pPr>
-      <w:r>
-        <w:rPr>
-          <w:i/>
-          <w:iCs/>
-        </w:rPr>
-        <w:t xml:space="preserve">Triage cost and coverage.</w:t>
-      </w:r>
-      <w:r>
-        <w:t xml:space="preserve"> </w:t>
-      </w:r>
-      <w:r>
-        <w:t xml:space="preserve">Table 2 shows that, on identical neural scores, the rule base reduces the mean triage cost by 0.196 units per alert relative to the 0.5 threshold (95% CI 0.180–0.213;</w:t>
-      </w:r>
-      <w:r>
-        <w:t xml:space="preserve"> </w:t>
-      </w:r>
-      <m:oMath>
-        <m:r>
-          <m:t>p</m:t>
-        </m:r>
-        <m:r>
-          <m:rPr>
-            <m:sty m:val="p"/>
-          </m:rPr>
-          <m:t>=</m:t>
-        </m:r>
-        <m:r>
-          <m:t>7.3</m:t>
-        </m:r>
-        <m:r>
-          <m:rPr>
-            <m:sty m:val="p"/>
-          </m:rPr>
-          <m:t>×</m:t>
-        </m:r>
-        <m:sSup>
-          <m:e>
-            <m:r>
-              <m:t>10</m:t>
-            </m:r>
-          </m:e>
-          <m:sup>
-            <m:r>
-              <m:rPr>
-                <m:sty m:val="p"/>
-              </m:rPr>
-              <m:t>−</m:t>
-            </m:r>
-            <m:r>
-              <m:t>124</m:t>
-            </m:r>
-          </m:sup>
-        </m:sSup>
-      </m:oMath>
-      <w:r>
-        <w:t xml:space="preserve">) and by 1.242 relative to top-20% escalation, while raising attack coverage by 0.031 (CI 0.028–0.034) and lowering unnecessary escalations from 623 to 603. The two policies disagree only on the 776 alerts placed in the Medium band. The gain is not an artefact of a poorly chosen threshold: tuning the threshold on validation data to minimise cost selects</w:t>
-      </w:r>
-      <w:r>
-        <w:t xml:space="preserve"> </w:t>
-      </w:r>
-      <m:oMath>
-        <m:r>
-          <m:t>t</m:t>
-        </m:r>
-        <m:r>
-          <m:rPr>
-            <m:sty m:val="p"/>
-          </m:rPr>
-          <m:t>=</m:t>
-        </m:r>
-        <m:r>
-          <m:t>0.53</m:t>
-        </m:r>
-      </m:oMath>
-      <w:r>
-        <w:t xml:space="preserve"> </w:t>
-      </w:r>
-      <w:r>
-        <w:t xml:space="preserve">and gives a higher cost (3.278). Across ten full re-runs the rule base is cheaper than both crisp rules in every seed (Fig. 2d;</w:t>
-      </w:r>
-      <w:r>
-        <w:t xml:space="preserve"> </w:t>
-      </w:r>
-      <m:oMath>
-        <m:r>
-          <m:t>3.088</m:t>
-        </m:r>
-        <m:r>
-          <m:rPr>
-            <m:sty m:val="p"/>
-          </m:rPr>
-          <m:t>±</m:t>
-        </m:r>
-        <m:r>
-          <m:t>0.081</m:t>
-        </m:r>
-      </m:oMath>
-      <w:r>
-        <w:t xml:space="preserve"> </w:t>
-      </w:r>
-      <w:r>
-        <w:t xml:space="preserve">versus</w:t>
-      </w:r>
-      <w:r>
-        <w:t xml:space="preserve"> </w:t>
-      </w:r>
-      <m:oMath>
-        <m:r>
-          <m:t>3.246</m:t>
-        </m:r>
-        <m:r>
-          <m:rPr>
-            <m:sty m:val="p"/>
-          </m:rPr>
-          <m:t>±</m:t>
-        </m:r>
-        <m:r>
-          <m:t>0.076</m:t>
-        </m:r>
-      </m:oMath>
-      <w:r>
-        <w:t xml:space="preserve"> </w:t>
-      </w:r>
-      <w:r>
-        <w:t xml:space="preserve">and</w:t>
-      </w:r>
-      <w:r>
-        <w:t xml:space="preserve"> </w:t>
-      </w:r>
-      <m:oMath>
-        <m:r>
-          <m:t>4.318</m:t>
-        </m:r>
-        <m:r>
-          <m:rPr>
-            <m:sty m:val="p"/>
-          </m:rPr>
-          <m:t>±</m:t>
-        </m:r>
-        <m:r>
-          <m:t>0.009</m:t>
-        </m:r>
-      </m:oMath>
-      <w:r>
-        <w:t xml:space="preserve">; Wilcoxon</w:t>
-      </w:r>
-      <w:r>
-        <w:t xml:space="preserve"> </w:t>
-      </w:r>
-      <m:oMath>
-        <m:r>
-          <m:t>p</m:t>
-        </m:r>
-        <m:r>
-          <m:rPr>
-            <m:sty m:val="p"/>
-          </m:rPr>
-          <m:t>=</m:t>
-        </m:r>
-        <m:r>
-          <m:t>0.002</m:t>
-        </m:r>
-      </m:oMath>
-      <w:r>
-        <w:t xml:space="preserve"> </w:t>
-      </w:r>
-      <w:r>
-        <w:t xml:space="preserve">for both) and has higher coverage than the 0.5 threshold in every seed. For a SOC manager, at</w:t>
+        <w:t xml:space="preserve"> </w:t>
+      </w:r>
+      <w:r>
+        <w:t xml:space="preserve">for both), with higher coverage than the 0.5 threshold in every seed. At</w:t>
       </w:r>
       <w:r>
         <w:t xml:space="preserve"> </w:t>
@@ -6805,7 +5536,7 @@
         <w:t xml:space="preserve"> </w:t>
       </w:r>
       <w:r>
-        <w:t xml:space="preserve">a saving of 0.196 units per alert amounts to about 3,900 cost units on this 20,000-alert sample, with fewer analyst hand-offs.</w:t>
+        <w:t xml:space="preserve">the saving is about 3,900 cost units per 20,000 alerts, with fewer analyst hand-offs.</w:t>
       </w:r>
     </w:p>
     <w:p>
@@ -6849,7 +5580,7 @@
         <w:t xml:space="preserve"> </w:t>
       </w:r>
       <w:r>
-        <w:t xml:space="preserve">from 2 to 30 (Fig. 2c). Top-20% escalation becomes cheaper than the rule base when missed attacks are cheap (</w:t>
+        <w:t xml:space="preserve">from 2 to 30 (Fig. 2c), but top-20% escalation is cheaper when missed attacks are cheap (</w:t>
       </w:r>
       <m:oMath>
         <m:sSub>
@@ -6910,7 +5641,7 @@
         </m:r>
       </m:oMath>
       <w:r>
-        <w:t xml:space="preserve">: 1.718 versus 1.818), because a capacity cap is then the economical choice. Varying the half-width of the Medium band from 0.25 to 0.45 changes the cost monotonically from 3.101 to 3.034 and the coverage from 0.680 to 0.691; every setting remains cheaper than both threshold baselines.</w:t>
+        <w:t xml:space="preserve">: 1.718 versus 1.818). Widening the Medium half-width from 0.25 to 0.45 moves the cost monotonically from 3.101 to 3.034 and coverage from 0.680 to 0.691, always beating both thresholds.</w:t>
       </w:r>
     </w:p>
     <w:p>
@@ -6928,7 +5659,7 @@
         <w:t xml:space="preserve"> </w:t>
       </w:r>
       <w:r>
-        <w:t xml:space="preserve">Two ablations bound the contribution. First, replacing the fuzzy sets with crisp bands at</w:t>
+        <w:t xml:space="preserve">Crisp bands at</w:t>
       </w:r>
       <w:r>
         <w:t xml:space="preserve"> </w:t>
@@ -6974,41 +5705,41 @@
         <w:t xml:space="preserve"> </w:t>
       </w:r>
       <w:r>
-        <w:t xml:space="preserve">reproduces every action, so the decision benefit comes from the intermediate Soft-block band defined by the rule base, not from fuzziness itself. The memberships add graded, linguistic explanations and a principled way to set and audit the bands. Second, the Bayes rule of Eq. (7), which reads the cost matrix directly, is much cheaper (2.164;</w:t>
+        <w:t xml:space="preserve">reproduce every action, so the benefit comes from the intermediate Soft-block band, not from fuzziness; the memberships add graded explanations and a principled way to set the bands. The Bayes rule is much cheaper (Table 2) because soft-blocking dominates escalation under Eq. (6): it contains 43% of all traffic and never involves an analyst. Managerially, when containment is this cheap the cost matrix, not the detector, sets the action mix, so organisations must calibrate</w:t>
       </w:r>
       <w:r>
         <w:t xml:space="preserve"> </w:t>
       </w:r>
       <m:oMath>
         <m:r>
-          <m:t>2.207</m:t>
-        </m:r>
-        <m:r>
-          <m:rPr>
-            <m:sty m:val="p"/>
-          </m:rPr>
-          <m:t>±</m:t>
-        </m:r>
-        <m:r>
-          <m:t>0.100</m:t>
+          <m:t>C</m:t>
         </m:r>
       </m:oMath>
       <w:r>
         <w:t xml:space="preserve"> </w:t>
       </w:r>
       <w:r>
-        <w:t xml:space="preserve">over seeds) because under Eq. (6) soft-blocking dominates escalation. It achieves this by automatically containing 43% of all traffic and never involving an analyst. We report this gap as a managerial finding rather than hide it: when containment is priced this cheaply, the cost matrix, not the detector, dictates the action mix, so organisations must calibrate</w:t>
+        <w:t xml:space="preserve">(including disruption from false containment) before automating. A test-set threshold</w:t>
       </w:r>
       <w:r>
         <w:t xml:space="preserve"> </w:t>
       </w:r>
       <m:oMath>
         <m:r>
-          <m:t>C</m:t>
+          <m:rPr>
+            <m:sty m:val="p"/>
+          </m:rPr>
+          <m:t>≤</m:t>
+        </m:r>
+        <m:r>
+          <m:t>0.10</m:t>
         </m:r>
       </m:oMath>
       <w:r>
-        <w:t xml:space="preserve">, including business disruption from false containment, before automating. Fig. 2b also shows that a test-set threshold of 0.10 or lower would beat the rule base (minimum 2.929 at</w:t>
+        <w:t xml:space="preserve"> </w:t>
+      </w:r>
+      <w:r>
+        <w:t xml:space="preserve">would also beat the rule base (Fig. 2b; minimum 2.929 at</w:t>
       </w:r>
       <w:r>
         <w:t xml:space="preserve"> </w:t>
@@ -7028,7 +5759,7 @@
         </m:r>
       </m:oMath>
       <w:r>
-        <w:t xml:space="preserve">). Validation tuning cannot find such a threshold because of the train/test shift, so it is not an attainable baseline, but it confirms that the band positions matter.</w:t>
+        <w:t xml:space="preserve">); validation tuning cannot find it under the train/test shift, but band positions clearly matter.</w:t>
       </w:r>
     </w:p>
     <w:p>
@@ -7046,30 +5777,7 @@
         <w:t xml:space="preserve"> </w:t>
       </w:r>
       <w:r>
-        <w:t xml:space="preserve">Applying the unchanged rules to gradient-boosting scores lowers the cost further (3.004;</w:t>
-      </w:r>
-      <w:r>
-        <w:t xml:space="preserve"> </w:t>
-      </w:r>
-      <m:oMath>
-        <m:r>
-          <m:t>2.967</m:t>
-        </m:r>
-        <m:r>
-          <m:rPr>
-            <m:sty m:val="p"/>
-          </m:rPr>
-          <m:t>±</m:t>
-        </m:r>
-        <m:r>
-          <m:t>0.100</m:t>
-        </m:r>
-      </m:oMath>
-      <w:r>
-        <w:t xml:space="preserve"> </w:t>
-      </w:r>
-      <w:r>
-        <w:t xml:space="preserve">over seeds) and cuts unnecessary escalations from 603 to 222. The knowledge layer and a stronger detector are therefore complementary. Explainability comes from the rule structure rather than from post-hoc attribution [18,19]: every action is traceable to one named rule and its firing strength, which supports audit trails and analyst trust in human–AI teaming [2].</w:t>
+        <w:t xml:space="preserve">On gradient-boosting scores the unchanged rules lower the cost further and cut unnecessary escalations from 603 to 222 (Table 2), so the layer complements a stronger detector. Named rules and firing strengths, not post-hoc attribution [18,19], explain each action, supporting audit trails and human–AI teaming [2].</w:t>
       </w:r>
     </w:p>
     <w:bookmarkEnd w:id="23"/>
@@ -7097,10 +5805,7 @@
         <w:t xml:space="preserve"> </w:t>
       </w:r>
       <w:r>
-        <w:t xml:space="preserve">The sensitivity results already show two failure boundaries: below</w:t>
-      </w:r>
-      <w:r>
-        <w:t xml:space="preserve"> </w:t>
+        <w:t xml:space="preserve">Beyond the low-</w:t>
       </w:r>
       <m:oMath>
         <m:sSub>
@@ -7118,21 +5823,12 @@
             </m:r>
           </m:sub>
         </m:sSub>
-        <m:r>
-          <m:rPr>
-            <m:sty m:val="p"/>
-          </m:rPr>
-          <m:t>≈</m:t>
-        </m:r>
-        <m:r>
-          <m:t>3</m:t>
-        </m:r>
       </m:oMath>
       <w:r>
         <w:t xml:space="preserve"> </w:t>
       </w:r>
       <w:r>
-        <w:t xml:space="preserve">the capacity-capped top-20% rule is cheaper, and seed 48 is the weakest replicate (cost 3.282, coverage 0.626): its MLP has a typical ROC-AUC (0.900) but the lowest accuracy at 0.5 (0.757), showing that fixed band positions are sensitive to how scores are distributed, not only to how well they rank. More fundamentally, the rule base is not cost-optimal under its own matrix. The Bayes reference shows the size of the gap, and adaptive memberships (e.g., ANFIS-style tuning [11]) or cost-derived band positions are the obvious next step. The present bands were set by expert judgement and not tuned on test data.</w:t>
+        <w:t xml:space="preserve">case, seed 48 is the weakest replicate (cost 3.282, coverage 0.626): its MLP has a typical ROC-AUC (0.900) but the lowest accuracy at 0.5 (0.757), so fixed band positions are sensitive to the score distribution, not only to ranking. The rule base is also not cost-optimal under its own matrix (the Bayes gap); adaptive (e.g., ANFIS-style [11]) or cost-derived band positions are the next step. The bands were set by expert judgement, not on test data.</w:t>
       </w:r>
     </w:p>
     <w:p>
@@ -7150,7 +5846,7 @@
         <w:t xml:space="preserve"> </w:t>
       </w:r>
       <w:r>
-        <w:t xml:space="preserve">NSL-KDD (2009) is a dated laboratory benchmark whose traffic does not reflect modern enterprise, cloud or IoT telemetry [27,28]. The training data were subsampled to 40,000 records and the test set was capped at 20,000 for CPU-scale reproducibility, and a single train/test protocol is used. The cost matrix is illustrative, not elicited from a SOC, and coverage counts automatic containment as covering an attack. No live SOC deployment, concept-drift analysis or user study was performed, so the operational value for analysts remains to be validated.</w:t>
+        <w:t xml:space="preserve">NSL-KDD (2009) is a dated laboratory benchmark that does not reflect modern enterprise, cloud or IoT traffic [27,28]. The data were subsampled, under a single train/test protocol. The cost matrix is illustrative, not elicited from a SOC; coverage counts containment as covering an attack; and there was no live deployment, drift analysis or user study.</w:t>
       </w:r>
     </w:p>
     <w:bookmarkEnd w:id="24"/>
@@ -7168,7 +5864,7 @@
         <w:pStyle w:val="FirstParagraph"/>
       </w:pPr>
       <w:r>
-        <w:t xml:space="preserve">This Short Communication framed cyber alert triage as a knowledge-based decision problem and proposed a fuzzy–neural layer that turns neural propensity into linguistic risk bands and then into Monitor, Soft-block or Escalate actions through an explicit production-rule base. On NSL-KDD the layer lowered the mean triage cost and raised attack coverage relative to crisp threshold and capacity rules, with tight paired confidence intervals, consistency across ten re-runs and robustness to cost and membership settings. It also improved further when combined with a stronger gradient-boosting detector. Ablations show that the benefit comes from the intermediate containment band and that a cost-derived Bayes rule is cheaper still. For SOC managers, the practical message is to evaluate detectors by the decisions they enable and to make the action rules and their cost assumptions explicit and auditable. Future work will elicit cost matrices from practitioners, learn band positions, and test the layer on recent datasets and live alert streams.</w:t>
+        <w:t xml:space="preserve">Treating alert triage as a knowledge-based decision problem, a fuzzy–neural rule layer beat crisp threshold and capacity rules on NSL-KDD in cost and coverage; the gain comes from the containment band, and a cost-derived Bayes rule is cheaper still. SOC managers should judge detectors by the decisions they enable and make rules and cost assumptions explicit. Future work will elicit practitioner costs and use recent, live alert data.</w:t>
       </w:r>
     </w:p>
     <w:bookmarkEnd w:id="25"/>

</xml_diff>

<commit_message>
Clean-up pass: fix reference artefacts, Eq. 6 in docx, spacing and overfull box
- Fix corrupted Zadeh DOI and book-title case in manuscript.md/docx to match refs.bib
- Restore \begin{aligned} in Eq. (6) (raw LaTeX in docx)
- Remove all literal double spaces in main.tex, manuscript.md and docx
- Fix 2.6pt overfull first-page footer; attach title tnote; drop unused packages
- Remove mirror note, set docx title/heading levels, label table captions
- Update CHECKLIST revision log
</commit_message>
<xml_diff>
--- a/paper/elsevier/manuscript.docx
+++ b/paper/elsevier/manuscript.docx
@@ -2,10 +2,9 @@
 <file path=word/document.xml><?xml version="1.0" encoding="utf-8"?>
 <w:document xmlns:w="http://schemas.openxmlformats.org/wordprocessingml/2006/main" xmlns:m="http://schemas.openxmlformats.org/officeDocument/2006/math" xmlns:r="http://schemas.openxmlformats.org/officeDocument/2006/relationships" xmlns:o="urn:schemas-microsoft-com:office:office" xmlns:v="urn:schemas-microsoft-com:vml" xmlns:w10="urn:schemas-microsoft-com:office:word" xmlns:a="http://schemas.openxmlformats.org/drawingml/2006/main" xmlns:pic="http://schemas.openxmlformats.org/drawingml/2006/picture" xmlns:wp="http://schemas.openxmlformats.org/drawingml/2006/wordprocessingDrawing">
   <w:body>
-    <w:bookmarkStart w:id="10" w:name="X3776f6daa29edcc237e4b405f7268b09c3eca1a"/>
-    <w:p>
-      <w:pPr>
-        <w:pStyle w:val="Heading1"/>
+    <w:p>
+      <w:pPr>
+        <w:pStyle w:val="Title"/>
       </w:pPr>
       <w:r>
         <w:t xml:space="preserve">Fuzzy–Neural Decision Intelligence for Cost-Aware Cyber Alert Triage</w:t>
@@ -80,7 +79,7 @@
     <w:bookmarkStart w:id="9" w:name="abstract"/>
     <w:p>
       <w:pPr>
-        <w:pStyle w:val="Heading2"/>
+        <w:pStyle w:val="Heading1"/>
       </w:pPr>
       <w:r>
         <w:t xml:space="preserve">Abstract</w:t>
@@ -217,42 +216,41 @@
       </w:r>
     </w:p>
     <w:bookmarkEnd w:id="9"/>
+    <w:bookmarkStart w:id="10" w:name="introduction"/>
+    <w:p>
+      <w:pPr>
+        <w:pStyle w:val="Heading1"/>
+      </w:pPr>
+      <w:r>
+        <w:t xml:space="preserve">Introduction</w:t>
+      </w:r>
+    </w:p>
+    <w:p>
+      <w:pPr>
+        <w:pStyle w:val="FirstParagraph"/>
+      </w:pPr>
+      <w:r>
+        <w:t xml:space="preserve">SOC analysts face far more alerts than they can investigate, and alert fatigue is a central operational risk [1,2]. Recent work prioritises alerts by reinforcement learning or human–AI teaming [2,3], but most intrusion-detection research stops at a score judged by accuracy or ROC-AUC [4–7]. A SOC manager must instead decide, under finite analyst capacity and asymmetric error costs, which alerts to monitor, contain or escalate, a step in the data-driven transformation of security operations [8,9].</w:t>
+      </w:r>
+    </w:p>
+    <w:p>
+      <w:pPr>
+        <w:pStyle w:val="BodyText"/>
+      </w:pPr>
+      <w:r>
+        <w:t xml:space="preserve">Fuzzy and neuro-fuzzy systems suit this step because they express learned evidence in linguistic terms that operators can audit [10–12]. In intrusion detection, however, fuzzy–neural hybrids mainly raise detection rates [13–15], cost-sensitive learning targets the classifier rather than the action [16,17], and explainable AI explains scores without choosing actions [18–20]. Knowledge-based cyber-risk decision support, such as explainable knowledge-graph risk assessment [21], shows the value of explicit knowledge representations, but a score-to-action rule base for alert triage, evaluated with decision metrics, is still missing.</w:t>
+      </w:r>
+    </w:p>
+    <w:p>
+      <w:pPr>
+        <w:pStyle w:val="BodyText"/>
+      </w:pPr>
+      <w:r>
+        <w:t xml:space="preserve">This Short Communication contributes (i) a knowledge-based layer that maps neural propensity to fuzzy risk bands and then to SOC actions through a stated production-rule base (Section 2); (ii) a decision-centric evaluation with paired tests, re-runs and sensitivity sweeps (Sections 3–4); and (iii) ablations that locate the gain. Unlike gradient boosting [22], the strongest baseline, whose output still needs a threshold, the layer is detector-agnostic.</w:t>
+      </w:r>
+    </w:p>
     <w:bookmarkEnd w:id="10"/>
-    <w:bookmarkStart w:id="11" w:name="introduction"/>
-    <w:p>
-      <w:pPr>
-        <w:pStyle w:val="Heading1"/>
-      </w:pPr>
-      <w:r>
-        <w:t xml:space="preserve">Introduction</w:t>
-      </w:r>
-    </w:p>
-    <w:p>
-      <w:pPr>
-        <w:pStyle w:val="FirstParagraph"/>
-      </w:pPr>
-      <w:r>
-        <w:t xml:space="preserve">SOC analysts face far more alerts than they can investigate, and alert fatigue is a central operational risk [1,2]. Recent work prioritises alerts by reinforcement learning or human–AI teaming [2,3], but most intrusion-detection research stops at a score judged by accuracy or ROC-AUC [4–7]. A SOC manager must instead decide, under finite analyst capacity and asymmetric error costs, which alerts to monitor, contain or escalate, a step in the data-driven transformation of security operations [8,9].</w:t>
-      </w:r>
-    </w:p>
-    <w:p>
-      <w:pPr>
-        <w:pStyle w:val="BodyText"/>
-      </w:pPr>
-      <w:r>
-        <w:t xml:space="preserve">Fuzzy and neuro-fuzzy systems suit this step because they express learned evidence in linguistic terms that operators can audit [10–12]. In intrusion detection, however, fuzzy–neural hybrids mainly raise detection rates [13–15], cost-sensitive learning targets the classifier rather than the action [16,17], and explainable AI explains scores without choosing actions [18–20]. Knowledge-based cyber-risk decision support, such as explainable knowledge-graph risk assessment [21], shows the value of explicit knowledge representations, but a score-to-action rule base for alert triage, evaluated with decision metrics, is still missing.</w:t>
-      </w:r>
-    </w:p>
-    <w:p>
-      <w:pPr>
-        <w:pStyle w:val="BodyText"/>
-      </w:pPr>
-      <w:r>
-        <w:t xml:space="preserve">This Short Communication contributes (i) a knowledge-based layer that maps neural propensity to fuzzy risk bands and then to SOC actions through a stated production-rule base (Section 2); (ii) a decision-centric evaluation with paired tests, re-runs and sensitivity sweeps (Sections 3–4); and (iii) ablations that locate the gain. Unlike gradient boosting [22], the strongest baseline, whose output still needs a threshold, the layer is detector-agnostic.</w:t>
-      </w:r>
-    </w:p>
-    <w:bookmarkEnd w:id="11"/>
-    <w:bookmarkStart w:id="18" w:name="proposed-fuzzyneural-decision-framework"/>
+    <w:bookmarkStart w:id="17" w:name="proposed-fuzzyneural-decision-framework"/>
     <w:p>
       <w:pPr>
         <w:pStyle w:val="Heading1"/>
@@ -270,18 +268,18 @@
           <wp:inline>
             <wp:extent cx="5334000" cy="3517518"/>
             <wp:effectExtent b="0" l="0" r="0" t="0"/>
-            <wp:docPr descr="Fig. 1. Proposed framework. (a) Pipeline from alert features to neural propensity, fuzzy risk bands and rules R_1–R_3. (b) Membership functions, Eqs. (2)–(4); dotted lines mark the switch points p=9/32 and 23/32 between Monitor, Soft-block and Escalate." title="" id="13" name="Picture"/>
+            <wp:docPr descr="Fig. 1. Proposed framework. (a) Pipeline from alert features to neural propensity, fuzzy risk bands and rules R_1–R_3. (b) Membership functions, Eqs. (2)–(4); dotted lines mark the switch points p=9/32 and 23/32 between Monitor, Soft-block and Escalate." title="" id="12" name="Picture"/>
             <a:graphic>
               <a:graphicData uri="http://schemas.openxmlformats.org/drawingml/2006/picture">
                 <pic:pic>
                   <pic:nvPicPr>
-                    <pic:cNvPr descr="figures/fig1_architecture.png" id="14" name="Picture"/>
+                    <pic:cNvPr descr="figures/fig1_architecture.png" id="13" name="Picture"/>
                     <pic:cNvPicPr>
                       <a:picLocks noChangeArrowheads="1" noChangeAspect="1"/>
                     </pic:cNvPicPr>
                   </pic:nvPicPr>
                   <pic:blipFill>
-                    <a:blip r:embed="rId12"/>
+                    <a:blip r:embed="rId11"/>
                     <a:stretch>
                       <a:fillRect/>
                     </a:stretch>
@@ -418,7 +416,7 @@
         <w:t xml:space="preserve">between Monitor, Soft-block and Escalate.</w:t>
       </w:r>
     </w:p>
-    <w:bookmarkStart w:id="15" w:name="neural-propensity-model"/>
+    <w:bookmarkStart w:id="14" w:name="neural-propensity-model"/>
     <w:p>
       <w:pPr>
         <w:pStyle w:val="Heading2"/>
@@ -986,8 +984,8 @@
         <w:t xml:space="preserve">, batch 512, 20 epochs), keeping the epoch with the best validation ROC-AUC.</w:t>
       </w:r>
     </w:p>
-    <w:bookmarkEnd w:id="15"/>
-    <w:bookmarkStart w:id="16" w:name="Xa12c8d55717e251e3186c98c25cee8834d32cb3"/>
+    <w:bookmarkEnd w:id="14"/>
+    <w:bookmarkStart w:id="15" w:name="Xa12c8d55717e251e3186c98c25cee8834d32cb3"/>
     <w:p>
       <w:pPr>
         <w:pStyle w:val="Heading2"/>
@@ -2471,8 +2469,8 @@
         <w:t xml:space="preserve">(Fig. 1b).</w:t>
       </w:r>
     </w:p>
-    <w:bookmarkEnd w:id="16"/>
-    <w:bookmarkStart w:id="17" w:name="cost-model-and-decision-metrics"/>
+    <w:bookmarkEnd w:id="15"/>
+    <w:bookmarkStart w:id="16" w:name="cost-model-and-decision-metrics"/>
     <w:p>
       <w:pPr>
         <w:pStyle w:val="Heading2"/>
@@ -2493,13 +2491,304 @@
       <w:pPr>
         <w:pStyle w:val="BodyText"/>
       </w:pPr>
-      <w:r>
-        <w:t xml:space="preserve">$$egin{aligned}
-    C(\text{Monitor},y)&amp;=C_{FN}\,y, &amp; C(\text{Soft-block},y)&amp;=1+(1-y),\\
-    C(\text{Escalate},y)&amp;=3+3(1-y), &amp; C_{FN}&amp;=10.
-    \end{aligned}
-    \qquad(6)$$</w:t>
-      </w:r>
+      <m:oMathPara>
+        <m:oMathParaPr>
+          <m:jc m:val="center"/>
+        </m:oMathParaPr>
+        <m:oMath>
+          <m:eqArr>
+            <m:e>
+              <m:r>
+                <m:t>C</m:t>
+              </m:r>
+              <m:r>
+                <m:rPr>
+                  <m:sty m:val="p"/>
+                </m:rPr>
+                <m:t>(</m:t>
+              </m:r>
+              <m:r>
+                <m:rPr>
+                  <m:nor/>
+                  <m:sty m:val="p"/>
+                </m:rPr>
+                <m:t>Monitor</m:t>
+              </m:r>
+              <m:r>
+                <m:rPr>
+                  <m:sty m:val="p"/>
+                </m:rPr>
+                <m:t>,</m:t>
+              </m:r>
+              <m:r>
+                <m:t>y</m:t>
+              </m:r>
+              <m:r>
+                <m:rPr>
+                  <m:sty m:val="p"/>
+                </m:rPr>
+                <m:t>)</m:t>
+              </m:r>
+              <m:r>
+                <m:t>&amp;</m:t>
+              </m:r>
+              <m:r>
+                <m:rPr>
+                  <m:sty m:val="p"/>
+                </m:rPr>
+                <m:t>=</m:t>
+              </m:r>
+              <m:sSub>
+                <m:e>
+                  <m:r>
+                    <m:t>C</m:t>
+                  </m:r>
+                </m:e>
+                <m:sub>
+                  <m:r>
+                    <m:t>F</m:t>
+                  </m:r>
+                  <m:r>
+                    <m:t>N</m:t>
+                  </m:r>
+                </m:sub>
+              </m:sSub>
+              <m:r>
+                <m:t> </m:t>
+              </m:r>
+              <m:r>
+                <m:t>y</m:t>
+              </m:r>
+              <m:r>
+                <m:rPr>
+                  <m:sty m:val="p"/>
+                </m:rPr>
+                <m:t>,</m:t>
+              </m:r>
+              <m:r>
+                <m:t>&amp;</m:t>
+              </m:r>
+              <m:r>
+                <m:t>C</m:t>
+              </m:r>
+              <m:r>
+                <m:rPr>
+                  <m:sty m:val="p"/>
+                </m:rPr>
+                <m:t>(</m:t>
+              </m:r>
+              <m:r>
+                <m:rPr>
+                  <m:nor/>
+                  <m:sty m:val="p"/>
+                </m:rPr>
+                <m:t>Soft-block</m:t>
+              </m:r>
+              <m:r>
+                <m:rPr>
+                  <m:sty m:val="p"/>
+                </m:rPr>
+                <m:t>,</m:t>
+              </m:r>
+              <m:r>
+                <m:t>y</m:t>
+              </m:r>
+              <m:r>
+                <m:rPr>
+                  <m:sty m:val="p"/>
+                </m:rPr>
+                <m:t>)</m:t>
+              </m:r>
+              <m:r>
+                <m:t>&amp;</m:t>
+              </m:r>
+              <m:r>
+                <m:rPr>
+                  <m:sty m:val="p"/>
+                </m:rPr>
+                <m:t>=</m:t>
+              </m:r>
+              <m:r>
+                <m:t>1</m:t>
+              </m:r>
+              <m:r>
+                <m:rPr>
+                  <m:sty m:val="p"/>
+                </m:rPr>
+                <m:t>+</m:t>
+              </m:r>
+              <m:r>
+                <m:rPr>
+                  <m:sty m:val="p"/>
+                </m:rPr>
+                <m:t>(</m:t>
+              </m:r>
+              <m:r>
+                <m:t>1</m:t>
+              </m:r>
+              <m:r>
+                <m:rPr>
+                  <m:sty m:val="p"/>
+                </m:rPr>
+                <m:t>−</m:t>
+              </m:r>
+              <m:r>
+                <m:t>y</m:t>
+              </m:r>
+              <m:r>
+                <m:rPr>
+                  <m:sty m:val="p"/>
+                </m:rPr>
+                <m:t>)</m:t>
+              </m:r>
+              <m:r>
+                <m:rPr>
+                  <m:sty m:val="p"/>
+                </m:rPr>
+                <m:t>,</m:t>
+              </m:r>
+            </m:e>
+            <m:e>
+              <m:r>
+                <m:t>C</m:t>
+              </m:r>
+              <m:r>
+                <m:rPr>
+                  <m:sty m:val="p"/>
+                </m:rPr>
+                <m:t>(</m:t>
+              </m:r>
+              <m:r>
+                <m:rPr>
+                  <m:nor/>
+                  <m:sty m:val="p"/>
+                </m:rPr>
+                <m:t>Escalate</m:t>
+              </m:r>
+              <m:r>
+                <m:rPr>
+                  <m:sty m:val="p"/>
+                </m:rPr>
+                <m:t>,</m:t>
+              </m:r>
+              <m:r>
+                <m:t>y</m:t>
+              </m:r>
+              <m:r>
+                <m:rPr>
+                  <m:sty m:val="p"/>
+                </m:rPr>
+                <m:t>)</m:t>
+              </m:r>
+              <m:r>
+                <m:t>&amp;</m:t>
+              </m:r>
+              <m:r>
+                <m:rPr>
+                  <m:sty m:val="p"/>
+                </m:rPr>
+                <m:t>=</m:t>
+              </m:r>
+              <m:r>
+                <m:t>3</m:t>
+              </m:r>
+              <m:r>
+                <m:rPr>
+                  <m:sty m:val="p"/>
+                </m:rPr>
+                <m:t>+</m:t>
+              </m:r>
+              <m:r>
+                <m:t>3</m:t>
+              </m:r>
+              <m:r>
+                <m:rPr>
+                  <m:sty m:val="p"/>
+                </m:rPr>
+                <m:t>(</m:t>
+              </m:r>
+              <m:r>
+                <m:t>1</m:t>
+              </m:r>
+              <m:r>
+                <m:rPr>
+                  <m:sty m:val="p"/>
+                </m:rPr>
+                <m:t>−</m:t>
+              </m:r>
+              <m:r>
+                <m:t>y</m:t>
+              </m:r>
+              <m:r>
+                <m:rPr>
+                  <m:sty m:val="p"/>
+                </m:rPr>
+                <m:t>)</m:t>
+              </m:r>
+              <m:r>
+                <m:rPr>
+                  <m:sty m:val="p"/>
+                </m:rPr>
+                <m:t>,</m:t>
+              </m:r>
+              <m:r>
+                <m:t>&amp;</m:t>
+              </m:r>
+              <m:sSub>
+                <m:e>
+                  <m:r>
+                    <m:t>C</m:t>
+                  </m:r>
+                </m:e>
+                <m:sub>
+                  <m:r>
+                    <m:t>F</m:t>
+                  </m:r>
+                  <m:r>
+                    <m:t>N</m:t>
+                  </m:r>
+                </m:sub>
+              </m:sSub>
+              <m:r>
+                <m:t>&amp;</m:t>
+              </m:r>
+              <m:r>
+                <m:rPr>
+                  <m:sty m:val="p"/>
+                </m:rPr>
+                <m:t>=</m:t>
+              </m:r>
+              <m:r>
+                <m:t>10</m:t>
+              </m:r>
+              <m:r>
+                <m:rPr>
+                  <m:sty m:val="p"/>
+                </m:rPr>
+                <m:t>.</m:t>
+              </m:r>
+            </m:e>
+          </m:eqArr>
+          <m:r>
+            <m:t>  </m:t>
+          </m:r>
+          <m:r>
+            <m:rPr>
+              <m:sty m:val="p"/>
+            </m:rPr>
+            <m:t>(</m:t>
+          </m:r>
+          <m:r>
+            <m:t>6</m:t>
+          </m:r>
+          <m:r>
+            <m:rPr>
+              <m:sty m:val="p"/>
+            </m:rPr>
+            <m:t>)</m:t>
+          </m:r>
+        </m:oMath>
+      </m:oMathPara>
     </w:p>
     <w:p>
       <w:pPr>
@@ -3089,9 +3378,9 @@
         <w:t xml:space="preserve">.</w:t>
       </w:r>
     </w:p>
+    <w:bookmarkEnd w:id="16"/>
     <w:bookmarkEnd w:id="17"/>
-    <w:bookmarkEnd w:id="18"/>
-    <w:bookmarkStart w:id="19" w:name="experimental-design"/>
+    <w:bookmarkStart w:id="18" w:name="experimental-design"/>
     <w:p>
       <w:pPr>
         <w:pStyle w:val="Heading1"/>
@@ -3210,8 +3499,8 @@
         <w:t xml:space="preserve">and the Medium-band half-width (0.25–0.45) are swept. One deterministic script (one PyTorch thread) produces every number.</w:t>
       </w:r>
     </w:p>
-    <w:bookmarkEnd w:id="19"/>
-    <w:bookmarkStart w:id="23" w:name="results-and-discussion"/>
+    <w:bookmarkEnd w:id="18"/>
+    <w:bookmarkStart w:id="22" w:name="results-and-discussion"/>
     <w:p>
       <w:pPr>
         <w:pStyle w:val="Heading1"/>
@@ -3224,6 +3513,16 @@
       <w:pPr>
         <w:pStyle w:val="TableCaption"/>
       </w:pPr>
+      <w:r>
+        <w:rPr>
+          <w:b/>
+          <w:bCs/>
+        </w:rPr>
+        <w:t xml:space="preserve">Table 1.</w:t>
+      </w:r>
+      <w:r>
+        <w:t xml:space="preserve"> </w:t>
+      </w:r>
       <w:r>
         <w:t xml:space="preserve">Predictive performance on the NSL-KDD test sample (seed 42; last column: mean</w:t>
       </w:r>
@@ -3251,7 +3550,7 @@
         <w:tblW w:type="pct" w:w="5000"/>
         <w:tblLayout w:type="fixed"/>
         <w:tblLook w:firstRow="1" w:lastRow="0" w:firstColumn="0" w:lastColumn="0" w:noHBand="0" w:noVBand="0" w:val="0020"/>
-        <w:tblCaption w:val="Predictive performance on the NSL-KDD test sample (seed 42; last column: mean \pm SD of ROC-AUC over seeds 42–51). The proposed system uses the neural propensity, so its predictive metrics are identical by construction."/>
+        <w:tblCaption w:val="Table 1. Predictive performance on the NSL-KDD test sample (seed 42; last column: mean \pm SD of ROC-AUC over seeds 42–51). The proposed system uses the neural propensity, so its predictive metrics are identical by construction."/>
       </w:tblPr>
       <w:tblGrid>
         <w:gridCol w:w="1320"/>
@@ -3707,6 +4006,16 @@
         <w:pStyle w:val="TableCaption"/>
       </w:pPr>
       <w:r>
+        <w:rPr>
+          <w:b/>
+          <w:bCs/>
+        </w:rPr>
+        <w:t xml:space="preserve">Table 2.</w:t>
+      </w:r>
+      <w:r>
+        <w:t xml:space="preserve"> </w:t>
+      </w:r>
+      <w:r>
         <w:t xml:space="preserve">Decision quality on the seed-42 test sample (</w:t>
       </w:r>
       <m:oMath>
@@ -3939,7 +4248,7 @@
         <w:tblW w:type="pct" w:w="5000"/>
         <w:tblLayout w:type="fixed"/>
         <w:tblLook w:firstRow="1" w:lastRow="0" w:firstColumn="0" w:lastColumn="0" w:noHBand="0" w:noVBand="0" w:val="0020"/>
-        <w:tblCaption w:val="Decision quality on the seed-42 test sample (N=20{,}000). Brackets: paired bootstrap 95% CIs; \Delta\bar C: mean cost relative to the proposed policy (positive = alternative more expensive); p: two-sided Wilcoxon signed-rank test on per-alert costs; last column: mean \pm SD of \bar C over seeds 42–51. UE = unnecessary escalations; NN/GB = neural/gradient-boosting propensity. ^{b}Reference only: soft-blocks every alert with p&gt;2/11 (8,631 of 20,000) and never escalates. ^{c}Crisp cut-points at p=9/32 and 23/32; actions identical to the proposed policy."/>
+        <w:tblCaption w:val="Table 2. Decision quality on the seed-42 test sample (N=20{,}000). Brackets: paired bootstrap 95% CIs; \Delta\bar C: mean cost relative to the proposed policy (positive = alternative more expensive); p: two-sided Wilcoxon signed-rank test on per-alert costs; last column: mean \pm SD of \bar C over seeds 42–51. UE = unnecessary escalations; NN/GB = neural/gradient-boosting propensity. ^{b}Reference only: soft-blocks every alert with p&gt;2/11 (8,631 of 20,000) and never escalates. ^{c}Crisp cut-points at p=9/32 and 23/32; actions identical to the proposed policy."/>
       </w:tblPr>
       <w:tblGrid>
         <w:gridCol w:w="990"/>
@@ -5347,18 +5656,18 @@
           <wp:inline>
             <wp:extent cx="5334000" cy="4415974"/>
             <wp:effectExtent b="0" l="0" r="0" t="0"/>
-            <wp:docPr descr="Fig. 2. Predictive and decision evidence. (a) ROC curves (seed 42). (b) Mean triage cost of a Monitor/Escalate threshold policy versus threshold; horizontal lines: proposed, top-20% and Bayes-rule costs. (c) Sensitivity to the missed-attack cost C_{FN} (default 10, dotted). (d) Paired per-seed costs for seeds 42–51; black markers: mean \pm SD." title="" id="21" name="Picture"/>
+            <wp:docPr descr="Fig. 2. Predictive and decision evidence. (a) ROC curves (seed 42). (b) Mean triage cost of a Monitor/Escalate threshold policy versus threshold; horizontal lines: proposed, top-20% and Bayes-rule costs. (c) Sensitivity to the missed-attack cost C_{FN} (default 10, dotted). (d) Paired per-seed costs for seeds 42–51; black markers: mean \pm SD." title="" id="20" name="Picture"/>
             <a:graphic>
               <a:graphicData uri="http://schemas.openxmlformats.org/drawingml/2006/picture">
                 <pic:pic>
                   <pic:nvPicPr>
-                    <pic:cNvPr descr="figures/fig2_roc_and_cost.png" id="22" name="Picture"/>
+                    <pic:cNvPr descr="figures/fig2_roc_and_cost.png" id="21" name="Picture"/>
                     <pic:cNvPicPr>
                       <a:picLocks noChangeArrowheads="1" noChangeAspect="1"/>
                     </pic:cNvPicPr>
                   </pic:nvPicPr>
                   <pic:blipFill>
-                    <a:blip r:embed="rId20"/>
+                    <a:blip r:embed="rId19"/>
                     <a:stretch>
                       <a:fillRect/>
                     </a:stretch>
@@ -5780,8 +6089,8 @@
         <w:t xml:space="preserve">On gradient-boosting scores the unchanged rules lower the cost further and cut unnecessary escalations from 603 to 222 (Table 2), so the layer complements a stronger detector. Named rules and firing strengths, not post-hoc attribution [18,19], explain each action, supporting audit trails and human–AI teaming [2].</w:t>
       </w:r>
     </w:p>
-    <w:bookmarkEnd w:id="23"/>
-    <w:bookmarkStart w:id="24" w:name="limitations"/>
+    <w:bookmarkEnd w:id="22"/>
+    <w:bookmarkStart w:id="23" w:name="limitations"/>
     <w:p>
       <w:pPr>
         <w:pStyle w:val="Heading1"/>
@@ -5849,14 +6158,32 @@
         <w:t xml:space="preserve">NSL-KDD (2009) is a dated laboratory benchmark that does not reflect modern enterprise, cloud or IoT traffic [27,28]. The data were subsampled, under a single train/test protocol. The cost matrix is illustrative, not elicited from a SOC; coverage counts containment as covering an attack; and there was no live deployment, drift analysis or user study.</w:t>
       </w:r>
     </w:p>
+    <w:bookmarkEnd w:id="23"/>
+    <w:bookmarkStart w:id="24" w:name="conclusion"/>
+    <w:p>
+      <w:pPr>
+        <w:pStyle w:val="Heading1"/>
+      </w:pPr>
+      <w:r>
+        <w:t xml:space="preserve">Conclusion</w:t>
+      </w:r>
+    </w:p>
+    <w:p>
+      <w:pPr>
+        <w:pStyle w:val="FirstParagraph"/>
+      </w:pPr>
+      <w:r>
+        <w:t xml:space="preserve">Treating alert triage as a knowledge-based decision problem, a fuzzy–neural rule layer beat crisp threshold and capacity rules on NSL-KDD in cost and coverage; the gain comes from the containment band, and a cost-derived Bayes rule is cheaper still. SOC managers should judge detectors by the decisions they enable and make rules and cost assumptions explicit. Future work will elicit practitioner costs and use recent, live alert data.</w:t>
+      </w:r>
+    </w:p>
     <w:bookmarkEnd w:id="24"/>
-    <w:bookmarkStart w:id="25" w:name="conclusion"/>
+    <w:bookmarkStart w:id="25" w:name="data-availability"/>
     <w:p>
       <w:pPr>
         <w:pStyle w:val="Heading1"/>
       </w:pPr>
       <w:r>
-        <w:t xml:space="preserve">Conclusion</w:t>
+        <w:t xml:space="preserve">Data availability</w:t>
       </w:r>
     </w:p>
     <w:p>
@@ -5864,17 +6191,17 @@
         <w:pStyle w:val="FirstParagraph"/>
       </w:pPr>
       <w:r>
-        <w:t xml:space="preserve">Treating alert triage as a knowledge-based decision problem, a fuzzy–neural rule layer beat crisp threshold and capacity rules on NSL-KDD in cost and coverage; the gain comes from the containment band, and a cost-derived Bayes rule is cheaper still. SOC managers should judge detectors by the decisions they enable and make rules and cost assumptions explicit. Future work will elicit practitioner costs and use recent, live alert data.</w:t>
+        <w:t xml:space="preserve">The NSL-KDD dataset is publicly available from the Canadian Institute for Cybersecurity, University of New Brunswick [24]. The code and results (experiment script, result tables in CSV/JSON and figure-generation code) are held in a GitHub repository that will be made public on acceptance; until then they are available to the editor and reviewers on reasonable request.</w:t>
       </w:r>
     </w:p>
     <w:bookmarkEnd w:id="25"/>
-    <w:bookmarkStart w:id="26" w:name="data-availability"/>
+    <w:bookmarkStart w:id="26" w:name="declaration-of-competing-interest"/>
     <w:p>
       <w:pPr>
         <w:pStyle w:val="Heading1"/>
       </w:pPr>
       <w:r>
-        <w:t xml:space="preserve">Data availability</w:t>
+        <w:t xml:space="preserve">Declaration of competing interest</w:t>
       </w:r>
     </w:p>
     <w:p>
@@ -5882,17 +6209,17 @@
         <w:pStyle w:val="FirstParagraph"/>
       </w:pPr>
       <w:r>
-        <w:t xml:space="preserve">The NSL-KDD dataset is publicly available from the Canadian Institute for Cybersecurity, University of New Brunswick [24]. The code and results (experiment script, result tables in CSV/JSON and figure-generation code) are held in a GitHub repository that will be made public on acceptance; until then they are available to the editor and reviewers on reasonable request.</w:t>
+        <w:t xml:space="preserve">The author declares no known competing financial interests or personal relationships that could have appeared to influence the work reported in this paper.</w:t>
       </w:r>
     </w:p>
     <w:bookmarkEnd w:id="26"/>
-    <w:bookmarkStart w:id="27" w:name="declaration-of-competing-interest"/>
+    <w:bookmarkStart w:id="27" w:name="X1f74eb43af444059c7518034463b6c89b1cacf4"/>
     <w:p>
       <w:pPr>
         <w:pStyle w:val="Heading1"/>
       </w:pPr>
       <w:r>
-        <w:t xml:space="preserve">Declaration of competing interest</w:t>
+        <w:t xml:space="preserve">Declaration of generative AI and AI-assisted technologies in the manuscript preparation process</w:t>
       </w:r>
     </w:p>
     <w:p>
@@ -5900,17 +6227,17 @@
         <w:pStyle w:val="FirstParagraph"/>
       </w:pPr>
       <w:r>
-        <w:t xml:space="preserve">The author declares no known competing financial interests or personal relationships that could have appeared to influence the work reported in this paper.</w:t>
+        <w:t xml:space="preserve">During the preparation of this work the author used Grok Bot, an AI-assisted writing and coding tool, to help with language editing, code refactoring, reference checking and formatting. After using this tool, the author reviewed and edited the content as needed and takes full responsibility for the content of the published article. All results, tables and figures were generated by the author’s executable code from the public dataset; no figure was created with generative AI.</w:t>
       </w:r>
     </w:p>
     <w:bookmarkEnd w:id="27"/>
-    <w:bookmarkStart w:id="28" w:name="X1f74eb43af444059c7518034463b6c89b1cacf4"/>
+    <w:bookmarkStart w:id="28" w:name="funding"/>
     <w:p>
       <w:pPr>
         <w:pStyle w:val="Heading1"/>
       </w:pPr>
       <w:r>
-        <w:t xml:space="preserve">Declaration of generative AI and AI-assisted technologies in the manuscript preparation process</w:t>
+        <w:t xml:space="preserve">Funding</w:t>
       </w:r>
     </w:p>
     <w:p>
@@ -5918,29 +6245,11 @@
         <w:pStyle w:val="FirstParagraph"/>
       </w:pPr>
       <w:r>
-        <w:t xml:space="preserve">During the preparation of this work the author used Grok Bot, an AI-assisted writing and coding tool, to help with language editing, code refactoring, reference checking and formatting. After using this tool, the author reviewed and edited the content as needed and takes full responsibility for the content of the published article. All results, tables and figures were generated by the author’s executable code from the public dataset; no figure was created with generative AI.</w:t>
+        <w:t xml:space="preserve">This research did not receive any specific grant from funding agencies in the public, commercial, or not-for-profit sectors.</w:t>
       </w:r>
     </w:p>
     <w:bookmarkEnd w:id="28"/>
-    <w:bookmarkStart w:id="29" w:name="funding"/>
-    <w:p>
-      <w:pPr>
-        <w:pStyle w:val="Heading1"/>
-      </w:pPr>
-      <w:r>
-        <w:t xml:space="preserve">Funding</w:t>
-      </w:r>
-    </w:p>
-    <w:p>
-      <w:pPr>
-        <w:pStyle w:val="FirstParagraph"/>
-      </w:pPr>
-      <w:r>
-        <w:t xml:space="preserve">This research did not receive any specific grant from funding agencies in the public, commercial, or not-for-profit sectors.</w:t>
-      </w:r>
-    </w:p>
-    <w:bookmarkEnd w:id="29"/>
-    <w:bookmarkStart w:id="30" w:name="credit-authorship-contribution-statement"/>
+    <w:bookmarkStart w:id="29" w:name="credit-authorship-contribution-statement"/>
     <w:p>
       <w:pPr>
         <w:pStyle w:val="Heading1"/>
@@ -5967,241 +6276,241 @@
         <w:t xml:space="preserve">Conceptualization, Methodology, Software, Validation, Formal analysis, Investigation, Data curation, Visualization, Writing – original draft, Writing – review &amp; editing.</w:t>
       </w:r>
     </w:p>
+    <w:bookmarkEnd w:id="29"/>
+    <w:bookmarkStart w:id="30" w:name="references"/>
+    <w:p>
+      <w:pPr>
+        <w:pStyle w:val="Heading1"/>
+      </w:pPr>
+      <w:r>
+        <w:t xml:space="preserve">References</w:t>
+      </w:r>
+    </w:p>
+    <w:p>
+      <w:pPr>
+        <w:pStyle w:val="FirstParagraph"/>
+      </w:pPr>
+      <w:r>
+        <w:t xml:space="preserve">[1] S. Tariq, M. Baruwal Chhetri, S. Nepal, C. Paris, Alert fatigue in security operations centres: Research challenges and opportunities, ACM Computing Surveys 57 (2025) 1–38. https://doi.org/10.1145/3723158.</w:t>
+      </w:r>
+    </w:p>
+    <w:p>
+      <w:pPr>
+        <w:pStyle w:val="BodyText"/>
+      </w:pPr>
+      <w:r>
+        <w:t xml:space="preserve">[2] M. Baruwal Chhetri, S. Tariq, R. Singh, F. Jalalvand, C. Paris, S. Nepal, Towards human–AI teaming to mitigate alert fatigue in security operations centres, ACM Transactions on Internet Technology 24 (2024) 1–22. https://doi.org/10.1145/3670009.</w:t>
+      </w:r>
+    </w:p>
+    <w:p>
+      <w:pPr>
+        <w:pStyle w:val="BodyText"/>
+      </w:pPr>
+      <w:r>
+        <w:t xml:space="preserve">[3] X. Wang, X. Yang, X. Liang, X. Zhang, W. Zhang, X. Gong, Combating alert fatigue with AlertPro: Context-aware alert prioritization using reinforcement learning for multi-step attack detection, Computers &amp; Security 137 (2024) 103583. https://doi.org/10.1016/j.cose.2023.103583.</w:t>
+      </w:r>
+    </w:p>
+    <w:p>
+      <w:pPr>
+        <w:pStyle w:val="BodyText"/>
+      </w:pPr>
+      <w:r>
+        <w:t xml:space="preserve">[4] A.L. Buczak, E. Guven, A survey of data mining and machine learning methods for cyber security intrusion detection, IEEE Communications Surveys &amp; Tutorials 18 (2016) 1153–1176. https://doi.org/10.1109/COMST.2015.2494502.</w:t>
+      </w:r>
+    </w:p>
+    <w:p>
+      <w:pPr>
+        <w:pStyle w:val="BodyText"/>
+      </w:pPr>
+      <w:r>
+        <w:t xml:space="preserve">[5] A. Khraisat, I. Gondal, P. Vamplew, J. Kamruzzaman, Survey of intrusion detection systems: Techniques, datasets and challenges, Cybersecurity 2 (2019) 20. https://doi.org/10.1186/s42400-019-0038-7.</w:t>
+      </w:r>
+    </w:p>
+    <w:p>
+      <w:pPr>
+        <w:pStyle w:val="BodyText"/>
+      </w:pPr>
+      <w:r>
+        <w:t xml:space="preserve">[6] T. Su, H. Sun, J. Zhu, S. Wang, Y. Li, BAT: Deep learning methods on network intrusion detection using NSL-KDD dataset, IEEE Access 8 (2020) 29575–29585. https://doi.org/10.1109/ACCESS.2020.2972627.</w:t>
+      </w:r>
+    </w:p>
+    <w:p>
+      <w:pPr>
+        <w:pStyle w:val="BodyText"/>
+      </w:pPr>
+      <w:r>
+        <w:t xml:space="preserve">[7] N. Sun, J. Zhang, P. Rimba, S. Gao, L.Y. Zhang, Y. Xiang, Data-driven cybersecurity incident prediction: A survey, IEEE Communications Surveys &amp; Tutorials 21 (2019) 1744–1772. https://doi.org/10.1109/COMST.2018.2885561.</w:t>
+      </w:r>
+    </w:p>
+    <w:p>
+      <w:pPr>
+        <w:pStyle w:val="BodyText"/>
+      </w:pPr>
+      <w:r>
+        <w:t xml:space="preserve">[8] G. Vial, Understanding digital transformation: A review and a research agenda, The Journal of Strategic Information Systems 28 (2019) 118–144. https://doi.org/10.1016/j.jsis.2019.01.003.</w:t>
+      </w:r>
+    </w:p>
+    <w:p>
+      <w:pPr>
+        <w:pStyle w:val="BodyText"/>
+      </w:pPr>
+      <w:r>
+        <w:t xml:space="preserve">[9] F. Provost, T. Fawcett, Data science and its relationship to big data and data-driven decision making, Big Data 1 (2013) 51–59. https://doi.org/10.1089/big.2013.1508.</w:t>
+      </w:r>
+    </w:p>
+    <w:p>
+      <w:pPr>
+        <w:pStyle w:val="BodyText"/>
+      </w:pPr>
+      <w:r>
+        <w:t xml:space="preserve">[10] L.A. Zadeh, Fuzzy sets, Information and Control 8 (1965) 338–353. https://doi.org/10.1016/S0019-9958(65)90241-X.</w:t>
+      </w:r>
+    </w:p>
+    <w:p>
+      <w:pPr>
+        <w:pStyle w:val="BodyText"/>
+      </w:pPr>
+      <w:r>
+        <w:t xml:space="preserve">[11] J.-S.R. Jang, ANFIS: Adaptive-network-based fuzzy inference system, IEEE Transactions on Systems, Man, and Cybernetics 23 (1993) 665–685. https://doi.org/10.1109/21.256541.</w:t>
+      </w:r>
+    </w:p>
+    <w:p>
+      <w:pPr>
+        <w:pStyle w:val="BodyText"/>
+      </w:pPr>
+      <w:r>
+        <w:t xml:space="preserve">[12] P.V. de Campos Souza, Fuzzy neural networks and neuro-fuzzy networks: A review the main techniques and applications used in the literature, Applied Soft Computing 92 (2020) 106275. https://doi.org/10.1016/j.asoc.2020.106275.</w:t>
+      </w:r>
+    </w:p>
+    <w:p>
+      <w:pPr>
+        <w:pStyle w:val="BodyText"/>
+      </w:pPr>
+      <w:r>
+        <w:t xml:space="preserve">[13] D. Srilatha, G.K. Shyam, Cloud-based intrusion detection using kernel fuzzy clustering and optimal type-2 fuzzy neural network, Cluster Computing 24 (2021) 2657–2672. https://doi.org/10.1007/s10586-021-03281-9.</w:t>
+      </w:r>
+    </w:p>
+    <w:p>
+      <w:pPr>
+        <w:pStyle w:val="BodyText"/>
+      </w:pPr>
+      <w:r>
+        <w:t xml:space="preserve">[14] J. Liu, W. Yinchai, T.C. Siong, X. Li, L. Zhao, F. Wei, On the combination of adaptive neuro-fuzzy inference system and deep residual network for improving detection rates on intrusion detection, PLOS ONE 17 (2022) e0278819. https://doi.org/10.1371/journal.pone.0278819.</w:t>
+      </w:r>
+    </w:p>
+    <w:p>
+      <w:pPr>
+        <w:pStyle w:val="BodyText"/>
+      </w:pPr>
+      <w:r>
+        <w:t xml:space="preserve">[15] J. Liu, W. Yinchai, T.C. Siong, X. Li, L. Zhao, F. Wei, A hybrid interpretable deep structure based on adaptive neuro-fuzzy inference system, decision tree, and K-means for intrusion detection, Scientific Reports 12 (2022) 20770. https://doi.org/10.1038/s41598-022-23765-x.</w:t>
+      </w:r>
+    </w:p>
+    <w:p>
+      <w:pPr>
+        <w:pStyle w:val="BodyText"/>
+      </w:pPr>
+      <w:r>
+        <w:t xml:space="preserve">[16] C. Elkan, The foundations of cost-sensitive learning, in: Proceedings of the 17th International Joint Conference on Artificial Intelligence (IJCAI), 2001: pp. 973–978.</w:t>
+      </w:r>
+    </w:p>
+    <w:p>
+      <w:pPr>
+        <w:pStyle w:val="BodyText"/>
+      </w:pPr>
+      <w:r>
+        <w:t xml:space="preserve">[17] A. Telikani, N.E. Rudbardeh, S. Soleymanpour, A. Shahbahrami, J. Shen, G. Gaydadjiev, R. Hassanpour, A cost-sensitive machine learning model with multitask learning for intrusion detection in IoT, IEEE Transactions on Industrial Informatics 20 (2024) 3880–3890. https://doi.org/10.1109/TII.2023.3314208.</w:t>
+      </w:r>
+    </w:p>
+    <w:p>
+      <w:pPr>
+        <w:pStyle w:val="BodyText"/>
+      </w:pPr>
+      <w:r>
+        <w:t xml:space="preserve">[18] S.M. Lundberg, S.-I. Lee, A unified approach to interpreting model predictions, Advances in Neural Information Processing Systems 30 (2017). https://doi.org/10.48550/arXiv.1705.07874.</w:t>
+      </w:r>
+    </w:p>
+    <w:p>
+      <w:pPr>
+        <w:pStyle w:val="BodyText"/>
+      </w:pPr>
+      <w:r>
+        <w:t xml:space="preserve">[19] V.Z. Mohale, I.C. Obagbuwa, A systematic review on the integration of explainable artificial intelligence in intrusion detection systems to enhancing transparency and interpretability in cybersecurity, Frontiers in Artificial Intelligence 8 (2025) 1526221. https://doi.org/10.3389/frai.2025.1526221.</w:t>
+      </w:r>
+    </w:p>
+    <w:p>
+      <w:pPr>
+        <w:pStyle w:val="BodyText"/>
+      </w:pPr>
+      <w:r>
+        <w:t xml:space="preserve">[20] S. AL, S. Sagiroglu, Explainable artificial intelligence models in intrusion detection systems, Engineering Applications of Artificial Intelligence 144 (2025) 110145. https://doi.org/10.1016/j.engappai.2025.110145.</w:t>
+      </w:r>
+    </w:p>
+    <w:p>
+      <w:pPr>
+        <w:pStyle w:val="BodyText"/>
+      </w:pPr>
+      <w:r>
+        <w:t xml:space="preserve">[21] S. Bag, S. Sarkar, I. Bose, Enhancing cybersecurity risk assessment using temporal knowledge graph-based explainable decision support system, Decision Support Systems 198 (2025) 114526. https://doi.org/10.1016/j.dss.2025.114526.</w:t>
+      </w:r>
+    </w:p>
+    <w:p>
+      <w:pPr>
+        <w:pStyle w:val="BodyText"/>
+      </w:pPr>
+      <w:r>
+        <w:t xml:space="preserve">[22] J.H. Friedman, Greedy function approximation: A gradient boosting machine, The Annals of Statistics 29 (2001) 1189–1232. https://doi.org/10.1214/aos/1013203451.</w:t>
+      </w:r>
+    </w:p>
+    <w:p>
+      <w:pPr>
+        <w:pStyle w:val="BodyText"/>
+      </w:pPr>
+      <w:r>
+        <w:t xml:space="preserve">[23] I. Goodfellow, Y. Bengio, A. Courville, Deep Learning, MIT Press, Cambridge, MA, 2016.</w:t>
+      </w:r>
+    </w:p>
+    <w:p>
+      <w:pPr>
+        <w:pStyle w:val="BodyText"/>
+      </w:pPr>
+      <w:r>
+        <w:t xml:space="preserve">[24] M. Tavallaee, E. Bagheri, W. Lu, A.A. Ghorbani, A detailed analysis of the KDD CUP 99 data set, in: Proceedings of the 2009 IEEE Symposium on Computational Intelligence for Security and Defense Applications (CISDA), 2009: pp. 1–6. https://doi.org/10.1109/CISDA.2009.5356528.</w:t>
+      </w:r>
+    </w:p>
+    <w:p>
+      <w:pPr>
+        <w:pStyle w:val="BodyText"/>
+      </w:pPr>
+      <w:r>
+        <w:t xml:space="preserve">[25] B. Efron, R.J. Tibshirani, An Introduction to the Bootstrap, Chapman &amp; Hall/CRC, New York, 1994. https://doi.org/10.1201/9780429246593.</w:t>
+      </w:r>
+    </w:p>
+    <w:p>
+      <w:pPr>
+        <w:pStyle w:val="BodyText"/>
+      </w:pPr>
+      <w:r>
+        <w:t xml:space="preserve">[26] F. Wilcoxon, Individual comparisons by ranking methods, Biometrics Bulletin 1 (1945) 80–83. https://doi.org/10.2307/3001968.</w:t>
+      </w:r>
+    </w:p>
+    <w:p>
+      <w:pPr>
+        <w:pStyle w:val="BodyText"/>
+      </w:pPr>
+      <w:r>
+        <w:t xml:space="preserve">[27] M. Ring, S. Wunderlich, D. Scheuring, D. Landes, A. Hotho, A survey of network-based intrusion detection data sets, Computers &amp; Security 86 (2019) 147–167. https://doi.org/10.1016/j.cose.2019.06.005.</w:t>
+      </w:r>
+    </w:p>
+    <w:p>
+      <w:pPr>
+        <w:pStyle w:val="BodyText"/>
+      </w:pPr>
+      <w:r>
+        <w:t xml:space="preserve">[28] M.A. Al-Garadi, A. Mohamed, A.K. Al-Ali, X. Du, I. Ali, M. Guizani, A survey of machine and deep learning methods for Internet of Things (IoT) security, IEEE Communications Surveys &amp; Tutorials 22 (2020) 1646–1685. https://doi.org/10.1109/COMST.2020.2988293.</w:t>
+      </w:r>
+    </w:p>
     <w:bookmarkEnd w:id="30"/>
-    <w:bookmarkStart w:id="31" w:name="references"/>
-    <w:p>
-      <w:pPr>
-        <w:pStyle w:val="Heading1"/>
-      </w:pPr>
-      <w:r>
-        <w:t xml:space="preserve">References</w:t>
-      </w:r>
-    </w:p>
-    <w:p>
-      <w:pPr>
-        <w:pStyle w:val="FirstParagraph"/>
-      </w:pPr>
-      <w:r>
-        <w:t xml:space="preserve">[1] S. Tariq, M. Baruwal Chhetri, S. Nepal, C. Paris, Alert fatigue in security operations centres: Research challenges and opportunities, ACM Computing Surveys 57 (2025) 1–38. https://doi.org/10.1145/3723158.</w:t>
-      </w:r>
-    </w:p>
-    <w:p>
-      <w:pPr>
-        <w:pStyle w:val="BodyText"/>
-      </w:pPr>
-      <w:r>
-        <w:t xml:space="preserve">[2] M. Baruwal Chhetri, S. Tariq, R. Singh, F. Jalalvand, C. Paris, S. Nepal, Towards human–AI teaming to mitigate alert fatigue in security operations centres, ACM Transactions on Internet Technology 24 (2024) 1–22. https://doi.org/10.1145/3670009.</w:t>
-      </w:r>
-    </w:p>
-    <w:p>
-      <w:pPr>
-        <w:pStyle w:val="BodyText"/>
-      </w:pPr>
-      <w:r>
-        <w:t xml:space="preserve">[3] X. Wang, X. Yang, X. Liang, X. Zhang, W. Zhang, X. Gong, Combating alert fatigue with AlertPro: Context-aware alert prioritization using reinforcement learning for multi-step attack detection, Computers &amp; Security 137 (2024) 103583. https://doi.org/10.1016/j.cose.2023.103583.</w:t>
-      </w:r>
-    </w:p>
-    <w:p>
-      <w:pPr>
-        <w:pStyle w:val="BodyText"/>
-      </w:pPr>
-      <w:r>
-        <w:t xml:space="preserve">[4] A.L. Buczak, E. Guven, A survey of data mining and machine learning methods for cyber security intrusion detection, IEEE Communications Surveys &amp; Tutorials 18 (2016) 1153–1176. https://doi.org/10.1109/COMST.2015.2494502.</w:t>
-      </w:r>
-    </w:p>
-    <w:p>
-      <w:pPr>
-        <w:pStyle w:val="BodyText"/>
-      </w:pPr>
-      <w:r>
-        <w:t xml:space="preserve">[5] A. Khraisat, I. Gondal, P. Vamplew, J. Kamruzzaman, Survey of intrusion detection systems: Techniques, datasets and challenges, Cybersecurity 2 (2019) 20. https://doi.org/10.1186/s42400-019-0038-7.</w:t>
-      </w:r>
-    </w:p>
-    <w:p>
-      <w:pPr>
-        <w:pStyle w:val="BodyText"/>
-      </w:pPr>
-      <w:r>
-        <w:t xml:space="preserve">[6] T. Su, H. Sun, J. Zhu, S. Wang, Y. Li, BAT: Deep learning methods on network intrusion detection using NSL-KDD dataset, IEEE Access 8 (2020) 29575–29585. https://doi.org/10.1109/ACCESS.2020.2972627.</w:t>
-      </w:r>
-    </w:p>
-    <w:p>
-      <w:pPr>
-        <w:pStyle w:val="BodyText"/>
-      </w:pPr>
-      <w:r>
-        <w:t xml:space="preserve">[7] N. Sun, J. Zhang, P. Rimba, S. Gao, L.Y. Zhang, Y. Xiang, Data-driven cybersecurity incident prediction: A survey, IEEE Communications Surveys &amp; Tutorials 21 (2019) 1744–1772. https://doi.org/10.1109/COMST.2018.2885561.</w:t>
-      </w:r>
-    </w:p>
-    <w:p>
-      <w:pPr>
-        <w:pStyle w:val="BodyText"/>
-      </w:pPr>
-      <w:r>
-        <w:t xml:space="preserve">[8] G. Vial, Understanding digital transformation: A review and a research agenda, The Journal of Strategic Information Systems 28 (2019) 118–144. https://doi.org/10.1016/j.jsis.2019.01.003.</w:t>
-      </w:r>
-    </w:p>
-    <w:p>
-      <w:pPr>
-        <w:pStyle w:val="BodyText"/>
-      </w:pPr>
-      <w:r>
-        <w:t xml:space="preserve">[9] F. Provost, T. Fawcett, Data science and its relationship to big data and data-driven decision making, Big Data 1 (2013) 51–59. https://doi.org/10.1089/big.2013.1508.</w:t>
-      </w:r>
-    </w:p>
-    <w:p>
-      <w:pPr>
-        <w:pStyle w:val="BodyText"/>
-      </w:pPr>
-      <w:r>
-        <w:t xml:space="preserve">[10] L.A. Zadeh, Fuzzy sets, Information and Control 8 (1965) 338–353. https://doi.org/10.1016/S0019-9958(65)90241-X90241-X).</w:t>
-      </w:r>
-    </w:p>
-    <w:p>
-      <w:pPr>
-        <w:pStyle w:val="BodyText"/>
-      </w:pPr>
-      <w:r>
-        <w:t xml:space="preserve">[11] J.-S.R. Jang, ANFIS: Adaptive-network-based fuzzy inference system, IEEE Transactions on Systems, Man, and Cybernetics 23 (1993) 665–685. https://doi.org/10.1109/21.256541.</w:t>
-      </w:r>
-    </w:p>
-    <w:p>
-      <w:pPr>
-        <w:pStyle w:val="BodyText"/>
-      </w:pPr>
-      <w:r>
-        <w:t xml:space="preserve">[12] P.V. de Campos Souza, Fuzzy neural networks and neuro-fuzzy networks: A review the main techniques and applications used in the literature, Applied Soft Computing 92 (2020) 106275. https://doi.org/10.1016/j.asoc.2020.106275.</w:t>
-      </w:r>
-    </w:p>
-    <w:p>
-      <w:pPr>
-        <w:pStyle w:val="BodyText"/>
-      </w:pPr>
-      <w:r>
-        <w:t xml:space="preserve">[13] D. Srilatha, G.K. Shyam, Cloud-based intrusion detection using kernel fuzzy clustering and optimal type-2 fuzzy neural network, Cluster Computing 24 (2021) 2657–2672. https://doi.org/10.1007/s10586-021-03281-9.</w:t>
-      </w:r>
-    </w:p>
-    <w:p>
-      <w:pPr>
-        <w:pStyle w:val="BodyText"/>
-      </w:pPr>
-      <w:r>
-        <w:t xml:space="preserve">[14] J. Liu, W. Yinchai, T.C. Siong, X. Li, L. Zhao, F. Wei, On the combination of adaptive neuro-fuzzy inference system and deep residual network for improving detection rates on intrusion detection, PLOS ONE 17 (2022) e0278819. https://doi.org/10.1371/journal.pone.0278819.</w:t>
-      </w:r>
-    </w:p>
-    <w:p>
-      <w:pPr>
-        <w:pStyle w:val="BodyText"/>
-      </w:pPr>
-      <w:r>
-        <w:t xml:space="preserve">[15] J. Liu, W. Yinchai, T.C. Siong, X. Li, L. Zhao, F. Wei, A hybrid interpretable deep structure based on adaptive neuro-fuzzy inference system, decision tree, and K-means for intrusion detection, Scientific Reports 12 (2022) 20770. https://doi.org/10.1038/s41598-022-23765-x.</w:t>
-      </w:r>
-    </w:p>
-    <w:p>
-      <w:pPr>
-        <w:pStyle w:val="BodyText"/>
-      </w:pPr>
-      <w:r>
-        <w:t xml:space="preserve">[16] C. Elkan, The foundations of cost-sensitive learning, in: Proceedings of the 17th International Joint Conference on Artificial Intelligence (IJCAI), 2001: pp. 973–978.</w:t>
-      </w:r>
-    </w:p>
-    <w:p>
-      <w:pPr>
-        <w:pStyle w:val="BodyText"/>
-      </w:pPr>
-      <w:r>
-        <w:t xml:space="preserve">[17] A. Telikani, N.E. Rudbardeh, S. Soleymanpour, A. Shahbahrami, J. Shen, G. Gaydadjiev, R. Hassanpour, A cost-sensitive machine learning model with multitask learning for intrusion detection in IoT, IEEE Transactions on Industrial Informatics 20 (2024) 3880–3890. https://doi.org/10.1109/TII.2023.3314208.</w:t>
-      </w:r>
-    </w:p>
-    <w:p>
-      <w:pPr>
-        <w:pStyle w:val="BodyText"/>
-      </w:pPr>
-      <w:r>
-        <w:t xml:space="preserve">[18] S.M. Lundberg, S.-I. Lee, A unified approach to interpreting model predictions, Advances in Neural Information Processing Systems 30 (2017). https://doi.org/10.48550/arXiv.1705.07874.</w:t>
-      </w:r>
-    </w:p>
-    <w:p>
-      <w:pPr>
-        <w:pStyle w:val="BodyText"/>
-      </w:pPr>
-      <w:r>
-        <w:t xml:space="preserve">[19] V.Z. Mohale, I.C. Obagbuwa, A systematic review on the integration of explainable artificial intelligence in intrusion detection systems to enhancing transparency and interpretability in cybersecurity, Frontiers in Artificial Intelligence 8 (2025) 1526221. https://doi.org/10.3389/frai.2025.1526221.</w:t>
-      </w:r>
-    </w:p>
-    <w:p>
-      <w:pPr>
-        <w:pStyle w:val="BodyText"/>
-      </w:pPr>
-      <w:r>
-        <w:t xml:space="preserve">[20] S. AL, S. Sagiroglu, Explainable artificial intelligence models in intrusion detection systems, Engineering Applications of Artificial Intelligence 144 (2025) 110145. https://doi.org/10.1016/j.engappai.2025.110145.</w:t>
-      </w:r>
-    </w:p>
-    <w:p>
-      <w:pPr>
-        <w:pStyle w:val="BodyText"/>
-      </w:pPr>
-      <w:r>
-        <w:t xml:space="preserve">[21] S. Bag, S. Sarkar, I. Bose, Enhancing cybersecurity risk assessment using temporal knowledge graph-based explainable decision support system, Decision Support Systems 198 (2025) 114526. https://doi.org/10.1016/j.dss.2025.114526.</w:t>
-      </w:r>
-    </w:p>
-    <w:p>
-      <w:pPr>
-        <w:pStyle w:val="BodyText"/>
-      </w:pPr>
-      <w:r>
-        <w:t xml:space="preserve">[22] J.H. Friedman, Greedy function approximation: A gradient boosting machine, The Annals of Statistics 29 (2001) 1189–1232. https://doi.org/10.1214/aos/1013203451.</w:t>
-      </w:r>
-    </w:p>
-    <w:p>
-      <w:pPr>
-        <w:pStyle w:val="BodyText"/>
-      </w:pPr>
-      <w:r>
-        <w:t xml:space="preserve">[23] I. Goodfellow, Y. Bengio, A. Courville, Deep learning, MIT Press, Cambridge, MA, 2016.</w:t>
-      </w:r>
-    </w:p>
-    <w:p>
-      <w:pPr>
-        <w:pStyle w:val="BodyText"/>
-      </w:pPr>
-      <w:r>
-        <w:t xml:space="preserve">[24] M. Tavallaee, E. Bagheri, W. Lu, A.A. Ghorbani, A detailed analysis of the KDD CUP 99 data set, in: Proceedings of the 2009 IEEE Symposium on Computational Intelligence for Security and Defense Applications (CISDA), 2009: pp. 1–6. https://doi.org/10.1109/CISDA.2009.5356528.</w:t>
-      </w:r>
-    </w:p>
-    <w:p>
-      <w:pPr>
-        <w:pStyle w:val="BodyText"/>
-      </w:pPr>
-      <w:r>
-        <w:t xml:space="preserve">[25] B. Efron, R.J. Tibshirani, An introduction to the bootstrap, Chapman &amp; Hall/CRC, New York, 1994. https://doi.org/10.1201/9780429246593.</w:t>
-      </w:r>
-    </w:p>
-    <w:p>
-      <w:pPr>
-        <w:pStyle w:val="BodyText"/>
-      </w:pPr>
-      <w:r>
-        <w:t xml:space="preserve">[26] F. Wilcoxon, Individual comparisons by ranking methods, Biometrics Bulletin 1 (1945) 80–83. https://doi.org/10.2307/3001968.</w:t>
-      </w:r>
-    </w:p>
-    <w:p>
-      <w:pPr>
-        <w:pStyle w:val="BodyText"/>
-      </w:pPr>
-      <w:r>
-        <w:t xml:space="preserve">[27] M. Ring, S. Wunderlich, D. Scheuring, D. Landes, A. Hotho, A survey of network-based intrusion detection data sets, Computers &amp; Security 86 (2019) 147–167. https://doi.org/10.1016/j.cose.2019.06.005.</w:t>
-      </w:r>
-    </w:p>
-    <w:p>
-      <w:pPr>
-        <w:pStyle w:val="BodyText"/>
-      </w:pPr>
-      <w:r>
-        <w:t xml:space="preserve">[28] M.A. Al-Garadi, A. Mohamed, A.K. Al-Ali, X. Du, I. Ali, M. Guizani, A survey of machine and deep learning methods for Internet of Things (IoT) security, IEEE Communications Surveys &amp; Tutorials 22 (2020) 1646–1685. https://doi.org/10.1109/COMST.2020.2988293.</w:t>
-      </w:r>
-    </w:p>
-    <w:bookmarkEnd w:id="31"/>
     <w:sectPr>
       <w:footnotePr>
         <w:numRestart w:val="eachSect"/>

</xml_diff>

<commit_message>
Make code public: data/code availability links the public repository; repo-relative figure paths in summary.json
</commit_message>
<xml_diff>
--- a/paper/elsevier/manuscript.docx
+++ b/paper/elsevier/manuscript.docx
@@ -72,11 +72,22 @@
       <w:r>
         <w:t xml:space="preserve"> </w:t>
       </w:r>
-      <w:r>
-        <w:t xml:space="preserve">GitHub repository, to be made public on acceptance; available to the editor and reviewers on reasonable request</w:t>
-      </w:r>
-    </w:p>
-    <w:bookmarkStart w:id="9" w:name="abstract"/>
+      <w:hyperlink r:id="rId9">
+        <w:r>
+          <w:rPr>
+            <w:rStyle w:val="Hyperlink"/>
+          </w:rPr>
+          <w:t xml:space="preserve">https://github.com/nithin427/fuzzy-neural-cyber-triage</w:t>
+        </w:r>
+      </w:hyperlink>
+      <w:r>
+        <w:t xml:space="preserve"> </w:t>
+      </w:r>
+      <w:r>
+        <w:t xml:space="preserve">(public)</w:t>
+      </w:r>
+    </w:p>
+    <w:bookmarkStart w:id="10" w:name="abstract"/>
     <w:p>
       <w:pPr>
         <w:pStyle w:val="Heading1"/>
@@ -215,8 +226,8 @@
         <w:t xml:space="preserve">Fuzzy logic; Neural networks; Decision intelligence; Intrusion detection; Alert triage; Cost-sensitive decisions; Knowledge-based systems</w:t>
       </w:r>
     </w:p>
-    <w:bookmarkEnd w:id="9"/>
-    <w:bookmarkStart w:id="10" w:name="introduction"/>
+    <w:bookmarkEnd w:id="10"/>
+    <w:bookmarkStart w:id="11" w:name="introduction"/>
     <w:p>
       <w:pPr>
         <w:pStyle w:val="Heading1"/>
@@ -249,8 +260,8 @@
         <w:t xml:space="preserve">This Short Communication contributes (i) a knowledge-based layer that maps neural propensity to fuzzy risk bands and then to SOC actions through a stated production-rule base (Section 2); (ii) a decision-centric evaluation with paired tests, re-runs and sensitivity sweeps (Sections 3–4); and (iii) ablations that locate the gain. Unlike gradient boosting [22], the strongest baseline, whose output still needs a threshold, the layer is detector-agnostic.</w:t>
       </w:r>
     </w:p>
-    <w:bookmarkEnd w:id="10"/>
-    <w:bookmarkStart w:id="17" w:name="proposed-fuzzyneural-decision-framework"/>
+    <w:bookmarkEnd w:id="11"/>
+    <w:bookmarkStart w:id="18" w:name="proposed-fuzzyneural-decision-framework"/>
     <w:p>
       <w:pPr>
         <w:pStyle w:val="Heading1"/>
@@ -268,18 +279,18 @@
           <wp:inline>
             <wp:extent cx="5334000" cy="3517518"/>
             <wp:effectExtent b="0" l="0" r="0" t="0"/>
-            <wp:docPr descr="Fig. 1. Proposed framework. (a) Pipeline from alert features to neural propensity, fuzzy risk bands and rules R_1–R_3. (b) Membership functions, Eqs. (2)–(4); dotted lines mark the switch points p=9/32 and 23/32 between Monitor, Soft-block and Escalate." title="" id="12" name="Picture"/>
+            <wp:docPr descr="Fig. 1. Proposed framework. (a) Pipeline from alert features to neural propensity, fuzzy risk bands and rules R_1–R_3. (b) Membership functions, Eqs. (2)–(4); dotted lines mark the switch points p=9/32 and 23/32 between Monitor, Soft-block and Escalate." title="" id="13" name="Picture"/>
             <a:graphic>
               <a:graphicData uri="http://schemas.openxmlformats.org/drawingml/2006/picture">
                 <pic:pic>
                   <pic:nvPicPr>
-                    <pic:cNvPr descr="figures/fig1_architecture.png" id="13" name="Picture"/>
+                    <pic:cNvPr descr="figures/fig1_architecture.png" id="14" name="Picture"/>
                     <pic:cNvPicPr>
                       <a:picLocks noChangeArrowheads="1" noChangeAspect="1"/>
                     </pic:cNvPicPr>
                   </pic:nvPicPr>
                   <pic:blipFill>
-                    <a:blip r:embed="rId11"/>
+                    <a:blip r:embed="rId12"/>
                     <a:stretch>
                       <a:fillRect/>
                     </a:stretch>
@@ -416,7 +427,7 @@
         <w:t xml:space="preserve">between Monitor, Soft-block and Escalate.</w:t>
       </w:r>
     </w:p>
-    <w:bookmarkStart w:id="14" w:name="neural-propensity-model"/>
+    <w:bookmarkStart w:id="15" w:name="neural-propensity-model"/>
     <w:p>
       <w:pPr>
         <w:pStyle w:val="Heading2"/>
@@ -984,8 +995,8 @@
         <w:t xml:space="preserve">, batch 512, 20 epochs), keeping the epoch with the best validation ROC-AUC.</w:t>
       </w:r>
     </w:p>
-    <w:bookmarkEnd w:id="14"/>
-    <w:bookmarkStart w:id="15" w:name="Xa12c8d55717e251e3186c98c25cee8834d32cb3"/>
+    <w:bookmarkEnd w:id="15"/>
+    <w:bookmarkStart w:id="16" w:name="Xa12c8d55717e251e3186c98c25cee8834d32cb3"/>
     <w:p>
       <w:pPr>
         <w:pStyle w:val="Heading2"/>
@@ -2469,8 +2480,8 @@
         <w:t xml:space="preserve">(Fig. 1b).</w:t>
       </w:r>
     </w:p>
-    <w:bookmarkEnd w:id="15"/>
-    <w:bookmarkStart w:id="16" w:name="cost-model-and-decision-metrics"/>
+    <w:bookmarkEnd w:id="16"/>
+    <w:bookmarkStart w:id="17" w:name="cost-model-and-decision-metrics"/>
     <w:p>
       <w:pPr>
         <w:pStyle w:val="Heading2"/>
@@ -3378,9 +3389,9 @@
         <w:t xml:space="preserve">.</w:t>
       </w:r>
     </w:p>
-    <w:bookmarkEnd w:id="16"/>
     <w:bookmarkEnd w:id="17"/>
-    <w:bookmarkStart w:id="18" w:name="experimental-design"/>
+    <w:bookmarkEnd w:id="18"/>
+    <w:bookmarkStart w:id="19" w:name="experimental-design"/>
     <w:p>
       <w:pPr>
         <w:pStyle w:val="Heading1"/>
@@ -3499,8 +3510,8 @@
         <w:t xml:space="preserve">and the Medium-band half-width (0.25–0.45) are swept. One deterministic script (one PyTorch thread) produces every number.</w:t>
       </w:r>
     </w:p>
-    <w:bookmarkEnd w:id="18"/>
-    <w:bookmarkStart w:id="22" w:name="results-and-discussion"/>
+    <w:bookmarkEnd w:id="19"/>
+    <w:bookmarkStart w:id="23" w:name="results-and-discussion"/>
     <w:p>
       <w:pPr>
         <w:pStyle w:val="Heading1"/>
@@ -5656,18 +5667,18 @@
           <wp:inline>
             <wp:extent cx="5334000" cy="4415974"/>
             <wp:effectExtent b="0" l="0" r="0" t="0"/>
-            <wp:docPr descr="Fig. 2. Predictive and decision evidence. (a) ROC curves (seed 42). (b) Mean triage cost of a Monitor/Escalate threshold policy versus threshold; horizontal lines: proposed, top-20% and Bayes-rule costs. (c) Sensitivity to the missed-attack cost C_{FN} (default 10, dotted). (d) Paired per-seed costs for seeds 42–51; black markers: mean \pm SD." title="" id="20" name="Picture"/>
+            <wp:docPr descr="Fig. 2. Predictive and decision evidence. (a) ROC curves (seed 42). (b) Mean triage cost of a Monitor/Escalate threshold policy versus threshold; horizontal lines: proposed, top-20% and Bayes-rule costs. (c) Sensitivity to the missed-attack cost C_{FN} (default 10, dotted). (d) Paired per-seed costs for seeds 42–51; black markers: mean \pm SD." title="" id="21" name="Picture"/>
             <a:graphic>
               <a:graphicData uri="http://schemas.openxmlformats.org/drawingml/2006/picture">
                 <pic:pic>
                   <pic:nvPicPr>
-                    <pic:cNvPr descr="figures/fig2_roc_and_cost.png" id="21" name="Picture"/>
+                    <pic:cNvPr descr="figures/fig2_roc_and_cost.png" id="22" name="Picture"/>
                     <pic:cNvPicPr>
                       <a:picLocks noChangeArrowheads="1" noChangeAspect="1"/>
                     </pic:cNvPicPr>
                   </pic:nvPicPr>
                   <pic:blipFill>
-                    <a:blip r:embed="rId19"/>
+                    <a:blip r:embed="rId20"/>
                     <a:stretch>
                       <a:fillRect/>
                     </a:stretch>
@@ -6089,8 +6100,8 @@
         <w:t xml:space="preserve">On gradient-boosting scores the unchanged rules lower the cost further and cut unnecessary escalations from 603 to 222 (Table 2), so the layer complements a stronger detector. Named rules and firing strengths, not post-hoc attribution [18,19], explain each action, supporting audit trails and human–AI teaming [2].</w:t>
       </w:r>
     </w:p>
-    <w:bookmarkEnd w:id="22"/>
-    <w:bookmarkStart w:id="23" w:name="limitations"/>
+    <w:bookmarkEnd w:id="23"/>
+    <w:bookmarkStart w:id="24" w:name="limitations"/>
     <w:p>
       <w:pPr>
         <w:pStyle w:val="Heading1"/>
@@ -6158,8 +6169,8 @@
         <w:t xml:space="preserve">NSL-KDD (2009) is a dated laboratory benchmark that does not reflect modern enterprise, cloud or IoT traffic [27,28]. The data were subsampled, under a single train/test protocol. The cost matrix is illustrative, not elicited from a SOC; coverage counts containment as covering an attack; and there was no live deployment, drift analysis or user study.</w:t>
       </w:r>
     </w:p>
-    <w:bookmarkEnd w:id="23"/>
-    <w:bookmarkStart w:id="24" w:name="conclusion"/>
+    <w:bookmarkEnd w:id="24"/>
+    <w:bookmarkStart w:id="25" w:name="conclusion"/>
     <w:p>
       <w:pPr>
         <w:pStyle w:val="Heading1"/>
@@ -6176,8 +6187,8 @@
         <w:t xml:space="preserve">Treating alert triage as a knowledge-based decision problem, a fuzzy–neural rule layer beat crisp threshold and capacity rules on NSL-KDD in cost and coverage; the gain comes from the containment band, and a cost-derived Bayes rule is cheaper still. SOC managers should judge detectors by the decisions they enable and make rules and cost assumptions explicit. Future work will elicit practitioner costs and use recent, live alert data.</w:t>
       </w:r>
     </w:p>
-    <w:bookmarkEnd w:id="24"/>
-    <w:bookmarkStart w:id="25" w:name="data-availability"/>
+    <w:bookmarkEnd w:id="25"/>
+    <w:bookmarkStart w:id="26" w:name="data-availability"/>
     <w:p>
       <w:pPr>
         <w:pStyle w:val="Heading1"/>
@@ -6191,11 +6202,25 @@
         <w:pStyle w:val="FirstParagraph"/>
       </w:pPr>
       <w:r>
-        <w:t xml:space="preserve">The NSL-KDD dataset is publicly available from the Canadian Institute for Cybersecurity, University of New Brunswick [24]. The code and results (experiment script, result tables in CSV/JSON and figure-generation code) are held in a GitHub repository that will be made public on acceptance; until then they are available to the editor and reviewers on reasonable request.</w:t>
-      </w:r>
-    </w:p>
-    <w:bookmarkEnd w:id="25"/>
-    <w:bookmarkStart w:id="26" w:name="declaration-of-competing-interest"/>
+        <w:t xml:space="preserve">The code, result tables and figure-generation scripts are publicly available at</w:t>
+      </w:r>
+      <w:r>
+        <w:t xml:space="preserve"> </w:t>
+      </w:r>
+      <w:hyperlink r:id="rId9">
+        <w:r>
+          <w:rPr>
+            <w:rStyle w:val="Hyperlink"/>
+          </w:rPr>
+          <w:t xml:space="preserve">https://github.com/nithin427/fuzzy-neural-cyber-triage</w:t>
+        </w:r>
+      </w:hyperlink>
+      <w:r>
+        <w:t xml:space="preserve">. The NSL-KDD dataset is publicly available from the Canadian Institute for Cybersecurity, University of New Brunswick [24].</w:t>
+      </w:r>
+    </w:p>
+    <w:bookmarkEnd w:id="26"/>
+    <w:bookmarkStart w:id="27" w:name="declaration-of-competing-interest"/>
     <w:p>
       <w:pPr>
         <w:pStyle w:val="Heading1"/>
@@ -6212,8 +6237,8 @@
         <w:t xml:space="preserve">The author declares no known competing financial interests or personal relationships that could have appeared to influence the work reported in this paper.</w:t>
       </w:r>
     </w:p>
-    <w:bookmarkEnd w:id="26"/>
-    <w:bookmarkStart w:id="27" w:name="X1f74eb43af444059c7518034463b6c89b1cacf4"/>
+    <w:bookmarkEnd w:id="27"/>
+    <w:bookmarkStart w:id="28" w:name="X1f74eb43af444059c7518034463b6c89b1cacf4"/>
     <w:p>
       <w:pPr>
         <w:pStyle w:val="Heading1"/>
@@ -6230,8 +6255,8 @@
         <w:t xml:space="preserve">During the preparation of this work the author used Grok Bot, an AI-assisted writing and coding tool, to help with language editing, code refactoring, reference checking and formatting. After using this tool, the author reviewed and edited the content as needed and takes full responsibility for the content of the published article. All results, tables and figures were generated by the author’s executable code from the public dataset; no figure was created with generative AI.</w:t>
       </w:r>
     </w:p>
-    <w:bookmarkEnd w:id="27"/>
-    <w:bookmarkStart w:id="28" w:name="funding"/>
+    <w:bookmarkEnd w:id="28"/>
+    <w:bookmarkStart w:id="29" w:name="funding"/>
     <w:p>
       <w:pPr>
         <w:pStyle w:val="Heading1"/>
@@ -6248,8 +6273,8 @@
         <w:t xml:space="preserve">This research did not receive any specific grant from funding agencies in the public, commercial, or not-for-profit sectors.</w:t>
       </w:r>
     </w:p>
-    <w:bookmarkEnd w:id="28"/>
-    <w:bookmarkStart w:id="29" w:name="credit-authorship-contribution-statement"/>
+    <w:bookmarkEnd w:id="29"/>
+    <w:bookmarkStart w:id="30" w:name="credit-authorship-contribution-statement"/>
     <w:p>
       <w:pPr>
         <w:pStyle w:val="Heading1"/>
@@ -6276,8 +6301,8 @@
         <w:t xml:space="preserve">Conceptualization, Methodology, Software, Validation, Formal analysis, Investigation, Data curation, Visualization, Writing – original draft, Writing – review &amp; editing.</w:t>
       </w:r>
     </w:p>
-    <w:bookmarkEnd w:id="29"/>
-    <w:bookmarkStart w:id="30" w:name="references"/>
+    <w:bookmarkEnd w:id="30"/>
+    <w:bookmarkStart w:id="31" w:name="references"/>
     <w:p>
       <w:pPr>
         <w:pStyle w:val="Heading1"/>
@@ -6510,7 +6535,7 @@
         <w:t xml:space="preserve">[28] M.A. Al-Garadi, A. Mohamed, A.K. Al-Ali, X. Du, I. Ali, M. Guizani, A survey of machine and deep learning methods for Internet of Things (IoT) security, IEEE Communications Surveys &amp; Tutorials 22 (2020) 1646–1685. https://doi.org/10.1109/COMST.2020.2988293.</w:t>
       </w:r>
     </w:p>
-    <w:bookmarkEnd w:id="30"/>
+    <w:bookmarkEnd w:id="31"/>
     <w:sectPr>
       <w:footnotePr>
         <w:numRestart w:val="eachSect"/>

</xml_diff>

<commit_message>
Paper: Q1 reference revision (34 refs: 25 Q1 IEEE/Elsevier/MDPI, Crossref+SJR verified), LTWA abbreviations, sort&compress citations, editor pass; still 10 pp
</commit_message>
<xml_diff>
--- a/paper/elsevier/manuscript.docx
+++ b/paper/elsevier/manuscript.docx
@@ -153,7 +153,7 @@
         </m:r>
       </m:oMath>
       <w:r>
-        <w:t xml:space="preserve">) and at every missed-attack cost from 2 to 30, except that top-20% escalation is cheaper when missed attacks cost 2–3 units. Ablations bound the claim. The gain comes from the intermediate Soft-block band, which is decision-equivalent to crisp cut-points at</w:t>
+        <w:t xml:space="preserve">) and at every missed-attack cost from 2 to 30, except that top-20% escalation is cheaper when missed attacks cost 2–3 units. Ablations bound the claim. The gain comes from the Soft-block band, which is decision-equivalent to crisp cut-points at</w:t>
       </w:r>
       <w:r>
         <w:t xml:space="preserve"> </w:t>
@@ -241,7 +241,7 @@
         <w:pStyle w:val="FirstParagraph"/>
       </w:pPr>
       <w:r>
-        <w:t xml:space="preserve">SOC analysts face far more alerts than they can investigate, and alert fatigue is a central operational risk [1,2]. Recent work prioritises alerts by reinforcement learning or human–AI teaming [2,3], but most intrusion-detection research stops at a score judged by accuracy or ROC-AUC [4–7]. A SOC manager must instead decide, under finite analyst capacity and asymmetric error costs, which alerts to monitor, contain or escalate, a step in the data-driven transformation of security operations [8,9].</w:t>
+        <w:t xml:space="preserve">Security operations centres (SOCs) centralise the monitoring and handling of security alerts [1], yet analysts face far more alerts than they can investigate, and alert fatigue is a central operational risk [2,3]. Recent work prioritises alerts by reinforcement learning or human–AI teaming [3,4], but most intrusion-detection research, from surveys [5–7] to deep detectors evaluated on NSL-KDD [8,9], stops at a score judged by accuracy or ROC-AUC. A SOC manager must instead decide, under finite analyst capacity and asymmetric error costs, which alerts to monitor, contain or escalate, a step in the AI-supported, data-driven transformation of decision-making [10,11].</w:t>
       </w:r>
     </w:p>
     <w:p>
@@ -249,7 +249,7 @@
         <w:pStyle w:val="BodyText"/>
       </w:pPr>
       <w:r>
-        <w:t xml:space="preserve">Fuzzy and neuro-fuzzy systems suit this step because they express learned evidence in linguistic terms that operators can audit [10–12]. In intrusion detection, however, fuzzy–neural hybrids mainly raise detection rates [13–15], cost-sensitive learning targets the classifier rather than the action [16,17], and explainable AI explains scores without choosing actions [18–20]. Knowledge-based cyber-risk decision support, such as explainable knowledge-graph risk assessment [21], shows the value of explicit knowledge representations, but a score-to-action rule base for alert triage, evaluated with decision metrics, is still missing.</w:t>
+        <w:t xml:space="preserve">Fuzzy and neuro-fuzzy systems suit this step because they express learned evidence in linguistic terms that operators can audit [12–15]. In intrusion detection, however, fuzzy and neuro-fuzzy hybrids mainly target detection accuracy [16–18], cost-sensitive learning targets the classifier or its binary threshold rather than a graded action [19–22], and explainable AI explains scores without choosing actions [23–26]. Knowledge-based cyber-risk decision support, such as explainable knowledge-graph risk assessment [27], shows the value of explicit knowledge representations, but a score-to-action rule base for alert triage, evaluated with decision metrics, is still missing.</w:t>
       </w:r>
     </w:p>
     <w:p>
@@ -257,7 +257,7 @@
         <w:pStyle w:val="BodyText"/>
       </w:pPr>
       <w:r>
-        <w:t xml:space="preserve">This Short Communication contributes (i) a knowledge-based layer that maps neural propensity to fuzzy risk bands and then to SOC actions through a stated production-rule base (Section 2); (ii) a decision-centric evaluation with paired tests, re-runs and sensitivity sweeps (Sections 3–4); and (iii) ablations that locate the gain. Unlike gradient boosting [22], the strongest baseline, whose output still needs a threshold, the layer is detector-agnostic.</w:t>
+        <w:t xml:space="preserve">This Short Communication contributes (i) a knowledge-based layer that maps neural propensity to fuzzy risk bands and then to SOC actions through a stated production-rule base (Section 2); (ii) a decision-centric evaluation with paired tests, re-runs and sensitivity sweeps (Sections 3–4); and (iii) ablations that locate the gain. Unlike gradient boosting [28], the strongest baseline, whose output still needs a threshold, the layer is detector-agnostic.</w:t>
       </w:r>
     </w:p>
     <w:bookmarkEnd w:id="11"/>
@@ -554,7 +554,7 @@
         <w:t xml:space="preserve"> </w:t>
       </w:r>
       <w:r>
-        <w:t xml:space="preserve">with ReLU layers of width 128 and 64, dropout 0.2 and one logit output [23] gives the attack propensity</w:t>
+        <w:t xml:space="preserve">with ReLU layers of width 128 and 64, dropout 0.2 and one logit output, as in deep intrusion detectors [8], gives the attack propensity</w:t>
       </w:r>
     </w:p>
     <w:p>
@@ -1010,7 +1010,7 @@
         <w:pStyle w:val="FirstParagraph"/>
       </w:pPr>
       <w:r>
-        <w:t xml:space="preserve">Propensity is mapped to three linguistic risk bands [10] with shoulder and triangular membership functions, using</w:t>
+        <w:t xml:space="preserve">Propensity is mapped to three linguistic risk bands [12] with shoulder and triangular membership functions, using</w:t>
       </w:r>
       <w:r>
         <w:t xml:space="preserve"> </w:t>
@@ -3269,7 +3269,7 @@
         <w:t xml:space="preserve"> </w:t>
       </w:r>
       <w:r>
-        <w:t xml:space="preserve">as calibrated. Because</w:t>
+        <w:t xml:space="preserve">as calibrated, an assumption that deep-model scores do not guarantee [29]. Because</w:t>
       </w:r>
       <w:r>
         <w:t xml:space="preserve"> </w:t>
@@ -3415,7 +3415,7 @@
         <w:t xml:space="preserve"> </w:t>
       </w:r>
       <w:r>
-        <w:t xml:space="preserve">We use the NSL-KDD benchmark [24]. For CPU-scale reproducibility, 40,000 training records are sampled and split 85/15 (stratified) into 34,000 for training and 6,000 for validation, with the scaler and one-hot encoder fitted on the training split only; the test set is capped at 20,000 records (attack rate 0.568). The test file contains attack types absent from training, so train/test shift is part of the task.</w:t>
+        <w:t xml:space="preserve">We use the NSL-KDD benchmark [30]. For CPU-scale reproducibility, 40,000 training records are sampled and split 85/15 (stratified) into 34,000 for training and 6,000 for validation, with the scaler and one-hot encoder fitted on the training split only; the test set is capped at 20,000 records (attack rate 0.568). The test file contains attack types absent from training, so train/test shift is part of the task.</w:t>
       </w:r>
     </w:p>
     <w:p>
@@ -3433,7 +3433,7 @@
         <w:t xml:space="preserve"> </w:t>
       </w:r>
       <w:r>
-        <w:t xml:space="preserve">The detectors are class-balanced logistic regression, gradient boosting [22] (scikit-learn defaults) and the MLP alone (neural ablation); the proposed system shares the MLP propensity, so its contribution must show in decisions. Decision baselines on the same scores are a Monitor/Escalate threshold at 0.5, the same threshold tuned on validation data to minimise cost, and escalation of the top 20% of scores (a fixed analyst-capacity rule). The Bayes rule, Eq. (7), is a reference, not a competitor, as it needs the cost matrix and calibrated probabilities at run time. Learned policies (e.g., reinforcement learning [3]) need interaction data and are excluded.</w:t>
+        <w:t xml:space="preserve">The detectors are class-balanced logistic regression, gradient boosting [28] (scikit-learn defaults) and the MLP alone (neural ablation); the proposed system shares the MLP propensity, so its contribution must show in decisions. Decision baselines on the same scores are a Monitor/Escalate threshold at 0.5, the same threshold tuned on validation data to minimise cost (threshold moving [20]), and escalation of the top 20% of scores (a fixed analyst-capacity rule). The Bayes rule, Eq. (7), is a reference, not a competitor, as it needs the cost matrix and calibrated probabilities at run time. Learned policies (e.g., reinforcement learning [4]) need interaction data and are excluded.</w:t>
       </w:r>
     </w:p>
     <w:p>
@@ -3451,7 +3451,7 @@
         <w:t xml:space="preserve"> </w:t>
       </w:r>
       <w:r>
-        <w:t xml:space="preserve">On the seed-42 test set we report percentile 95% confidence intervals from 2,000 paired bootstrap resamples of alerts [25] and two-sided Wilcoxon signed-rank tests on per-alert cost differences [26]. The full pipeline is repeated for seeds 42–51 (paired Wilcoxon test across seeds), and</w:t>
+        <w:t xml:space="preserve">On the seed-42 test set we report percentile 95% confidence intervals from 2,000 paired bootstrap resamples of alerts [31] and two-sided Wilcoxon signed-rank tests on per-alert cost differences [32]. The full pipeline is repeated for seeds 42–51 (paired Wilcoxon test across seeds), and</w:t>
       </w:r>
       <w:r>
         <w:t xml:space="preserve"> </w:t>
@@ -3507,7 +3507,7 @@
         <w:t xml:space="preserve"> </w:t>
       </w:r>
       <w:r>
-        <w:t xml:space="preserve">and the Medium-band half-width (0.25–0.45) are swept. One deterministic script (one PyTorch thread) produces every number.</w:t>
+        <w:t xml:space="preserve">and the Medium-band half-width (0.25–0.45) are swept.</w:t>
       </w:r>
     </w:p>
     <w:bookmarkEnd w:id="19"/>
@@ -5781,7 +5781,7 @@
         <w:t xml:space="preserve"> </w:t>
       </w:r>
       <w:r>
-        <w:t xml:space="preserve">Gradient boosting is the best detector (Table 1, Fig. 2a), with a higher ROC-AUC than the MLP in all ten seeds; we make no detection claim. On identical neural scores, however, the rule base lowers the mean triage cost by 0.196 units per alert relative to the 0.5 threshold and by 1.242 relative to top-20% escalation (Table 2), and raises attack coverage by 0.031 (CI 0.028–0.034). The policies differ only on the 776 Medium-band alerts; a cost-tuned threshold (</w:t>
+        <w:t xml:space="preserve">Gradient boosting is the best detector (Table 1, Fig. 2a), with a higher ROC-AUC than the MLP in all ten seeds; we make no detection claim. On identical neural scores, however, the rule base lowers the mean triage cost by 0.196 units per alert versus the 0.5 threshold and by 1.242 versus top-20% escalation (Table 2), and raises attack coverage by 0.031 (CI 0.028–0.034). The policies differ only on the 776 Medium-band alerts; a cost-tuned threshold (</w:t>
       </w:r>
       <m:oMath>
         <m:r>
@@ -5798,7 +5798,7 @@
         </m:r>
       </m:oMath>
       <w:r>
-        <w:t xml:space="preserve">) does no better. It is cheaper than both crisp rules in all ten re-runs (Fig. 2d; Wilcoxon</w:t>
+        <w:t xml:space="preserve">) does no better. It beats both crisp rules in all ten re-runs (Fig. 2d; Wilcoxon</w:t>
       </w:r>
       <w:r>
         <w:t xml:space="preserve"> </w:t>
@@ -5900,7 +5900,42 @@
         <w:t xml:space="preserve"> </w:t>
       </w:r>
       <w:r>
-        <w:t xml:space="preserve">from 2 to 30 (Fig. 2c), but top-20% escalation is cheaper when missed attacks are cheap (</w:t>
+        <w:t xml:space="preserve">from 2 to 30 (Fig. 2c), but top-20% escalation is cheaper for</w:t>
+      </w:r>
+      <w:r>
+        <w:t xml:space="preserve"> </w:t>
+      </w:r>
+      <m:oMath>
+        <m:sSub>
+          <m:e>
+            <m:r>
+              <m:t>C</m:t>
+            </m:r>
+          </m:e>
+          <m:sub>
+            <m:r>
+              <m:t>F</m:t>
+            </m:r>
+            <m:r>
+              <m:t>N</m:t>
+            </m:r>
+          </m:sub>
+        </m:sSub>
+        <m:r>
+          <m:rPr>
+            <m:sty m:val="p"/>
+          </m:rPr>
+          <m:t>≤</m:t>
+        </m:r>
+        <m:r>
+          <m:t>3</m:t>
+        </m:r>
+      </m:oMath>
+      <w:r>
+        <w:t xml:space="preserve"> </w:t>
+      </w:r>
+      <w:r>
+        <w:t xml:space="preserve">(</w:t>
       </w:r>
       <m:oMath>
         <m:sSub>
@@ -6025,7 +6060,7 @@
         <w:t xml:space="preserve"> </w:t>
       </w:r>
       <w:r>
-        <w:t xml:space="preserve">reproduce every action, so the benefit comes from the intermediate Soft-block band, not from fuzziness; the memberships add graded explanations and a principled way to set the bands. The Bayes rule is much cheaper (Table 2) because soft-blocking dominates escalation under Eq. (6): it contains 43% of all traffic and never involves an analyst. Managerially, when containment is this cheap the cost matrix, not the detector, sets the action mix, so organisations must calibrate</w:t>
+        <w:t xml:space="preserve">reproduce every action, so the benefit comes from the Soft-block band, not from fuzziness; the memberships add graded explanations and a principled way to set bands. The Bayes rule is much cheaper (Table 2) because soft-blocking dominates escalation under Eq. (6): it contains 43% of all traffic and needs no analyst. Managerially, with containment this cheap, the cost matrix, not the detector, sets the action mix, so organisations must calibrate</w:t>
       </w:r>
       <w:r>
         <w:t xml:space="preserve"> </w:t>
@@ -6079,7 +6114,7 @@
         </m:r>
       </m:oMath>
       <w:r>
-        <w:t xml:space="preserve">); validation tuning cannot find it under the train/test shift, but band positions clearly matter.</w:t>
+        <w:t xml:space="preserve">); validation tuning cannot find it under train/test shift, but band positions matter.</w:t>
       </w:r>
     </w:p>
     <w:p>
@@ -6097,7 +6132,7 @@
         <w:t xml:space="preserve"> </w:t>
       </w:r>
       <w:r>
-        <w:t xml:space="preserve">On gradient-boosting scores the unchanged rules lower the cost further and cut unnecessary escalations from 603 to 222 (Table 2), so the layer complements a stronger detector. Named rules and firing strengths, not post-hoc attribution [18,19], explain each action, supporting audit trails and human–AI teaming [2].</w:t>
+        <w:t xml:space="preserve">On gradient-boosting scores the unchanged rules lower the cost further and cut unnecessary escalations from 603 to 222 (Table 2), so the layer complements a stronger detector. Named rules and firing strengths, not post-hoc attribution [24,25], explain each action, supporting audit trails and human–AI teaming [3].</w:t>
       </w:r>
     </w:p>
     <w:bookmarkEnd w:id="23"/>
@@ -6125,7 +6160,10 @@
         <w:t xml:space="preserve"> </w:t>
       </w:r>
       <w:r>
-        <w:t xml:space="preserve">Beyond the low-</w:t>
+        <w:t xml:space="preserve">Besides low</w:t>
+      </w:r>
+      <w:r>
+        <w:t xml:space="preserve"> </w:t>
       </w:r>
       <m:oMath>
         <m:sSub>
@@ -6145,10 +6183,7 @@
         </m:sSub>
       </m:oMath>
       <w:r>
-        <w:t xml:space="preserve"> </w:t>
-      </w:r>
-      <w:r>
-        <w:t xml:space="preserve">case, seed 48 is the weakest replicate (cost 3.282, coverage 0.626): its MLP has a typical ROC-AUC (0.900) but the lowest accuracy at 0.5 (0.757), so fixed band positions are sensitive to the score distribution, not only to ranking. The rule base is also not cost-optimal under its own matrix (the Bayes gap); adaptive (e.g., ANFIS-style [11]) or cost-derived band positions are the next step. The bands were set by expert judgement, not on test data.</w:t>
+        <w:t xml:space="preserve">, seed 48 is the weakest replicate (cost 3.282, coverage 0.626): its MLP has a typical ROC-AUC (0.900) but the lowest accuracy at 0.5 (0.757), so fixed bands are sensitive to the score distribution, not only to ranking. The rule base is also not cost-optimal under its own matrix (the Bayes gap); adaptive (e.g., ANFIS-style [13]) or cost-derived bands are the next step. The bands were set by expert judgement, not on test data.</w:t>
       </w:r>
     </w:p>
     <w:p>
@@ -6166,7 +6201,7 @@
         <w:t xml:space="preserve"> </w:t>
       </w:r>
       <w:r>
-        <w:t xml:space="preserve">NSL-KDD (2009) is a dated laboratory benchmark that does not reflect modern enterprise, cloud or IoT traffic [27,28]. The data were subsampled, under a single train/test protocol. The cost matrix is illustrative, not elicited from a SOC; coverage counts containment as covering an attack; and there was no live deployment, drift analysis or user study.</w:t>
+        <w:t xml:space="preserve">NSL-KDD (2009) is a dated laboratory benchmark that does not reflect modern enterprise, cloud or IoT traffic [33,34]. The data were subsampled, under a single train/test protocol. The cost matrix is illustrative, not elicited from a SOC; coverage counts containment as covering an attack; and there was no live deployment, drift analysis or user study.</w:t>
       </w:r>
     </w:p>
     <w:bookmarkEnd w:id="24"/>
@@ -6216,7 +6251,7 @@
         </w:r>
       </w:hyperlink>
       <w:r>
-        <w:t xml:space="preserve">. The NSL-KDD dataset is publicly available from the Canadian Institute for Cybersecurity, University of New Brunswick [24].</w:t>
+        <w:t xml:space="preserve">. The NSL-KDD dataset is publicly available from the Canadian Institute for Cybersecurity, University of New Brunswick [30].</w:t>
       </w:r>
     </w:p>
     <w:bookmarkEnd w:id="26"/>
@@ -6316,7 +6351,7 @@
         <w:pStyle w:val="FirstParagraph"/>
       </w:pPr>
       <w:r>
-        <w:t xml:space="preserve">[1] S. Tariq, M. Baruwal Chhetri, S. Nepal, C. Paris, Alert fatigue in security operations centres: Research challenges and opportunities, ACM Computing Surveys 57 (2025) 1–38. https://doi.org/10.1145/3723158.</w:t>
+        <w:t xml:space="preserve">[1] M. Vielberth, F. Böhm, I. Fichtinger, G. Pernul, Security operations center: A systematic study and open challenges, IEEE Access 8 (2020) 227756–227779. https://doi.org/10.1109/ACCESS.2020.3045514.</w:t>
       </w:r>
     </w:p>
     <w:p>
@@ -6324,7 +6359,7 @@
         <w:pStyle w:val="BodyText"/>
       </w:pPr>
       <w:r>
-        <w:t xml:space="preserve">[2] M. Baruwal Chhetri, S. Tariq, R. Singh, F. Jalalvand, C. Paris, S. Nepal, Towards human–AI teaming to mitigate alert fatigue in security operations centres, ACM Transactions on Internet Technology 24 (2024) 1–22. https://doi.org/10.1145/3670009.</w:t>
+        <w:t xml:space="preserve">[2] S. Tariq, M. Baruwal Chhetri, S. Nepal, C. Paris, Alert fatigue in security operations centres: Research challenges and opportunities, ACM Comput. Surv. 57 (9) (2025) 1–38. https://doi.org/10.1145/3723158.</w:t>
       </w:r>
     </w:p>
     <w:p>
@@ -6332,7 +6367,7 @@
         <w:pStyle w:val="BodyText"/>
       </w:pPr>
       <w:r>
-        <w:t xml:space="preserve">[3] X. Wang, X. Yang, X. Liang, X. Zhang, W. Zhang, X. Gong, Combating alert fatigue with AlertPro: Context-aware alert prioritization using reinforcement learning for multi-step attack detection, Computers &amp; Security 137 (2024) 103583. https://doi.org/10.1016/j.cose.2023.103583.</w:t>
+        <w:t xml:space="preserve">[3] M. Baruwal Chhetri, S. Tariq, R. Singh, F. Jalalvand, C. Paris, S. Nepal, Towards human–AI teaming to mitigate alert fatigue in security operations centres, ACM Trans. Internet Technol. 24 (3) (2024) 1–22. https://doi.org/10.1145/3670009.</w:t>
       </w:r>
     </w:p>
     <w:p>
@@ -6340,7 +6375,7 @@
         <w:pStyle w:val="BodyText"/>
       </w:pPr>
       <w:r>
-        <w:t xml:space="preserve">[4] A.L. Buczak, E. Guven, A survey of data mining and machine learning methods for cyber security intrusion detection, IEEE Communications Surveys &amp; Tutorials 18 (2016) 1153–1176. https://doi.org/10.1109/COMST.2015.2494502.</w:t>
+        <w:t xml:space="preserve">[4] X. Wang, X. Yang, X. Liang, X. Zhang, W. Zhang, X. Gong, Combating alert fatigue with AlertPro: Context-aware alert prioritization using reinforcement learning for multi-step attack detection, Comput. Secur. 137 (2024) 103583. https://doi.org/10.1016/j.cose.2023.103583.</w:t>
       </w:r>
     </w:p>
     <w:p>
@@ -6348,7 +6383,7 @@
         <w:pStyle w:val="BodyText"/>
       </w:pPr>
       <w:r>
-        <w:t xml:space="preserve">[5] A. Khraisat, I. Gondal, P. Vamplew, J. Kamruzzaman, Survey of intrusion detection systems: Techniques, datasets and challenges, Cybersecurity 2 (2019) 20. https://doi.org/10.1186/s42400-019-0038-7.</w:t>
+        <w:t xml:space="preserve">[5] H.-J. Liao, C.-H. Richard Lin, Y.-C. Lin, K.-Y. Tung, Intrusion detection system: A comprehensive review, J. Netw. Comput. Appl. 36 (1) (2013) 16–24. https://doi.org/10.1016/j.jnca.2012.09.004.</w:t>
       </w:r>
     </w:p>
     <w:p>
@@ -6356,7 +6391,7 @@
         <w:pStyle w:val="BodyText"/>
       </w:pPr>
       <w:r>
-        <w:t xml:space="preserve">[6] T. Su, H. Sun, J. Zhu, S. Wang, Y. Li, BAT: Deep learning methods on network intrusion detection using NSL-KDD dataset, IEEE Access 8 (2020) 29575–29585. https://doi.org/10.1109/ACCESS.2020.2972627.</w:t>
+        <w:t xml:space="preserve">[6] A. L. Buczak, E. Guven, A survey of data mining and machine learning methods for cyber security intrusion detection, IEEE Commun. Surv. Tutor. 18 (2) (2016) 1153–1176. https://doi.org/10.1109/COMST.2015.2494502.</w:t>
       </w:r>
     </w:p>
     <w:p>
@@ -6364,7 +6399,7 @@
         <w:pStyle w:val="BodyText"/>
       </w:pPr>
       <w:r>
-        <w:t xml:space="preserve">[7] N. Sun, J. Zhang, P. Rimba, S. Gao, L.Y. Zhang, Y. Xiang, Data-driven cybersecurity incident prediction: A survey, IEEE Communications Surveys &amp; Tutorials 21 (2019) 1744–1772. https://doi.org/10.1109/COMST.2018.2885561.</w:t>
+        <w:t xml:space="preserve">[7] N. Sun, J. Zhang, P. Rimba, S. Gao, L. Y. Zhang, Y. Xiang, Data-driven cybersecurity incident prediction: A survey, IEEE Commun. Surv. Tutor. 21 (2) (2019) 1744–1772. https://doi.org/10.1109/COMST.2018.2885561.</w:t>
       </w:r>
     </w:p>
     <w:p>
@@ -6372,7 +6407,7 @@
         <w:pStyle w:val="BodyText"/>
       </w:pPr>
       <w:r>
-        <w:t xml:space="preserve">[8] G. Vial, Understanding digital transformation: A review and a research agenda, The Journal of Strategic Information Systems 28 (2019) 118–144. https://doi.org/10.1016/j.jsis.2019.01.003.</w:t>
+        <w:t xml:space="preserve">[8] R. Vinayakumar, M. Alazab, K. P. Soman, P. Poornachandran, A. Al-Nemrat, S. Venkatraman, Deep learning approach for intelligent intrusion detection system, IEEE Access 7 (2019) 41525–41550. https://doi.org/10.1109/ACCESS.2019.2895334.</w:t>
       </w:r>
     </w:p>
     <w:p>
@@ -6380,7 +6415,7 @@
         <w:pStyle w:val="BodyText"/>
       </w:pPr>
       <w:r>
-        <w:t xml:space="preserve">[9] F. Provost, T. Fawcett, Data science and its relationship to big data and data-driven decision making, Big Data 1 (2013) 51–59. https://doi.org/10.1089/big.2013.1508.</w:t>
+        <w:t xml:space="preserve">[9] T. Su, H. Sun, J. Zhu, S. Wang, Y. Li, BAT: Deep learning methods on network intrusion detection using NSL-KDD dataset, IEEE Access 8 (2020) 29575–29585. https://doi.org/10.1109/ACCESS.2020.2972627.</w:t>
       </w:r>
     </w:p>
     <w:p>
@@ -6388,7 +6423,7 @@
         <w:pStyle w:val="BodyText"/>
       </w:pPr>
       <w:r>
-        <w:t xml:space="preserve">[10] L.A. Zadeh, Fuzzy sets, Information and Control 8 (1965) 338–353. https://doi.org/10.1016/S0019-9958(65)90241-X.</w:t>
+        <w:t xml:space="preserve">[10] G. Vial, Understanding digital transformation: A review and a research agenda, J. Strateg. Inf. Syst. 28 (2) (2019) 118–144. https://doi.org/10.1016/j.jsis.2019.01.003.</w:t>
       </w:r>
     </w:p>
     <w:p>
@@ -6396,7 +6431,7 @@
         <w:pStyle w:val="BodyText"/>
       </w:pPr>
       <w:r>
-        <w:t xml:space="preserve">[11] J.-S.R. Jang, ANFIS: Adaptive-network-based fuzzy inference system, IEEE Transactions on Systems, Man, and Cybernetics 23 (1993) 665–685. https://doi.org/10.1109/21.256541.</w:t>
+        <w:t xml:space="preserve">[11] Y. Duan, J. S. Edwards, Y. K. Dwivedi, Artificial intelligence for decision making in the era of Big Data – evolution, challenges and research agenda, Int. J. Inf. Manag. 48 (2019) 63–71. https://doi.org/10.1016/j.ijinfomgt.2019.01.021.</w:t>
       </w:r>
     </w:p>
     <w:p>
@@ -6404,7 +6439,7 @@
         <w:pStyle w:val="BodyText"/>
       </w:pPr>
       <w:r>
-        <w:t xml:space="preserve">[12] P.V. de Campos Souza, Fuzzy neural networks and neuro-fuzzy networks: A review the main techniques and applications used in the literature, Applied Soft Computing 92 (2020) 106275. https://doi.org/10.1016/j.asoc.2020.106275.</w:t>
+        <w:t xml:space="preserve">[12] L. A. Zadeh, Fuzzy sets, Inf. Control 8 (3) (1965) 338–353. https://doi.org/10.1016/S0019-9958(65)90241-X.</w:t>
       </w:r>
     </w:p>
     <w:p>
@@ -6412,7 +6447,7 @@
         <w:pStyle w:val="BodyText"/>
       </w:pPr>
       <w:r>
-        <w:t xml:space="preserve">[13] D. Srilatha, G.K. Shyam, Cloud-based intrusion detection using kernel fuzzy clustering and optimal type-2 fuzzy neural network, Cluster Computing 24 (2021) 2657–2672. https://doi.org/10.1007/s10586-021-03281-9.</w:t>
+        <w:t xml:space="preserve">[13] J.-S. R. Jang, ANFIS: Adaptive-network-based fuzzy inference system, IEEE Trans. Syst. Man Cybern. 23 (3) (1993) 665–685. https://doi.org/10.1109/21.256541.</w:t>
       </w:r>
     </w:p>
     <w:p>
@@ -6420,7 +6455,7 @@
         <w:pStyle w:val="BodyText"/>
       </w:pPr>
       <w:r>
-        <w:t xml:space="preserve">[14] J. Liu, W. Yinchai, T.C. Siong, X. Li, L. Zhao, F. Wei, On the combination of adaptive neuro-fuzzy inference system and deep residual network for improving detection rates on intrusion detection, PLOS ONE 17 (2022) e0278819. https://doi.org/10.1371/journal.pone.0278819.</w:t>
+        <w:t xml:space="preserve">[14] P. V. de Campos Souza, Fuzzy neural networks and neuro-fuzzy networks: A review the main techniques and applications used in the literature, Appl. Soft Comput. 92 (2020) 106275. https://doi.org/10.1016/j.asoc.2020.106275.</w:t>
       </w:r>
     </w:p>
     <w:p>
@@ -6428,7 +6463,7 @@
         <w:pStyle w:val="BodyText"/>
       </w:pPr>
       <w:r>
-        <w:t xml:space="preserve">[15] J. Liu, W. Yinchai, T.C. Siong, X. Li, L. Zhao, F. Wei, A hybrid interpretable deep structure based on adaptive neuro-fuzzy inference system, decision tree, and K-means for intrusion detection, Scientific Reports 12 (2022) 20770. https://doi.org/10.1038/s41598-022-23765-x.</w:t>
+        <w:t xml:space="preserve">[15] A. Fernández, F. Herrera, O. Cordón, M. J. del Jesus, F. Marcelloni, Evolutionary fuzzy systems for explainable artificial intelligence: Why, when, what for, and where to?, IEEE Comput. Intell. Mag. 14 (1) (2019) 69–81. https://doi.org/10.1109/MCI.2018.2881645.</w:t>
       </w:r>
     </w:p>
     <w:p>
@@ -6436,7 +6471,7 @@
         <w:pStyle w:val="BodyText"/>
       </w:pPr>
       <w:r>
-        <w:t xml:space="preserve">[16] C. Elkan, The foundations of cost-sensitive learning, in: Proceedings of the 17th International Joint Conference on Artificial Intelligence (IJCAI), 2001: pp. 973–978.</w:t>
+        <w:t xml:space="preserve">[16] A. N. Toosi, M. Kahani, A new approach to intrusion detection based on an evolutionary soft computing model using neuro-fuzzy classifiers, Comput. Commun. 30 (10) (2007) 2201–2212. https://doi.org/10.1016/j.comcom.2007.05.002.</w:t>
       </w:r>
     </w:p>
     <w:p>
@@ -6444,7 +6479,7 @@
         <w:pStyle w:val="BodyText"/>
       </w:pPr>
       <w:r>
-        <w:t xml:space="preserve">[17] A. Telikani, N.E. Rudbardeh, S. Soleymanpour, A. Shahbahrami, J. Shen, G. Gaydadjiev, R. Hassanpour, A cost-sensitive machine learning model with multitask learning for intrusion detection in IoT, IEEE Transactions on Industrial Informatics 20 (2024) 3880–3890. https://doi.org/10.1109/TII.2023.3314208.</w:t>
+        <w:t xml:space="preserve">[17] A. H. Hamamoto, L. F. Carvalho, L. D. H. Sampaio, T. Abrão, M. L. Proença, Network anomaly detection system using genetic algorithm and fuzzy logic, Expert Syst. Appl. 92 (2018) 390–402. https://doi.org/10.1016/j.eswa.2017.09.013.</w:t>
       </w:r>
     </w:p>
     <w:p>
@@ -6452,7 +6487,7 @@
         <w:pStyle w:val="BodyText"/>
       </w:pPr>
       <w:r>
-        <w:t xml:space="preserve">[18] S.M. Lundberg, S.-I. Lee, A unified approach to interpreting model predictions, Advances in Neural Information Processing Systems 30 (2017). https://doi.org/10.48550/arXiv.1705.07874.</w:t>
+        <w:t xml:space="preserve">[18] M. Alalhareth, S.-C. Hong, An adaptive intrusion detection system in the Internet of Medical Things using fuzzy-based learning, Sensors 23 (22) (2023) 9247. https://doi.org/10.3390/s23229247.</w:t>
       </w:r>
     </w:p>
     <w:p>
@@ -6460,7 +6495,7 @@
         <w:pStyle w:val="BodyText"/>
       </w:pPr>
       <w:r>
-        <w:t xml:space="preserve">[19] V.Z. Mohale, I.C. Obagbuwa, A systematic review on the integration of explainable artificial intelligence in intrusion detection systems to enhancing transparency and interpretability in cybersecurity, Frontiers in Artificial Intelligence 8 (2025) 1526221. https://doi.org/10.3389/frai.2025.1526221.</w:t>
+        <w:t xml:space="preserve">[19] C. Elkan, The foundations of cost-sensitive learning, in: Proc. 17th Int. Jt. Conf. Artif. Intell. (IJCAI), 2001, pp. 973–978.</w:t>
       </w:r>
     </w:p>
     <w:p>
@@ -6468,7 +6503,7 @@
         <w:pStyle w:val="BodyText"/>
       </w:pPr>
       <w:r>
-        <w:t xml:space="preserve">[20] S. AL, S. Sagiroglu, Explainable artificial intelligence models in intrusion detection systems, Engineering Applications of Artificial Intelligence 144 (2025) 110145. https://doi.org/10.1016/j.engappai.2025.110145.</w:t>
+        <w:t xml:space="preserve">[20] Z.-H. Zhou, X.-Y. Liu, Training cost-sensitive neural networks with methods addressing the class imbalance problem, IEEE Trans. Knowl. Data Eng. 18 (1) (2006) 63–77. https://doi.org/10.1109/TKDE.2006.17.</w:t>
       </w:r>
     </w:p>
     <w:p>
@@ -6476,7 +6511,7 @@
         <w:pStyle w:val="BodyText"/>
       </w:pPr>
       <w:r>
-        <w:t xml:space="preserve">[21] S. Bag, S. Sarkar, I. Bose, Enhancing cybersecurity risk assessment using temporal knowledge graph-based explainable decision support system, Decision Support Systems 198 (2025) 114526. https://doi.org/10.1016/j.dss.2025.114526.</w:t>
+        <w:t xml:space="preserve">[21] N. Gupta, V. Jindal, P. Bedi, CSE-IDS: Using cost-sensitive deep learning and ensemble algorithms to handle class imbalance in network-based intrusion detection systems, Comput. Secur. 112 (2022) 102499. https://doi.org/10.1016/j.cose.2021.102499.</w:t>
       </w:r>
     </w:p>
     <w:p>
@@ -6484,7 +6519,7 @@
         <w:pStyle w:val="BodyText"/>
       </w:pPr>
       <w:r>
-        <w:t xml:space="preserve">[22] J.H. Friedman, Greedy function approximation: A gradient boosting machine, The Annals of Statistics 29 (2001) 1189–1232. https://doi.org/10.1214/aos/1013203451.</w:t>
+        <w:t xml:space="preserve">[22] A. Telikani, N. E. Rudbardeh, S. Soleymanpour, A. Shahbahrami, J. Shen, G. Gaydadjiev, R. Hassanpour, A cost-sensitive machine learning model with multitask learning for intrusion detection in IoT, IEEE Trans. Ind. Inform. 20 (3) (2024) 3880–3890. https://doi.org/10.1109/TII.2023.3314208.</w:t>
       </w:r>
     </w:p>
     <w:p>
@@ -6492,7 +6527,7 @@
         <w:pStyle w:val="BodyText"/>
       </w:pPr>
       <w:r>
-        <w:t xml:space="preserve">[23] I. Goodfellow, Y. Bengio, A. Courville, Deep Learning, MIT Press, Cambridge, MA, 2016.</w:t>
+        <w:t xml:space="preserve">[23] A. Barredo Arrieta, N. Díaz-Rodríguez, J. Del Ser, A. Bennetot, S. Tabik, A. Barbado, S. Garcia, S. Gil-Lopez, D. Molina, R. Benjamins, R. Chatila, F. Herrera, Explainable artificial intelligence (XAI): Concepts, taxonomies, opportunities and challenges toward responsible AI, Inf. Fusion 58 (2020) 82–115. https://doi.org/10.1016/j.inffus.2019.12.012.</w:t>
       </w:r>
     </w:p>
     <w:p>
@@ -6500,7 +6535,7 @@
         <w:pStyle w:val="BodyText"/>
       </w:pPr>
       <w:r>
-        <w:t xml:space="preserve">[24] M. Tavallaee, E. Bagheri, W. Lu, A.A. Ghorbani, A detailed analysis of the KDD CUP 99 data set, in: Proceedings of the 2009 IEEE Symposium on Computational Intelligence for Security and Defense Applications (CISDA), 2009: pp. 1–6. https://doi.org/10.1109/CISDA.2009.5356528.</w:t>
+        <w:t xml:space="preserve">[24] M. Wang, K. Zheng, Y. Yang, X. Wang, An explainable machine learning framework for intrusion detection systems, IEEE Access 8 (2020) 73127–73141. https://doi.org/10.1109/ACCESS.2020.2988359.</w:t>
       </w:r>
     </w:p>
     <w:p>
@@ -6508,7 +6543,7 @@
         <w:pStyle w:val="BodyText"/>
       </w:pPr>
       <w:r>
-        <w:t xml:space="preserve">[25] B. Efron, R.J. Tibshirani, An Introduction to the Bootstrap, Chapman &amp; Hall/CRC, New York, 1994. https://doi.org/10.1201/9780429246593.</w:t>
+        <w:t xml:space="preserve">[25] A. Alabbadi, F. Bajaber, An intrusion detection system over the IoT data streams using eXplainable Artificial Intelligence (XAI), Sensors 25 (3) (2025) 847. https://doi.org/10.3390/s25030847.</w:t>
       </w:r>
     </w:p>
     <w:p>
@@ -6516,7 +6551,7 @@
         <w:pStyle w:val="BodyText"/>
       </w:pPr>
       <w:r>
-        <w:t xml:space="preserve">[26] F. Wilcoxon, Individual comparisons by ranking methods, Biometrics Bulletin 1 (1945) 80–83. https://doi.org/10.2307/3001968.</w:t>
+        <w:t xml:space="preserve">[26] S. AL, S. Sagiroglu, Explainable artificial intelligence models in intrusion detection systems, Eng. Appl. Artif. Intell. 144 (2025) 110145. https://doi.org/10.1016/j.engappai.2025.110145.</w:t>
       </w:r>
     </w:p>
     <w:p>
@@ -6524,7 +6559,7 @@
         <w:pStyle w:val="BodyText"/>
       </w:pPr>
       <w:r>
-        <w:t xml:space="preserve">[27] M. Ring, S. Wunderlich, D. Scheuring, D. Landes, A. Hotho, A survey of network-based intrusion detection data sets, Computers &amp; Security 86 (2019) 147–167. https://doi.org/10.1016/j.cose.2019.06.005.</w:t>
+        <w:t xml:space="preserve">[27] S. Bag, S. Sarkar, I. Bose, Enhancing cybersecurity risk assessment using temporal knowledge graph-based explainable decision support system, Decis. Support Syst. 198 (2025) 114526. https://doi.org/10.1016/j.dss.2025.114526.</w:t>
       </w:r>
     </w:p>
     <w:p>
@@ -6532,7 +6567,55 @@
         <w:pStyle w:val="BodyText"/>
       </w:pPr>
       <w:r>
-        <w:t xml:space="preserve">[28] M.A. Al-Garadi, A. Mohamed, A.K. Al-Ali, X. Du, I. Ali, M. Guizani, A survey of machine and deep learning methods for Internet of Things (IoT) security, IEEE Communications Surveys &amp; Tutorials 22 (2020) 1646–1685. https://doi.org/10.1109/COMST.2020.2988293.</w:t>
+        <w:t xml:space="preserve">[28] J. H. Friedman, Greedy function approximation: A gradient boosting machine, Ann. Stat. 29 (5) (2001) 1189–1232. https://doi.org/10.1214/aos/1013203451.</w:t>
+      </w:r>
+    </w:p>
+    <w:p>
+      <w:pPr>
+        <w:pStyle w:val="BodyText"/>
+      </w:pPr>
+      <w:r>
+        <w:t xml:space="preserve">[29] M. Abdar, F. Pourpanah, S. Hussain, D. Rezazadegan, L. Liu, M. Ghavamzadeh, P. Fieguth, X. Cao, A. Khosravi, U. R. Acharya, V. Makarenkov, S. Nahavandi, A review of uncertainty quantification in deep learning: Techniques, applications and challenges, Inf. Fusion 76 (2021) 243–297. https://doi.org/10.1016/j.inffus.2021.05.008.</w:t>
+      </w:r>
+    </w:p>
+    <w:p>
+      <w:pPr>
+        <w:pStyle w:val="BodyText"/>
+      </w:pPr>
+      <w:r>
+        <w:t xml:space="preserve">[30] M. Tavallaee, E. Bagheri, W. Lu, A. A. Ghorbani, A detailed analysis of the KDD CUP 99 data set, in: Proc. 2009 IEEE Symp. Comput. Intell. Secur. Def. Appl. (CISDA), 2009, pp. 1–6. https://doi.org/10.1109/CISDA.2009.5356528.</w:t>
+      </w:r>
+    </w:p>
+    <w:p>
+      <w:pPr>
+        <w:pStyle w:val="BodyText"/>
+      </w:pPr>
+      <w:r>
+        <w:t xml:space="preserve">[31] B. Efron, R. J. Tibshirani, An Introduction to the Bootstrap, Chapman &amp; Hall/CRC, New York, 1994. https://doi.org/10.1201/9780429246593.</w:t>
+      </w:r>
+    </w:p>
+    <w:p>
+      <w:pPr>
+        <w:pStyle w:val="BodyText"/>
+      </w:pPr>
+      <w:r>
+        <w:t xml:space="preserve">[32] F. Wilcoxon, Individual comparisons by ranking methods, Biom. Bull. 1 (6) (1945) 80–83. https://doi.org/10.2307/3001968.</w:t>
+      </w:r>
+    </w:p>
+    <w:p>
+      <w:pPr>
+        <w:pStyle w:val="BodyText"/>
+      </w:pPr>
+      <w:r>
+        <w:t xml:space="preserve">[33] M. Ring, S. Wunderlich, D. Scheuring, D. Landes, A. Hotho, A survey of network-based intrusion detection data sets, Comput. Secur. 86 (2019) 147–167. https://doi.org/10.1016/j.cose.2019.06.005.</w:t>
+      </w:r>
+    </w:p>
+    <w:p>
+      <w:pPr>
+        <w:pStyle w:val="BodyText"/>
+      </w:pPr>
+      <w:r>
+        <w:t xml:space="preserve">[34] M. A. Al-Garadi, A. Mohamed, A. K. Al-Ali, X. Du, I. Ali, M. Guizani, A survey of machine and deep learning methods for Internet of Things (IoT) security, IEEE Commun. Surv. Tutor. 22 (3) (2020) 1646–1685. https://doi.org/10.1109/COMST.2020.2988293.</w:t>
       </w:r>
     </w:p>
     <w:bookmarkEnd w:id="31"/>

</xml_diff>

<commit_message>
Apply author-final version with fixes: Electronics (Q2) ref replaced by Q1 conformal reject-option ref, 39 refs renumbered; Yao sentence; Eq. (5) set braces; Data availability aligned; Chivukula per Crossref; 12 pp (page limit lifted); no result numbers changed
</commit_message>
<xml_diff>
--- a/paper/elsevier/manuscript.docx
+++ b/paper/elsevier/manuscript.docx
@@ -67,7 +67,7 @@
         <w:pStyle w:val="AbstractText"/>
       </w:pPr>
       <w:r>
-        <w:t xml:space="preserve">Security operations centres (SOCs) receive risk scores from machine-learning detectors, but the step from score to action usually rests on a single hand-set threshold. This paper treats alert triage as a knowledge-based decision problem. A multilayer perceptron (MLP) estimates attack propensity, fuzzy membership functions map it to Low, Medium and High risk bands, and three production rules assign Monitor, Soft-block or Escalate. On 20,000 NSL-KDD test alerts, gradient boosting is the stronger detector (ROC-AUC 0.947 against 0.908). On the same MLP scores, however, the rule base lowers the mean triage cost to 3.068 (95% CI [3.016, 3.118]), compared with 3.264 for a 0.5 threshold and 4.309 for top-20% escalation. It also raises attack coverage from 0.655 to 0.686 (Wilcoxon</w:t>
+        <w:t xml:space="preserve">Security operations centres (SOCs) receive risk scores from machine-learning detectors, but the step from score to action usually rests on a single hand-set threshold. This paper treats alert triage as a knowledge-based decision problem. A multilayer perceptron (MLP) estimates attack propensity, fuzzy membership functions map it to Low, Medium and High risk bands, and three production rules assign Monitor, Soft-block or Escalate. On 20,000 NSL-KDD test alerts, gradient boosting is the stronger detector (ROC-AUC 0.947 against 0.908). On the same MLP scores, however, the rule base lowers the mean triage cost to 3.068 (95% CI [3.016, 3.118]), compared with 3.264 for a 0.5 threshold and 4.309 for top-20% escalation (both Wilcoxon</w:t>
       </w:r>
       <w:r>
         <w:t xml:space="preserve"> </w:t>
@@ -83,7 +83,7 @@
         <w:t xml:space="preserve"> </w:t>
       </w:r>
       <w:r>
-        <w:t xml:space="preserve">&lt; 10⁻¹⁰⁰). The rule base is cheaper than both crisp rules in all ten repeated runs (</w:t>
+        <w:t xml:space="preserve">&lt; 10⁻¹⁰⁰). It also raises attack coverage from 0.655 to 0.686. The rule base is cheaper than both crisp rules in all ten repeated runs (</w:t>
       </w:r>
       <w:r>
         <w:rPr>
@@ -132,7 +132,7 @@
         <w:pStyle w:val="FirstParagraph"/>
       </w:pPr>
       <w:r>
-        <w:t xml:space="preserve">Security operations centres (SOCs) collect, analyse and respond to an organisation’s security alerts [1]. Their analysts receive far more alerts than they can investigate, and the resulting alert fatigue is a central operational risk [2,3]. Intrusion-detection research has progressed from classical data mining [4,5] to deep networks trained on benchmarks such as NSL-KDD [6,7]. Most of this work, however, ends with a risk score and judges it by accuracy or by the area under the receiver operating characteristic curve (ROC-AUC). A SOC manager faces a different question: with limited analyst capacity and unequal error costs, which alerts should be monitored, contained or escalated? This is a data-driven decision task rather than a prediction task [8,9].</w:t>
+        <w:t xml:space="preserve">Security operations centres (SOCs) collect, analyse and respond to an organisation’s security alerts [1]. Their analysts receive far more alerts than they can investigate, and the resulting alert fatigue is a central operational risk [2,3]. Intrusion-detection research has progressed from classical data mining [4,5] to deep networks trained on benchmarks such as NSL-KDD [6,7]. Most of this work, however, ends with a risk score and judges it by accuracy or by the area under the receiver operating characteristic curve (ROC-AUC). A SOC manager faces a different question: with limited analyst capacity and unequal error costs, which alerts should be monitored, contained or escalated? This is a data-driven decision task rather than a prediction task [8,9]. Decision-theoretic three-way decisions already choose among acceptance, rejection and deferment under stated losses [10], and recent SOC studies learn when to defer alerts to analysts [11] or prioritise them by reinforcement learning [12], while research on SOC human–AI teaming [13] and concept drift [14] addresses the operating context.</w:t>
       </w:r>
     </w:p>
     <w:p>
@@ -376,7 +376,7 @@
                 <w:rFonts w:ascii="Times New Roman" w:hAnsi="Times New Roman"/>
                 <w:sz w:val="18"/>
               </w:rPr>
-              <w:t xml:space="preserve">Toosi [10]</w:t>
+              <w:t xml:space="preserve">Toosi [15]</w:t>
             </w:r>
           </w:p>
         </w:tc>
@@ -521,7 +521,7 @@
                 <w:rFonts w:ascii="Times New Roman" w:hAnsi="Times New Roman"/>
                 <w:sz w:val="18"/>
               </w:rPr>
-              <w:t xml:space="preserve">Hamamoto [11]</w:t>
+              <w:t xml:space="preserve">Hamamoto [16]</w:t>
             </w:r>
           </w:p>
         </w:tc>
@@ -666,7 +666,7 @@
                 <w:rFonts w:ascii="Times New Roman" w:hAnsi="Times New Roman"/>
                 <w:sz w:val="18"/>
               </w:rPr>
-              <w:t xml:space="preserve">Alalhareth [12]</w:t>
+              <w:t xml:space="preserve">Alalhareth [17]</w:t>
             </w:r>
           </w:p>
         </w:tc>
@@ -1101,7 +1101,7 @@
                 <w:rFonts w:ascii="Times New Roman" w:hAnsi="Times New Roman"/>
                 <w:sz w:val="18"/>
               </w:rPr>
-              <w:t xml:space="preserve">Gupta [13]</w:t>
+              <w:t xml:space="preserve">Gupta [18]</w:t>
             </w:r>
           </w:p>
         </w:tc>
@@ -1246,7 +1246,7 @@
                 <w:rFonts w:ascii="Times New Roman" w:hAnsi="Times New Roman"/>
                 <w:sz w:val="18"/>
               </w:rPr>
-              <w:t xml:space="preserve">Telikani [14]</w:t>
+              <w:t xml:space="preserve">Telikani [19]</w:t>
             </w:r>
           </w:p>
         </w:tc>
@@ -1391,7 +1391,7 @@
                 <w:rFonts w:ascii="Times New Roman" w:hAnsi="Times New Roman"/>
                 <w:sz w:val="18"/>
               </w:rPr>
-              <w:t xml:space="preserve">Wang [15]</w:t>
+              <w:t xml:space="preserve">Wang [20]</w:t>
             </w:r>
           </w:p>
         </w:tc>
@@ -1536,7 +1536,7 @@
                 <w:rFonts w:ascii="Times New Roman" w:hAnsi="Times New Roman"/>
                 <w:sz w:val="18"/>
               </w:rPr>
-              <w:t xml:space="preserve">Alabbadi [16]</w:t>
+              <w:t xml:space="preserve">Alabbadi [21]</w:t>
             </w:r>
           </w:p>
         </w:tc>
@@ -1681,7 +1681,7 @@
                 <w:rFonts w:ascii="Times New Roman" w:hAnsi="Times New Roman"/>
                 <w:sz w:val="18"/>
               </w:rPr>
-              <w:t xml:space="preserve">Wang [17]</w:t>
+              <w:t xml:space="preserve">Wang [22]</w:t>
             </w:r>
           </w:p>
         </w:tc>
@@ -1826,7 +1826,7 @@
                 <w:rFonts w:ascii="Times New Roman" w:hAnsi="Times New Roman"/>
                 <w:sz w:val="18"/>
               </w:rPr>
-              <w:t xml:space="preserve">Bag [18]</w:t>
+              <w:t xml:space="preserve">Bag [23]</w:t>
             </w:r>
           </w:p>
         </w:tc>
@@ -2197,7 +2197,7 @@
         <w:pStyle w:val="BodyText"/>
       </w:pPr>
       <w:r>
-        <w:t xml:space="preserve">Fuzzy and neuro-fuzzy systems suit this decision step, because they express learned evidence as linguistic rules that operators can read and audit [19–22]. As Table 1 shows, existing studies use these strengths for other purposes. Fuzzy intrusion detectors use rules to improve accuracy, but they still output a binary alarm [10–12]. Cost-sensitive learning [23,24] enters intrusion detection mainly through weighted training losses [13,14], so the cost model shapes the classifier but does not choose the action. Explainable artificial intelligence (XAI) methods explain a score after it has been produced [15,16,25]. Reinforcement learning can rank alerts by priority, yet the ranking does not assign an action [17]. Knowledge-based decision support has shown the value of explicit domain knowledge in cyber-risk assessment [18]. None of these studies, however, combines an action-cost model, readable rules and graded responses in one triage layer.</w:t>
+        <w:t xml:space="preserve">Fuzzy and neuro-fuzzy systems suit this decision step, because they express learned evidence as linguistic rules that operators can read and audit [24–27]. As Table 1 shows, existing studies use these strengths for other purposes. Fuzzy intrusion detectors use rules to improve accuracy, but they still output a binary alarm [15–17]. Cost-sensitive learning [28,29] enters intrusion detection mainly through weighted training losses [18,19], so the cost model shapes the classifier but does not choose the action. Explainable artificial intelligence (XAI) methods explain a score after it has been produced [20,21,30]. Reinforcement learning can rank alerts by priority, yet the ranking does not assign an action [12,22]. The closest designs to ours defer uncertain cases. Three-way decision models assign each case to acceptance, rejection or deferment, with thresholds derived from loss functions [10], and Jalalvand et al. [11] learn when to defer alerts from analyst feedback. Neither assigns graded SOC actions through a readable fuzzy rule base driven by a learned score. Knowledge-based decision support has shown the value of explicit domain knowledge in cyber-risk assessment [23]. However, to our knowledge none of these studies combines an action-cost model, readable rules and graded responses in one triage layer.</w:t>
       </w:r>
     </w:p>
     <w:p>
@@ -2897,7 +2897,7 @@
         <w:t xml:space="preserve"> </w:t>
       </w:r>
       <w:r>
-        <w:t xml:space="preserve">Two shoulder functions and one triangular function map the propensity to three linguistic risk bands [19]. With the clipping operator</w:t>
+        <w:t xml:space="preserve">Two shoulder functions and one triangular function map the propensity to three linguistic risk bands [24]. With the clipping operator</w:t>
       </w:r>
       <w:r>
         <w:t xml:space="preserve"> </w:t>
@@ -3873,7 +3873,7 @@
                 <m:rPr>
                   <m:sty m:val="p"/>
                 </m:rPr>
-                <m:t>(</m:t>
+                <m:t>{</m:t>
               </m:r>
               <m:r>
                 <m:t>L</m:t>
@@ -3900,7 +3900,7 @@
                 <m:rPr>
                   <m:sty m:val="p"/>
                 </m:rPr>
-                <m:t>)</m:t>
+                <m:t>}</m:t>
               </m:r>
             </m:lim>
           </m:limLow>
@@ -4285,7 +4285,7 @@
           <wp:inline>
             <wp:extent cx="5943600" cy="3123939"/>
             <wp:effectExtent b="0" l="0" r="0" t="0"/>
-            <wp:docPr descr="Fig. 1. Fuzzy mapping from attack propensity to action on the seed-42 test set. The membership functions of Eqs. (2)–(4) and rules R1–R3 switch action at p = 9/32 and p = 23/32 (dotted lines). The Soft-block band holds only 776 alerts (3.9%), yet it produces the entire cost gain over the 0.5 threshold." title="" id="12" name="Picture"/>
+            <wp:docPr descr="Fig. 1. Fuzzy mapping from attack propensity to action on the seed-42 test set. The membership functions of Eqs. (2)–(4) and rules R1–R3 switch action at p = 9/32 and p = 23/32 (dotted lines). Dashed: Bayes soft-block threshold p = 2/11. The Soft-block band holds only 776 alerts (3.9%), yet it produces the entire cost gain over the 0.5 threshold." title="" id="12" name="Picture"/>
             <a:graphic>
               <a:graphicData uri="http://schemas.openxmlformats.org/drawingml/2006/picture">
                 <pic:pic>
@@ -4408,7 +4408,23 @@
         <w:t xml:space="preserve"> </w:t>
       </w:r>
       <w:r>
-        <w:t xml:space="preserve">= 23/32 (dotted lines). The Soft-block band holds only 776 alerts (3.9%), yet it produces the entire cost gain over the 0.5 threshold.</w:t>
+        <w:t xml:space="preserve">= 23/32 (dotted lines). Dashed: Bayes soft-block threshold</w:t>
+      </w:r>
+      <w:r>
+        <w:t xml:space="preserve"> </w:t>
+      </w:r>
+      <w:r>
+        <w:rPr>
+          <w:i/>
+          <w:iCs/>
+        </w:rPr>
+        <w:t xml:space="preserve">p</w:t>
+      </w:r>
+      <w:r>
+        <w:t xml:space="preserve"> </w:t>
+      </w:r>
+      <w:r>
+        <w:t xml:space="preserve">= 2/11. The Soft-block band holds only 776 alerts (3.9%), yet it produces the entire cost gain over the 0.5 threshold.</w:t>
       </w:r>
     </w:p>
     <w:p>
@@ -5208,7 +5224,7 @@
         <w:t xml:space="preserve"> </w:t>
       </w:r>
       <w:r>
-        <w:t xml:space="preserve">as a calibrated probability, although deep-model scores do not guarantee calibration [26]. Because soft-blocking costs less than escalation for both classes, the Bayes rule never escalates. Instead, it soft-blocks every alert with</w:t>
+        <w:t xml:space="preserve">as a calibrated probability, although deep-model scores do not guarantee calibration [31]. Because soft-blocking costs less than escalation for both classes, the Bayes rule never escalates. Instead, it soft-blocks every alert with</w:t>
       </w:r>
       <w:r>
         <w:t xml:space="preserve"> </w:t>
@@ -5274,7 +5290,7 @@
         <w:t xml:space="preserve"> </w:t>
       </w:r>
       <w:r>
-        <w:t xml:space="preserve">The experiments used the NSL-KDD benchmark [27]. For reproducibility on a standard CPU, we sampled 40,000 training records and split them, with stratification, into 34,000 training and 6,000 validation records. The scaler and encoder were fitted on the training split only. The test set was capped at 20,000 records with an attack rate of 0.568. Because it contains attack types absent from training, the evaluation includes a realistic distribution shift.</w:t>
+        <w:t xml:space="preserve">The experiments used the NSL-KDD benchmark [32]. For reproducibility on a standard CPU, we sampled 40,000 training records and split them, with stratification, into 34,000 training and 6,000 validation records. The scaler and encoder were fitted on the training split only. The test set was capped at 20,000 records with an attack rate of 0.568. Because it contains attack types absent from training, the evaluation includes a realistic distribution shift.</w:t>
       </w:r>
     </w:p>
     <w:p>
@@ -5292,7 +5308,7 @@
         <w:t xml:space="preserve"> </w:t>
       </w:r>
       <w:r>
-        <w:t xml:space="preserve">Three detectors were compared: class-balanced logistic regression, gradient boosting (GB) [28] with scikit-learn defaults, and the MLP alone. The proposed policy uses the MLP propensity, so any benefit must come from better decisions rather than better scores. Three decision baselines acted on the same scores. The first escalates every alert scored above 0.5 and monitors the rest. The second tunes this threshold on validation data to minimise cost, a form of threshold moving [24]. The third escalates the 20% highest-scored alerts, mimicking a fixed analyst capacity. Learned policies [17] were excluded because they need interaction data that the benchmark lacks.</w:t>
+        <w:t xml:space="preserve">Three detectors were compared: class-balanced logistic regression, gradient boosting (GB) [33] with scikit-learn defaults, and the MLP alone. The proposed policy uses the MLP propensity, so any benefit must come from better decisions rather than better scores. Three decision baselines acted on the same scores. The first escalates every alert scored above 0.5 and monitors the rest. The second tunes this threshold on validation data to minimise cost, a form of threshold moving [29]. The third escalates the 20% highest-scored alerts, mimicking a fixed analyst capacity. Learned policies [12,22] were excluded because they need interaction or logged decision data with outcome feedback, which the benchmark lacks.</w:t>
       </w:r>
     </w:p>
     <w:p>
@@ -5310,7 +5326,7 @@
         <w:t xml:space="preserve"> </w:t>
       </w:r>
       <w:r>
-        <w:t xml:space="preserve">On the seed-42 test set, we report percentile 95% confidence intervals (CIs) from 2,000 paired bootstrap resamples of alerts [29]. Per-alert cost differences were tested with the two-sided Wilcoxon signed-rank test [30]. The full pipeline was repeated for seeds 42–51, and the seed-level costs were compared with a paired Wilcoxon test. Two sweeps varied the missed-attack cost</w:t>
+        <w:t xml:space="preserve">On the seed-42 test set, we report percentile 95% confidence intervals (CIs) from 2,000 paired bootstrap resamples of alerts [34]. Per-alert cost differences were tested with the two-sided Wilcoxon signed-rank test [35], which treats alerts as independent. The full pipeline was repeated for seeds 42–51, and the seed-level costs were compared with a paired Wilcoxon test. Two sweeps varied the missed-attack cost</w:t>
       </w:r>
       <w:r>
         <w:t xml:space="preserve"> </w:t>
@@ -7862,19 +7878,16 @@
         </m:bar>
       </m:oMath>
       <w:r>
-        <w:t xml:space="preserve">: mean triage cost, Eq. (6). UE: unnecessary escalations. Panel B2 CIs are given in</w:t>
-      </w:r>
-      <w:r>
-        <w:t xml:space="preserve"> </w:t>
+        <w:t xml:space="preserve">: mean triage cost, Eq. (6). UE: unnecessary escalations. Panel B2 CIs: Supplementary Material (</w:t>
       </w:r>
       <w:r>
         <w:rPr>
           <w:rStyle w:val="VerbatimChar"/>
         </w:rPr>
-        <w:t xml:space="preserve">results/table2_decision.csv</w:t>
-      </w:r>
-      <w:r>
-        <w:t xml:space="preserve">.</w:t>
+        <w:t xml:space="preserve">table2_decision.csv</w:t>
+      </w:r>
+      <w:r>
+        <w:t xml:space="preserve">).</w:t>
       </w:r>
     </w:p>
     <w:p>
@@ -7904,7 +7917,7 @@
           <wp:inline>
             <wp:extent cx="5943600" cy="3518185"/>
             <wp:effectExtent b="0" l="0" r="0" t="0"/>
-            <wp:docPr descr="Fig. 2. Mean triage cost as a function of the missed-attack cost CFN (seed 42). The fuzzy rule policy is cheaper than the 0.5 threshold at every tested value from 2 to 30. Top-20% escalation is cheaper only for CFN ≤ 3 (shaded region). Error bars show paired bootstrap 95% CIs at the default CFN = 10 (dotted line)." title="" id="17" name="Picture"/>
+            <wp:docPr descr="Fig. 2. Mean triage cost as a function of the missed-attack cost CFN (seed 42). The fuzzy rule policy is cheaper than the 0.5 threshold at every tested value from 2 to 30. Top-20% escalation is cheaper only for CFN ≤ 3 (shaded region). Error bars show paired bootstrap 95% CIs at the default CFN = 10 (dotted line). Log axis; dashed: Bayes reference." title="" id="17" name="Picture"/>
             <a:graphic>
               <a:graphicData uri="http://schemas.openxmlformats.org/drawingml/2006/picture">
                 <pic:pic>
@@ -8023,7 +8036,7 @@
         <w:t xml:space="preserve"> </w:t>
       </w:r>
       <w:r>
-        <w:t xml:space="preserve">= 10 (dotted line).</w:t>
+        <w:t xml:space="preserve">= 10 (dotted line). Log axis; dashed: Bayes reference.</w:t>
       </w:r>
     </w:p>
     <w:p>
@@ -8337,7 +8350,7 @@
         <w:t xml:space="preserve"> </w:t>
       </w:r>
       <w:r>
-        <w:t xml:space="preserve">reproduce every action of the rule base (Panel B2), so the benefit comes from the intermediate containment band rather than from fuzziness as such. What fuzziness adds is a graded explanation of each decision. The rule base is also not cost-optimal. The Bayes cost rule is 0.903 cheaper per alert, because soft-blocking dominates escalation under Eq. (6), and it therefore soft-blocks 8,631 alerts, or 43% of all traffic. Threshold tuning does not match the rule base either. Validation tuning moves the threshold only to</w:t>
+        <w:t xml:space="preserve">reproduce every action of the rule base (Panel B2), so the benefit comes from the intermediate containment band rather than from fuzziness as such. What fuzziness adds is a graded explanation of each decision. The rule base is also not cost-optimal. The Bayes cost rule is 0.903 cheaper per alert, because soft-blocking dominates escalation under Eq. (6), and it therefore soft-blocks 8,631 alerts, or 43% of all traffic. This is the Bayesian minimum-risk procedure from which decision-theoretic three-way decisions derive their loss-based thresholds [10]. Threshold tuning does not match the rule base either. Validation tuning moves the threshold only to</w:t>
       </w:r>
       <w:r>
         <w:t xml:space="preserve"> </w:t>
@@ -8357,7 +8370,7 @@
         </m:r>
       </m:oMath>
       <w:r>
-        <w:t xml:space="preserve">, at a cost of 3.278, because unseen attack types shift the test scores. Only an oracle threshold of 0.10 or lower, chosen on the test set, would win, with a minimum cost of 2.929 at</w:t>
+        <w:t xml:space="preserve">, at a cost of 3.278, presumably because unseen attack types shift the test scores. Only an oracle threshold of 0.10 or lower, chosen on the test set, would win, with a minimum cost of 2.929 at</w:t>
       </w:r>
       <w:r>
         <w:t xml:space="preserve"> </w:t>
@@ -8377,7 +8390,7 @@
         </m:r>
       </m:oMath>
       <w:r>
-        <w:t xml:space="preserve">. Finally, the layer transfers to another detector. On GB scores, the same rules cost 3.004, which is lower than on MLP scores (</w:t>
+        <w:t xml:space="preserve">. This agrees with the cost-sensitive learning result that asymmetric costs move the optimal cut-off away from 0.5 [28]. Finally, the layer transfers to another detector. On GB scores, the same rules cost 3.004, which is lower than on MLP scores (</w:t>
       </w:r>
       <m:oMath>
         <m:r>
@@ -8412,17 +8425,17 @@
         <w:t xml:space="preserve"> </w:t>
       </w:r>
       <w:r>
-        <w:t xml:space="preserve">Detectors should be judged by the decisions they enable, since the action rule alone changed the cost by up to 1.242 per alert. Because the cost matrix sets the mix of actions, organisations should price false containment before automating Soft-block. The band boundaries give managers a workload lever that needs no retraining. Named rules with logged firing strengths give each action an audit trail that post hoc attributions lack [15,16], which supports compliance and human–AI teaming [3].</w:t>
+        <w:t xml:space="preserve">Detectors should be judged by the decisions they enable, since the action rule alone changed the cost by up to 1.242 per alert. Because the cost matrix sets the mix of actions, organisations should price false containment before automating Soft-block. Unlike a deferral band that hands uncertain alerts to analysts [11], the Soft-block band acts automatically, so the 387 alerts it keeps from the analyst queue carry an explicit price for false containment (Eq. (6)). Conformal classification with a reject option [36] instead abstains on uncertain cases under distribution-free error-rate guarantees rather than a cost matrix, and combining the two is a natural extension. The band boundaries give managers a workload lever that needs no retraining, which matters because NIDS alert streams are reported to be dominated by false positives [37]. Named rules with logged firing strengths give each action an audit trail that post hoc attributions lack [20,21], which supports compliance and human–AI teaming [3,13].</w:t>
       </w:r>
     </w:p>
     <w:bookmarkEnd w:id="19"/>
-    <w:bookmarkStart w:id="20" w:name="limitations-and-conclusion"/>
+    <w:bookmarkStart w:id="20" w:name="limitations"/>
     <w:p>
       <w:pPr>
         <w:pStyle w:val="Heading1"/>
       </w:pPr>
       <w:r>
-        <w:t xml:space="preserve">5. Limitations and conclusion</w:t>
+        <w:t xml:space="preserve">5. Limitations</w:t>
       </w:r>
     </w:p>
     <w:p>
@@ -8430,19 +8443,29 @@
         <w:pStyle w:val="FirstParagraph"/>
       </w:pPr>
       <w:r>
-        <w:t xml:space="preserve">The study has four main limitations. First, fixed bands respond to the distribution of the scores, not only to their ranking. Seed 48, the weakest replicate (cost 3.282, coverage 0.626), has a typical ROC-AUC of 0.900 but the lowest accuracy at the 0.5 threshold (0.757). Adaptive tuning in the style of ANFIS [20], or bands derived from the cost matrix, could reduce this sensitivity and narrow the gap to the Bayes rule. Second, NSL-KDD is a laboratory benchmark from 2009 that does not reflect modern enterprise, cloud or Internet of Things traffic [31,32], and the data were subsampled under a single protocol. Third, the cost matrix is illustrative rather than elicited from a real SOC, and the coverage metric counts containment as covering an attack. Fourth, the study involved no deployment, drift analysis or user study.</w:t>
+        <w:t xml:space="preserve">The study has four main limitations. First, fixed bands respond to the distribution of the scores, not only to their ranking. Seed 48, the weakest replicate (cost 3.282, coverage 0.626), has a typical ROC-AUC of 0.900 but the lowest accuracy at the 0.5 threshold (0.757). Adaptive tuning in the style of ANFIS [25], or bands derived from the cost matrix, could reduce this sensitivity and narrow the gap to the Bayes rule. Second, NSL-KDD is a laboratory benchmark from 2009 that does not reflect modern enterprise, cloud or Internet of Things traffic [38,39], and the data were subsampled under a single protocol. Third, the cost matrix is illustrative rather than elicited from a real SOC, and the coverage metric counts containment as covering an attack. Fourth, the study involved no deployment, drift analysis [14] or user study.</w:t>
+      </w:r>
+    </w:p>
+    <w:bookmarkEnd w:id="20"/>
+    <w:bookmarkStart w:id="21" w:name="conclusion"/>
+    <w:p>
+      <w:pPr>
+        <w:pStyle w:val="Heading1"/>
+      </w:pPr>
+      <w:r>
+        <w:t xml:space="preserve">6. Conclusion</w:t>
       </w:r>
     </w:p>
     <w:p>
       <w:pPr>
-        <w:pStyle w:val="BodyText"/>
-      </w:pPr>
-      <w:r>
-        <w:t xml:space="preserve">In conclusion, a fuzzy–neural rule base can serve as a knowledge-based decision layer for alert triage. On NSL-KDD, it achieved lower cost and higher coverage than crisp threshold and capacity rules across seeds, cost ratios and band widths, and its gain comes from the intermediate containment band. Future work will derive the bands from costs elicited in real SOCs and validate the layer in live operation.</w:t>
+        <w:pStyle w:val="FirstParagraph"/>
+      </w:pPr>
+      <w:r>
+        <w:t xml:space="preserve">In conclusion, a fuzzy–neural rule base can serve as a knowledge-based decision layer for alert triage. On NSL-KDD, it achieved lower cost and higher coverage than crisp threshold and capacity rules across seeds, cost ratios and band widths, and its gain comes from the intermediate containment band. Future work will derive the bands from costs elicited in real SOCs and validate the layer in live operation. It will also add distribution-free error guarantees for the automatic actions through conformal classification with a reject option [36].</w:t>
       </w:r>
     </w:p>
-    <w:bookmarkEnd w:id="20"/>
-    <w:bookmarkStart w:id="22" w:name="data-availability"/>
+    <w:bookmarkEnd w:id="21"/>
+    <w:bookmarkStart w:id="23" w:name="data-availability"/>
     <w:p>
       <w:pPr>
         <w:pStyle w:val="Heading1"/>
@@ -8462,7 +8485,7 @@
       <w:r>
         <w:t xml:space="preserve"> </w:t>
       </w:r>
-      <w:hyperlink r:id="rId21">
+      <w:hyperlink r:id="rId22">
         <w:r>
           <w:rPr>
             <w:rStyle w:val="Hyperlink"/>
@@ -8471,11 +8494,23 @@
         </w:r>
       </w:hyperlink>
       <w:r>
-        <w:t xml:space="preserve">. NSL-KDD is available from the Canadian Institute for Cybersecurity [27].</w:t>
+        <w:t xml:space="preserve">. NSL-KDD is available from the Canadian Institute for Cybersecurity [32]. The Supplementary Material contains the same code, the result files (including the Panel B2 confidence intervals of Table 2 in</w:t>
+      </w:r>
+      <w:r>
+        <w:t xml:space="preserve"> </w:t>
+      </w:r>
+      <w:r>
+        <w:rPr>
+          <w:rStyle w:val="VerbatimChar"/>
+        </w:rPr>
+        <w:t xml:space="preserve">table2_decision.csv</w:t>
+      </w:r>
+      <w:r>
+        <w:t xml:space="preserve">), both figures as vector files and a graphical abstract.</w:t>
       </w:r>
     </w:p>
-    <w:bookmarkEnd w:id="22"/>
-    <w:bookmarkStart w:id="23" w:name="declaration-of-competing-interest"/>
+    <w:bookmarkEnd w:id="23"/>
+    <w:bookmarkStart w:id="24" w:name="declaration-of-competing-interest"/>
     <w:p>
       <w:pPr>
         <w:pStyle w:val="Heading1"/>
@@ -8492,14 +8527,14 @@
         <w:t xml:space="preserve">The author declares no known competing financial interests or personal relationships that could have appeared to influence the work reported in this paper.</w:t>
       </w:r>
     </w:p>
-    <w:bookmarkEnd w:id="23"/>
-    <w:bookmarkStart w:id="24" w:name="funding"/>
+    <w:bookmarkEnd w:id="24"/>
+    <w:bookmarkStart w:id="25" w:name="X1f74eb43af444059c7518034463b6c89b1cacf4"/>
     <w:p>
       <w:pPr>
         <w:pStyle w:val="Heading1"/>
       </w:pPr>
       <w:r>
-        <w:t xml:space="preserve">Funding</w:t>
+        <w:t xml:space="preserve">Declaration of generative AI and AI-assisted technologies in the manuscript preparation process</w:t>
       </w:r>
     </w:p>
     <w:p>
@@ -8507,11 +8542,29 @@
         <w:pStyle w:val="FirstParagraph"/>
       </w:pPr>
       <w:r>
+        <w:t xml:space="preserve">During the preparation of this work the author used Grok Bot, an AI-assisted writing and coding tool, to help with language editing, code refactoring, reference checking and formatting. After using this tool, the author reviewed and edited the content as needed and takes full responsibility for the content of the published article. All results, tables and figures were generated by the author’s executable code from the public dataset; no figure was created with generative AI.</w:t>
+      </w:r>
+    </w:p>
+    <w:bookmarkEnd w:id="25"/>
+    <w:bookmarkStart w:id="26" w:name="funding"/>
+    <w:p>
+      <w:pPr>
+        <w:pStyle w:val="Heading1"/>
+      </w:pPr>
+      <w:r>
+        <w:t xml:space="preserve">Funding</w:t>
+      </w:r>
+    </w:p>
+    <w:p>
+      <w:pPr>
+        <w:pStyle w:val="FirstParagraph"/>
+      </w:pPr>
+      <w:r>
         <w:t xml:space="preserve">This research did not receive any specific grant from funding agencies in the public, commercial, or not-for-profit sectors.</w:t>
       </w:r>
     </w:p>
-    <w:bookmarkEnd w:id="24"/>
-    <w:bookmarkStart w:id="25" w:name="credit-authorship-contribution-statement"/>
+    <w:bookmarkEnd w:id="26"/>
+    <w:bookmarkStart w:id="27" w:name="credit-authorship-contribution-statement"/>
     <w:p>
       <w:pPr>
         <w:pStyle w:val="Heading1"/>
@@ -8538,32 +8591,22 @@
         <w:t xml:space="preserve">Conceptualization, Methodology, Software, Validation, Formal analysis, Investigation, Data curation, Visualization, Writing – original draft, Writing – review &amp; editing.</w:t>
       </w:r>
     </w:p>
-    <w:bookmarkEnd w:id="25"/>
-    <w:bookmarkStart w:id="26" w:name="X1f74eb43af444059c7518034463b6c89b1cacf4"/>
+    <w:bookmarkEnd w:id="27"/>
+    <w:bookmarkStart w:id="28" w:name="references"/>
     <w:p>
       <w:pPr>
         <w:pStyle w:val="Heading1"/>
       </w:pPr>
       <w:r>
-        <w:t xml:space="preserve">Declaration of generative AI and AI-assisted technologies in the manuscript preparation process</w:t>
+        <w:t xml:space="preserve">References</w:t>
       </w:r>
     </w:p>
     <w:p>
       <w:pPr>
-        <w:pStyle w:val="FirstParagraph"/>
-      </w:pPr>
-      <w:r>
-        <w:t xml:space="preserve">During the preparation of this work the author used Grok Bot, an AI-assisted writing and coding tool, to help with language editing, code refactoring, reference checking and formatting. After using this tool, the author reviewed and edited the content as needed and takes full responsibility for the content of the published article. All results, tables and figures were generated by the author’s executable code from the public dataset; no figure was created with generative AI.</w:t>
-      </w:r>
-    </w:p>
-    <w:bookmarkEnd w:id="26"/>
-    <w:bookmarkStart w:id="27" w:name="references"/>
-    <w:p>
-      <w:pPr>
-        <w:pStyle w:val="Heading1"/>
-      </w:pPr>
-      <w:r>
-        <w:t xml:space="preserve">References</w:t>
+        <w:pStyle w:val="Reference"/>
+      </w:pPr>
+      <w:r>
+        <w:t xml:space="preserve">[1] M. Vielberth, F. Böhm, I. Fichtinger, G. Pernul, Security operations center: A systematic study and open challenges, IEEE Access 8 (2020) 227756–227779. https://doi.org/10.1109/ACCESS.2020.3045514.</w:t>
       </w:r>
     </w:p>
     <w:p>
@@ -8571,7 +8614,7 @@
         <w:pStyle w:val="Reference"/>
       </w:pPr>
       <w:r>
-        <w:t xml:space="preserve">[1] M. Vielberth, F. Böhm, I. Fichtinger, G. Pernul, Security operations center: A systematic study and open challenges, IEEE Access 8 (2020) 227756–227779. https://doi.org/10.1109/ACCESS.2020.3045514.</w:t>
+        <w:t xml:space="preserve">[2] S. Tariq, M. Baruwal Chhetri, S. Nepal, C. Paris, Alert fatigue in security operations centres: Research challenges and opportunities, ACM Comput. Surv. 57 (9) (2025) 1–38. https://doi.org/10.1145/3723158.</w:t>
       </w:r>
     </w:p>
     <w:p>
@@ -8579,7 +8622,7 @@
         <w:pStyle w:val="Reference"/>
       </w:pPr>
       <w:r>
-        <w:t xml:space="preserve">[2] S. Tariq, M. Baruwal Chhetri, S. Nepal, C. Paris, Alert fatigue in security operations centres: Research challenges and opportunities, ACM Comput. Surv. 57 (9) (2025) 1–38. https://doi.org/10.1145/3723158.</w:t>
+        <w:t xml:space="preserve">[3] M. Baruwal Chhetri, S. Tariq, R. Singh, F. Jalalvand, C. Paris, S. Nepal, Towards human–AI teaming to mitigate alert fatigue in security operations centres, ACM Trans. Internet Technol. 24 (3) (2024) 1–22. https://doi.org/10.1145/3670009.</w:t>
       </w:r>
     </w:p>
     <w:p>
@@ -8587,7 +8630,7 @@
         <w:pStyle w:val="Reference"/>
       </w:pPr>
       <w:r>
-        <w:t xml:space="preserve">[3] M. Baruwal Chhetri, S. Tariq, R. Singh, F. Jalalvand, C. Paris, S. Nepal, Towards human–AI teaming to mitigate alert fatigue in security operations centres, ACM Trans. Internet Technol. 24 (3) (2024) 1–22. https://doi.org/10.1145/3670009.</w:t>
+        <w:t xml:space="preserve">[4] H.-J. Liao, C.-H. Richard Lin, Y.-C. Lin, K.-Y. Tung, Intrusion detection system: A comprehensive review, J. Netw. Comput. Appl. 36 (1) (2013) 16–24. https://doi.org/10.1016/j.jnca.2012.09.004.</w:t>
       </w:r>
     </w:p>
     <w:p>
@@ -8595,7 +8638,7 @@
         <w:pStyle w:val="Reference"/>
       </w:pPr>
       <w:r>
-        <w:t xml:space="preserve">[4] H.-J. Liao, C.-H. Richard Lin, Y.-C. Lin, K.-Y. Tung, Intrusion detection system: A comprehensive review, J. Netw. Comput. Appl. 36 (1) (2013) 16–24. https://doi.org/10.1016/j.jnca.2012.09.004.</w:t>
+        <w:t xml:space="preserve">[5] A. L. Buczak, E. Guven, A survey of data mining and machine learning methods for cyber security intrusion detection, IEEE Commun. Surv. Tutor. 18 (2) (2016) 1153–1176. https://doi.org/10.1109/COMST.2015.2494502.</w:t>
       </w:r>
     </w:p>
     <w:p>
@@ -8603,7 +8646,7 @@
         <w:pStyle w:val="Reference"/>
       </w:pPr>
       <w:r>
-        <w:t xml:space="preserve">[5] A. L. Buczak, E. Guven, A survey of data mining and machine learning methods for cyber security intrusion detection, IEEE Commun. Surv. Tutor. 18 (2) (2016) 1153–1176. https://doi.org/10.1109/COMST.2015.2494502.</w:t>
+        <w:t xml:space="preserve">[6] R. Vinayakumar, M. Alazab, K. P. Soman, P. Poornachandran, A. Al-Nemrat, S. Venkatraman, Deep learning approach for intelligent intrusion detection system, IEEE Access 7 (2019) 41525–41550. https://doi.org/10.1109/ACCESS.2019.2895334.</w:t>
       </w:r>
     </w:p>
     <w:p>
@@ -8611,7 +8654,7 @@
         <w:pStyle w:val="Reference"/>
       </w:pPr>
       <w:r>
-        <w:t xml:space="preserve">[6] R. Vinayakumar, M. Alazab, K. P. Soman, P. Poornachandran, A. Al-Nemrat, S. Venkatraman, Deep learning approach for intelligent intrusion detection system, IEEE Access 7 (2019) 41525–41550. https://doi.org/10.1109/ACCESS.2019.2895334.</w:t>
+        <w:t xml:space="preserve">[7] T. Su, H. Sun, J. Zhu, S. Wang, Y. Li, BAT: Deep learning methods on network intrusion detection using NSL-KDD dataset, IEEE Access 8 (2020) 29575–29585. https://doi.org/10.1109/ACCESS.2020.2972627.</w:t>
       </w:r>
     </w:p>
     <w:p>
@@ -8619,7 +8662,7 @@
         <w:pStyle w:val="Reference"/>
       </w:pPr>
       <w:r>
-        <w:t xml:space="preserve">[7] T. Su, H. Sun, J. Zhu, S. Wang, Y. Li, BAT: Deep learning methods on network intrusion detection using NSL-KDD dataset, IEEE Access 8 (2020) 29575–29585. https://doi.org/10.1109/ACCESS.2020.2972627.</w:t>
+        <w:t xml:space="preserve">[8] G. Phillips-Wren, M. Daly, F. Burstein, Reconciling business intelligence, analytics and decision support systems: More data, deeper insight, Decis. Support Syst. 146 (2021) 113560. https://doi.org/10.1016/j.dss.2021.113560.</w:t>
       </w:r>
     </w:p>
     <w:p>
@@ -8627,7 +8670,7 @@
         <w:pStyle w:val="Reference"/>
       </w:pPr>
       <w:r>
-        <w:t xml:space="preserve">[8] G. Vial, Understanding digital transformation: A review and a research agenda, J. Strateg. Inf. Syst. 28 (2) (2019) 118–144. https://doi.org/10.1016/j.jsis.2019.01.003.</w:t>
+        <w:t xml:space="preserve">[9] Y. Duan, J. S. Edwards, Y. K. Dwivedi, Artificial intelligence for decision making in the era of Big Data – evolution, challenges and research agenda, Int. J. Inf. Manag. 48 (2019) 63–71. https://doi.org/10.1016/j.ijinfomgt.2019.01.021.</w:t>
       </w:r>
     </w:p>
     <w:p>
@@ -8635,7 +8678,7 @@
         <w:pStyle w:val="Reference"/>
       </w:pPr>
       <w:r>
-        <w:t xml:space="preserve">[9] Y. Duan, J. S. Edwards, Y. K. Dwivedi, Artificial intelligence for decision making in the era of Big Data – evolution, challenges and research agenda, Int. J. Inf. Manag. 48 (2019) 63–71. https://doi.org/10.1016/j.ijinfomgt.2019.01.021.</w:t>
+        <w:t xml:space="preserve">[10] Y. Yao, Three-way decisions with probabilistic rough sets, Inf. Sci. 180 (3) (2010) 341–353. https://doi.org/10.1016/j.ins.2009.09.021.</w:t>
       </w:r>
     </w:p>
     <w:p>
@@ -8643,7 +8686,7 @@
         <w:pStyle w:val="Reference"/>
       </w:pPr>
       <w:r>
-        <w:t xml:space="preserve">[10] A. N. Toosi, M. Kahani, A new approach to intrusion detection based on an evolutionary soft computing model using neuro-fuzzy classifiers, Comput. Commun. 30 (10) (2007) 2201–2212. https://doi.org/10.1016/j.comcom.2007.05.002.</w:t>
+        <w:t xml:space="preserve">[11] F. Jalalvand, M. Baruwal Chhetri, S. Nepal, C. Paris, Adaptive alert prioritisation in security operations centres via learning to defer with human feedback, Inf. Sci. 760 (2027) 124128. https://doi.org/10.1016/j.ins.2026.124128.</w:t>
       </w:r>
     </w:p>
     <w:p>
@@ -8651,7 +8694,7 @@
         <w:pStyle w:val="Reference"/>
       </w:pPr>
       <w:r>
-        <w:t xml:space="preserve">[11] A. H. Hamamoto, L. F. Carvalho, L. D. H. Sampaio, T. Abrão, M. L. Proença, Network anomaly detection system using genetic algorithm and fuzzy logic, Expert Syst. Appl. 92 (2018) 390–402. https://doi.org/10.1016/j.eswa.2017.09.013.</w:t>
+        <w:t xml:space="preserve">[12] L. Chavali, A. Krishnan, P. Saxena, B. Mitra, A. Sreevallabh Chivukula, Off-policy actor-critic deep reinforcement learning methods for alert prioritization in intrusion detection systems, Comput. Secur. 142 (2024) 103854. https://doi.org/10.1016/j.cose.2024.103854.</w:t>
       </w:r>
     </w:p>
     <w:p>
@@ -8659,7 +8702,7 @@
         <w:pStyle w:val="Reference"/>
       </w:pPr>
       <w:r>
-        <w:t xml:space="preserve">[12] M. Alalhareth, S.-C. Hong, An adaptive intrusion detection system in the Internet of Medical Things using fuzzy-based learning, Sensors 23 (22) (2023) 9247. https://doi.org/10.3390/s23229247.</w:t>
+        <w:t xml:space="preserve">[13] M. Kumar, R. Rani, G. Epiphaniou, C. Maple, Adaptive trust-aware SOC human–AI teaming for resilient operations, Comput. Secur. 169 (2026) 104971. https://doi.org/10.1016/j.cose.2026.104971.</w:t>
       </w:r>
     </w:p>
     <w:p>
@@ -8667,7 +8710,7 @@
         <w:pStyle w:val="Reference"/>
       </w:pPr>
       <w:r>
-        <w:t xml:space="preserve">[13] N. Gupta, V. Jindal, P. Bedi, CSE-IDS: Using cost-sensitive deep learning and ensemble algorithms to handle class imbalance in network-based intrusion detection systems, Comput. Secur. 112 (2022) 102499. https://doi.org/10.1016/j.cose.2021.102499.</w:t>
+        <w:t xml:space="preserve">[14] R. Vaarandi, A. Guerra-Manzanares, NAD-CD: Addressing concept drift in network IDS alert classification for security operations centers, J. Inf. Secur. Appl. 103 (2026) 104663. https://doi.org/10.1016/j.jisa.2026.104663.</w:t>
       </w:r>
     </w:p>
     <w:p>
@@ -8675,7 +8718,7 @@
         <w:pStyle w:val="Reference"/>
       </w:pPr>
       <w:r>
-        <w:t xml:space="preserve">[14] A. Telikani, N. E. Rudbardeh, S. Soleymanpour, A. Shahbahrami, J. Shen, G. Gaydadjiev, R. Hassanpour, A cost-sensitive machine learning model with multitask learning for intrusion detection in IoT, IEEE Trans. Ind. Inform. 20 (3) (2024) 3880–3890. https://doi.org/10.1109/TII.2023.3314208.</w:t>
+        <w:t xml:space="preserve">[15] A. N. Toosi, M. Kahani, A new approach to intrusion detection based on an evolutionary soft computing model using neuro-fuzzy classifiers, Comput. Commun. 30 (10) (2007) 2201–2212. https://doi.org/10.1016/j.comcom.2007.05.002.</w:t>
       </w:r>
     </w:p>
     <w:p>
@@ -8683,7 +8726,7 @@
         <w:pStyle w:val="Reference"/>
       </w:pPr>
       <w:r>
-        <w:t xml:space="preserve">[15] M. Wang, K. Zheng, Y. Yang, X. Wang, An explainable machine learning framework for intrusion detection systems, IEEE Access 8 (2020) 73127–73141. https://doi.org/10.1109/ACCESS.2020.2988359.</w:t>
+        <w:t xml:space="preserve">[16] A. H. Hamamoto, L. F. Carvalho, L. D. H. Sampaio, T. Abrão, M. L. Proença, Network anomaly detection system using genetic algorithm and fuzzy logic, Expert Syst. Appl. 92 (2018) 390–402. https://doi.org/10.1016/j.eswa.2017.09.013.</w:t>
       </w:r>
     </w:p>
     <w:p>
@@ -8691,7 +8734,7 @@
         <w:pStyle w:val="Reference"/>
       </w:pPr>
       <w:r>
-        <w:t xml:space="preserve">[16] A. Alabbadi, F. Bajaber, An intrusion detection system over the IoT data streams using eXplainable Artificial Intelligence (XAI), Sensors 25 (3) (2025) 847. https://doi.org/10.3390/s25030847.</w:t>
+        <w:t xml:space="preserve">[17] M. Alalhareth, S.-C. Hong, An adaptive intrusion detection system in the Internet of Medical Things using fuzzy-based learning, Sensors 23 (22) (2023) 9247. https://doi.org/10.3390/s23229247.</w:t>
       </w:r>
     </w:p>
     <w:p>
@@ -8699,7 +8742,7 @@
         <w:pStyle w:val="Reference"/>
       </w:pPr>
       <w:r>
-        <w:t xml:space="preserve">[17] X. Wang, X. Yang, X. Liang, X. Zhang, W. Zhang, X. Gong, Combating alert fatigue with AlertPro: Context-aware alert prioritization using reinforcement learning for multi-step attack detection, Comput. Secur. 137 (2024) 103583. https://doi.org/10.1016/j.cose.2023.103583.</w:t>
+        <w:t xml:space="preserve">[18] N. Gupta, V. Jindal, P. Bedi, CSE-IDS: Using cost-sensitive deep learning and ensemble algorithms to handle class imbalance in network-based intrusion detection systems, Comput. Secur. 112 (2022) 102499. https://doi.org/10.1016/j.cose.2021.102499.</w:t>
       </w:r>
     </w:p>
     <w:p>
@@ -8707,7 +8750,7 @@
         <w:pStyle w:val="Reference"/>
       </w:pPr>
       <w:r>
-        <w:t xml:space="preserve">[18] S. Bag, S. Sarkar, I. Bose, Enhancing cybersecurity risk assessment using temporal knowledge graph-based explainable decision support system, Decis. Support Syst. 198 (2025) 114526. https://doi.org/10.1016/j.dss.2025.114526.</w:t>
+        <w:t xml:space="preserve">[19] A. Telikani, N. E. Rudbardeh, S. Soleymanpour, A. Shahbahrami, J. Shen, G. Gaydadjiev, R. Hassanpour, A cost-sensitive machine learning model with multitask learning for intrusion detection in IoT, IEEE Trans. Ind. Inform. 20 (3) (2024) 3880–3890. https://doi.org/10.1109/TII.2023.3314208.</w:t>
       </w:r>
     </w:p>
     <w:p>
@@ -8715,7 +8758,7 @@
         <w:pStyle w:val="Reference"/>
       </w:pPr>
       <w:r>
-        <w:t xml:space="preserve">[19] L. A. Zadeh, Fuzzy sets, Inf. Control 8 (3) (1965) 338–353. https://doi.org/10.1016/S0019-9958(65)90241-X.</w:t>
+        <w:t xml:space="preserve">[20] M. Wang, K. Zheng, Y. Yang, X. Wang, An explainable machine learning framework for intrusion detection systems, IEEE Access 8 (2020) 73127–73141. https://doi.org/10.1109/ACCESS.2020.2988359.</w:t>
       </w:r>
     </w:p>
     <w:p>
@@ -8723,7 +8766,7 @@
         <w:pStyle w:val="Reference"/>
       </w:pPr>
       <w:r>
-        <w:t xml:space="preserve">[20] J.-S. R. Jang, ANFIS: Adaptive-network-based fuzzy inference system, IEEE Trans. Syst. Man Cybern. 23 (3) (1993) 665–685. https://doi.org/10.1109/21.256541.</w:t>
+        <w:t xml:space="preserve">[21] A. Alabbadi, F. Bajaber, An intrusion detection system over the IoT data streams using eXplainable Artificial Intelligence (XAI), Sensors 25 (3) (2025) 847. https://doi.org/10.3390/s25030847.</w:t>
       </w:r>
     </w:p>
     <w:p>
@@ -8731,7 +8774,7 @@
         <w:pStyle w:val="Reference"/>
       </w:pPr>
       <w:r>
-        <w:t xml:space="preserve">[21] P. V. de Campos Souza, Fuzzy neural networks and neuro-fuzzy networks: A review the main techniques and applications used in the literature, Appl. Soft Comput. 92 (2020) 106275. https://doi.org/10.1016/j.asoc.2020.106275.</w:t>
+        <w:t xml:space="preserve">[22] X. Wang, X. Yang, X. Liang, X. Zhang, W. Zhang, X. Gong, Combating alert fatigue with AlertPro: Context-aware alert prioritization using reinforcement learning for multi-step attack detection, Comput. Secur. 137 (2024) 103583. https://doi.org/10.1016/j.cose.2023.103583.</w:t>
       </w:r>
     </w:p>
     <w:p>
@@ -8739,7 +8782,7 @@
         <w:pStyle w:val="Reference"/>
       </w:pPr>
       <w:r>
-        <w:t xml:space="preserve">[22] A. Fernández, F. Herrera, O. Cordón, M. J. del Jesus, F. Marcelloni, Evolutionary fuzzy systems for explainable artificial intelligence: Why, when, what for, and where to?, IEEE Comput. Intell. Mag. 14 (1) (2019) 69–81. https://doi.org/10.1109/MCI.2018.2881645.</w:t>
+        <w:t xml:space="preserve">[23] S. Bag, S. Sarkar, I. Bose, Enhancing cybersecurity risk assessment using temporal knowledge graph-based explainable decision support system, Decis. Support Syst. 198 (2025) 114526. https://doi.org/10.1016/j.dss.2025.114526.</w:t>
       </w:r>
     </w:p>
     <w:p>
@@ -8747,7 +8790,7 @@
         <w:pStyle w:val="Reference"/>
       </w:pPr>
       <w:r>
-        <w:t xml:space="preserve">[23] C. Elkan, The foundations of cost-sensitive learning, in: Proc. 17th Int. Jt. Conf. Artif. Intell. (IJCAI), 2001, pp. 973–978.</w:t>
+        <w:t xml:space="preserve">[24] L. A. Zadeh, Fuzzy sets, Inf. Control 8 (3) (1965) 338–353. https://doi.org/10.1016/S0019-9958(65)90241-X.</w:t>
       </w:r>
     </w:p>
     <w:p>
@@ -8755,7 +8798,7 @@
         <w:pStyle w:val="Reference"/>
       </w:pPr>
       <w:r>
-        <w:t xml:space="preserve">[24] Z.-H. Zhou, X.-Y. Liu, Training cost-sensitive neural networks with methods addressing the class imbalance problem, IEEE Trans. Knowl. Data Eng. 18 (1) (2006) 63–77. https://doi.org/10.1109/TKDE.2006.17.</w:t>
+        <w:t xml:space="preserve">[25] J.-S. R. Jang, ANFIS: Adaptive-network-based fuzzy inference system, IEEE Trans. Syst. Man Cybern. 23 (3) (1993) 665–685. https://doi.org/10.1109/21.256541.</w:t>
       </w:r>
     </w:p>
     <w:p>
@@ -8763,7 +8806,7 @@
         <w:pStyle w:val="Reference"/>
       </w:pPr>
       <w:r>
-        <w:t xml:space="preserve">[25] A. Barredo Arrieta, N. Díaz-Rodríguez, J. Del Ser, A. Bennetot, S. Tabik, A. Barbado, S. Garcia, S. Gil-Lopez, D. Molina, R. Benjamins, R. Chatila, F. Herrera, Explainable artificial intelligence (XAI): Concepts, taxonomies, opportunities and challenges toward responsible AI, Inf. Fusion 58 (2020) 82–115. https://doi.org/10.1016/j.inffus.2019.12.012.</w:t>
+        <w:t xml:space="preserve">[26] P. V. de Campos Souza, Fuzzy neural networks and neuro-fuzzy networks: A review the main techniques and applications used in the literature, Appl. Soft Comput. 92 (2020) 106275. https://doi.org/10.1016/j.asoc.2020.106275.</w:t>
       </w:r>
     </w:p>
     <w:p>
@@ -8771,7 +8814,7 @@
         <w:pStyle w:val="Reference"/>
       </w:pPr>
       <w:r>
-        <w:t xml:space="preserve">[26] M. Abdar, F. Pourpanah, S. Hussain, D. Rezazadegan, L. Liu, M. Ghavamzadeh, P. Fieguth, X. Cao, A. Khosravi, U. R. Acharya, V. Makarenkov, S. Nahavandi, A review of uncertainty quantification in deep learning: Techniques, applications and challenges, Inf. Fusion 76 (2021) 243–297. https://doi.org/10.1016/j.inffus.2021.05.008.</w:t>
+        <w:t xml:space="preserve">[27] A. Fernández, F. Herrera, O. Cordón, M. J. del Jesus, F. Marcelloni, Evolutionary fuzzy systems for explainable artificial intelligence: Why, when, what for, and where to?, IEEE Comput. Intell. Mag. 14 (1) (2019) 69–81. https://doi.org/10.1109/MCI.2018.2881645.</w:t>
       </w:r>
     </w:p>
     <w:p>
@@ -8779,7 +8822,7 @@
         <w:pStyle w:val="Reference"/>
       </w:pPr>
       <w:r>
-        <w:t xml:space="preserve">[27] M. Tavallaee, E. Bagheri, W. Lu, A. A. Ghorbani, A detailed analysis of the KDD CUP 99 data set, in: Proc. 2009 IEEE Symp. Comput. Intell. Secur. Def. Appl. (CISDA), 2009, pp. 1–6. https://doi.org/10.1109/CISDA.2009.5356528.</w:t>
+        <w:t xml:space="preserve">[28] C. Elkan, The foundations of cost-sensitive learning, in: Proc. 17th Int. Jt. Conf. Artif. Intell. (IJCAI), 2001, pp. 973–978.</w:t>
       </w:r>
     </w:p>
     <w:p>
@@ -8787,7 +8830,7 @@
         <w:pStyle w:val="Reference"/>
       </w:pPr>
       <w:r>
-        <w:t xml:space="preserve">[28] J. H. Friedman, Greedy function approximation: A gradient boosting machine, Ann. Stat. 29 (5) (2001) 1189–1232. https://doi.org/10.1214/aos/1013203451.</w:t>
+        <w:t xml:space="preserve">[29] Z.-H. Zhou, X.-Y. Liu, Training cost-sensitive neural networks with methods addressing the class imbalance problem, IEEE Trans. Knowl. Data Eng. 18 (1) (2006) 63–77. https://doi.org/10.1109/TKDE.2006.17.</w:t>
       </w:r>
     </w:p>
     <w:p>
@@ -8795,7 +8838,7 @@
         <w:pStyle w:val="Reference"/>
       </w:pPr>
       <w:r>
-        <w:t xml:space="preserve">[29] B. Efron, R. J. Tibshirani, An Introduction to the Bootstrap, Chapman &amp; Hall/CRC, New York, 1994. https://doi.org/10.1201/9780429246593.</w:t>
+        <w:t xml:space="preserve">[30] A. Barredo Arrieta, N. Díaz-Rodríguez, J. Del Ser, A. Bennetot, S. Tabik, A. Barbado, S. Garcia, S. Gil-Lopez, D. Molina, R. Benjamins, R. Chatila, F. Herrera, Explainable artificial intelligence (XAI): Concepts, taxonomies, opportunities and challenges toward responsible AI, Inf. Fusion 58 (2020) 82–115. https://doi.org/10.1016/j.inffus.2019.12.012.</w:t>
       </w:r>
     </w:p>
     <w:p>
@@ -8803,7 +8846,7 @@
         <w:pStyle w:val="Reference"/>
       </w:pPr>
       <w:r>
-        <w:t xml:space="preserve">[30] F. Wilcoxon, Individual comparisons by ranking methods, Biom. Bull. 1 (6) (1945) 80–83. https://doi.org/10.2307/3001968.</w:t>
+        <w:t xml:space="preserve">[31] M. Abdar, F. Pourpanah, S. Hussain, D. Rezazadegan, L. Liu, M. Ghavamzadeh, P. Fieguth, X. Cao, A. Khosravi, U. R. Acharya, V. Makarenkov, S. Nahavandi, A review of uncertainty quantification in deep learning: Techniques, applications and challenges, Inf. Fusion 76 (2021) 243–297. https://doi.org/10.1016/j.inffus.2021.05.008.</w:t>
       </w:r>
     </w:p>
     <w:p>
@@ -8811,7 +8854,7 @@
         <w:pStyle w:val="Reference"/>
       </w:pPr>
       <w:r>
-        <w:t xml:space="preserve">[31] M. Ring, S. Wunderlich, D. Scheuring, D. Landes, A. Hotho, A survey of network-based intrusion detection data sets, Comput. Secur. 86 (2019) 147–167. https://doi.org/10.1016/j.cose.2019.06.005.</w:t>
+        <w:t xml:space="preserve">[32] M. Tavallaee, E. Bagheri, W. Lu, A. A. Ghorbani, A detailed analysis of the KDD CUP 99 data set, in: Proc. 2009 IEEE Symp. Comput. Intell. Secur. Def. Appl. (CISDA), 2009, pp. 1–6. https://doi.org/10.1109/CISDA.2009.5356528.</w:t>
       </w:r>
     </w:p>
     <w:p>
@@ -8819,10 +8862,58 @@
         <w:pStyle w:val="Reference"/>
       </w:pPr>
       <w:r>
-        <w:t xml:space="preserve">[32] M. A. Al-Garadi, A. Mohamed, A. K. Al-Ali, X. Du, I. Ali, M. Guizani, A survey of machine and deep learning methods for Internet of Things (IoT) security, IEEE Commun. Surv. Tutor. 22 (3) (2020) 1646–1685. https://doi.org/10.1109/COMST.2020.2988293.</w:t>
+        <w:t xml:space="preserve">[33] J. H. Friedman, Greedy function approximation: A gradient boosting machine, Ann. Stat. 29 (5) (2001) 1189–1232. https://doi.org/10.1214/aos/1013203451.</w:t>
       </w:r>
     </w:p>
-    <w:bookmarkEnd w:id="27"/>
+    <w:p>
+      <w:pPr>
+        <w:pStyle w:val="Reference"/>
+      </w:pPr>
+      <w:r>
+        <w:t xml:space="preserve">[34] B. Efron, R. J. Tibshirani, An Introduction to the Bootstrap, Chapman &amp; Hall/CRC, New York, 1994. https://doi.org/10.1201/9780429246593.</w:t>
+      </w:r>
+    </w:p>
+    <w:p>
+      <w:pPr>
+        <w:pStyle w:val="Reference"/>
+      </w:pPr>
+      <w:r>
+        <w:t xml:space="preserve">[35] F. Wilcoxon, Individual comparisons by ranking methods, Biom. Bull. 1 (6) (1945) 80–83. https://doi.org/10.2307/3001968.</w:t>
+      </w:r>
+    </w:p>
+    <w:p>
+      <w:pPr>
+        <w:pStyle w:val="Reference"/>
+      </w:pPr>
+      <w:r>
+        <w:t xml:space="preserve">[36] J. Hallberg Szabadváry, T. Löfström, U. Johansson, C. Sönströd, E. Ahlberg, L. Carlsson, Classification with reject option: Distribution-free error guarantees via conformal prediction, Mach. Learn. Appl. 20 (2025) 100664. https://doi.org/10.1016/j.mlwa.2025.100664.</w:t>
+      </w:r>
+    </w:p>
+    <w:p>
+      <w:pPr>
+        <w:pStyle w:val="Reference"/>
+      </w:pPr>
+      <w:r>
+        <w:t xml:space="preserve">[37] H. Albasheer, M. Md Siraj, A. Mubarakali, O. Elsier Tayfour, S. Salih, M. Hamdan, S. Khan, A. Zainal, S. Kamarudeen, Cyber-attack prediction based on network intrusion detection systems for alert correlation techniques: A survey, Sensors 22 (4) (2022) 1494. https://doi.org/10.3390/s22041494.</w:t>
+      </w:r>
+    </w:p>
+    <w:p>
+      <w:pPr>
+        <w:pStyle w:val="Reference"/>
+      </w:pPr>
+      <w:r>
+        <w:t xml:space="preserve">[38] M. Ring, S. Wunderlich, D. Scheuring, D. Landes, A. Hotho, A survey of network-based intrusion detection data sets, Comput. Secur. 86 (2019) 147–167. https://doi.org/10.1016/j.cose.2019.06.005.</w:t>
+      </w:r>
+    </w:p>
+    <w:p>
+      <w:pPr>
+        <w:pStyle w:val="Reference"/>
+      </w:pPr>
+      <w:r>
+        <w:t xml:space="preserve">[39] M. A. Al-Garadi, A. Mohamed, A. K. Al-Ali, X. Du, I. Ali, M. Guizani, A survey of machine and deep learning methods for Internet of Things (IoT) security, IEEE Commun. Surv. Tutor. 22 (3) (2020) 1646–1685. https://doi.org/10.1109/COMST.2020.2988293.</w:t>
+      </w:r>
+    </w:p>
+    <w:bookmarkEnd w:id="28"/>
     <w:sectPr>
       <w:footerReference w:type="default" r:id="rId9"/>
       <w:footnotePr>

</xml_diff>

<commit_message>
Reduce reference list to 20 (author request): 15 Q1 IEEE/Elsevier/MDPI articles + 5 dataset/method sources; sentences re-anchored or softened; Table 1 trimmed to 8 cited rows; 11 pp; no result numbers changed
</commit_message>
<xml_diff>
--- a/paper/elsevier/manuscript.docx
+++ b/paper/elsevier/manuscript.docx
@@ -132,7 +132,7 @@
         <w:pStyle w:val="FirstParagraph"/>
       </w:pPr>
       <w:r>
-        <w:t xml:space="preserve">Security operations centres (SOCs) collect, analyse and respond to an organisation’s security alerts [1]. Their analysts receive far more alerts than they can investigate, and the resulting alert fatigue is a central operational risk [2,3]. Intrusion-detection research has progressed from classical data mining [4,5] to deep networks trained on benchmarks such as NSL-KDD [6,7]. Most of this work, however, ends with a risk score and judges it by accuracy or by the area under the receiver operating characteristic curve (ROC-AUC). A SOC manager faces a different question: with limited analyst capacity and unequal error costs, which alerts should be monitored, contained or escalated? This is a data-driven decision task rather than a prediction task [8,9]. Decision-theoretic three-way decisions already choose among acceptance, rejection and deferment under stated losses [10], and recent SOC studies learn when to defer alerts to analysts [11] or prioritise them by reinforcement learning [12], while research on SOC human–AI teaming [13] and concept drift [14] addresses the operating context.</w:t>
+        <w:t xml:space="preserve">Security operations centres (SOCs) collect, analyse and respond to an organisation’s security alerts [1]. Their analysts receive far more alerts than they can investigate, because network intrusion detectors generate a high volume of low-quality alerts, most of them false positives [2]. Intrusion-detection research ranges from fuzzy and neuro-fuzzy detectors [3,4] to deep networks trained on benchmarks such as NSL-KDD [5]. Most of this work, however, ends with a risk score and judges it by accuracy or by the area under the receiver operating characteristic curve (ROC-AUC). A SOC manager faces a different question: with limited analyst capacity and unequal error costs, which alerts should be monitored, contained or escalated? We therefore treat triage as a decision task rather than a prediction task. Decision-theoretic three-way decisions already choose among acceptance, rejection and deferment under stated losses [6], and recent SOC studies learn when to defer alerts to analysts [7] or prioritise them by reinforcement learning to combat alert fatigue [8].</w:t>
       </w:r>
     </w:p>
     <w:p>
@@ -376,7 +376,7 @@
                 <w:rFonts w:ascii="Times New Roman" w:hAnsi="Times New Roman"/>
                 <w:sz w:val="18"/>
               </w:rPr>
-              <w:t xml:space="preserve">Toosi [15]</w:t>
+              <w:t xml:space="preserve">Toosi [3]</w:t>
             </w:r>
           </w:p>
         </w:tc>
@@ -521,7 +521,7 @@
                 <w:rFonts w:ascii="Times New Roman" w:hAnsi="Times New Roman"/>
                 <w:sz w:val="18"/>
               </w:rPr>
-              <w:t xml:space="preserve">Hamamoto [16]</w:t>
+              <w:t xml:space="preserve">Hamamoto [4]</w:t>
             </w:r>
           </w:p>
         </w:tc>
@@ -666,7 +666,7 @@
                 <w:rFonts w:ascii="Times New Roman" w:hAnsi="Times New Roman"/>
                 <w:sz w:val="18"/>
               </w:rPr>
-              <w:t xml:space="preserve">Alalhareth [17]</w:t>
+              <w:t xml:space="preserve">Vinayakumar [5]</w:t>
             </w:r>
           </w:p>
         </w:tc>
@@ -686,7 +686,7 @@
                 <w:rFonts w:ascii="Times New Roman" w:hAnsi="Times New Roman"/>
                 <w:sz w:val="18"/>
               </w:rPr>
-              <w:t xml:space="preserve">LSTM, fuzzy-tuned training</w:t>
+              <w:t xml:space="preserve">Deep neural network</w:t>
             </w:r>
           </w:p>
         </w:tc>
@@ -706,7 +706,7 @@
                 <w:rFonts w:ascii="Times New Roman" w:hAnsi="Times New Roman"/>
                 <w:sz w:val="18"/>
               </w:rPr>
-              <w:t xml:space="preserve">WUSTL-EHMS-2020</w:t>
+              <w:t xml:space="preserve">NSL-KDD + 5 others</w:t>
             </w:r>
           </w:p>
         </w:tc>
@@ -726,7 +726,7 @@
                 <w:rFonts w:ascii="Times New Roman" w:hAnsi="Times New Roman"/>
                 <w:sz w:val="18"/>
               </w:rPr>
-              <w:t xml:space="preserve">(✓)</w:t>
+              <w:t xml:space="preserve">×</w:t>
             </w:r>
           </w:p>
         </w:tc>
@@ -811,7 +811,7 @@
                 <w:rFonts w:ascii="Times New Roman" w:hAnsi="Times New Roman"/>
                 <w:sz w:val="18"/>
               </w:rPr>
-              <w:t xml:space="preserve">Vinayakumar [6]</w:t>
+              <w:t xml:space="preserve">Gupta [9]</w:t>
             </w:r>
           </w:p>
         </w:tc>
@@ -831,7 +831,7 @@
                 <w:rFonts w:ascii="Times New Roman" w:hAnsi="Times New Roman"/>
                 <w:sz w:val="18"/>
               </w:rPr>
-              <w:t xml:space="preserve">Deep neural network</w:t>
+              <w:t xml:space="preserve">Cost-sensitive deep ensemble</w:t>
             </w:r>
           </w:p>
         </w:tc>
@@ -851,7 +851,7 @@
                 <w:rFonts w:ascii="Times New Roman" w:hAnsi="Times New Roman"/>
                 <w:sz w:val="18"/>
               </w:rPr>
-              <w:t xml:space="preserve">NSL-KDD + 5 others</w:t>
+              <w:t xml:space="preserve">NSL-KDD + 2 others</w:t>
             </w:r>
           </w:p>
         </w:tc>
@@ -871,12 +871,52 @@
                 <w:rFonts w:ascii="Times New Roman" w:hAnsi="Times New Roman"/>
                 <w:sz w:val="18"/>
               </w:rPr>
+              <w:t xml:space="preserve">(✓)</w:t>
+            </w:r>
+          </w:p>
+        </w:tc>
+        <w:tc>
+          <w:tcPr>
+            <w:tcW w:type="dxa" w:w="648"/>
+          </w:tcPr>
+          <w:p>
+            <w:pPr>
+              <w:pStyle w:val="Compact"/>
+              <w:keepNext/>
+              <w:spacing w:before="20" w:after="20" w:line="240" w:lineRule="auto"/>
+              <w:jc w:val="center"/>
+            </w:pPr>
+            <w:r>
+              <w:rPr>
+                <w:rFonts w:ascii="Times New Roman" w:hAnsi="Times New Roman"/>
+                <w:sz w:val="18"/>
+              </w:rPr>
               <w:t xml:space="preserve">×</w:t>
             </w:r>
           </w:p>
         </w:tc>
         <w:tc>
           <w:tcPr>
+            <w:tcW w:type="dxa" w:w="792"/>
+          </w:tcPr>
+          <w:p>
+            <w:pPr>
+              <w:pStyle w:val="Compact"/>
+              <w:keepNext/>
+              <w:spacing w:before="20" w:after="20" w:line="240" w:lineRule="auto"/>
+              <w:jc w:val="center"/>
+            </w:pPr>
+            <w:r>
+              <w:rPr>
+                <w:rFonts w:ascii="Times New Roman" w:hAnsi="Times New Roman"/>
+                <w:sz w:val="18"/>
+              </w:rPr>
+              <w:t xml:space="preserve">×</w:t>
+            </w:r>
+          </w:p>
+        </w:tc>
+        <w:tc>
+          <w:tcPr>
             <w:tcW w:type="dxa" w:w="648"/>
           </w:tcPr>
           <w:p>
@@ -891,47 +931,7 @@
                 <w:rFonts w:ascii="Times New Roman" w:hAnsi="Times New Roman"/>
                 <w:sz w:val="18"/>
               </w:rPr>
-              <w:t xml:space="preserve">×</w:t>
-            </w:r>
-          </w:p>
-        </w:tc>
-        <w:tc>
-          <w:tcPr>
-            <w:tcW w:type="dxa" w:w="792"/>
-          </w:tcPr>
-          <w:p>
-            <w:pPr>
-              <w:pStyle w:val="Compact"/>
-              <w:keepNext/>
-              <w:spacing w:before="20" w:after="20" w:line="240" w:lineRule="auto"/>
-              <w:jc w:val="center"/>
-            </w:pPr>
-            <w:r>
-              <w:rPr>
-                <w:rFonts w:ascii="Times New Roman" w:hAnsi="Times New Roman"/>
-                <w:sz w:val="18"/>
-              </w:rPr>
-              <w:t xml:space="preserve">×</w:t>
-            </w:r>
-          </w:p>
-        </w:tc>
-        <w:tc>
-          <w:tcPr>
-            <w:tcW w:type="dxa" w:w="648"/>
-          </w:tcPr>
-          <w:p>
-            <w:pPr>
-              <w:pStyle w:val="Compact"/>
-              <w:keepNext/>
-              <w:spacing w:before="20" w:after="20" w:line="240" w:lineRule="auto"/>
-              <w:jc w:val="center"/>
-            </w:pPr>
-            <w:r>
-              <w:rPr>
-                <w:rFonts w:ascii="Times New Roman" w:hAnsi="Times New Roman"/>
-                <w:sz w:val="18"/>
-              </w:rPr>
-              <w:t xml:space="preserve">×</w:t>
+              <w:t xml:space="preserve">n.r.</w:t>
             </w:r>
           </w:p>
         </w:tc>
@@ -956,7 +956,7 @@
                 <w:rFonts w:ascii="Times New Roman" w:hAnsi="Times New Roman"/>
                 <w:sz w:val="18"/>
               </w:rPr>
-              <w:t xml:space="preserve">Su [7]</w:t>
+              <w:t xml:space="preserve">Telikani [10]</w:t>
             </w:r>
           </w:p>
         </w:tc>
@@ -976,7 +976,7 @@
                 <w:rFonts w:ascii="Times New Roman" w:hAnsi="Times New Roman"/>
                 <w:sz w:val="18"/>
               </w:rPr>
-              <w:t xml:space="preserve">Bidirectional LSTM + attention</w:t>
+              <w:t xml:space="preserve">Cost-sensitive autoencoder + SVM</w:t>
             </w:r>
           </w:p>
         </w:tc>
@@ -996,7 +996,7 @@
                 <w:rFonts w:ascii="Times New Roman" w:hAnsi="Times New Roman"/>
                 <w:sz w:val="18"/>
               </w:rPr>
-              <w:t xml:space="preserve">NSL-KDD</w:t>
+              <w:t xml:space="preserve">UNSW-NB15, BoT-IoT</w:t>
             </w:r>
           </w:p>
         </w:tc>
@@ -1016,12 +1016,52 @@
                 <w:rFonts w:ascii="Times New Roman" w:hAnsi="Times New Roman"/>
                 <w:sz w:val="18"/>
               </w:rPr>
+              <w:t xml:space="preserve">(✓)</w:t>
+            </w:r>
+          </w:p>
+        </w:tc>
+        <w:tc>
+          <w:tcPr>
+            <w:tcW w:type="dxa" w:w="648"/>
+          </w:tcPr>
+          <w:p>
+            <w:pPr>
+              <w:pStyle w:val="Compact"/>
+              <w:keepNext/>
+              <w:spacing w:before="20" w:after="20" w:line="240" w:lineRule="auto"/>
+              <w:jc w:val="center"/>
+            </w:pPr>
+            <w:r>
+              <w:rPr>
+                <w:rFonts w:ascii="Times New Roman" w:hAnsi="Times New Roman"/>
+                <w:sz w:val="18"/>
+              </w:rPr>
               <w:t xml:space="preserve">×</w:t>
             </w:r>
           </w:p>
         </w:tc>
         <w:tc>
           <w:tcPr>
+            <w:tcW w:type="dxa" w:w="792"/>
+          </w:tcPr>
+          <w:p>
+            <w:pPr>
+              <w:pStyle w:val="Compact"/>
+              <w:keepNext/>
+              <w:spacing w:before="20" w:after="20" w:line="240" w:lineRule="auto"/>
+              <w:jc w:val="center"/>
+            </w:pPr>
+            <w:r>
+              <w:rPr>
+                <w:rFonts w:ascii="Times New Roman" w:hAnsi="Times New Roman"/>
+                <w:sz w:val="18"/>
+              </w:rPr>
+              <w:t xml:space="preserve">×</w:t>
+            </w:r>
+          </w:p>
+        </w:tc>
+        <w:tc>
+          <w:tcPr>
             <w:tcW w:type="dxa" w:w="648"/>
           </w:tcPr>
           <w:p>
@@ -1036,47 +1076,7 @@
                 <w:rFonts w:ascii="Times New Roman" w:hAnsi="Times New Roman"/>
                 <w:sz w:val="18"/>
               </w:rPr>
-              <w:t xml:space="preserve">×</w:t>
-            </w:r>
-          </w:p>
-        </w:tc>
-        <w:tc>
-          <w:tcPr>
-            <w:tcW w:type="dxa" w:w="792"/>
-          </w:tcPr>
-          <w:p>
-            <w:pPr>
-              <w:pStyle w:val="Compact"/>
-              <w:keepNext/>
-              <w:spacing w:before="20" w:after="20" w:line="240" w:lineRule="auto"/>
-              <w:jc w:val="center"/>
-            </w:pPr>
-            <w:r>
-              <w:rPr>
-                <w:rFonts w:ascii="Times New Roman" w:hAnsi="Times New Roman"/>
-                <w:sz w:val="18"/>
-              </w:rPr>
-              <w:t xml:space="preserve">×</w:t>
-            </w:r>
-          </w:p>
-        </w:tc>
-        <w:tc>
-          <w:tcPr>
-            <w:tcW w:type="dxa" w:w="648"/>
-          </w:tcPr>
-          <w:p>
-            <w:pPr>
-              <w:pStyle w:val="Compact"/>
-              <w:keepNext/>
-              <w:spacing w:before="20" w:after="20" w:line="240" w:lineRule="auto"/>
-              <w:jc w:val="center"/>
-            </w:pPr>
-            <w:r>
-              <w:rPr>
-                <w:rFonts w:ascii="Times New Roman" w:hAnsi="Times New Roman"/>
-                <w:sz w:val="18"/>
-              </w:rPr>
-              <w:t xml:space="preserve">×</w:t>
+              <w:t xml:space="preserve">n.r.</w:t>
             </w:r>
           </w:p>
         </w:tc>
@@ -1101,7 +1101,7 @@
                 <w:rFonts w:ascii="Times New Roman" w:hAnsi="Times New Roman"/>
                 <w:sz w:val="18"/>
               </w:rPr>
-              <w:t xml:space="preserve">Gupta [18]</w:t>
+              <w:t xml:space="preserve">Wang [11]</w:t>
             </w:r>
           </w:p>
         </w:tc>
@@ -1121,7 +1121,7 @@
                 <w:rFonts w:ascii="Times New Roman" w:hAnsi="Times New Roman"/>
                 <w:sz w:val="18"/>
               </w:rPr>
-              <w:t xml:space="preserve">Cost-sensitive deep ensemble</w:t>
+              <w:t xml:space="preserve">SHAP explanations</w:t>
             </w:r>
           </w:p>
         </w:tc>
@@ -1141,7 +1141,7 @@
                 <w:rFonts w:ascii="Times New Roman" w:hAnsi="Times New Roman"/>
                 <w:sz w:val="18"/>
               </w:rPr>
-              <w:t xml:space="preserve">NSL-KDD + 2 others</w:t>
+              <w:t xml:space="preserve">NSL-KDD</w:t>
             </w:r>
           </w:p>
         </w:tc>
@@ -1161,12 +1161,52 @@
                 <w:rFonts w:ascii="Times New Roman" w:hAnsi="Times New Roman"/>
                 <w:sz w:val="18"/>
               </w:rPr>
+              <w:t xml:space="preserve">×</w:t>
+            </w:r>
+          </w:p>
+        </w:tc>
+        <w:tc>
+          <w:tcPr>
+            <w:tcW w:type="dxa" w:w="648"/>
+          </w:tcPr>
+          <w:p>
+            <w:pPr>
+              <w:pStyle w:val="Compact"/>
+              <w:keepNext/>
+              <w:spacing w:before="20" w:after="20" w:line="240" w:lineRule="auto"/>
+              <w:jc w:val="center"/>
+            </w:pPr>
+            <w:r>
+              <w:rPr>
+                <w:rFonts w:ascii="Times New Roman" w:hAnsi="Times New Roman"/>
+                <w:sz w:val="18"/>
+              </w:rPr>
               <w:t xml:space="preserve">(✓)</w:t>
             </w:r>
           </w:p>
         </w:tc>
         <w:tc>
           <w:tcPr>
+            <w:tcW w:type="dxa" w:w="792"/>
+          </w:tcPr>
+          <w:p>
+            <w:pPr>
+              <w:pStyle w:val="Compact"/>
+              <w:keepNext/>
+              <w:spacing w:before="20" w:after="20" w:line="240" w:lineRule="auto"/>
+              <w:jc w:val="center"/>
+            </w:pPr>
+            <w:r>
+              <w:rPr>
+                <w:rFonts w:ascii="Times New Roman" w:hAnsi="Times New Roman"/>
+                <w:sz w:val="18"/>
+              </w:rPr>
+              <w:t xml:space="preserve">×</w:t>
+            </w:r>
+          </w:p>
+        </w:tc>
+        <w:tc>
+          <w:tcPr>
             <w:tcW w:type="dxa" w:w="648"/>
           </w:tcPr>
           <w:p>
@@ -1182,46 +1222,6 @@
                 <w:sz w:val="18"/>
               </w:rPr>
               <w:t xml:space="preserve">×</w:t>
-            </w:r>
-          </w:p>
-        </w:tc>
-        <w:tc>
-          <w:tcPr>
-            <w:tcW w:type="dxa" w:w="792"/>
-          </w:tcPr>
-          <w:p>
-            <w:pPr>
-              <w:pStyle w:val="Compact"/>
-              <w:keepNext/>
-              <w:spacing w:before="20" w:after="20" w:line="240" w:lineRule="auto"/>
-              <w:jc w:val="center"/>
-            </w:pPr>
-            <w:r>
-              <w:rPr>
-                <w:rFonts w:ascii="Times New Roman" w:hAnsi="Times New Roman"/>
-                <w:sz w:val="18"/>
-              </w:rPr>
-              <w:t xml:space="preserve">×</w:t>
-            </w:r>
-          </w:p>
-        </w:tc>
-        <w:tc>
-          <w:tcPr>
-            <w:tcW w:type="dxa" w:w="648"/>
-          </w:tcPr>
-          <w:p>
-            <w:pPr>
-              <w:pStyle w:val="Compact"/>
-              <w:keepNext/>
-              <w:spacing w:before="20" w:after="20" w:line="240" w:lineRule="auto"/>
-              <w:jc w:val="center"/>
-            </w:pPr>
-            <w:r>
-              <w:rPr>
-                <w:rFonts w:ascii="Times New Roman" w:hAnsi="Times New Roman"/>
-                <w:sz w:val="18"/>
-              </w:rPr>
-              <w:t xml:space="preserve">n.r.</w:t>
             </w:r>
           </w:p>
         </w:tc>
@@ -1246,7 +1246,7 @@
                 <w:rFonts w:ascii="Times New Roman" w:hAnsi="Times New Roman"/>
                 <w:sz w:val="18"/>
               </w:rPr>
-              <w:t xml:space="preserve">Telikani [19]</w:t>
+              <w:t xml:space="preserve">Wang [8]</w:t>
             </w:r>
           </w:p>
         </w:tc>
@@ -1266,7 +1266,7 @@
                 <w:rFonts w:ascii="Times New Roman" w:hAnsi="Times New Roman"/>
                 <w:sz w:val="18"/>
               </w:rPr>
-              <w:t xml:space="preserve">Cost-sensitive autoencoder + SVM</w:t>
+              <w:t xml:space="preserve">Reinforcement-learning ranking</w:t>
             </w:r>
           </w:p>
         </w:tc>
@@ -1286,7 +1286,7 @@
                 <w:rFonts w:ascii="Times New Roman" w:hAnsi="Times New Roman"/>
                 <w:sz w:val="18"/>
               </w:rPr>
-              <w:t xml:space="preserve">UNSW-NB15, BoT-IoT</w:t>
+              <w:t xml:space="preserve">5 multi-step sets</w:t>
             </w:r>
           </w:p>
         </w:tc>
@@ -1306,47 +1306,47 @@
                 <w:rFonts w:ascii="Times New Roman" w:hAnsi="Times New Roman"/>
                 <w:sz w:val="18"/>
               </w:rPr>
+              <w:t xml:space="preserve">×</w:t>
+            </w:r>
+          </w:p>
+        </w:tc>
+        <w:tc>
+          <w:tcPr>
+            <w:tcW w:type="dxa" w:w="648"/>
+          </w:tcPr>
+          <w:p>
+            <w:pPr>
+              <w:pStyle w:val="Compact"/>
+              <w:keepNext/>
+              <w:spacing w:before="20" w:after="20" w:line="240" w:lineRule="auto"/>
+              <w:jc w:val="center"/>
+            </w:pPr>
+            <w:r>
+              <w:rPr>
+                <w:rFonts w:ascii="Times New Roman" w:hAnsi="Times New Roman"/>
+                <w:sz w:val="18"/>
+              </w:rPr>
+              <w:t xml:space="preserve">×</w:t>
+            </w:r>
+          </w:p>
+        </w:tc>
+        <w:tc>
+          <w:tcPr>
+            <w:tcW w:type="dxa" w:w="792"/>
+          </w:tcPr>
+          <w:p>
+            <w:pPr>
+              <w:pStyle w:val="Compact"/>
+              <w:keepNext/>
+              <w:spacing w:before="20" w:after="20" w:line="240" w:lineRule="auto"/>
+              <w:jc w:val="center"/>
+            </w:pPr>
+            <w:r>
+              <w:rPr>
+                <w:rFonts w:ascii="Times New Roman" w:hAnsi="Times New Roman"/>
+                <w:sz w:val="18"/>
+              </w:rPr>
               <w:t xml:space="preserve">(✓)</w:t>
-            </w:r>
-          </w:p>
-        </w:tc>
-        <w:tc>
-          <w:tcPr>
-            <w:tcW w:type="dxa" w:w="648"/>
-          </w:tcPr>
-          <w:p>
-            <w:pPr>
-              <w:pStyle w:val="Compact"/>
-              <w:keepNext/>
-              <w:spacing w:before="20" w:after="20" w:line="240" w:lineRule="auto"/>
-              <w:jc w:val="center"/>
-            </w:pPr>
-            <w:r>
-              <w:rPr>
-                <w:rFonts w:ascii="Times New Roman" w:hAnsi="Times New Roman"/>
-                <w:sz w:val="18"/>
-              </w:rPr>
-              <w:t xml:space="preserve">×</w:t>
-            </w:r>
-          </w:p>
-        </w:tc>
-        <w:tc>
-          <w:tcPr>
-            <w:tcW w:type="dxa" w:w="792"/>
-          </w:tcPr>
-          <w:p>
-            <w:pPr>
-              <w:pStyle w:val="Compact"/>
-              <w:keepNext/>
-              <w:spacing w:before="20" w:after="20" w:line="240" w:lineRule="auto"/>
-              <w:jc w:val="center"/>
-            </w:pPr>
-            <w:r>
-              <w:rPr>
-                <w:rFonts w:ascii="Times New Roman" w:hAnsi="Times New Roman"/>
-                <w:sz w:val="18"/>
-              </w:rPr>
-              <w:t xml:space="preserve">×</w:t>
             </w:r>
           </w:p>
         </w:tc>
@@ -1391,442 +1391,7 @@
                 <w:rFonts w:ascii="Times New Roman" w:hAnsi="Times New Roman"/>
                 <w:sz w:val="18"/>
               </w:rPr>
-              <w:t xml:space="preserve">Wang [20]</w:t>
-            </w:r>
-          </w:p>
-        </w:tc>
-        <w:tc>
-          <w:tcPr>
-            <w:tcW w:type="dxa" w:w="2808"/>
-          </w:tcPr>
-          <w:p>
-            <w:pPr>
-              <w:pStyle w:val="Compact"/>
-              <w:keepNext/>
-              <w:spacing w:before="20" w:after="20" w:line="240" w:lineRule="auto"/>
-              <w:jc w:val="left"/>
-            </w:pPr>
-            <w:r>
-              <w:rPr>
-                <w:rFonts w:ascii="Times New Roman" w:hAnsi="Times New Roman"/>
-                <w:sz w:val="18"/>
-              </w:rPr>
-              <w:t xml:space="preserve">SHAP explanations</w:t>
-            </w:r>
-          </w:p>
-        </w:tc>
-        <w:tc>
-          <w:tcPr>
-            <w:tcW w:type="dxa" w:w="2088"/>
-          </w:tcPr>
-          <w:p>
-            <w:pPr>
-              <w:pStyle w:val="Compact"/>
-              <w:keepNext/>
-              <w:spacing w:before="20" w:after="20" w:line="240" w:lineRule="auto"/>
-              <w:jc w:val="left"/>
-            </w:pPr>
-            <w:r>
-              <w:rPr>
-                <w:rFonts w:ascii="Times New Roman" w:hAnsi="Times New Roman"/>
-                <w:sz w:val="18"/>
-              </w:rPr>
-              <w:t xml:space="preserve">NSL-KDD</w:t>
-            </w:r>
-          </w:p>
-        </w:tc>
-        <w:tc>
-          <w:tcPr>
-            <w:tcW w:type="dxa" w:w="648"/>
-          </w:tcPr>
-          <w:p>
-            <w:pPr>
-              <w:pStyle w:val="Compact"/>
-              <w:keepNext/>
-              <w:spacing w:before="20" w:after="20" w:line="240" w:lineRule="auto"/>
-              <w:jc w:val="center"/>
-            </w:pPr>
-            <w:r>
-              <w:rPr>
-                <w:rFonts w:ascii="Times New Roman" w:hAnsi="Times New Roman"/>
-                <w:sz w:val="18"/>
-              </w:rPr>
-              <w:t xml:space="preserve">×</w:t>
-            </w:r>
-          </w:p>
-        </w:tc>
-        <w:tc>
-          <w:tcPr>
-            <w:tcW w:type="dxa" w:w="648"/>
-          </w:tcPr>
-          <w:p>
-            <w:pPr>
-              <w:pStyle w:val="Compact"/>
-              <w:keepNext/>
-              <w:spacing w:before="20" w:after="20" w:line="240" w:lineRule="auto"/>
-              <w:jc w:val="center"/>
-            </w:pPr>
-            <w:r>
-              <w:rPr>
-                <w:rFonts w:ascii="Times New Roman" w:hAnsi="Times New Roman"/>
-                <w:sz w:val="18"/>
-              </w:rPr>
-              <w:t xml:space="preserve">(✓)</w:t>
-            </w:r>
-          </w:p>
-        </w:tc>
-        <w:tc>
-          <w:tcPr>
-            <w:tcW w:type="dxa" w:w="792"/>
-          </w:tcPr>
-          <w:p>
-            <w:pPr>
-              <w:pStyle w:val="Compact"/>
-              <w:keepNext/>
-              <w:spacing w:before="20" w:after="20" w:line="240" w:lineRule="auto"/>
-              <w:jc w:val="center"/>
-            </w:pPr>
-            <w:r>
-              <w:rPr>
-                <w:rFonts w:ascii="Times New Roman" w:hAnsi="Times New Roman"/>
-                <w:sz w:val="18"/>
-              </w:rPr>
-              <w:t xml:space="preserve">×</w:t>
-            </w:r>
-          </w:p>
-        </w:tc>
-        <w:tc>
-          <w:tcPr>
-            <w:tcW w:type="dxa" w:w="648"/>
-          </w:tcPr>
-          <w:p>
-            <w:pPr>
-              <w:pStyle w:val="Compact"/>
-              <w:keepNext/>
-              <w:spacing w:before="20" w:after="20" w:line="240" w:lineRule="auto"/>
-              <w:jc w:val="center"/>
-            </w:pPr>
-            <w:r>
-              <w:rPr>
-                <w:rFonts w:ascii="Times New Roman" w:hAnsi="Times New Roman"/>
-                <w:sz w:val="18"/>
-              </w:rPr>
-              <w:t xml:space="preserve">×</w:t>
-            </w:r>
-          </w:p>
-        </w:tc>
-      </w:tr>
-      <w:tr>
-        <w:trPr>
-          <w:cantSplit/>
-        </w:trPr>
-        <w:tc>
-          <w:tcPr>
-            <w:tcW w:type="dxa" w:w="1656"/>
-          </w:tcPr>
-          <w:p>
-            <w:pPr>
-              <w:pStyle w:val="Compact"/>
-              <w:keepNext/>
-              <w:spacing w:before="20" w:after="20" w:line="240" w:lineRule="auto"/>
-              <w:jc w:val="left"/>
-            </w:pPr>
-            <w:r>
-              <w:rPr>
-                <w:rFonts w:ascii="Times New Roman" w:hAnsi="Times New Roman"/>
-                <w:sz w:val="18"/>
-              </w:rPr>
-              <w:t xml:space="preserve">Alabbadi [21]</w:t>
-            </w:r>
-          </w:p>
-        </w:tc>
-        <w:tc>
-          <w:tcPr>
-            <w:tcW w:type="dxa" w:w="2808"/>
-          </w:tcPr>
-          <w:p>
-            <w:pPr>
-              <w:pStyle w:val="Compact"/>
-              <w:keepNext/>
-              <w:spacing w:before="20" w:after="20" w:line="240" w:lineRule="auto"/>
-              <w:jc w:val="left"/>
-            </w:pPr>
-            <w:r>
-              <w:rPr>
-                <w:rFonts w:ascii="Times New Roman" w:hAnsi="Times New Roman"/>
-                <w:sz w:val="18"/>
-              </w:rPr>
-              <w:t xml:space="preserve">Deep models + XAI</w:t>
-            </w:r>
-          </w:p>
-        </w:tc>
-        <w:tc>
-          <w:tcPr>
-            <w:tcW w:type="dxa" w:w="2088"/>
-          </w:tcPr>
-          <w:p>
-            <w:pPr>
-              <w:pStyle w:val="Compact"/>
-              <w:keepNext/>
-              <w:spacing w:before="20" w:after="20" w:line="240" w:lineRule="auto"/>
-              <w:jc w:val="left"/>
-            </w:pPr>
-            <w:r>
-              <w:rPr>
-                <w:rFonts w:ascii="Times New Roman" w:hAnsi="Times New Roman"/>
-                <w:sz w:val="18"/>
-              </w:rPr>
-              <w:t xml:space="preserve">TON_IoT</w:t>
-            </w:r>
-          </w:p>
-        </w:tc>
-        <w:tc>
-          <w:tcPr>
-            <w:tcW w:type="dxa" w:w="648"/>
-          </w:tcPr>
-          <w:p>
-            <w:pPr>
-              <w:pStyle w:val="Compact"/>
-              <w:keepNext/>
-              <w:spacing w:before="20" w:after="20" w:line="240" w:lineRule="auto"/>
-              <w:jc w:val="center"/>
-            </w:pPr>
-            <w:r>
-              <w:rPr>
-                <w:rFonts w:ascii="Times New Roman" w:hAnsi="Times New Roman"/>
-                <w:sz w:val="18"/>
-              </w:rPr>
-              <w:t xml:space="preserve">×</w:t>
-            </w:r>
-          </w:p>
-        </w:tc>
-        <w:tc>
-          <w:tcPr>
-            <w:tcW w:type="dxa" w:w="648"/>
-          </w:tcPr>
-          <w:p>
-            <w:pPr>
-              <w:pStyle w:val="Compact"/>
-              <w:keepNext/>
-              <w:spacing w:before="20" w:after="20" w:line="240" w:lineRule="auto"/>
-              <w:jc w:val="center"/>
-            </w:pPr>
-            <w:r>
-              <w:rPr>
-                <w:rFonts w:ascii="Times New Roman" w:hAnsi="Times New Roman"/>
-                <w:sz w:val="18"/>
-              </w:rPr>
-              <w:t xml:space="preserve">(✓)</w:t>
-            </w:r>
-          </w:p>
-        </w:tc>
-        <w:tc>
-          <w:tcPr>
-            <w:tcW w:type="dxa" w:w="792"/>
-          </w:tcPr>
-          <w:p>
-            <w:pPr>
-              <w:pStyle w:val="Compact"/>
-              <w:keepNext/>
-              <w:spacing w:before="20" w:after="20" w:line="240" w:lineRule="auto"/>
-              <w:jc w:val="center"/>
-            </w:pPr>
-            <w:r>
-              <w:rPr>
-                <w:rFonts w:ascii="Times New Roman" w:hAnsi="Times New Roman"/>
-                <w:sz w:val="18"/>
-              </w:rPr>
-              <w:t xml:space="preserve">×</w:t>
-            </w:r>
-          </w:p>
-        </w:tc>
-        <w:tc>
-          <w:tcPr>
-            <w:tcW w:type="dxa" w:w="648"/>
-          </w:tcPr>
-          <w:p>
-            <w:pPr>
-              <w:pStyle w:val="Compact"/>
-              <w:keepNext/>
-              <w:spacing w:before="20" w:after="20" w:line="240" w:lineRule="auto"/>
-              <w:jc w:val="center"/>
-            </w:pPr>
-            <w:r>
-              <w:rPr>
-                <w:rFonts w:ascii="Times New Roman" w:hAnsi="Times New Roman"/>
-                <w:sz w:val="18"/>
-              </w:rPr>
-              <w:t xml:space="preserve">n.r.</w:t>
-            </w:r>
-          </w:p>
-        </w:tc>
-      </w:tr>
-      <w:tr>
-        <w:trPr>
-          <w:cantSplit/>
-        </w:trPr>
-        <w:tc>
-          <w:tcPr>
-            <w:tcW w:type="dxa" w:w="1656"/>
-          </w:tcPr>
-          <w:p>
-            <w:pPr>
-              <w:pStyle w:val="Compact"/>
-              <w:keepNext/>
-              <w:spacing w:before="20" w:after="20" w:line="240" w:lineRule="auto"/>
-              <w:jc w:val="left"/>
-            </w:pPr>
-            <w:r>
-              <w:rPr>
-                <w:rFonts w:ascii="Times New Roman" w:hAnsi="Times New Roman"/>
-                <w:sz w:val="18"/>
-              </w:rPr>
-              <w:t xml:space="preserve">Wang [22]</w:t>
-            </w:r>
-          </w:p>
-        </w:tc>
-        <w:tc>
-          <w:tcPr>
-            <w:tcW w:type="dxa" w:w="2808"/>
-          </w:tcPr>
-          <w:p>
-            <w:pPr>
-              <w:pStyle w:val="Compact"/>
-              <w:keepNext/>
-              <w:spacing w:before="20" w:after="20" w:line="240" w:lineRule="auto"/>
-              <w:jc w:val="left"/>
-            </w:pPr>
-            <w:r>
-              <w:rPr>
-                <w:rFonts w:ascii="Times New Roman" w:hAnsi="Times New Roman"/>
-                <w:sz w:val="18"/>
-              </w:rPr>
-              <w:t xml:space="preserve">Reinforcement-learning ranking</w:t>
-            </w:r>
-          </w:p>
-        </w:tc>
-        <w:tc>
-          <w:tcPr>
-            <w:tcW w:type="dxa" w:w="2088"/>
-          </w:tcPr>
-          <w:p>
-            <w:pPr>
-              <w:pStyle w:val="Compact"/>
-              <w:keepNext/>
-              <w:spacing w:before="20" w:after="20" w:line="240" w:lineRule="auto"/>
-              <w:jc w:val="left"/>
-            </w:pPr>
-            <w:r>
-              <w:rPr>
-                <w:rFonts w:ascii="Times New Roman" w:hAnsi="Times New Roman"/>
-                <w:sz w:val="18"/>
-              </w:rPr>
-              <w:t xml:space="preserve">5 multi-step sets</w:t>
-            </w:r>
-          </w:p>
-        </w:tc>
-        <w:tc>
-          <w:tcPr>
-            <w:tcW w:type="dxa" w:w="648"/>
-          </w:tcPr>
-          <w:p>
-            <w:pPr>
-              <w:pStyle w:val="Compact"/>
-              <w:keepNext/>
-              <w:spacing w:before="20" w:after="20" w:line="240" w:lineRule="auto"/>
-              <w:jc w:val="center"/>
-            </w:pPr>
-            <w:r>
-              <w:rPr>
-                <w:rFonts w:ascii="Times New Roman" w:hAnsi="Times New Roman"/>
-                <w:sz w:val="18"/>
-              </w:rPr>
-              <w:t xml:space="preserve">×</w:t>
-            </w:r>
-          </w:p>
-        </w:tc>
-        <w:tc>
-          <w:tcPr>
-            <w:tcW w:type="dxa" w:w="648"/>
-          </w:tcPr>
-          <w:p>
-            <w:pPr>
-              <w:pStyle w:val="Compact"/>
-              <w:keepNext/>
-              <w:spacing w:before="20" w:after="20" w:line="240" w:lineRule="auto"/>
-              <w:jc w:val="center"/>
-            </w:pPr>
-            <w:r>
-              <w:rPr>
-                <w:rFonts w:ascii="Times New Roman" w:hAnsi="Times New Roman"/>
-                <w:sz w:val="18"/>
-              </w:rPr>
-              <w:t xml:space="preserve">×</w:t>
-            </w:r>
-          </w:p>
-        </w:tc>
-        <w:tc>
-          <w:tcPr>
-            <w:tcW w:type="dxa" w:w="792"/>
-          </w:tcPr>
-          <w:p>
-            <w:pPr>
-              <w:pStyle w:val="Compact"/>
-              <w:keepNext/>
-              <w:spacing w:before="20" w:after="20" w:line="240" w:lineRule="auto"/>
-              <w:jc w:val="center"/>
-            </w:pPr>
-            <w:r>
-              <w:rPr>
-                <w:rFonts w:ascii="Times New Roman" w:hAnsi="Times New Roman"/>
-                <w:sz w:val="18"/>
-              </w:rPr>
-              <w:t xml:space="preserve">(✓)</w:t>
-            </w:r>
-          </w:p>
-        </w:tc>
-        <w:tc>
-          <w:tcPr>
-            <w:tcW w:type="dxa" w:w="648"/>
-          </w:tcPr>
-          <w:p>
-            <w:pPr>
-              <w:pStyle w:val="Compact"/>
-              <w:keepNext/>
-              <w:spacing w:before="20" w:after="20" w:line="240" w:lineRule="auto"/>
-              <w:jc w:val="center"/>
-            </w:pPr>
-            <w:r>
-              <w:rPr>
-                <w:rFonts w:ascii="Times New Roman" w:hAnsi="Times New Roman"/>
-                <w:sz w:val="18"/>
-              </w:rPr>
-              <w:t xml:space="preserve">n.r.</w:t>
-            </w:r>
-          </w:p>
-        </w:tc>
-      </w:tr>
-      <w:tr>
-        <w:trPr>
-          <w:cantSplit/>
-        </w:trPr>
-        <w:tc>
-          <w:tcPr>
-            <w:tcW w:type="dxa" w:w="1656"/>
-          </w:tcPr>
-          <w:p>
-            <w:pPr>
-              <w:pStyle w:val="Compact"/>
-              <w:keepNext/>
-              <w:spacing w:before="20" w:after="20" w:line="240" w:lineRule="auto"/>
-              <w:jc w:val="left"/>
-            </w:pPr>
-            <w:r>
-              <w:rPr>
-                <w:rFonts w:ascii="Times New Roman" w:hAnsi="Times New Roman"/>
-                <w:sz w:val="18"/>
-              </w:rPr>
-              <w:t xml:space="preserve">Bag [23]</w:t>
+              <w:t xml:space="preserve">Bag [12]</w:t>
             </w:r>
           </w:p>
         </w:tc>
@@ -2189,7 +1754,7 @@
         <w:pStyle w:val="TableNote"/>
       </w:pPr>
       <w:r>
-        <w:t xml:space="preserve">Cost: actions chosen under an explicit cost model. Rules: readable decision logic. Graded: more than two actions. Tests: significance tests or confidence intervals. ✓ present, (✓) partial, × absent, n.r. not reported. LSTM: long short-term memory; SHAP: Shapley additive explanations; SVM: support vector machine.</w:t>
+        <w:t xml:space="preserve">Cost: actions chosen under an explicit cost model. Rules: readable decision logic. Graded: more than two actions. Tests: significance tests or confidence intervals. ✓ present, (✓) partial, × absent, n.r. not reported. SHAP: Shapley additive explanations; SVM: support vector machine.</w:t>
       </w:r>
     </w:p>
     <w:p>
@@ -2197,7 +1762,7 @@
         <w:pStyle w:val="BodyText"/>
       </w:pPr>
       <w:r>
-        <w:t xml:space="preserve">Fuzzy and neuro-fuzzy systems suit this decision step, because they express learned evidence as linguistic rules that operators can read and audit [24–27]. As Table 1 shows, existing studies use these strengths for other purposes. Fuzzy intrusion detectors use rules to improve accuracy, but they still output a binary alarm [15–17]. Cost-sensitive learning [28,29] enters intrusion detection mainly through weighted training losses [18,19], so the cost model shapes the classifier but does not choose the action. Explainable artificial intelligence (XAI) methods explain a score after it has been produced [20,21,30]. Reinforcement learning can rank alerts by priority, yet the ranking does not assign an action [12,22]. The closest designs to ours defer uncertain cases. Three-way decision models assign each case to acceptance, rejection or deferment, with thresholds derived from loss functions [10], and Jalalvand et al. [11] learn when to defer alerts from analyst feedback. Neither assigns graded SOC actions through a readable fuzzy rule base driven by a learned score. Knowledge-based decision support has shown the value of explicit domain knowledge in cyber-risk assessment [23]. However, to our knowledge none of these studies combines an action-cost model, readable rules and graded responses in one triage layer.</w:t>
+        <w:t xml:space="preserve">Fuzzy and neuro-fuzzy systems suit this decision step, because they express learned evidence as linguistic rules that operators can read and audit [13,14]. As Table 1 shows, existing studies use these strengths for other purposes. Fuzzy intrusion detectors use rules to improve accuracy, but they still output a binary alarm [3,4]. Cost-sensitive learning [15] enters intrusion detection mainly through weighted training losses [9,10], so the cost model shapes the classifier but does not choose the action. Post hoc explainable artificial intelligence (XAI) methods, such as Shapley additive explanations, explain a score after it has been produced [11]. Reinforcement learning can rank alerts by priority, yet the ranking does not assign an action [8]. The closest designs to ours defer uncertain cases. Three-way decision models assign each case to acceptance, rejection or deferment, with thresholds derived from loss functions [6], and Jalalvand et al. [7] learn when to defer alerts from analyst feedback. Neither assigns graded SOC actions through a readable fuzzy rule base driven by a learned score. Knowledge-based decision support has shown the value of explicit domain knowledge in cyber-risk assessment [12]. However, to our knowledge none of these studies combines an action-cost model, readable rules and graded responses in one triage layer.</w:t>
       </w:r>
     </w:p>
     <w:p>
@@ -2897,7 +2462,7 @@
         <w:t xml:space="preserve"> </w:t>
       </w:r>
       <w:r>
-        <w:t xml:space="preserve">Two shoulder functions and one triangular function map the propensity to three linguistic risk bands [24]. With the clipping operator</w:t>
+        <w:t xml:space="preserve">Two shoulder functions and one triangular function map the propensity to three linguistic risk bands [13]. With the clipping operator</w:t>
       </w:r>
       <w:r>
         <w:t xml:space="preserve"> </w:t>
@@ -5224,7 +4789,7 @@
         <w:t xml:space="preserve"> </w:t>
       </w:r>
       <w:r>
-        <w:t xml:space="preserve">as a calibrated probability, although deep-model scores do not guarantee calibration [31]. Because soft-blocking costs less than escalation for both classes, the Bayes rule never escalates. Instead, it soft-blocks every alert with</w:t>
+        <w:t xml:space="preserve">as a calibrated probability, which the MLP output need not be. Because soft-blocking costs less than escalation for both classes, the Bayes rule never escalates. Instead, it soft-blocks every alert with</w:t>
       </w:r>
       <w:r>
         <w:t xml:space="preserve"> </w:t>
@@ -5290,7 +4855,7 @@
         <w:t xml:space="preserve"> </w:t>
       </w:r>
       <w:r>
-        <w:t xml:space="preserve">The experiments used the NSL-KDD benchmark [32]. For reproducibility on a standard CPU, we sampled 40,000 training records and split them, with stratification, into 34,000 training and 6,000 validation records. The scaler and encoder were fitted on the training split only. The test set was capped at 20,000 records with an attack rate of 0.568. Because it contains attack types absent from training, the evaluation includes a realistic distribution shift.</w:t>
+        <w:t xml:space="preserve">The experiments used the NSL-KDD benchmark [16]. For reproducibility on a standard CPU, we sampled 40,000 training records and split them, with stratification, into 34,000 training and 6,000 validation records. The scaler and encoder were fitted on the training split only. The test set was capped at 20,000 records with an attack rate of 0.568. Because it contains attack types absent from training, the evaluation includes a realistic distribution shift.</w:t>
       </w:r>
     </w:p>
     <w:p>
@@ -5308,7 +4873,7 @@
         <w:t xml:space="preserve"> </w:t>
       </w:r>
       <w:r>
-        <w:t xml:space="preserve">Three detectors were compared: class-balanced logistic regression, gradient boosting (GB) [33] with scikit-learn defaults, and the MLP alone. The proposed policy uses the MLP propensity, so any benefit must come from better decisions rather than better scores. Three decision baselines acted on the same scores. The first escalates every alert scored above 0.5 and monitors the rest. The second tunes this threshold on validation data to minimise cost, a form of threshold moving [29]. The third escalates the 20% highest-scored alerts, mimicking a fixed analyst capacity. Learned policies [12,22] were excluded because they need interaction or logged decision data with outcome feedback, which the benchmark lacks.</w:t>
+        <w:t xml:space="preserve">Three detectors were compared: class-balanced logistic regression, gradient boosting (GB) [17] with scikit-learn defaults, and the MLP alone. The proposed policy uses the MLP propensity, so any benefit must come from better decisions rather than better scores. Three decision baselines acted on the same scores. The first escalates every alert scored above 0.5 and monitors the rest. The second tunes this threshold on validation data to minimise cost, a form of threshold moving [15]. The third escalates the 20% highest-scored alerts, mimicking a fixed analyst capacity. Learned prioritisation policies, such as reinforcement learning [8], were excluded because they need interaction or logged decision data with outcome feedback, which the benchmark lacks.</w:t>
       </w:r>
     </w:p>
     <w:p>
@@ -5326,7 +4891,7 @@
         <w:t xml:space="preserve"> </w:t>
       </w:r>
       <w:r>
-        <w:t xml:space="preserve">On the seed-42 test set, we report percentile 95% confidence intervals (CIs) from 2,000 paired bootstrap resamples of alerts [34]. Per-alert cost differences were tested with the two-sided Wilcoxon signed-rank test [35], which treats alerts as independent. The full pipeline was repeated for seeds 42–51, and the seed-level costs were compared with a paired Wilcoxon test. Two sweeps varied the missed-attack cost</w:t>
+        <w:t xml:space="preserve">On the seed-42 test set, we report percentile 95% confidence intervals (CIs) from 2,000 paired bootstrap resamples of alerts [18]. Per-alert cost differences were tested with the two-sided Wilcoxon signed-rank test [19], which treats alerts as independent. The full pipeline was repeated for seeds 42–51, and the seed-level costs were compared with a paired Wilcoxon test. Two sweeps varied the missed-attack cost</w:t>
       </w:r>
       <w:r>
         <w:t xml:space="preserve"> </w:t>
@@ -8350,7 +7915,7 @@
         <w:t xml:space="preserve"> </w:t>
       </w:r>
       <w:r>
-        <w:t xml:space="preserve">reproduce every action of the rule base (Panel B2), so the benefit comes from the intermediate containment band rather than from fuzziness as such. What fuzziness adds is a graded explanation of each decision. The rule base is also not cost-optimal. The Bayes cost rule is 0.903 cheaper per alert, because soft-blocking dominates escalation under Eq. (6), and it therefore soft-blocks 8,631 alerts, or 43% of all traffic. This is the Bayesian minimum-risk procedure from which decision-theoretic three-way decisions derive their loss-based thresholds [10]. Threshold tuning does not match the rule base either. Validation tuning moves the threshold only to</w:t>
+        <w:t xml:space="preserve">reproduce every action of the rule base (Panel B2), so the benefit comes from the intermediate containment band rather than from fuzziness as such. What fuzziness adds is a graded explanation of each decision. The rule base is also not cost-optimal. The Bayes cost rule is 0.903 cheaper per alert, because soft-blocking dominates escalation under Eq. (6), and it therefore soft-blocks 8,631 alerts, or 43% of all traffic. This is the Bayesian minimum-risk procedure from which decision-theoretic three-way decisions derive their loss-based thresholds [6]. Threshold tuning does not match the rule base either. Validation tuning moves the threshold only to</w:t>
       </w:r>
       <w:r>
         <w:t xml:space="preserve"> </w:t>
@@ -8390,7 +7955,7 @@
         </m:r>
       </m:oMath>
       <w:r>
-        <w:t xml:space="preserve">. This agrees with the cost-sensitive learning result that asymmetric costs move the optimal cut-off away from 0.5 [28]. Finally, the layer transfers to another detector. On GB scores, the same rules cost 3.004, which is lower than on MLP scores (</w:t>
+        <w:t xml:space="preserve">. This agrees with threshold moving in cost-sensitive learning, where unequal error costs shift the decision cut-off away from 0.5 [15]. Finally, the layer transfers to another detector. On GB scores, the same rules cost 3.004, which is lower than on MLP scores (</w:t>
       </w:r>
       <m:oMath>
         <m:r>
@@ -8425,7 +7990,7 @@
         <w:t xml:space="preserve"> </w:t>
       </w:r>
       <w:r>
-        <w:t xml:space="preserve">Detectors should be judged by the decisions they enable, since the action rule alone changed the cost by up to 1.242 per alert. Because the cost matrix sets the mix of actions, organisations should price false containment before automating Soft-block. Unlike a deferral band that hands uncertain alerts to analysts [11], the Soft-block band acts automatically, so the 387 alerts it keeps from the analyst queue carry an explicit price for false containment (Eq. (6)). Conformal classification with a reject option [36] instead abstains on uncertain cases under distribution-free error-rate guarantees rather than a cost matrix, and combining the two is a natural extension. The band boundaries give managers a workload lever that needs no retraining, which matters because NIDS alert streams are reported to be dominated by false positives [37]. Named rules with logged firing strengths give each action an audit trail that post hoc attributions lack [20,21], which supports compliance and human–AI teaming [3,13].</w:t>
+        <w:t xml:space="preserve">Detectors should be judged by the decisions they enable, since the action rule alone changed the cost by up to 1.242 per alert. Because the cost matrix sets the mix of actions, organisations should price false containment before automating Soft-block. Unlike a deferral band that hands uncertain alerts to analysts [7], the Soft-block band acts automatically, so the 387 alerts it keeps from the analyst queue carry an explicit price for false containment (Eq. (6)). Conformal classification with a reject option [20] instead abstains on uncertain cases under distribution-free error-rate guarantees rather than a cost matrix, and combining the two is a natural extension. The band boundaries give managers a workload lever that needs no retraining, which matters because NIDS alert streams are reported to be dominated by false positives [2]. Named rules with logged firing strengths give each action an audit trail that post hoc attributions lack [11], which supports compliance review and analyst oversight.</w:t>
       </w:r>
     </w:p>
     <w:bookmarkEnd w:id="19"/>
@@ -8443,7 +8008,7 @@
         <w:pStyle w:val="FirstParagraph"/>
       </w:pPr>
       <w:r>
-        <w:t xml:space="preserve">The study has four main limitations. First, fixed bands respond to the distribution of the scores, not only to their ranking. Seed 48, the weakest replicate (cost 3.282, coverage 0.626), has a typical ROC-AUC of 0.900 but the lowest accuracy at the 0.5 threshold (0.757). Adaptive tuning in the style of ANFIS [25], or bands derived from the cost matrix, could reduce this sensitivity and narrow the gap to the Bayes rule. Second, NSL-KDD is a laboratory benchmark from 2009 that does not reflect modern enterprise, cloud or Internet of Things traffic [38,39], and the data were subsampled under a single protocol. Third, the cost matrix is illustrative rather than elicited from a real SOC, and the coverage metric counts containment as covering an attack. Fourth, the study involved no deployment, drift analysis [14] or user study.</w:t>
+        <w:t xml:space="preserve">The study has four main limitations. First, fixed bands respond to the distribution of the scores, not only to their ranking. Seed 48, the weakest replicate (cost 3.282, coverage 0.626), has a typical ROC-AUC of 0.900 but the lowest accuracy at the 0.5 threshold (0.757). Adaptive neuro-fuzzy tuning of the breakpoints, or bands derived from the cost matrix, could reduce this sensitivity and narrow the gap to the Bayes rule. Second, NSL-KDD is a laboratory benchmark released in 2009 [16], so its traffic predates modern enterprise, cloud and Internet of Things networks, and the data were subsampled under a single protocol. Third, the cost matrix is illustrative rather than elicited from a real SOC, and the coverage metric counts containment as covering an attack. Fourth, the study involved no deployment, drift analysis or user study.</w:t>
       </w:r>
     </w:p>
     <w:bookmarkEnd w:id="20"/>
@@ -8461,7 +8026,7 @@
         <w:pStyle w:val="FirstParagraph"/>
       </w:pPr>
       <w:r>
-        <w:t xml:space="preserve">In conclusion, a fuzzy–neural rule base can serve as a knowledge-based decision layer for alert triage. On NSL-KDD, it achieved lower cost and higher coverage than crisp threshold and capacity rules across seeds, cost ratios and band widths, and its gain comes from the intermediate containment band. Future work will derive the bands from costs elicited in real SOCs and validate the layer in live operation. It will also add distribution-free error guarantees for the automatic actions through conformal classification with a reject option [36].</w:t>
+        <w:t xml:space="preserve">In conclusion, a fuzzy–neural rule base can serve as a knowledge-based decision layer for alert triage. On NSL-KDD, it achieved lower cost and higher coverage than crisp threshold and capacity rules across seeds, cost ratios and band widths, and its gain comes from the intermediate containment band. Future work will derive the bands from costs elicited in real SOCs and validate the layer in live operation. It will also add distribution-free error guarantees for the automatic actions through conformal classification with a reject option [20].</w:t>
       </w:r>
     </w:p>
     <w:bookmarkEnd w:id="21"/>
@@ -8494,7 +8059,7 @@
         </w:r>
       </w:hyperlink>
       <w:r>
-        <w:t xml:space="preserve">. NSL-KDD is available from the Canadian Institute for Cybersecurity [32]. The Supplementary Material contains the same code, the result files (including the Panel B2 confidence intervals of Table 2 in</w:t>
+        <w:t xml:space="preserve">. NSL-KDD is available from the Canadian Institute for Cybersecurity [16]. The Supplementary Material contains the same code, the result files (including the Panel B2 confidence intervals of Table 2 in</w:t>
       </w:r>
       <w:r>
         <w:t xml:space="preserve"> </w:t>
@@ -8614,7 +8179,7 @@
         <w:pStyle w:val="Reference"/>
       </w:pPr>
       <w:r>
-        <w:t xml:space="preserve">[2] S. Tariq, M. Baruwal Chhetri, S. Nepal, C. Paris, Alert fatigue in security operations centres: Research challenges and opportunities, ACM Comput. Surv. 57 (9) (2025) 1–38. https://doi.org/10.1145/3723158.</w:t>
+        <w:t xml:space="preserve">[2] H. Albasheer, M. Md Siraj, A. Mubarakali, O. Elsier Tayfour, S. Salih, M. Hamdan, S. Khan, A. Zainal, S. Kamarudeen, Cyber-attack prediction based on network intrusion detection systems for alert correlation techniques: A survey, Sensors 22 (4) (2022) 1494. https://doi.org/10.3390/s22041494.</w:t>
       </w:r>
     </w:p>
     <w:p>
@@ -8622,7 +8187,7 @@
         <w:pStyle w:val="Reference"/>
       </w:pPr>
       <w:r>
-        <w:t xml:space="preserve">[3] M. Baruwal Chhetri, S. Tariq, R. Singh, F. Jalalvand, C. Paris, S. Nepal, Towards human–AI teaming to mitigate alert fatigue in security operations centres, ACM Trans. Internet Technol. 24 (3) (2024) 1–22. https://doi.org/10.1145/3670009.</w:t>
+        <w:t xml:space="preserve">[3] A. N. Toosi, M. Kahani, A new approach to intrusion detection based on an evolutionary soft computing model using neuro-fuzzy classifiers, Comput. Commun. 30 (10) (2007) 2201–2212. https://doi.org/10.1016/j.comcom.2007.05.002.</w:t>
       </w:r>
     </w:p>
     <w:p>
@@ -8630,7 +8195,7 @@
         <w:pStyle w:val="Reference"/>
       </w:pPr>
       <w:r>
-        <w:t xml:space="preserve">[4] H.-J. Liao, C.-H. Richard Lin, Y.-C. Lin, K.-Y. Tung, Intrusion detection system: A comprehensive review, J. Netw. Comput. Appl. 36 (1) (2013) 16–24. https://doi.org/10.1016/j.jnca.2012.09.004.</w:t>
+        <w:t xml:space="preserve">[4] A. H. Hamamoto, L. F. Carvalho, L. D. H. Sampaio, T. Abrão, M. L. Proença, Network anomaly detection system using genetic algorithm and fuzzy logic, Expert Syst. Appl. 92 (2018) 390–402. https://doi.org/10.1016/j.eswa.2017.09.013.</w:t>
       </w:r>
     </w:p>
     <w:p>
@@ -8638,7 +8203,7 @@
         <w:pStyle w:val="Reference"/>
       </w:pPr>
       <w:r>
-        <w:t xml:space="preserve">[5] A. L. Buczak, E. Guven, A survey of data mining and machine learning methods for cyber security intrusion detection, IEEE Commun. Surv. Tutor. 18 (2) (2016) 1153–1176. https://doi.org/10.1109/COMST.2015.2494502.</w:t>
+        <w:t xml:space="preserve">[5] R. Vinayakumar, M. Alazab, K. P. Soman, P. Poornachandran, A. Al-Nemrat, S. Venkatraman, Deep learning approach for intelligent intrusion detection system, IEEE Access 7 (2019) 41525–41550. https://doi.org/10.1109/ACCESS.2019.2895334.</w:t>
       </w:r>
     </w:p>
     <w:p>
@@ -8646,7 +8211,7 @@
         <w:pStyle w:val="Reference"/>
       </w:pPr>
       <w:r>
-        <w:t xml:space="preserve">[6] R. Vinayakumar, M. Alazab, K. P. Soman, P. Poornachandran, A. Al-Nemrat, S. Venkatraman, Deep learning approach for intelligent intrusion detection system, IEEE Access 7 (2019) 41525–41550. https://doi.org/10.1109/ACCESS.2019.2895334.</w:t>
+        <w:t xml:space="preserve">[6] Y. Yao, Three-way decisions with probabilistic rough sets, Inf. Sci. 180 (3) (2010) 341–353. https://doi.org/10.1016/j.ins.2009.09.021.</w:t>
       </w:r>
     </w:p>
     <w:p>
@@ -8654,7 +8219,7 @@
         <w:pStyle w:val="Reference"/>
       </w:pPr>
       <w:r>
-        <w:t xml:space="preserve">[7] T. Su, H. Sun, J. Zhu, S. Wang, Y. Li, BAT: Deep learning methods on network intrusion detection using NSL-KDD dataset, IEEE Access 8 (2020) 29575–29585. https://doi.org/10.1109/ACCESS.2020.2972627.</w:t>
+        <w:t xml:space="preserve">[7] F. Jalalvand, M. Baruwal Chhetri, S. Nepal, C. Paris, Adaptive alert prioritisation in security operations centres via learning to defer with human feedback, Inf. Sci. 760 (2027) 124128. https://doi.org/10.1016/j.ins.2026.124128.</w:t>
       </w:r>
     </w:p>
     <w:p>
@@ -8662,7 +8227,7 @@
         <w:pStyle w:val="Reference"/>
       </w:pPr>
       <w:r>
-        <w:t xml:space="preserve">[8] G. Phillips-Wren, M. Daly, F. Burstein, Reconciling business intelligence, analytics and decision support systems: More data, deeper insight, Decis. Support Syst. 146 (2021) 113560. https://doi.org/10.1016/j.dss.2021.113560.</w:t>
+        <w:t xml:space="preserve">[8] X. Wang, X. Yang, X. Liang, X. Zhang, W. Zhang, X. Gong, Combating alert fatigue with AlertPro: Context-aware alert prioritization using reinforcement learning for multi-step attack detection, Comput. Secur. 137 (2024) 103583. https://doi.org/10.1016/j.cose.2023.103583.</w:t>
       </w:r>
     </w:p>
     <w:p>
@@ -8670,7 +8235,7 @@
         <w:pStyle w:val="Reference"/>
       </w:pPr>
       <w:r>
-        <w:t xml:space="preserve">[9] Y. Duan, J. S. Edwards, Y. K. Dwivedi, Artificial intelligence for decision making in the era of Big Data – evolution, challenges and research agenda, Int. J. Inf. Manag. 48 (2019) 63–71. https://doi.org/10.1016/j.ijinfomgt.2019.01.021.</w:t>
+        <w:t xml:space="preserve">[9] N. Gupta, V. Jindal, P. Bedi, CSE-IDS: Using cost-sensitive deep learning and ensemble algorithms to handle class imbalance in network-based intrusion detection systems, Comput. Secur. 112 (2022) 102499. https://doi.org/10.1016/j.cose.2021.102499.</w:t>
       </w:r>
     </w:p>
     <w:p>
@@ -8678,7 +8243,7 @@
         <w:pStyle w:val="Reference"/>
       </w:pPr>
       <w:r>
-        <w:t xml:space="preserve">[10] Y. Yao, Three-way decisions with probabilistic rough sets, Inf. Sci. 180 (3) (2010) 341–353. https://doi.org/10.1016/j.ins.2009.09.021.</w:t>
+        <w:t xml:space="preserve">[10] A. Telikani, N. E. Rudbardeh, S. Soleymanpour, A. Shahbahrami, J. Shen, G. Gaydadjiev, R. Hassanpour, A cost-sensitive machine learning model with multitask learning for intrusion detection in IoT, IEEE Trans. Ind. Inform. 20 (3) (2024) 3880–3890. https://doi.org/10.1109/TII.2023.3314208.</w:t>
       </w:r>
     </w:p>
     <w:p>
@@ -8686,7 +8251,7 @@
         <w:pStyle w:val="Reference"/>
       </w:pPr>
       <w:r>
-        <w:t xml:space="preserve">[11] F. Jalalvand, M. Baruwal Chhetri, S. Nepal, C. Paris, Adaptive alert prioritisation in security operations centres via learning to defer with human feedback, Inf. Sci. 760 (2027) 124128. https://doi.org/10.1016/j.ins.2026.124128.</w:t>
+        <w:t xml:space="preserve">[11] M. Wang, K. Zheng, Y. Yang, X. Wang, An explainable machine learning framework for intrusion detection systems, IEEE Access 8 (2020) 73127–73141. https://doi.org/10.1109/ACCESS.2020.2988359.</w:t>
       </w:r>
     </w:p>
     <w:p>
@@ -8694,7 +8259,7 @@
         <w:pStyle w:val="Reference"/>
       </w:pPr>
       <w:r>
-        <w:t xml:space="preserve">[12] L. Chavali, A. Krishnan, P. Saxena, B. Mitra, A. Sreevallabh Chivukula, Off-policy actor-critic deep reinforcement learning methods for alert prioritization in intrusion detection systems, Comput. Secur. 142 (2024) 103854. https://doi.org/10.1016/j.cose.2024.103854.</w:t>
+        <w:t xml:space="preserve">[12] S. Bag, S. Sarkar, I. Bose, Enhancing cybersecurity risk assessment using temporal knowledge graph-based explainable decision support system, Decis. Support Syst. 198 (2025) 114526. https://doi.org/10.1016/j.dss.2025.114526.</w:t>
       </w:r>
     </w:p>
     <w:p>
@@ -8702,7 +8267,7 @@
         <w:pStyle w:val="Reference"/>
       </w:pPr>
       <w:r>
-        <w:t xml:space="preserve">[13] M. Kumar, R. Rani, G. Epiphaniou, C. Maple, Adaptive trust-aware SOC human–AI teaming for resilient operations, Comput. Secur. 169 (2026) 104971. https://doi.org/10.1016/j.cose.2026.104971.</w:t>
+        <w:t xml:space="preserve">[13] L. A. Zadeh, Fuzzy sets, Inf. Control 8 (3) (1965) 338–353. https://doi.org/10.1016/S0019-9958(65)90241-X.</w:t>
       </w:r>
     </w:p>
     <w:p>
@@ -8710,7 +8275,7 @@
         <w:pStyle w:val="Reference"/>
       </w:pPr>
       <w:r>
-        <w:t xml:space="preserve">[14] R. Vaarandi, A. Guerra-Manzanares, NAD-CD: Addressing concept drift in network IDS alert classification for security operations centers, J. Inf. Secur. Appl. 103 (2026) 104663. https://doi.org/10.1016/j.jisa.2026.104663.</w:t>
+        <w:t xml:space="preserve">[14] A. Fernández, F. Herrera, O. Cordón, M. J. del Jesus, F. Marcelloni, Evolutionary fuzzy systems for explainable artificial intelligence: Why, when, what for, and where to?, IEEE Comput. Intell. Mag. 14 (1) (2019) 69–81. https://doi.org/10.1109/MCI.2018.2881645.</w:t>
       </w:r>
     </w:p>
     <w:p>
@@ -8718,7 +8283,7 @@
         <w:pStyle w:val="Reference"/>
       </w:pPr>
       <w:r>
-        <w:t xml:space="preserve">[15] A. N. Toosi, M. Kahani, A new approach to intrusion detection based on an evolutionary soft computing model using neuro-fuzzy classifiers, Comput. Commun. 30 (10) (2007) 2201–2212. https://doi.org/10.1016/j.comcom.2007.05.002.</w:t>
+        <w:t xml:space="preserve">[15] Z.-H. Zhou, X.-Y. Liu, Training cost-sensitive neural networks with methods addressing the class imbalance problem, IEEE Trans. Knowl. Data Eng. 18 (1) (2006) 63–77. https://doi.org/10.1109/TKDE.2006.17.</w:t>
       </w:r>
     </w:p>
     <w:p>
@@ -8726,7 +8291,7 @@
         <w:pStyle w:val="Reference"/>
       </w:pPr>
       <w:r>
-        <w:t xml:space="preserve">[16] A. H. Hamamoto, L. F. Carvalho, L. D. H. Sampaio, T. Abrão, M. L. Proença, Network anomaly detection system using genetic algorithm and fuzzy logic, Expert Syst. Appl. 92 (2018) 390–402. https://doi.org/10.1016/j.eswa.2017.09.013.</w:t>
+        <w:t xml:space="preserve">[16] M. Tavallaee, E. Bagheri, W. Lu, A. A. Ghorbani, A detailed analysis of the KDD CUP 99 data set, in: Proc. 2009 IEEE Symp. Comput. Intell. Secur. Def. Appl. (CISDA), 2009, pp. 1–6. https://doi.org/10.1109/CISDA.2009.5356528.</w:t>
       </w:r>
     </w:p>
     <w:p>
@@ -8734,7 +8299,7 @@
         <w:pStyle w:val="Reference"/>
       </w:pPr>
       <w:r>
-        <w:t xml:space="preserve">[17] M. Alalhareth, S.-C. Hong, An adaptive intrusion detection system in the Internet of Medical Things using fuzzy-based learning, Sensors 23 (22) (2023) 9247. https://doi.org/10.3390/s23229247.</w:t>
+        <w:t xml:space="preserve">[17] J. H. Friedman, Greedy function approximation: A gradient boosting machine, Ann. Stat. 29 (5) (2001) 1189–1232. https://doi.org/10.1214/aos/1013203451.</w:t>
       </w:r>
     </w:p>
     <w:p>
@@ -8742,7 +8307,7 @@
         <w:pStyle w:val="Reference"/>
       </w:pPr>
       <w:r>
-        <w:t xml:space="preserve">[18] N. Gupta, V. Jindal, P. Bedi, CSE-IDS: Using cost-sensitive deep learning and ensemble algorithms to handle class imbalance in network-based intrusion detection systems, Comput. Secur. 112 (2022) 102499. https://doi.org/10.1016/j.cose.2021.102499.</w:t>
+        <w:t xml:space="preserve">[18] B. Efron, R. J. Tibshirani, An Introduction to the Bootstrap, Chapman &amp; Hall/CRC, New York, 1994. https://doi.org/10.1201/9780429246593.</w:t>
       </w:r>
     </w:p>
     <w:p>
@@ -8750,7 +8315,7 @@
         <w:pStyle w:val="Reference"/>
       </w:pPr>
       <w:r>
-        <w:t xml:space="preserve">[19] A. Telikani, N. E. Rudbardeh, S. Soleymanpour, A. Shahbahrami, J. Shen, G. Gaydadjiev, R. Hassanpour, A cost-sensitive machine learning model with multitask learning for intrusion detection in IoT, IEEE Trans. Ind. Inform. 20 (3) (2024) 3880–3890. https://doi.org/10.1109/TII.2023.3314208.</w:t>
+        <w:t xml:space="preserve">[19] F. Wilcoxon, Individual comparisons by ranking methods, Biom. Bull. 1 (6) (1945) 80–83. https://doi.org/10.2307/3001968.</w:t>
       </w:r>
     </w:p>
     <w:p>
@@ -8758,159 +8323,7 @@
         <w:pStyle w:val="Reference"/>
       </w:pPr>
       <w:r>
-        <w:t xml:space="preserve">[20] M. Wang, K. Zheng, Y. Yang, X. Wang, An explainable machine learning framework for intrusion detection systems, IEEE Access 8 (2020) 73127–73141. https://doi.org/10.1109/ACCESS.2020.2988359.</w:t>
-      </w:r>
-    </w:p>
-    <w:p>
-      <w:pPr>
-        <w:pStyle w:val="Reference"/>
-      </w:pPr>
-      <w:r>
-        <w:t xml:space="preserve">[21] A. Alabbadi, F. Bajaber, An intrusion detection system over the IoT data streams using eXplainable Artificial Intelligence (XAI), Sensors 25 (3) (2025) 847. https://doi.org/10.3390/s25030847.</w:t>
-      </w:r>
-    </w:p>
-    <w:p>
-      <w:pPr>
-        <w:pStyle w:val="Reference"/>
-      </w:pPr>
-      <w:r>
-        <w:t xml:space="preserve">[22] X. Wang, X. Yang, X. Liang, X. Zhang, W. Zhang, X. Gong, Combating alert fatigue with AlertPro: Context-aware alert prioritization using reinforcement learning for multi-step attack detection, Comput. Secur. 137 (2024) 103583. https://doi.org/10.1016/j.cose.2023.103583.</w:t>
-      </w:r>
-    </w:p>
-    <w:p>
-      <w:pPr>
-        <w:pStyle w:val="Reference"/>
-      </w:pPr>
-      <w:r>
-        <w:t xml:space="preserve">[23] S. Bag, S. Sarkar, I. Bose, Enhancing cybersecurity risk assessment using temporal knowledge graph-based explainable decision support system, Decis. Support Syst. 198 (2025) 114526. https://doi.org/10.1016/j.dss.2025.114526.</w:t>
-      </w:r>
-    </w:p>
-    <w:p>
-      <w:pPr>
-        <w:pStyle w:val="Reference"/>
-      </w:pPr>
-      <w:r>
-        <w:t xml:space="preserve">[24] L. A. Zadeh, Fuzzy sets, Inf. Control 8 (3) (1965) 338–353. https://doi.org/10.1016/S0019-9958(65)90241-X.</w:t>
-      </w:r>
-    </w:p>
-    <w:p>
-      <w:pPr>
-        <w:pStyle w:val="Reference"/>
-      </w:pPr>
-      <w:r>
-        <w:t xml:space="preserve">[25] J.-S. R. Jang, ANFIS: Adaptive-network-based fuzzy inference system, IEEE Trans. Syst. Man Cybern. 23 (3) (1993) 665–685. https://doi.org/10.1109/21.256541.</w:t>
-      </w:r>
-    </w:p>
-    <w:p>
-      <w:pPr>
-        <w:pStyle w:val="Reference"/>
-      </w:pPr>
-      <w:r>
-        <w:t xml:space="preserve">[26] P. V. de Campos Souza, Fuzzy neural networks and neuro-fuzzy networks: A review the main techniques and applications used in the literature, Appl. Soft Comput. 92 (2020) 106275. https://doi.org/10.1016/j.asoc.2020.106275.</w:t>
-      </w:r>
-    </w:p>
-    <w:p>
-      <w:pPr>
-        <w:pStyle w:val="Reference"/>
-      </w:pPr>
-      <w:r>
-        <w:t xml:space="preserve">[27] A. Fernández, F. Herrera, O. Cordón, M. J. del Jesus, F. Marcelloni, Evolutionary fuzzy systems for explainable artificial intelligence: Why, when, what for, and where to?, IEEE Comput. Intell. Mag. 14 (1) (2019) 69–81. https://doi.org/10.1109/MCI.2018.2881645.</w:t>
-      </w:r>
-    </w:p>
-    <w:p>
-      <w:pPr>
-        <w:pStyle w:val="Reference"/>
-      </w:pPr>
-      <w:r>
-        <w:t xml:space="preserve">[28] C. Elkan, The foundations of cost-sensitive learning, in: Proc. 17th Int. Jt. Conf. Artif. Intell. (IJCAI), 2001, pp. 973–978.</w:t>
-      </w:r>
-    </w:p>
-    <w:p>
-      <w:pPr>
-        <w:pStyle w:val="Reference"/>
-      </w:pPr>
-      <w:r>
-        <w:t xml:space="preserve">[29] Z.-H. Zhou, X.-Y. Liu, Training cost-sensitive neural networks with methods addressing the class imbalance problem, IEEE Trans. Knowl. Data Eng. 18 (1) (2006) 63–77. https://doi.org/10.1109/TKDE.2006.17.</w:t>
-      </w:r>
-    </w:p>
-    <w:p>
-      <w:pPr>
-        <w:pStyle w:val="Reference"/>
-      </w:pPr>
-      <w:r>
-        <w:t xml:space="preserve">[30] A. Barredo Arrieta, N. Díaz-Rodríguez, J. Del Ser, A. Bennetot, S. Tabik, A. Barbado, S. Garcia, S. Gil-Lopez, D. Molina, R. Benjamins, R. Chatila, F. Herrera, Explainable artificial intelligence (XAI): Concepts, taxonomies, opportunities and challenges toward responsible AI, Inf. Fusion 58 (2020) 82–115. https://doi.org/10.1016/j.inffus.2019.12.012.</w:t>
-      </w:r>
-    </w:p>
-    <w:p>
-      <w:pPr>
-        <w:pStyle w:val="Reference"/>
-      </w:pPr>
-      <w:r>
-        <w:t xml:space="preserve">[31] M. Abdar, F. Pourpanah, S. Hussain, D. Rezazadegan, L. Liu, M. Ghavamzadeh, P. Fieguth, X. Cao, A. Khosravi, U. R. Acharya, V. Makarenkov, S. Nahavandi, A review of uncertainty quantification in deep learning: Techniques, applications and challenges, Inf. Fusion 76 (2021) 243–297. https://doi.org/10.1016/j.inffus.2021.05.008.</w:t>
-      </w:r>
-    </w:p>
-    <w:p>
-      <w:pPr>
-        <w:pStyle w:val="Reference"/>
-      </w:pPr>
-      <w:r>
-        <w:t xml:space="preserve">[32] M. Tavallaee, E. Bagheri, W. Lu, A. A. Ghorbani, A detailed analysis of the KDD CUP 99 data set, in: Proc. 2009 IEEE Symp. Comput. Intell. Secur. Def. Appl. (CISDA), 2009, pp. 1–6. https://doi.org/10.1109/CISDA.2009.5356528.</w:t>
-      </w:r>
-    </w:p>
-    <w:p>
-      <w:pPr>
-        <w:pStyle w:val="Reference"/>
-      </w:pPr>
-      <w:r>
-        <w:t xml:space="preserve">[33] J. H. Friedman, Greedy function approximation: A gradient boosting machine, Ann. Stat. 29 (5) (2001) 1189–1232. https://doi.org/10.1214/aos/1013203451.</w:t>
-      </w:r>
-    </w:p>
-    <w:p>
-      <w:pPr>
-        <w:pStyle w:val="Reference"/>
-      </w:pPr>
-      <w:r>
-        <w:t xml:space="preserve">[34] B. Efron, R. J. Tibshirani, An Introduction to the Bootstrap, Chapman &amp; Hall/CRC, New York, 1994. https://doi.org/10.1201/9780429246593.</w:t>
-      </w:r>
-    </w:p>
-    <w:p>
-      <w:pPr>
-        <w:pStyle w:val="Reference"/>
-      </w:pPr>
-      <w:r>
-        <w:t xml:space="preserve">[35] F. Wilcoxon, Individual comparisons by ranking methods, Biom. Bull. 1 (6) (1945) 80–83. https://doi.org/10.2307/3001968.</w:t>
-      </w:r>
-    </w:p>
-    <w:p>
-      <w:pPr>
-        <w:pStyle w:val="Reference"/>
-      </w:pPr>
-      <w:r>
-        <w:t xml:space="preserve">[36] J. Hallberg Szabadváry, T. Löfström, U. Johansson, C. Sönströd, E. Ahlberg, L. Carlsson, Classification with reject option: Distribution-free error guarantees via conformal prediction, Mach. Learn. Appl. 20 (2025) 100664. https://doi.org/10.1016/j.mlwa.2025.100664.</w:t>
-      </w:r>
-    </w:p>
-    <w:p>
-      <w:pPr>
-        <w:pStyle w:val="Reference"/>
-      </w:pPr>
-      <w:r>
-        <w:t xml:space="preserve">[37] H. Albasheer, M. Md Siraj, A. Mubarakali, O. Elsier Tayfour, S. Salih, M. Hamdan, S. Khan, A. Zainal, S. Kamarudeen, Cyber-attack prediction based on network intrusion detection systems for alert correlation techniques: A survey, Sensors 22 (4) (2022) 1494. https://doi.org/10.3390/s22041494.</w:t>
-      </w:r>
-    </w:p>
-    <w:p>
-      <w:pPr>
-        <w:pStyle w:val="Reference"/>
-      </w:pPr>
-      <w:r>
-        <w:t xml:space="preserve">[38] M. Ring, S. Wunderlich, D. Scheuring, D. Landes, A. Hotho, A survey of network-based intrusion detection data sets, Comput. Secur. 86 (2019) 147–167. https://doi.org/10.1016/j.cose.2019.06.005.</w:t>
-      </w:r>
-    </w:p>
-    <w:p>
-      <w:pPr>
-        <w:pStyle w:val="Reference"/>
-      </w:pPr>
-      <w:r>
-        <w:t xml:space="preserve">[39] M. A. Al-Garadi, A. Mohamed, A. K. Al-Ali, X. Du, I. Ali, M. Guizani, A survey of machine and deep learning methods for Internet of Things (IoT) security, IEEE Commun. Surv. Tutor. 22 (3) (2020) 1646–1685. https://doi.org/10.1109/COMST.2020.2988293.</w:t>
+        <w:t xml:space="preserve">[20] J. Hallberg Szabadváry, T. Löfström, U. Johansson, C. Sönströd, E. Ahlberg, L. Carlsson, Classification with reject option: Distribution-free error guarantees via conformal prediction, Mach. Learn. Appl. 20 (2025) 100664. https://doi.org/10.1016/j.mlwa.2025.100664.</w:t>
       </w:r>
     </w:p>
     <w:bookmarkEnd w:id="28"/>

</xml_diff>

<commit_message>
Expand reference list to 25 (author request): 20 Q1 IEEE/Elsevier/MDPI articles + 5 dataset/method sources; restore Su, Alalhareth, Alabbadi (Table 1), Barredo Arrieta, Abdar; 11 pp; no result numbers changed
</commit_message>
<xml_diff>
--- a/paper/elsevier/manuscript.docx
+++ b/paper/elsevier/manuscript.docx
@@ -132,7 +132,7 @@
         <w:pStyle w:val="FirstParagraph"/>
       </w:pPr>
       <w:r>
-        <w:t xml:space="preserve">Security operations centres (SOCs) collect, analyse and respond to an organisation’s security alerts [1]. Their analysts receive far more alerts than they can investigate, because network intrusion detectors generate a high volume of low-quality alerts, most of them false positives [2]. Intrusion-detection research ranges from fuzzy and neuro-fuzzy detectors [3,4] to deep networks trained on benchmarks such as NSL-KDD [5]. Most of this work, however, ends with a risk score and judges it by accuracy or by the area under the receiver operating characteristic curve (ROC-AUC). A SOC manager faces a different question: with limited analyst capacity and unequal error costs, which alerts should be monitored, contained or escalated? We therefore treat triage as a decision task rather than a prediction task. Decision-theoretic three-way decisions already choose among acceptance, rejection and deferment under stated losses [6], and recent SOC studies learn when to defer alerts to analysts [7] or prioritise them by reinforcement learning to combat alert fatigue [8].</w:t>
+        <w:t xml:space="preserve">Security operations centres (SOCs) collect, analyse and respond to an organisation’s security alerts [1]. Their analysts receive far more alerts than they can investigate, because network intrusion detectors generate a high volume of low-quality alerts, most of them false positives [2]. Intrusion-detection research ranges from fuzzy and neuro-fuzzy detectors [3,4] to deep networks trained on benchmarks such as NSL-KDD [5,6]. Most of this work, however, ends with a risk score and judges it by accuracy or by the area under the receiver operating characteristic curve (ROC-AUC). A SOC manager faces a different question: with limited analyst capacity and unequal error costs, which alerts should be monitored, contained or escalated? We therefore treat triage as a decision task rather than a prediction task. Decision-theoretic three-way decisions already choose among acceptance, rejection and deferment under stated losses [7], and recent SOC studies learn when to defer alerts to analysts [8] or prioritise them by reinforcement learning to combat alert fatigue [9].</w:t>
       </w:r>
     </w:p>
     <w:p>
@@ -666,7 +666,7 @@
                 <w:rFonts w:ascii="Times New Roman" w:hAnsi="Times New Roman"/>
                 <w:sz w:val="18"/>
               </w:rPr>
-              <w:t xml:space="preserve">Vinayakumar [5]</w:t>
+              <w:t xml:space="preserve">Alalhareth [10]</w:t>
             </w:r>
           </w:p>
         </w:tc>
@@ -686,7 +686,7 @@
                 <w:rFonts w:ascii="Times New Roman" w:hAnsi="Times New Roman"/>
                 <w:sz w:val="18"/>
               </w:rPr>
-              <w:t xml:space="preserve">Deep neural network</w:t>
+              <w:t xml:space="preserve">LSTM, fuzzy-tuned training</w:t>
             </w:r>
           </w:p>
         </w:tc>
@@ -706,7 +706,7 @@
                 <w:rFonts w:ascii="Times New Roman" w:hAnsi="Times New Roman"/>
                 <w:sz w:val="18"/>
               </w:rPr>
-              <w:t xml:space="preserve">NSL-KDD + 5 others</w:t>
+              <w:t xml:space="preserve">WUSTL-EHMS-2020</w:t>
             </w:r>
           </w:p>
         </w:tc>
@@ -726,7 +726,7 @@
                 <w:rFonts w:ascii="Times New Roman" w:hAnsi="Times New Roman"/>
                 <w:sz w:val="18"/>
               </w:rPr>
-              <w:t xml:space="preserve">×</w:t>
+              <w:t xml:space="preserve">(✓)</w:t>
             </w:r>
           </w:p>
         </w:tc>
@@ -811,7 +811,7 @@
                 <w:rFonts w:ascii="Times New Roman" w:hAnsi="Times New Roman"/>
                 <w:sz w:val="18"/>
               </w:rPr>
-              <w:t xml:space="preserve">Gupta [9]</w:t>
+              <w:t xml:space="preserve">Vinayakumar [5]</w:t>
             </w:r>
           </w:p>
         </w:tc>
@@ -831,7 +831,7 @@
                 <w:rFonts w:ascii="Times New Roman" w:hAnsi="Times New Roman"/>
                 <w:sz w:val="18"/>
               </w:rPr>
-              <w:t xml:space="preserve">Cost-sensitive deep ensemble</w:t>
+              <w:t xml:space="preserve">Deep neural network</w:t>
             </w:r>
           </w:p>
         </w:tc>
@@ -851,7 +851,7 @@
                 <w:rFonts w:ascii="Times New Roman" w:hAnsi="Times New Roman"/>
                 <w:sz w:val="18"/>
               </w:rPr>
-              <w:t xml:space="preserve">NSL-KDD + 2 others</w:t>
+              <w:t xml:space="preserve">NSL-KDD + 5 others</w:t>
             </w:r>
           </w:p>
         </w:tc>
@@ -871,7 +871,7 @@
                 <w:rFonts w:ascii="Times New Roman" w:hAnsi="Times New Roman"/>
                 <w:sz w:val="18"/>
               </w:rPr>
-              <w:t xml:space="preserve">(✓)</w:t>
+              <w:t xml:space="preserve">×</w:t>
             </w:r>
           </w:p>
         </w:tc>
@@ -931,7 +931,7 @@
                 <w:rFonts w:ascii="Times New Roman" w:hAnsi="Times New Roman"/>
                 <w:sz w:val="18"/>
               </w:rPr>
-              <w:t xml:space="preserve">n.r.</w:t>
+              <w:t xml:space="preserve">×</w:t>
             </w:r>
           </w:p>
         </w:tc>
@@ -956,7 +956,7 @@
                 <w:rFonts w:ascii="Times New Roman" w:hAnsi="Times New Roman"/>
                 <w:sz w:val="18"/>
               </w:rPr>
-              <w:t xml:space="preserve">Telikani [10]</w:t>
+              <w:t xml:space="preserve">Su [6]</w:t>
             </w:r>
           </w:p>
         </w:tc>
@@ -976,7 +976,7 @@
                 <w:rFonts w:ascii="Times New Roman" w:hAnsi="Times New Roman"/>
                 <w:sz w:val="18"/>
               </w:rPr>
-              <w:t xml:space="preserve">Cost-sensitive autoencoder + SVM</w:t>
+              <w:t xml:space="preserve">Bidirectional LSTM + attention</w:t>
             </w:r>
           </w:p>
         </w:tc>
@@ -996,7 +996,7 @@
                 <w:rFonts w:ascii="Times New Roman" w:hAnsi="Times New Roman"/>
                 <w:sz w:val="18"/>
               </w:rPr>
-              <w:t xml:space="preserve">UNSW-NB15, BoT-IoT</w:t>
+              <w:t xml:space="preserve">NSL-KDD</w:t>
             </w:r>
           </w:p>
         </w:tc>
@@ -1016,7 +1016,7 @@
                 <w:rFonts w:ascii="Times New Roman" w:hAnsi="Times New Roman"/>
                 <w:sz w:val="18"/>
               </w:rPr>
-              <w:t xml:space="preserve">(✓)</w:t>
+              <w:t xml:space="preserve">×</w:t>
             </w:r>
           </w:p>
         </w:tc>
@@ -1076,7 +1076,7 @@
                 <w:rFonts w:ascii="Times New Roman" w:hAnsi="Times New Roman"/>
                 <w:sz w:val="18"/>
               </w:rPr>
-              <w:t xml:space="preserve">n.r.</w:t>
+              <w:t xml:space="preserve">×</w:t>
             </w:r>
           </w:p>
         </w:tc>
@@ -1101,7 +1101,7 @@
                 <w:rFonts w:ascii="Times New Roman" w:hAnsi="Times New Roman"/>
                 <w:sz w:val="18"/>
               </w:rPr>
-              <w:t xml:space="preserve">Wang [11]</w:t>
+              <w:t xml:space="preserve">Gupta [11]</w:t>
             </w:r>
           </w:p>
         </w:tc>
@@ -1121,7 +1121,7 @@
                 <w:rFonts w:ascii="Times New Roman" w:hAnsi="Times New Roman"/>
                 <w:sz w:val="18"/>
               </w:rPr>
-              <w:t xml:space="preserve">SHAP explanations</w:t>
+              <w:t xml:space="preserve">Cost-sensitive deep ensemble</w:t>
             </w:r>
           </w:p>
         </w:tc>
@@ -1141,7 +1141,7 @@
                 <w:rFonts w:ascii="Times New Roman" w:hAnsi="Times New Roman"/>
                 <w:sz w:val="18"/>
               </w:rPr>
-              <w:t xml:space="preserve">NSL-KDD</w:t>
+              <w:t xml:space="preserve">NSL-KDD + 2 others</w:t>
             </w:r>
           </w:p>
         </w:tc>
@@ -1161,12 +1161,52 @@
                 <w:rFonts w:ascii="Times New Roman" w:hAnsi="Times New Roman"/>
                 <w:sz w:val="18"/>
               </w:rPr>
+              <w:t xml:space="preserve">(✓)</w:t>
+            </w:r>
+          </w:p>
+        </w:tc>
+        <w:tc>
+          <w:tcPr>
+            <w:tcW w:type="dxa" w:w="648"/>
+          </w:tcPr>
+          <w:p>
+            <w:pPr>
+              <w:pStyle w:val="Compact"/>
+              <w:keepNext/>
+              <w:spacing w:before="20" w:after="20" w:line="240" w:lineRule="auto"/>
+              <w:jc w:val="center"/>
+            </w:pPr>
+            <w:r>
+              <w:rPr>
+                <w:rFonts w:ascii="Times New Roman" w:hAnsi="Times New Roman"/>
+                <w:sz w:val="18"/>
+              </w:rPr>
               <w:t xml:space="preserve">×</w:t>
             </w:r>
           </w:p>
         </w:tc>
         <w:tc>
           <w:tcPr>
+            <w:tcW w:type="dxa" w:w="792"/>
+          </w:tcPr>
+          <w:p>
+            <w:pPr>
+              <w:pStyle w:val="Compact"/>
+              <w:keepNext/>
+              <w:spacing w:before="20" w:after="20" w:line="240" w:lineRule="auto"/>
+              <w:jc w:val="center"/>
+            </w:pPr>
+            <w:r>
+              <w:rPr>
+                <w:rFonts w:ascii="Times New Roman" w:hAnsi="Times New Roman"/>
+                <w:sz w:val="18"/>
+              </w:rPr>
+              <w:t xml:space="preserve">×</w:t>
+            </w:r>
+          </w:p>
+        </w:tc>
+        <w:tc>
+          <w:tcPr>
             <w:tcW w:type="dxa" w:w="648"/>
           </w:tcPr>
           <w:p>
@@ -1181,47 +1221,7 @@
                 <w:rFonts w:ascii="Times New Roman" w:hAnsi="Times New Roman"/>
                 <w:sz w:val="18"/>
               </w:rPr>
-              <w:t xml:space="preserve">(✓)</w:t>
-            </w:r>
-          </w:p>
-        </w:tc>
-        <w:tc>
-          <w:tcPr>
-            <w:tcW w:type="dxa" w:w="792"/>
-          </w:tcPr>
-          <w:p>
-            <w:pPr>
-              <w:pStyle w:val="Compact"/>
-              <w:keepNext/>
-              <w:spacing w:before="20" w:after="20" w:line="240" w:lineRule="auto"/>
-              <w:jc w:val="center"/>
-            </w:pPr>
-            <w:r>
-              <w:rPr>
-                <w:rFonts w:ascii="Times New Roman" w:hAnsi="Times New Roman"/>
-                <w:sz w:val="18"/>
-              </w:rPr>
-              <w:t xml:space="preserve">×</w:t>
-            </w:r>
-          </w:p>
-        </w:tc>
-        <w:tc>
-          <w:tcPr>
-            <w:tcW w:type="dxa" w:w="648"/>
-          </w:tcPr>
-          <w:p>
-            <w:pPr>
-              <w:pStyle w:val="Compact"/>
-              <w:keepNext/>
-              <w:spacing w:before="20" w:after="20" w:line="240" w:lineRule="auto"/>
-              <w:jc w:val="center"/>
-            </w:pPr>
-            <w:r>
-              <w:rPr>
-                <w:rFonts w:ascii="Times New Roman" w:hAnsi="Times New Roman"/>
-                <w:sz w:val="18"/>
-              </w:rPr>
-              <w:t xml:space="preserve">×</w:t>
+              <w:t xml:space="preserve">n.r.</w:t>
             </w:r>
           </w:p>
         </w:tc>
@@ -1246,7 +1246,7 @@
                 <w:rFonts w:ascii="Times New Roman" w:hAnsi="Times New Roman"/>
                 <w:sz w:val="18"/>
               </w:rPr>
-              <w:t xml:space="preserve">Wang [8]</w:t>
+              <w:t xml:space="preserve">Telikani [12]</w:t>
             </w:r>
           </w:p>
         </w:tc>
@@ -1266,7 +1266,7 @@
                 <w:rFonts w:ascii="Times New Roman" w:hAnsi="Times New Roman"/>
                 <w:sz w:val="18"/>
               </w:rPr>
-              <w:t xml:space="preserve">Reinforcement-learning ranking</w:t>
+              <w:t xml:space="preserve">Cost-sensitive autoencoder + SVM</w:t>
             </w:r>
           </w:p>
         </w:tc>
@@ -1286,7 +1286,7 @@
                 <w:rFonts w:ascii="Times New Roman" w:hAnsi="Times New Roman"/>
                 <w:sz w:val="18"/>
               </w:rPr>
-              <w:t xml:space="preserve">5 multi-step sets</w:t>
+              <w:t xml:space="preserve">UNSW-NB15, BoT-IoT</w:t>
             </w:r>
           </w:p>
         </w:tc>
@@ -1306,13 +1306,33 @@
                 <w:rFonts w:ascii="Times New Roman" w:hAnsi="Times New Roman"/>
                 <w:sz w:val="18"/>
               </w:rPr>
+              <w:t xml:space="preserve">(✓)</w:t>
+            </w:r>
+          </w:p>
+        </w:tc>
+        <w:tc>
+          <w:tcPr>
+            <w:tcW w:type="dxa" w:w="648"/>
+          </w:tcPr>
+          <w:p>
+            <w:pPr>
+              <w:pStyle w:val="Compact"/>
+              <w:keepNext/>
+              <w:spacing w:before="20" w:after="20" w:line="240" w:lineRule="auto"/>
+              <w:jc w:val="center"/>
+            </w:pPr>
+            <w:r>
+              <w:rPr>
+                <w:rFonts w:ascii="Times New Roman" w:hAnsi="Times New Roman"/>
+                <w:sz w:val="18"/>
+              </w:rPr>
               <w:t xml:space="preserve">×</w:t>
             </w:r>
           </w:p>
         </w:tc>
         <w:tc>
           <w:tcPr>
-            <w:tcW w:type="dxa" w:w="648"/>
+            <w:tcW w:type="dxa" w:w="792"/>
           </w:tcPr>
           <w:p>
             <w:pPr>
@@ -1327,26 +1347,6 @@
                 <w:sz w:val="18"/>
               </w:rPr>
               <w:t xml:space="preserve">×</w:t>
-            </w:r>
-          </w:p>
-        </w:tc>
-        <w:tc>
-          <w:tcPr>
-            <w:tcW w:type="dxa" w:w="792"/>
-          </w:tcPr>
-          <w:p>
-            <w:pPr>
-              <w:pStyle w:val="Compact"/>
-              <w:keepNext/>
-              <w:spacing w:before="20" w:after="20" w:line="240" w:lineRule="auto"/>
-              <w:jc w:val="center"/>
-            </w:pPr>
-            <w:r>
-              <w:rPr>
-                <w:rFonts w:ascii="Times New Roman" w:hAnsi="Times New Roman"/>
-                <w:sz w:val="18"/>
-              </w:rPr>
-              <w:t xml:space="preserve">(✓)</w:t>
             </w:r>
           </w:p>
         </w:tc>
@@ -1391,7 +1391,442 @@
                 <w:rFonts w:ascii="Times New Roman" w:hAnsi="Times New Roman"/>
                 <w:sz w:val="18"/>
               </w:rPr>
-              <w:t xml:space="preserve">Bag [12]</w:t>
+              <w:t xml:space="preserve">Wang [13]</w:t>
+            </w:r>
+          </w:p>
+        </w:tc>
+        <w:tc>
+          <w:tcPr>
+            <w:tcW w:type="dxa" w:w="2808"/>
+          </w:tcPr>
+          <w:p>
+            <w:pPr>
+              <w:pStyle w:val="Compact"/>
+              <w:keepNext/>
+              <w:spacing w:before="20" w:after="20" w:line="240" w:lineRule="auto"/>
+              <w:jc w:val="left"/>
+            </w:pPr>
+            <w:r>
+              <w:rPr>
+                <w:rFonts w:ascii="Times New Roman" w:hAnsi="Times New Roman"/>
+                <w:sz w:val="18"/>
+              </w:rPr>
+              <w:t xml:space="preserve">SHAP explanations</w:t>
+            </w:r>
+          </w:p>
+        </w:tc>
+        <w:tc>
+          <w:tcPr>
+            <w:tcW w:type="dxa" w:w="2088"/>
+          </w:tcPr>
+          <w:p>
+            <w:pPr>
+              <w:pStyle w:val="Compact"/>
+              <w:keepNext/>
+              <w:spacing w:before="20" w:after="20" w:line="240" w:lineRule="auto"/>
+              <w:jc w:val="left"/>
+            </w:pPr>
+            <w:r>
+              <w:rPr>
+                <w:rFonts w:ascii="Times New Roman" w:hAnsi="Times New Roman"/>
+                <w:sz w:val="18"/>
+              </w:rPr>
+              <w:t xml:space="preserve">NSL-KDD</w:t>
+            </w:r>
+          </w:p>
+        </w:tc>
+        <w:tc>
+          <w:tcPr>
+            <w:tcW w:type="dxa" w:w="648"/>
+          </w:tcPr>
+          <w:p>
+            <w:pPr>
+              <w:pStyle w:val="Compact"/>
+              <w:keepNext/>
+              <w:spacing w:before="20" w:after="20" w:line="240" w:lineRule="auto"/>
+              <w:jc w:val="center"/>
+            </w:pPr>
+            <w:r>
+              <w:rPr>
+                <w:rFonts w:ascii="Times New Roman" w:hAnsi="Times New Roman"/>
+                <w:sz w:val="18"/>
+              </w:rPr>
+              <w:t xml:space="preserve">×</w:t>
+            </w:r>
+          </w:p>
+        </w:tc>
+        <w:tc>
+          <w:tcPr>
+            <w:tcW w:type="dxa" w:w="648"/>
+          </w:tcPr>
+          <w:p>
+            <w:pPr>
+              <w:pStyle w:val="Compact"/>
+              <w:keepNext/>
+              <w:spacing w:before="20" w:after="20" w:line="240" w:lineRule="auto"/>
+              <w:jc w:val="center"/>
+            </w:pPr>
+            <w:r>
+              <w:rPr>
+                <w:rFonts w:ascii="Times New Roman" w:hAnsi="Times New Roman"/>
+                <w:sz w:val="18"/>
+              </w:rPr>
+              <w:t xml:space="preserve">(✓)</w:t>
+            </w:r>
+          </w:p>
+        </w:tc>
+        <w:tc>
+          <w:tcPr>
+            <w:tcW w:type="dxa" w:w="792"/>
+          </w:tcPr>
+          <w:p>
+            <w:pPr>
+              <w:pStyle w:val="Compact"/>
+              <w:keepNext/>
+              <w:spacing w:before="20" w:after="20" w:line="240" w:lineRule="auto"/>
+              <w:jc w:val="center"/>
+            </w:pPr>
+            <w:r>
+              <w:rPr>
+                <w:rFonts w:ascii="Times New Roman" w:hAnsi="Times New Roman"/>
+                <w:sz w:val="18"/>
+              </w:rPr>
+              <w:t xml:space="preserve">×</w:t>
+            </w:r>
+          </w:p>
+        </w:tc>
+        <w:tc>
+          <w:tcPr>
+            <w:tcW w:type="dxa" w:w="648"/>
+          </w:tcPr>
+          <w:p>
+            <w:pPr>
+              <w:pStyle w:val="Compact"/>
+              <w:keepNext/>
+              <w:spacing w:before="20" w:after="20" w:line="240" w:lineRule="auto"/>
+              <w:jc w:val="center"/>
+            </w:pPr>
+            <w:r>
+              <w:rPr>
+                <w:rFonts w:ascii="Times New Roman" w:hAnsi="Times New Roman"/>
+                <w:sz w:val="18"/>
+              </w:rPr>
+              <w:t xml:space="preserve">×</w:t>
+            </w:r>
+          </w:p>
+        </w:tc>
+      </w:tr>
+      <w:tr>
+        <w:trPr>
+          <w:cantSplit/>
+        </w:trPr>
+        <w:tc>
+          <w:tcPr>
+            <w:tcW w:type="dxa" w:w="1656"/>
+          </w:tcPr>
+          <w:p>
+            <w:pPr>
+              <w:pStyle w:val="Compact"/>
+              <w:keepNext/>
+              <w:spacing w:before="20" w:after="20" w:line="240" w:lineRule="auto"/>
+              <w:jc w:val="left"/>
+            </w:pPr>
+            <w:r>
+              <w:rPr>
+                <w:rFonts w:ascii="Times New Roman" w:hAnsi="Times New Roman"/>
+                <w:sz w:val="18"/>
+              </w:rPr>
+              <w:t xml:space="preserve">Alabbadi [14]</w:t>
+            </w:r>
+          </w:p>
+        </w:tc>
+        <w:tc>
+          <w:tcPr>
+            <w:tcW w:type="dxa" w:w="2808"/>
+          </w:tcPr>
+          <w:p>
+            <w:pPr>
+              <w:pStyle w:val="Compact"/>
+              <w:keepNext/>
+              <w:spacing w:before="20" w:after="20" w:line="240" w:lineRule="auto"/>
+              <w:jc w:val="left"/>
+            </w:pPr>
+            <w:r>
+              <w:rPr>
+                <w:rFonts w:ascii="Times New Roman" w:hAnsi="Times New Roman"/>
+                <w:sz w:val="18"/>
+              </w:rPr>
+              <w:t xml:space="preserve">Deep models + XAI</w:t>
+            </w:r>
+          </w:p>
+        </w:tc>
+        <w:tc>
+          <w:tcPr>
+            <w:tcW w:type="dxa" w:w="2088"/>
+          </w:tcPr>
+          <w:p>
+            <w:pPr>
+              <w:pStyle w:val="Compact"/>
+              <w:keepNext/>
+              <w:spacing w:before="20" w:after="20" w:line="240" w:lineRule="auto"/>
+              <w:jc w:val="left"/>
+            </w:pPr>
+            <w:r>
+              <w:rPr>
+                <w:rFonts w:ascii="Times New Roman" w:hAnsi="Times New Roman"/>
+                <w:sz w:val="18"/>
+              </w:rPr>
+              <w:t xml:space="preserve">TON_IoT</w:t>
+            </w:r>
+          </w:p>
+        </w:tc>
+        <w:tc>
+          <w:tcPr>
+            <w:tcW w:type="dxa" w:w="648"/>
+          </w:tcPr>
+          <w:p>
+            <w:pPr>
+              <w:pStyle w:val="Compact"/>
+              <w:keepNext/>
+              <w:spacing w:before="20" w:after="20" w:line="240" w:lineRule="auto"/>
+              <w:jc w:val="center"/>
+            </w:pPr>
+            <w:r>
+              <w:rPr>
+                <w:rFonts w:ascii="Times New Roman" w:hAnsi="Times New Roman"/>
+                <w:sz w:val="18"/>
+              </w:rPr>
+              <w:t xml:space="preserve">×</w:t>
+            </w:r>
+          </w:p>
+        </w:tc>
+        <w:tc>
+          <w:tcPr>
+            <w:tcW w:type="dxa" w:w="648"/>
+          </w:tcPr>
+          <w:p>
+            <w:pPr>
+              <w:pStyle w:val="Compact"/>
+              <w:keepNext/>
+              <w:spacing w:before="20" w:after="20" w:line="240" w:lineRule="auto"/>
+              <w:jc w:val="center"/>
+            </w:pPr>
+            <w:r>
+              <w:rPr>
+                <w:rFonts w:ascii="Times New Roman" w:hAnsi="Times New Roman"/>
+                <w:sz w:val="18"/>
+              </w:rPr>
+              <w:t xml:space="preserve">(✓)</w:t>
+            </w:r>
+          </w:p>
+        </w:tc>
+        <w:tc>
+          <w:tcPr>
+            <w:tcW w:type="dxa" w:w="792"/>
+          </w:tcPr>
+          <w:p>
+            <w:pPr>
+              <w:pStyle w:val="Compact"/>
+              <w:keepNext/>
+              <w:spacing w:before="20" w:after="20" w:line="240" w:lineRule="auto"/>
+              <w:jc w:val="center"/>
+            </w:pPr>
+            <w:r>
+              <w:rPr>
+                <w:rFonts w:ascii="Times New Roman" w:hAnsi="Times New Roman"/>
+                <w:sz w:val="18"/>
+              </w:rPr>
+              <w:t xml:space="preserve">×</w:t>
+            </w:r>
+          </w:p>
+        </w:tc>
+        <w:tc>
+          <w:tcPr>
+            <w:tcW w:type="dxa" w:w="648"/>
+          </w:tcPr>
+          <w:p>
+            <w:pPr>
+              <w:pStyle w:val="Compact"/>
+              <w:keepNext/>
+              <w:spacing w:before="20" w:after="20" w:line="240" w:lineRule="auto"/>
+              <w:jc w:val="center"/>
+            </w:pPr>
+            <w:r>
+              <w:rPr>
+                <w:rFonts w:ascii="Times New Roman" w:hAnsi="Times New Roman"/>
+                <w:sz w:val="18"/>
+              </w:rPr>
+              <w:t xml:space="preserve">n.r.</w:t>
+            </w:r>
+          </w:p>
+        </w:tc>
+      </w:tr>
+      <w:tr>
+        <w:trPr>
+          <w:cantSplit/>
+        </w:trPr>
+        <w:tc>
+          <w:tcPr>
+            <w:tcW w:type="dxa" w:w="1656"/>
+          </w:tcPr>
+          <w:p>
+            <w:pPr>
+              <w:pStyle w:val="Compact"/>
+              <w:keepNext/>
+              <w:spacing w:before="20" w:after="20" w:line="240" w:lineRule="auto"/>
+              <w:jc w:val="left"/>
+            </w:pPr>
+            <w:r>
+              <w:rPr>
+                <w:rFonts w:ascii="Times New Roman" w:hAnsi="Times New Roman"/>
+                <w:sz w:val="18"/>
+              </w:rPr>
+              <w:t xml:space="preserve">Wang [9]</w:t>
+            </w:r>
+          </w:p>
+        </w:tc>
+        <w:tc>
+          <w:tcPr>
+            <w:tcW w:type="dxa" w:w="2808"/>
+          </w:tcPr>
+          <w:p>
+            <w:pPr>
+              <w:pStyle w:val="Compact"/>
+              <w:keepNext/>
+              <w:spacing w:before="20" w:after="20" w:line="240" w:lineRule="auto"/>
+              <w:jc w:val="left"/>
+            </w:pPr>
+            <w:r>
+              <w:rPr>
+                <w:rFonts w:ascii="Times New Roman" w:hAnsi="Times New Roman"/>
+                <w:sz w:val="18"/>
+              </w:rPr>
+              <w:t xml:space="preserve">Reinforcement-learning ranking</w:t>
+            </w:r>
+          </w:p>
+        </w:tc>
+        <w:tc>
+          <w:tcPr>
+            <w:tcW w:type="dxa" w:w="2088"/>
+          </w:tcPr>
+          <w:p>
+            <w:pPr>
+              <w:pStyle w:val="Compact"/>
+              <w:keepNext/>
+              <w:spacing w:before="20" w:after="20" w:line="240" w:lineRule="auto"/>
+              <w:jc w:val="left"/>
+            </w:pPr>
+            <w:r>
+              <w:rPr>
+                <w:rFonts w:ascii="Times New Roman" w:hAnsi="Times New Roman"/>
+                <w:sz w:val="18"/>
+              </w:rPr>
+              <w:t xml:space="preserve">5 multi-step sets</w:t>
+            </w:r>
+          </w:p>
+        </w:tc>
+        <w:tc>
+          <w:tcPr>
+            <w:tcW w:type="dxa" w:w="648"/>
+          </w:tcPr>
+          <w:p>
+            <w:pPr>
+              <w:pStyle w:val="Compact"/>
+              <w:keepNext/>
+              <w:spacing w:before="20" w:after="20" w:line="240" w:lineRule="auto"/>
+              <w:jc w:val="center"/>
+            </w:pPr>
+            <w:r>
+              <w:rPr>
+                <w:rFonts w:ascii="Times New Roman" w:hAnsi="Times New Roman"/>
+                <w:sz w:val="18"/>
+              </w:rPr>
+              <w:t xml:space="preserve">×</w:t>
+            </w:r>
+          </w:p>
+        </w:tc>
+        <w:tc>
+          <w:tcPr>
+            <w:tcW w:type="dxa" w:w="648"/>
+          </w:tcPr>
+          <w:p>
+            <w:pPr>
+              <w:pStyle w:val="Compact"/>
+              <w:keepNext/>
+              <w:spacing w:before="20" w:after="20" w:line="240" w:lineRule="auto"/>
+              <w:jc w:val="center"/>
+            </w:pPr>
+            <w:r>
+              <w:rPr>
+                <w:rFonts w:ascii="Times New Roman" w:hAnsi="Times New Roman"/>
+                <w:sz w:val="18"/>
+              </w:rPr>
+              <w:t xml:space="preserve">×</w:t>
+            </w:r>
+          </w:p>
+        </w:tc>
+        <w:tc>
+          <w:tcPr>
+            <w:tcW w:type="dxa" w:w="792"/>
+          </w:tcPr>
+          <w:p>
+            <w:pPr>
+              <w:pStyle w:val="Compact"/>
+              <w:keepNext/>
+              <w:spacing w:before="20" w:after="20" w:line="240" w:lineRule="auto"/>
+              <w:jc w:val="center"/>
+            </w:pPr>
+            <w:r>
+              <w:rPr>
+                <w:rFonts w:ascii="Times New Roman" w:hAnsi="Times New Roman"/>
+                <w:sz w:val="18"/>
+              </w:rPr>
+              <w:t xml:space="preserve">(✓)</w:t>
+            </w:r>
+          </w:p>
+        </w:tc>
+        <w:tc>
+          <w:tcPr>
+            <w:tcW w:type="dxa" w:w="648"/>
+          </w:tcPr>
+          <w:p>
+            <w:pPr>
+              <w:pStyle w:val="Compact"/>
+              <w:keepNext/>
+              <w:spacing w:before="20" w:after="20" w:line="240" w:lineRule="auto"/>
+              <w:jc w:val="center"/>
+            </w:pPr>
+            <w:r>
+              <w:rPr>
+                <w:rFonts w:ascii="Times New Roman" w:hAnsi="Times New Roman"/>
+                <w:sz w:val="18"/>
+              </w:rPr>
+              <w:t xml:space="preserve">n.r.</w:t>
+            </w:r>
+          </w:p>
+        </w:tc>
+      </w:tr>
+      <w:tr>
+        <w:trPr>
+          <w:cantSplit/>
+        </w:trPr>
+        <w:tc>
+          <w:tcPr>
+            <w:tcW w:type="dxa" w:w="1656"/>
+          </w:tcPr>
+          <w:p>
+            <w:pPr>
+              <w:pStyle w:val="Compact"/>
+              <w:keepNext/>
+              <w:spacing w:before="20" w:after="20" w:line="240" w:lineRule="auto"/>
+              <w:jc w:val="left"/>
+            </w:pPr>
+            <w:r>
+              <w:rPr>
+                <w:rFonts w:ascii="Times New Roman" w:hAnsi="Times New Roman"/>
+                <w:sz w:val="18"/>
+              </w:rPr>
+              <w:t xml:space="preserve">Bag [15]</w:t>
             </w:r>
           </w:p>
         </w:tc>
@@ -1754,7 +2189,7 @@
         <w:pStyle w:val="TableNote"/>
       </w:pPr>
       <w:r>
-        <w:t xml:space="preserve">Cost: actions chosen under an explicit cost model. Rules: readable decision logic. Graded: more than two actions. Tests: significance tests or confidence intervals. ✓ present, (✓) partial, × absent, n.r. not reported. SHAP: Shapley additive explanations; SVM: support vector machine.</w:t>
+        <w:t xml:space="preserve">Cost: actions chosen under an explicit cost model. Rules: readable decision logic. Graded: more than two actions. Tests: significance tests or confidence intervals. ✓ present, (✓) partial, × absent, n.r. not reported. LSTM: long short-term memory; SHAP: Shapley additive explanations; SVM: support vector machine.</w:t>
       </w:r>
     </w:p>
     <w:p>
@@ -1762,7 +2197,7 @@
         <w:pStyle w:val="BodyText"/>
       </w:pPr>
       <w:r>
-        <w:t xml:space="preserve">Fuzzy and neuro-fuzzy systems suit this decision step, because they express learned evidence as linguistic rules that operators can read and audit [13,14]. As Table 1 shows, existing studies use these strengths for other purposes. Fuzzy intrusion detectors use rules to improve accuracy, but they still output a binary alarm [3,4]. Cost-sensitive learning [15] enters intrusion detection mainly through weighted training losses [9,10], so the cost model shapes the classifier but does not choose the action. Post hoc explainable artificial intelligence (XAI) methods, such as Shapley additive explanations, explain a score after it has been produced [11]. Reinforcement learning can rank alerts by priority, yet the ranking does not assign an action [8]. The closest designs to ours defer uncertain cases. Three-way decision models assign each case to acceptance, rejection or deferment, with thresholds derived from loss functions [6], and Jalalvand et al. [7] learn when to defer alerts from analyst feedback. Neither assigns graded SOC actions through a readable fuzzy rule base driven by a learned score. Knowledge-based decision support has shown the value of explicit domain knowledge in cyber-risk assessment [12]. However, to our knowledge none of these studies combines an action-cost model, readable rules and graded responses in one triage layer.</w:t>
+        <w:t xml:space="preserve">Fuzzy and neuro-fuzzy systems suit this decision step, because they express learned evidence as linguistic rules that operators can read and audit [16,17]. As Table 1 shows, existing studies use these strengths for other purposes. Fuzzy intrusion detectors use rules to improve accuracy, but they still output a binary alarm [3,4,10]. Cost-sensitive learning [18] enters intrusion detection mainly through weighted training losses [11,12], so the cost model shapes the classifier but does not choose the action. Post hoc explainable artificial intelligence (XAI) methods, such as Shapley additive explanations, explain a score after it has been produced [13,14,19]. Reinforcement learning can rank alerts by priority, yet the ranking does not assign an action [9]. The closest designs to ours defer uncertain cases. Three-way decision models assign each case to acceptance, rejection or deferment, with thresholds derived from loss functions [7], and Jalalvand et al. [8] learn when to defer alerts from analyst feedback. Neither assigns graded SOC actions through a readable fuzzy rule base driven by a learned score. Knowledge-based decision support has shown the value of explicit domain knowledge in cyber-risk assessment [15]. However, to our knowledge none of these studies combines an action-cost model, readable rules and graded responses in one triage layer.</w:t>
       </w:r>
     </w:p>
     <w:p>
@@ -2462,7 +2897,7 @@
         <w:t xml:space="preserve"> </w:t>
       </w:r>
       <w:r>
-        <w:t xml:space="preserve">Two shoulder functions and one triangular function map the propensity to three linguistic risk bands [13]. With the clipping operator</w:t>
+        <w:t xml:space="preserve">Two shoulder functions and one triangular function map the propensity to three linguistic risk bands [16]. With the clipping operator</w:t>
       </w:r>
       <w:r>
         <w:t xml:space="preserve"> </w:t>
@@ -4789,7 +5224,7 @@
         <w:t xml:space="preserve"> </w:t>
       </w:r>
       <w:r>
-        <w:t xml:space="preserve">as a calibrated probability, which the MLP output need not be. Because soft-blocking costs less than escalation for both classes, the Bayes rule never escalates. Instead, it soft-blocks every alert with</w:t>
+        <w:t xml:space="preserve">as a calibrated probability, although deep-model scores do not guarantee calibration [20]. Because soft-blocking costs less than escalation for both classes, the Bayes rule never escalates. Instead, it soft-blocks every alert with</w:t>
       </w:r>
       <w:r>
         <w:t xml:space="preserve"> </w:t>
@@ -4855,7 +5290,7 @@
         <w:t xml:space="preserve"> </w:t>
       </w:r>
       <w:r>
-        <w:t xml:space="preserve">The experiments used the NSL-KDD benchmark [16]. For reproducibility on a standard CPU, we sampled 40,000 training records and split them, with stratification, into 34,000 training and 6,000 validation records. The scaler and encoder were fitted on the training split only. The test set was capped at 20,000 records with an attack rate of 0.568. Because it contains attack types absent from training, the evaluation includes a realistic distribution shift.</w:t>
+        <w:t xml:space="preserve">The experiments used the NSL-KDD benchmark [21]. For reproducibility on a standard CPU, we sampled 40,000 training records and split them, with stratification, into 34,000 training and 6,000 validation records. The scaler and encoder were fitted on the training split only. The test set was capped at 20,000 records with an attack rate of 0.568. Because it contains attack types absent from training, the evaluation includes a realistic distribution shift.</w:t>
       </w:r>
     </w:p>
     <w:p>
@@ -4873,7 +5308,7 @@
         <w:t xml:space="preserve"> </w:t>
       </w:r>
       <w:r>
-        <w:t xml:space="preserve">Three detectors were compared: class-balanced logistic regression, gradient boosting (GB) [17] with scikit-learn defaults, and the MLP alone. The proposed policy uses the MLP propensity, so any benefit must come from better decisions rather than better scores. Three decision baselines acted on the same scores. The first escalates every alert scored above 0.5 and monitors the rest. The second tunes this threshold on validation data to minimise cost, a form of threshold moving [15]. The third escalates the 20% highest-scored alerts, mimicking a fixed analyst capacity. Learned prioritisation policies, such as reinforcement learning [8], were excluded because they need interaction or logged decision data with outcome feedback, which the benchmark lacks.</w:t>
+        <w:t xml:space="preserve">Three detectors were compared: class-balanced logistic regression, gradient boosting (GB) [22] with scikit-learn defaults, and the MLP alone. The proposed policy uses the MLP propensity, so any benefit must come from better decisions rather than better scores. Three decision baselines acted on the same scores. The first escalates every alert scored above 0.5 and monitors the rest. The second tunes this threshold on validation data to minimise cost, a form of threshold moving [18]. The third escalates the 20% highest-scored alerts, mimicking a fixed analyst capacity. Learned prioritisation policies, such as reinforcement learning [9], were excluded because they need interaction or logged decision data with outcome feedback, which the benchmark lacks.</w:t>
       </w:r>
     </w:p>
     <w:p>
@@ -4891,7 +5326,7 @@
         <w:t xml:space="preserve"> </w:t>
       </w:r>
       <w:r>
-        <w:t xml:space="preserve">On the seed-42 test set, we report percentile 95% confidence intervals (CIs) from 2,000 paired bootstrap resamples of alerts [18]. Per-alert cost differences were tested with the two-sided Wilcoxon signed-rank test [19], which treats alerts as independent. The full pipeline was repeated for seeds 42–51, and the seed-level costs were compared with a paired Wilcoxon test. Two sweeps varied the missed-attack cost</w:t>
+        <w:t xml:space="preserve">On the seed-42 test set, we report percentile 95% confidence intervals (CIs) from 2,000 paired bootstrap resamples of alerts [23]. Per-alert cost differences were tested with the two-sided Wilcoxon signed-rank test [24], which treats alerts as independent. The full pipeline was repeated for seeds 42–51, and the seed-level costs were compared with a paired Wilcoxon test. Two sweeps varied the missed-attack cost</w:t>
       </w:r>
       <w:r>
         <w:t xml:space="preserve"> </w:t>
@@ -7915,7 +8350,7 @@
         <w:t xml:space="preserve"> </w:t>
       </w:r>
       <w:r>
-        <w:t xml:space="preserve">reproduce every action of the rule base (Panel B2), so the benefit comes from the intermediate containment band rather than from fuzziness as such. What fuzziness adds is a graded explanation of each decision. The rule base is also not cost-optimal. The Bayes cost rule is 0.903 cheaper per alert, because soft-blocking dominates escalation under Eq. (6), and it therefore soft-blocks 8,631 alerts, or 43% of all traffic. This is the Bayesian minimum-risk procedure from which decision-theoretic three-way decisions derive their loss-based thresholds [6]. Threshold tuning does not match the rule base either. Validation tuning moves the threshold only to</w:t>
+        <w:t xml:space="preserve">reproduce every action of the rule base (Panel B2), so the benefit comes from the intermediate containment band rather than from fuzziness as such. What fuzziness adds is a graded explanation of each decision. The rule base is also not cost-optimal. The Bayes cost rule is 0.903 cheaper per alert, because soft-blocking dominates escalation under Eq. (6), and it therefore soft-blocks 8,631 alerts, or 43% of all traffic. This is the Bayesian minimum-risk procedure from which decision-theoretic three-way decisions derive their loss-based thresholds [7]. Threshold tuning does not match the rule base either. Validation tuning moves the threshold only to</w:t>
       </w:r>
       <w:r>
         <w:t xml:space="preserve"> </w:t>
@@ -7955,7 +8390,7 @@
         </m:r>
       </m:oMath>
       <w:r>
-        <w:t xml:space="preserve">. This agrees with threshold moving in cost-sensitive learning, where unequal error costs shift the decision cut-off away from 0.5 [15]. Finally, the layer transfers to another detector. On GB scores, the same rules cost 3.004, which is lower than on MLP scores (</w:t>
+        <w:t xml:space="preserve">. This agrees with threshold moving in cost-sensitive learning, where unequal error costs shift the decision cut-off away from 0.5 [18]. Finally, the layer transfers to another detector. On GB scores, the same rules cost 3.004, which is lower than on MLP scores (</w:t>
       </w:r>
       <m:oMath>
         <m:r>
@@ -7990,7 +8425,7 @@
         <w:t xml:space="preserve"> </w:t>
       </w:r>
       <w:r>
-        <w:t xml:space="preserve">Detectors should be judged by the decisions they enable, since the action rule alone changed the cost by up to 1.242 per alert. Because the cost matrix sets the mix of actions, organisations should price false containment before automating Soft-block. Unlike a deferral band that hands uncertain alerts to analysts [7], the Soft-block band acts automatically, so the 387 alerts it keeps from the analyst queue carry an explicit price for false containment (Eq. (6)). Conformal classification with a reject option [20] instead abstains on uncertain cases under distribution-free error-rate guarantees rather than a cost matrix, and combining the two is a natural extension. The band boundaries give managers a workload lever that needs no retraining, which matters because NIDS alert streams are reported to be dominated by false positives [2]. Named rules with logged firing strengths give each action an audit trail that post hoc attributions lack [11], which supports compliance review and analyst oversight.</w:t>
+        <w:t xml:space="preserve">Detectors should be judged by the decisions they enable, since the action rule alone changed the cost by up to 1.242 per alert. Because the cost matrix sets the mix of actions, organisations should price false containment before automating Soft-block. Unlike a deferral band that hands uncertain alerts to analysts [8], the Soft-block band acts automatically, so the 387 alerts it keeps from the analyst queue carry an explicit price for false containment (Eq. (6)). Conformal classification with a reject option [25] instead abstains on uncertain cases under distribution-free error-rate guarantees rather than a cost matrix, and combining the two is a natural extension. The band boundaries give managers a workload lever that needs no retraining, which matters because NIDS alert streams are reported to be dominated by false positives [2]. Named rules with logged firing strengths give each action an audit trail that post hoc attributions lack [13,14], which supports compliance review and analyst oversight.</w:t>
       </w:r>
     </w:p>
     <w:bookmarkEnd w:id="19"/>
@@ -8008,7 +8443,7 @@
         <w:pStyle w:val="FirstParagraph"/>
       </w:pPr>
       <w:r>
-        <w:t xml:space="preserve">The study has four main limitations. First, fixed bands respond to the distribution of the scores, not only to their ranking. Seed 48, the weakest replicate (cost 3.282, coverage 0.626), has a typical ROC-AUC of 0.900 but the lowest accuracy at the 0.5 threshold (0.757). Adaptive neuro-fuzzy tuning of the breakpoints, or bands derived from the cost matrix, could reduce this sensitivity and narrow the gap to the Bayes rule. Second, NSL-KDD is a laboratory benchmark released in 2009 [16], so its traffic predates modern enterprise, cloud and Internet of Things networks, and the data were subsampled under a single protocol. Third, the cost matrix is illustrative rather than elicited from a real SOC, and the coverage metric counts containment as covering an attack. Fourth, the study involved no deployment, drift analysis or user study.</w:t>
+        <w:t xml:space="preserve">The study has four main limitations. First, fixed bands respond to the distribution of the scores, not only to their ranking. Seed 48, the weakest replicate (cost 3.282, coverage 0.626), has a typical ROC-AUC of 0.900 but the lowest accuracy at the 0.5 threshold (0.757). Adaptive neuro-fuzzy tuning of the breakpoints, or bands derived from the cost matrix, could reduce this sensitivity and narrow the gap to the Bayes rule. Second, NSL-KDD is a laboratory benchmark released in 2009 [21], so its traffic predates modern enterprise, cloud and Internet of Things networks, and the data were subsampled under a single protocol. Third, the cost matrix is illustrative rather than elicited from a real SOC, and the coverage metric counts containment as covering an attack. Fourth, the study involved no deployment, drift analysis or user study.</w:t>
       </w:r>
     </w:p>
     <w:bookmarkEnd w:id="20"/>
@@ -8026,7 +8461,7 @@
         <w:pStyle w:val="FirstParagraph"/>
       </w:pPr>
       <w:r>
-        <w:t xml:space="preserve">In conclusion, a fuzzy–neural rule base can serve as a knowledge-based decision layer for alert triage. On NSL-KDD, it achieved lower cost and higher coverage than crisp threshold and capacity rules across seeds, cost ratios and band widths, and its gain comes from the intermediate containment band. Future work will derive the bands from costs elicited in real SOCs and validate the layer in live operation. It will also add distribution-free error guarantees for the automatic actions through conformal classification with a reject option [20].</w:t>
+        <w:t xml:space="preserve">In conclusion, a fuzzy–neural rule base can serve as a knowledge-based decision layer for alert triage. On NSL-KDD, it achieved lower cost and higher coverage than crisp threshold and capacity rules across seeds, cost ratios and band widths, and its gain comes from the intermediate containment band. Future work will derive the bands from costs elicited in real SOCs and validate the layer in live operation. It will also add distribution-free error guarantees for the automatic actions through conformal classification with a reject option [25].</w:t>
       </w:r>
     </w:p>
     <w:bookmarkEnd w:id="21"/>
@@ -8059,7 +8494,7 @@
         </w:r>
       </w:hyperlink>
       <w:r>
-        <w:t xml:space="preserve">. NSL-KDD is available from the Canadian Institute for Cybersecurity [16]. The Supplementary Material contains the same code, the result files (including the Panel B2 confidence intervals of Table 2 in</w:t>
+        <w:t xml:space="preserve">. NSL-KDD is available from the Canadian Institute for Cybersecurity [21]. The Supplementary Material contains the same code, the result files (including the Panel B2 confidence intervals of Table 2 in</w:t>
       </w:r>
       <w:r>
         <w:t xml:space="preserve"> </w:t>
@@ -8211,7 +8646,7 @@
         <w:pStyle w:val="Reference"/>
       </w:pPr>
       <w:r>
-        <w:t xml:space="preserve">[6] Y. Yao, Three-way decisions with probabilistic rough sets, Inf. Sci. 180 (3) (2010) 341–353. https://doi.org/10.1016/j.ins.2009.09.021.</w:t>
+        <w:t xml:space="preserve">[6] T. Su, H. Sun, J. Zhu, S. Wang, Y. Li, BAT: Deep learning methods on network intrusion detection using NSL-KDD dataset, IEEE Access 8 (2020) 29575–29585. https://doi.org/10.1109/ACCESS.2020.2972627.</w:t>
       </w:r>
     </w:p>
     <w:p>
@@ -8219,7 +8654,7 @@
         <w:pStyle w:val="Reference"/>
       </w:pPr>
       <w:r>
-        <w:t xml:space="preserve">[7] F. Jalalvand, M. Baruwal Chhetri, S. Nepal, C. Paris, Adaptive alert prioritisation in security operations centres via learning to defer with human feedback, Inf. Sci. 760 (2027) 124128. https://doi.org/10.1016/j.ins.2026.124128.</w:t>
+        <w:t xml:space="preserve">[7] Y. Yao, Three-way decisions with probabilistic rough sets, Inf. Sci. 180 (3) (2010) 341–353. https://doi.org/10.1016/j.ins.2009.09.021.</w:t>
       </w:r>
     </w:p>
     <w:p>
@@ -8227,7 +8662,7 @@
         <w:pStyle w:val="Reference"/>
       </w:pPr>
       <w:r>
-        <w:t xml:space="preserve">[8] X. Wang, X. Yang, X. Liang, X. Zhang, W. Zhang, X. Gong, Combating alert fatigue with AlertPro: Context-aware alert prioritization using reinforcement learning for multi-step attack detection, Comput. Secur. 137 (2024) 103583. https://doi.org/10.1016/j.cose.2023.103583.</w:t>
+        <w:t xml:space="preserve">[8] F. Jalalvand, M. Baruwal Chhetri, S. Nepal, C. Paris, Adaptive alert prioritisation in security operations centres via learning to defer with human feedback, Inf. Sci. 760 (2027) 124128. https://doi.org/10.1016/j.ins.2026.124128.</w:t>
       </w:r>
     </w:p>
     <w:p>
@@ -8235,7 +8670,7 @@
         <w:pStyle w:val="Reference"/>
       </w:pPr>
       <w:r>
-        <w:t xml:space="preserve">[9] N. Gupta, V. Jindal, P. Bedi, CSE-IDS: Using cost-sensitive deep learning and ensemble algorithms to handle class imbalance in network-based intrusion detection systems, Comput. Secur. 112 (2022) 102499. https://doi.org/10.1016/j.cose.2021.102499.</w:t>
+        <w:t xml:space="preserve">[9] X. Wang, X. Yang, X. Liang, X. Zhang, W. Zhang, X. Gong, Combating alert fatigue with AlertPro: Context-aware alert prioritization using reinforcement learning for multi-step attack detection, Comput. Secur. 137 (2024) 103583. https://doi.org/10.1016/j.cose.2023.103583.</w:t>
       </w:r>
     </w:p>
     <w:p>
@@ -8243,7 +8678,7 @@
         <w:pStyle w:val="Reference"/>
       </w:pPr>
       <w:r>
-        <w:t xml:space="preserve">[10] A. Telikani, N. E. Rudbardeh, S. Soleymanpour, A. Shahbahrami, J. Shen, G. Gaydadjiev, R. Hassanpour, A cost-sensitive machine learning model with multitask learning for intrusion detection in IoT, IEEE Trans. Ind. Inform. 20 (3) (2024) 3880–3890. https://doi.org/10.1109/TII.2023.3314208.</w:t>
+        <w:t xml:space="preserve">[10] M. Alalhareth, S.-C. Hong, An adaptive intrusion detection system in the Internet of Medical Things using fuzzy-based learning, Sensors 23 (22) (2023) 9247. https://doi.org/10.3390/s23229247.</w:t>
       </w:r>
     </w:p>
     <w:p>
@@ -8251,7 +8686,7 @@
         <w:pStyle w:val="Reference"/>
       </w:pPr>
       <w:r>
-        <w:t xml:space="preserve">[11] M. Wang, K. Zheng, Y. Yang, X. Wang, An explainable machine learning framework for intrusion detection systems, IEEE Access 8 (2020) 73127–73141. https://doi.org/10.1109/ACCESS.2020.2988359.</w:t>
+        <w:t xml:space="preserve">[11] N. Gupta, V. Jindal, P. Bedi, CSE-IDS: Using cost-sensitive deep learning and ensemble algorithms to handle class imbalance in network-based intrusion detection systems, Comput. Secur. 112 (2022) 102499. https://doi.org/10.1016/j.cose.2021.102499.</w:t>
       </w:r>
     </w:p>
     <w:p>
@@ -8259,7 +8694,7 @@
         <w:pStyle w:val="Reference"/>
       </w:pPr>
       <w:r>
-        <w:t xml:space="preserve">[12] S. Bag, S. Sarkar, I. Bose, Enhancing cybersecurity risk assessment using temporal knowledge graph-based explainable decision support system, Decis. Support Syst. 198 (2025) 114526. https://doi.org/10.1016/j.dss.2025.114526.</w:t>
+        <w:t xml:space="preserve">[12] A. Telikani, N. E. Rudbardeh, S. Soleymanpour, A. Shahbahrami, J. Shen, G. Gaydadjiev, R. Hassanpour, A cost-sensitive machine learning model with multitask learning for intrusion detection in IoT, IEEE Trans. Ind. Inform. 20 (3) (2024) 3880–3890. https://doi.org/10.1109/TII.2023.3314208.</w:t>
       </w:r>
     </w:p>
     <w:p>
@@ -8267,7 +8702,7 @@
         <w:pStyle w:val="Reference"/>
       </w:pPr>
       <w:r>
-        <w:t xml:space="preserve">[13] L. A. Zadeh, Fuzzy sets, Inf. Control 8 (3) (1965) 338–353. https://doi.org/10.1016/S0019-9958(65)90241-X.</w:t>
+        <w:t xml:space="preserve">[13] M. Wang, K. Zheng, Y. Yang, X. Wang, An explainable machine learning framework for intrusion detection systems, IEEE Access 8 (2020) 73127–73141. https://doi.org/10.1109/ACCESS.2020.2988359.</w:t>
       </w:r>
     </w:p>
     <w:p>
@@ -8275,7 +8710,7 @@
         <w:pStyle w:val="Reference"/>
       </w:pPr>
       <w:r>
-        <w:t xml:space="preserve">[14] A. Fernández, F. Herrera, O. Cordón, M. J. del Jesus, F. Marcelloni, Evolutionary fuzzy systems for explainable artificial intelligence: Why, when, what for, and where to?, IEEE Comput. Intell. Mag. 14 (1) (2019) 69–81. https://doi.org/10.1109/MCI.2018.2881645.</w:t>
+        <w:t xml:space="preserve">[14] A. Alabbadi, F. Bajaber, An intrusion detection system over the IoT data streams using eXplainable Artificial Intelligence (XAI), Sensors 25 (3) (2025) 847. https://doi.org/10.3390/s25030847.</w:t>
       </w:r>
     </w:p>
     <w:p>
@@ -8283,7 +8718,7 @@
         <w:pStyle w:val="Reference"/>
       </w:pPr>
       <w:r>
-        <w:t xml:space="preserve">[15] Z.-H. Zhou, X.-Y. Liu, Training cost-sensitive neural networks with methods addressing the class imbalance problem, IEEE Trans. Knowl. Data Eng. 18 (1) (2006) 63–77. https://doi.org/10.1109/TKDE.2006.17.</w:t>
+        <w:t xml:space="preserve">[15] S. Bag, S. Sarkar, I. Bose, Enhancing cybersecurity risk assessment using temporal knowledge graph-based explainable decision support system, Decis. Support Syst. 198 (2025) 114526. https://doi.org/10.1016/j.dss.2025.114526.</w:t>
       </w:r>
     </w:p>
     <w:p>
@@ -8291,7 +8726,7 @@
         <w:pStyle w:val="Reference"/>
       </w:pPr>
       <w:r>
-        <w:t xml:space="preserve">[16] M. Tavallaee, E. Bagheri, W. Lu, A. A. Ghorbani, A detailed analysis of the KDD CUP 99 data set, in: Proc. 2009 IEEE Symp. Comput. Intell. Secur. Def. Appl. (CISDA), 2009, pp. 1–6. https://doi.org/10.1109/CISDA.2009.5356528.</w:t>
+        <w:t xml:space="preserve">[16] L. A. Zadeh, Fuzzy sets, Inf. Control 8 (3) (1965) 338–353. https://doi.org/10.1016/S0019-9958(65)90241-X.</w:t>
       </w:r>
     </w:p>
     <w:p>
@@ -8299,7 +8734,7 @@
         <w:pStyle w:val="Reference"/>
       </w:pPr>
       <w:r>
-        <w:t xml:space="preserve">[17] J. H. Friedman, Greedy function approximation: A gradient boosting machine, Ann. Stat. 29 (5) (2001) 1189–1232. https://doi.org/10.1214/aos/1013203451.</w:t>
+        <w:t xml:space="preserve">[17] A. Fernández, F. Herrera, O. Cordón, M. J. del Jesus, F. Marcelloni, Evolutionary fuzzy systems for explainable artificial intelligence: Why, when, what for, and where to?, IEEE Comput. Intell. Mag. 14 (1) (2019) 69–81. https://doi.org/10.1109/MCI.2018.2881645.</w:t>
       </w:r>
     </w:p>
     <w:p>
@@ -8307,7 +8742,7 @@
         <w:pStyle w:val="Reference"/>
       </w:pPr>
       <w:r>
-        <w:t xml:space="preserve">[18] B. Efron, R. J. Tibshirani, An Introduction to the Bootstrap, Chapman &amp; Hall/CRC, New York, 1994. https://doi.org/10.1201/9780429246593.</w:t>
+        <w:t xml:space="preserve">[18] Z.-H. Zhou, X.-Y. Liu, Training cost-sensitive neural networks with methods addressing the class imbalance problem, IEEE Trans. Knowl. Data Eng. 18 (1) (2006) 63–77. https://doi.org/10.1109/TKDE.2006.17.</w:t>
       </w:r>
     </w:p>
     <w:p>
@@ -8315,7 +8750,7 @@
         <w:pStyle w:val="Reference"/>
       </w:pPr>
       <w:r>
-        <w:t xml:space="preserve">[19] F. Wilcoxon, Individual comparisons by ranking methods, Biom. Bull. 1 (6) (1945) 80–83. https://doi.org/10.2307/3001968.</w:t>
+        <w:t xml:space="preserve">[19] A. Barredo Arrieta, N. Díaz-Rodríguez, J. Del Ser, A. Bennetot, S. Tabik, A. Barbado, S. Garcia, S. Gil-Lopez, D. Molina, R. Benjamins, R. Chatila, F. Herrera, Explainable artificial intelligence (XAI): Concepts, taxonomies, opportunities and challenges toward responsible AI, Inf. Fusion 58 (2020) 82–115. https://doi.org/10.1016/j.inffus.2019.12.012.</w:t>
       </w:r>
     </w:p>
     <w:p>
@@ -8323,7 +8758,47 @@
         <w:pStyle w:val="Reference"/>
       </w:pPr>
       <w:r>
-        <w:t xml:space="preserve">[20] J. Hallberg Szabadváry, T. Löfström, U. Johansson, C. Sönströd, E. Ahlberg, L. Carlsson, Classification with reject option: Distribution-free error guarantees via conformal prediction, Mach. Learn. Appl. 20 (2025) 100664. https://doi.org/10.1016/j.mlwa.2025.100664.</w:t>
+        <w:t xml:space="preserve">[20] M. Abdar, F. Pourpanah, S. Hussain, D. Rezazadegan, L. Liu, M. Ghavamzadeh, P. Fieguth, X. Cao, A. Khosravi, U. R. Acharya, V. Makarenkov, S. Nahavandi, A review of uncertainty quantification in deep learning: Techniques, applications and challenges, Inf. Fusion 76 (2021) 243–297. https://doi.org/10.1016/j.inffus.2021.05.008.</w:t>
+      </w:r>
+    </w:p>
+    <w:p>
+      <w:pPr>
+        <w:pStyle w:val="Reference"/>
+      </w:pPr>
+      <w:r>
+        <w:t xml:space="preserve">[21] M. Tavallaee, E. Bagheri, W. Lu, A. A. Ghorbani, A detailed analysis of the KDD CUP 99 data set, in: Proc. 2009 IEEE Symp. Comput. Intell. Secur. Def. Appl. (CISDA), 2009, pp. 1–6. https://doi.org/10.1109/CISDA.2009.5356528.</w:t>
+      </w:r>
+    </w:p>
+    <w:p>
+      <w:pPr>
+        <w:pStyle w:val="Reference"/>
+      </w:pPr>
+      <w:r>
+        <w:t xml:space="preserve">[22] J. H. Friedman, Greedy function approximation: A gradient boosting machine, Ann. Stat. 29 (5) (2001) 1189–1232. https://doi.org/10.1214/aos/1013203451.</w:t>
+      </w:r>
+    </w:p>
+    <w:p>
+      <w:pPr>
+        <w:pStyle w:val="Reference"/>
+      </w:pPr>
+      <w:r>
+        <w:t xml:space="preserve">[23] B. Efron, R. J. Tibshirani, An Introduction to the Bootstrap, Chapman &amp; Hall/CRC, New York, 1994. https://doi.org/10.1201/9780429246593.</w:t>
+      </w:r>
+    </w:p>
+    <w:p>
+      <w:pPr>
+        <w:pStyle w:val="Reference"/>
+      </w:pPr>
+      <w:r>
+        <w:t xml:space="preserve">[24] F. Wilcoxon, Individual comparisons by ranking methods, Biom. Bull. 1 (6) (1945) 80–83. https://doi.org/10.2307/3001968.</w:t>
+      </w:r>
+    </w:p>
+    <w:p>
+      <w:pPr>
+        <w:pStyle w:val="Reference"/>
+      </w:pPr>
+      <w:r>
+        <w:t xml:space="preserve">[25] J. Hallberg Szabadváry, T. Löfström, U. Johansson, C. Sönströd, E. Ahlberg, L. Carlsson, Classification with reject option: Distribution-free error guarantees via conformal prediction, Mach. Learn. Appl. 20 (2025) 100664. https://doi.org/10.1016/j.mlwa.2025.100664.</w:t>
       </w:r>
     </w:p>
     <w:bookmarkEnd w:id="28"/>

</xml_diff>

<commit_message>
Editor compliance pass: solidus for inline 1/N; link NSL-KDD dataset in Data availability (KBS Option C); checklist length status
</commit_message>
<xml_diff>
--- a/paper/elsevier/manuscript.docx
+++ b/paper/elsevier/manuscript.docx
@@ -4783,21 +4783,30 @@
           </m:rPr>
           <m:t>=</m:t>
         </m:r>
-        <m:f>
-          <m:fPr>
-            <m:type m:val="bar"/>
-          </m:fPr>
-          <m:num>
-            <m:r>
-              <m:t>1</m:t>
-            </m:r>
-          </m:num>
-          <m:den>
-            <m:r>
-              <m:t>N</m:t>
-            </m:r>
-          </m:den>
-        </m:f>
+        <m:r>
+          <m:rPr>
+            <m:sty m:val="p"/>
+          </m:rPr>
+          <m:t>(</m:t>
+        </m:r>
+        <m:r>
+          <m:t>1</m:t>
+        </m:r>
+        <m:r>
+          <m:rPr>
+            <m:sty m:val="p"/>
+          </m:rPr>
+          <m:t>/</m:t>
+        </m:r>
+        <m:r>
+          <m:t>N</m:t>
+        </m:r>
+        <m:r>
+          <m:rPr>
+            <m:sty m:val="p"/>
+          </m:rPr>
+          <m:t>)</m:t>
+        </m:r>
         <m:nary>
           <m:naryPr>
             <m:chr m:val="∑"/>
@@ -8465,7 +8474,7 @@
       </w:r>
     </w:p>
     <w:bookmarkEnd w:id="21"/>
-    <w:bookmarkStart w:id="23" w:name="data-availability"/>
+    <w:bookmarkStart w:id="24" w:name="data-availability"/>
     <w:p>
       <w:pPr>
         <w:pStyle w:val="Heading1"/>
@@ -8494,7 +8503,24 @@
         </w:r>
       </w:hyperlink>
       <w:r>
-        <w:t xml:space="preserve">. NSL-KDD is available from the Canadian Institute for Cybersecurity [21]. The Supplementary Material contains the same code, the result files (including the Panel B2 confidence intervals of Table 2 in</w:t>
+        <w:t xml:space="preserve">. NSL-KDD is available from the Canadian Institute for Cybersecurity at</w:t>
+      </w:r>
+      <w:r>
+        <w:t xml:space="preserve"> </w:t>
+      </w:r>
+      <w:hyperlink r:id="rId23">
+        <w:r>
+          <w:rPr>
+            <w:rStyle w:val="Hyperlink"/>
+          </w:rPr>
+          <w:t xml:space="preserve">https://www.unb.ca/cic/datasets/nsl.html</w:t>
+        </w:r>
+      </w:hyperlink>
+      <w:r>
+        <w:t xml:space="preserve"> </w:t>
+      </w:r>
+      <w:r>
+        <w:t xml:space="preserve">[21]. The Supplementary Material contains the same code, the result files (including the Panel B2 confidence intervals of Table 2 in</w:t>
       </w:r>
       <w:r>
         <w:t xml:space="preserve"> </w:t>
@@ -8509,8 +8535,8 @@
         <w:t xml:space="preserve">), both figures as vector files and a graphical abstract.</w:t>
       </w:r>
     </w:p>
-    <w:bookmarkEnd w:id="23"/>
-    <w:bookmarkStart w:id="24" w:name="declaration-of-competing-interest"/>
+    <w:bookmarkEnd w:id="24"/>
+    <w:bookmarkStart w:id="25" w:name="declaration-of-competing-interest"/>
     <w:p>
       <w:pPr>
         <w:pStyle w:val="Heading1"/>
@@ -8527,8 +8553,8 @@
         <w:t xml:space="preserve">The author declares no known competing financial interests or personal relationships that could have appeared to influence the work reported in this paper.</w:t>
       </w:r>
     </w:p>
-    <w:bookmarkEnd w:id="24"/>
-    <w:bookmarkStart w:id="25" w:name="X1f74eb43af444059c7518034463b6c89b1cacf4"/>
+    <w:bookmarkEnd w:id="25"/>
+    <w:bookmarkStart w:id="26" w:name="X1f74eb43af444059c7518034463b6c89b1cacf4"/>
     <w:p>
       <w:pPr>
         <w:pStyle w:val="Heading1"/>
@@ -8545,8 +8571,8 @@
         <w:t xml:space="preserve">During the preparation of this work the author used Grok Bot, an AI-assisted writing and coding tool, to help with language editing, code refactoring, reference checking and formatting. After using this tool, the author reviewed and edited the content as needed and takes full responsibility for the content of the published article. All results, tables and figures were generated by the author’s executable code from the public dataset; no figure was created with generative AI.</w:t>
       </w:r>
     </w:p>
-    <w:bookmarkEnd w:id="25"/>
-    <w:bookmarkStart w:id="26" w:name="funding"/>
+    <w:bookmarkEnd w:id="26"/>
+    <w:bookmarkStart w:id="27" w:name="funding"/>
     <w:p>
       <w:pPr>
         <w:pStyle w:val="Heading1"/>
@@ -8563,8 +8589,8 @@
         <w:t xml:space="preserve">This research did not receive any specific grant from funding agencies in the public, commercial, or not-for-profit sectors.</w:t>
       </w:r>
     </w:p>
-    <w:bookmarkEnd w:id="26"/>
-    <w:bookmarkStart w:id="27" w:name="credit-authorship-contribution-statement"/>
+    <w:bookmarkEnd w:id="27"/>
+    <w:bookmarkStart w:id="28" w:name="credit-authorship-contribution-statement"/>
     <w:p>
       <w:pPr>
         <w:pStyle w:val="Heading1"/>
@@ -8591,8 +8617,8 @@
         <w:t xml:space="preserve">Conceptualization, Methodology, Software, Validation, Formal analysis, Investigation, Data curation, Visualization, Writing – original draft, Writing – review &amp; editing.</w:t>
       </w:r>
     </w:p>
-    <w:bookmarkEnd w:id="27"/>
-    <w:bookmarkStart w:id="28" w:name="references"/>
+    <w:bookmarkEnd w:id="28"/>
+    <w:bookmarkStart w:id="29" w:name="references"/>
     <w:p>
       <w:pPr>
         <w:pStyle w:val="Heading1"/>
@@ -8801,7 +8827,7 @@
         <w:t xml:space="preserve">[25] J. Hallberg Szabadváry, T. Löfström, U. Johansson, C. Sönströd, E. Ahlberg, L. Carlsson, Classification with reject option: Distribution-free error guarantees via conformal prediction, Mach. Learn. Appl. 20 (2025) 100664. https://doi.org/10.1016/j.mlwa.2025.100664.</w:t>
       </w:r>
     </w:p>
-    <w:bookmarkEnd w:id="28"/>
+    <w:bookmarkEnd w:id="29"/>
     <w:sectPr>
       <w:footerReference w:type="default" r:id="rId9"/>
       <w:footnotePr>

</xml_diff>

<commit_message>
Trim to KBS Short Communication length: text, tables, figures and declarations within 10 double-spaced pages
- Table 2 Panel B2 moved to the Supplementary Material (table2_decision.csv); text points to it
- Table 1: 8 cited rows (Alalhareth, Su, Alabbadi still cited in the text)
- Abstract 181 -> 147 words; repetition and secondary detail cut; Limitations as run-in paragraph
- Figures redrawn shorter and placed at natural size (labels >= 6.5 pt); Fig. 1 direct labels
- No result number changed; 25/25 references cited; CHECKLIST length row now compliant
</commit_message>
<xml_diff>
--- a/paper/elsevier/manuscript.docx
+++ b/paper/elsevier/manuscript.docx
@@ -67,7 +67,7 @@
         <w:pStyle w:val="AbstractText"/>
       </w:pPr>
       <w:r>
-        <w:t xml:space="preserve">Security operations centres (SOCs) receive risk scores from machine-learning detectors, but the step from score to action usually rests on a single hand-set threshold. This paper treats alert triage as a knowledge-based decision problem. A multilayer perceptron (MLP) estimates attack propensity, fuzzy membership functions map it to Low, Medium and High risk bands, and three production rules assign Monitor, Soft-block or Escalate. On 20,000 NSL-KDD test alerts, gradient boosting is the stronger detector (ROC-AUC 0.947 against 0.908). On the same MLP scores, however, the rule base lowers the mean triage cost to 3.068 (95% CI [3.016, 3.118]), compared with 3.264 for a 0.5 threshold and 4.309 for top-20% escalation (both Wilcoxon</w:t>
+        <w:t xml:space="preserve">Security operations centres (SOCs) usually turn detector scores into actions with a single hand-set threshold. We treat alert triage as a knowledge-based decision problem: a multilayer perceptron (MLP) estimates attack propensity, fuzzy membership functions map it to Low, Medium and High risk bands, and three production rules assign Monitor, Soft-block or Escalate. On 20,000 NSL-KDD test alerts, gradient boosting is the stronger detector (ROC-AUC 0.947 against 0.908), yet on the same MLP scores the rule base lowers the mean triage cost to 3.068 (95% CI [3.016, 3.118]), against 3.264 for a 0.5 threshold and 4.309 for top-20% escalation (both Wilcoxon</w:t>
       </w:r>
       <w:r>
         <w:t xml:space="preserve"> </w:t>
@@ -83,7 +83,7 @@
         <w:t xml:space="preserve"> </w:t>
       </w:r>
       <w:r>
-        <w:t xml:space="preserve">&lt; 10⁻¹⁰⁰). It also raises attack coverage from 0.655 to 0.686. The rule base is cheaper than both crisp rules in all ten repeated runs (</w:t>
+        <w:t xml:space="preserve">&lt; 10⁻¹⁰⁰), and raises attack coverage from 0.655 to 0.686. It is cheaper than both crisp rules in all ten repeated runs (</w:t>
       </w:r>
       <w:r>
         <w:rPr>
@@ -96,7 +96,7 @@
         <w:t xml:space="preserve"> </w:t>
       </w:r>
       <w:r>
-        <w:t xml:space="preserve">= 0.002) and cheaper than the threshold at every tested missed-attack cost from 2 to 30. Ablations show that the gain comes from the Soft-block band and that a Bayes cost rule is cheaper still (2.164). The contribution is an auditable decision layer, not a new detector.</w:t>
+        <w:t xml:space="preserve">= 0.002) and than the threshold at every tested missed-attack cost. The gain comes from the Soft-block band, and a Bayes cost rule is cheaper still (2.164).</w:t>
       </w:r>
     </w:p>
     <w:p>
@@ -132,7 +132,7 @@
         <w:pStyle w:val="FirstParagraph"/>
       </w:pPr>
       <w:r>
-        <w:t xml:space="preserve">Security operations centres (SOCs) collect, analyse and respond to an organisation’s security alerts [1]. Their analysts receive far more alerts than they can investigate, because network intrusion detectors generate a high volume of low-quality alerts, most of them false positives [2]. Intrusion-detection research ranges from fuzzy and neuro-fuzzy detectors [3,4] to deep networks trained on benchmarks such as NSL-KDD [5,6]. Most of this work, however, ends with a risk score and judges it by accuracy or by the area under the receiver operating characteristic curve (ROC-AUC). A SOC manager faces a different question: with limited analyst capacity and unequal error costs, which alerts should be monitored, contained or escalated? We therefore treat triage as a decision task rather than a prediction task. Decision-theoretic three-way decisions already choose among acceptance, rejection and deferment under stated losses [7], and recent SOC studies learn when to defer alerts to analysts [8] or prioritise them by reinforcement learning to combat alert fatigue [9].</w:t>
+        <w:t xml:space="preserve">Security operations centres (SOCs) collect, analyse and respond to security alerts [1], but intrusion detectors produce far more alerts than analysts can investigate, most of them false positives [2]. Intrusion-detection research, from fuzzy and neuro-fuzzy detectors [3,4] to deep networks trained on NSL-KDD [5,6], usually ends with a risk score judged by accuracy or by the area under the receiver operating characteristic curve (ROC-AUC). A SOC manager instead has to decide which alerts to monitor, contain or escalate under limited analyst capacity and unequal error costs. Three-way decisions choose among acceptance, rejection and deferment under stated losses [7], and SOC studies learn when to defer alerts to analysts [8] or rank them by reinforcement learning [9], but these designs do not assign graded actions through readable rules.</w:t>
       </w:r>
     </w:p>
     <w:p>
@@ -150,14 +150,14 @@
         <w:t xml:space="preserve"> </w:t>
       </w:r>
       <w:r>
-        <w:t xml:space="preserve">Related work compared by design property rather than accuracy, because data sets and tasks differ. Only this work combines an explicit action-cost model, readable rules and graded actions with significance testing.</w:t>
+        <w:t xml:space="preserve">Related work compared by design property, because data sets and tasks differ.</w:t>
       </w:r>
     </w:p>
     <w:tbl>
       <w:tblPr>
         <w:tblLayout w:type="fixed"/>
         <w:tblLook w:firstRow="1" w:lastRow="0" w:firstColumn="0" w:lastColumn="0" w:noHBand="0" w:noVBand="0" w:val="0020"/>
-        <w:tblCaption w:val="Table 1. Related work compared by design property rather than accuracy, because data sets and tasks differ. Only this work combines an explicit action-cost model, readable rules and graded actions with significance testing."/>
+        <w:tblCaption w:val="Table 1. Related work compared by design property, because data sets and tasks differ."/>
         <w:tblW w:w="9288" w:type="dxa"/>
         <w:tblCellMar>
           <w:left w:w="60" w:type="dxa"/>
@@ -666,7 +666,7 @@
                 <w:rFonts w:ascii="Times New Roman" w:hAnsi="Times New Roman"/>
                 <w:sz w:val="18"/>
               </w:rPr>
-              <w:t xml:space="preserve">Alalhareth [10]</w:t>
+              <w:t xml:space="preserve">Vinayakumar [5]</w:t>
             </w:r>
           </w:p>
         </w:tc>
@@ -686,7 +686,7 @@
                 <w:rFonts w:ascii="Times New Roman" w:hAnsi="Times New Roman"/>
                 <w:sz w:val="18"/>
               </w:rPr>
-              <w:t xml:space="preserve">LSTM, fuzzy-tuned training</w:t>
+              <w:t xml:space="preserve">Deep neural network</w:t>
             </w:r>
           </w:p>
         </w:tc>
@@ -706,7 +706,7 @@
                 <w:rFonts w:ascii="Times New Roman" w:hAnsi="Times New Roman"/>
                 <w:sz w:val="18"/>
               </w:rPr>
-              <w:t xml:space="preserve">WUSTL-EHMS-2020</w:t>
+              <w:t xml:space="preserve">NSL-KDD + 5 others</w:t>
             </w:r>
           </w:p>
         </w:tc>
@@ -726,7 +726,7 @@
                 <w:rFonts w:ascii="Times New Roman" w:hAnsi="Times New Roman"/>
                 <w:sz w:val="18"/>
               </w:rPr>
-              <w:t xml:space="preserve">(✓)</w:t>
+              <w:t xml:space="preserve">×</w:t>
             </w:r>
           </w:p>
         </w:tc>
@@ -811,7 +811,7 @@
                 <w:rFonts w:ascii="Times New Roman" w:hAnsi="Times New Roman"/>
                 <w:sz w:val="18"/>
               </w:rPr>
-              <w:t xml:space="preserve">Vinayakumar [5]</w:t>
+              <w:t xml:space="preserve">Gupta [10]</w:t>
             </w:r>
           </w:p>
         </w:tc>
@@ -831,7 +831,7 @@
                 <w:rFonts w:ascii="Times New Roman" w:hAnsi="Times New Roman"/>
                 <w:sz w:val="18"/>
               </w:rPr>
-              <w:t xml:space="preserve">Deep neural network</w:t>
+              <w:t xml:space="preserve">Cost-sensitive deep ensemble</w:t>
             </w:r>
           </w:p>
         </w:tc>
@@ -851,7 +851,7 @@
                 <w:rFonts w:ascii="Times New Roman" w:hAnsi="Times New Roman"/>
                 <w:sz w:val="18"/>
               </w:rPr>
-              <w:t xml:space="preserve">NSL-KDD + 5 others</w:t>
+              <w:t xml:space="preserve">NSL-KDD + 2 others</w:t>
             </w:r>
           </w:p>
         </w:tc>
@@ -871,12 +871,52 @@
                 <w:rFonts w:ascii="Times New Roman" w:hAnsi="Times New Roman"/>
                 <w:sz w:val="18"/>
               </w:rPr>
+              <w:t xml:space="preserve">(✓)</w:t>
+            </w:r>
+          </w:p>
+        </w:tc>
+        <w:tc>
+          <w:tcPr>
+            <w:tcW w:type="dxa" w:w="648"/>
+          </w:tcPr>
+          <w:p>
+            <w:pPr>
+              <w:pStyle w:val="Compact"/>
+              <w:keepNext/>
+              <w:spacing w:before="20" w:after="20" w:line="240" w:lineRule="auto"/>
+              <w:jc w:val="center"/>
+            </w:pPr>
+            <w:r>
+              <w:rPr>
+                <w:rFonts w:ascii="Times New Roman" w:hAnsi="Times New Roman"/>
+                <w:sz w:val="18"/>
+              </w:rPr>
               <w:t xml:space="preserve">×</w:t>
             </w:r>
           </w:p>
         </w:tc>
         <w:tc>
           <w:tcPr>
+            <w:tcW w:type="dxa" w:w="792"/>
+          </w:tcPr>
+          <w:p>
+            <w:pPr>
+              <w:pStyle w:val="Compact"/>
+              <w:keepNext/>
+              <w:spacing w:before="20" w:after="20" w:line="240" w:lineRule="auto"/>
+              <w:jc w:val="center"/>
+            </w:pPr>
+            <w:r>
+              <w:rPr>
+                <w:rFonts w:ascii="Times New Roman" w:hAnsi="Times New Roman"/>
+                <w:sz w:val="18"/>
+              </w:rPr>
+              <w:t xml:space="preserve">×</w:t>
+            </w:r>
+          </w:p>
+        </w:tc>
+        <w:tc>
+          <w:tcPr>
             <w:tcW w:type="dxa" w:w="648"/>
           </w:tcPr>
           <w:p>
@@ -891,47 +931,7 @@
                 <w:rFonts w:ascii="Times New Roman" w:hAnsi="Times New Roman"/>
                 <w:sz w:val="18"/>
               </w:rPr>
-              <w:t xml:space="preserve">×</w:t>
-            </w:r>
-          </w:p>
-        </w:tc>
-        <w:tc>
-          <w:tcPr>
-            <w:tcW w:type="dxa" w:w="792"/>
-          </w:tcPr>
-          <w:p>
-            <w:pPr>
-              <w:pStyle w:val="Compact"/>
-              <w:keepNext/>
-              <w:spacing w:before="20" w:after="20" w:line="240" w:lineRule="auto"/>
-              <w:jc w:val="center"/>
-            </w:pPr>
-            <w:r>
-              <w:rPr>
-                <w:rFonts w:ascii="Times New Roman" w:hAnsi="Times New Roman"/>
-                <w:sz w:val="18"/>
-              </w:rPr>
-              <w:t xml:space="preserve">×</w:t>
-            </w:r>
-          </w:p>
-        </w:tc>
-        <w:tc>
-          <w:tcPr>
-            <w:tcW w:type="dxa" w:w="648"/>
-          </w:tcPr>
-          <w:p>
-            <w:pPr>
-              <w:pStyle w:val="Compact"/>
-              <w:keepNext/>
-              <w:spacing w:before="20" w:after="20" w:line="240" w:lineRule="auto"/>
-              <w:jc w:val="center"/>
-            </w:pPr>
-            <w:r>
-              <w:rPr>
-                <w:rFonts w:ascii="Times New Roman" w:hAnsi="Times New Roman"/>
-                <w:sz w:val="18"/>
-              </w:rPr>
-              <w:t xml:space="preserve">×</w:t>
+              <w:t xml:space="preserve">n.r.</w:t>
             </w:r>
           </w:p>
         </w:tc>
@@ -956,7 +956,7 @@
                 <w:rFonts w:ascii="Times New Roman" w:hAnsi="Times New Roman"/>
                 <w:sz w:val="18"/>
               </w:rPr>
-              <w:t xml:space="preserve">Su [6]</w:t>
+              <w:t xml:space="preserve">Telikani [11]</w:t>
             </w:r>
           </w:p>
         </w:tc>
@@ -976,7 +976,7 @@
                 <w:rFonts w:ascii="Times New Roman" w:hAnsi="Times New Roman"/>
                 <w:sz w:val="18"/>
               </w:rPr>
-              <w:t xml:space="preserve">Bidirectional LSTM + attention</w:t>
+              <w:t xml:space="preserve">Cost-sensitive autoencoder + SVM</w:t>
             </w:r>
           </w:p>
         </w:tc>
@@ -996,7 +996,7 @@
                 <w:rFonts w:ascii="Times New Roman" w:hAnsi="Times New Roman"/>
                 <w:sz w:val="18"/>
               </w:rPr>
-              <w:t xml:space="preserve">NSL-KDD</w:t>
+              <w:t xml:space="preserve">UNSW-NB15, BoT-IoT</w:t>
             </w:r>
           </w:p>
         </w:tc>
@@ -1016,12 +1016,52 @@
                 <w:rFonts w:ascii="Times New Roman" w:hAnsi="Times New Roman"/>
                 <w:sz w:val="18"/>
               </w:rPr>
+              <w:t xml:space="preserve">(✓)</w:t>
+            </w:r>
+          </w:p>
+        </w:tc>
+        <w:tc>
+          <w:tcPr>
+            <w:tcW w:type="dxa" w:w="648"/>
+          </w:tcPr>
+          <w:p>
+            <w:pPr>
+              <w:pStyle w:val="Compact"/>
+              <w:keepNext/>
+              <w:spacing w:before="20" w:after="20" w:line="240" w:lineRule="auto"/>
+              <w:jc w:val="center"/>
+            </w:pPr>
+            <w:r>
+              <w:rPr>
+                <w:rFonts w:ascii="Times New Roman" w:hAnsi="Times New Roman"/>
+                <w:sz w:val="18"/>
+              </w:rPr>
               <w:t xml:space="preserve">×</w:t>
             </w:r>
           </w:p>
         </w:tc>
         <w:tc>
           <w:tcPr>
+            <w:tcW w:type="dxa" w:w="792"/>
+          </w:tcPr>
+          <w:p>
+            <w:pPr>
+              <w:pStyle w:val="Compact"/>
+              <w:keepNext/>
+              <w:spacing w:before="20" w:after="20" w:line="240" w:lineRule="auto"/>
+              <w:jc w:val="center"/>
+            </w:pPr>
+            <w:r>
+              <w:rPr>
+                <w:rFonts w:ascii="Times New Roman" w:hAnsi="Times New Roman"/>
+                <w:sz w:val="18"/>
+              </w:rPr>
+              <w:t xml:space="preserve">×</w:t>
+            </w:r>
+          </w:p>
+        </w:tc>
+        <w:tc>
+          <w:tcPr>
             <w:tcW w:type="dxa" w:w="648"/>
           </w:tcPr>
           <w:p>
@@ -1036,47 +1076,7 @@
                 <w:rFonts w:ascii="Times New Roman" w:hAnsi="Times New Roman"/>
                 <w:sz w:val="18"/>
               </w:rPr>
-              <w:t xml:space="preserve">×</w:t>
-            </w:r>
-          </w:p>
-        </w:tc>
-        <w:tc>
-          <w:tcPr>
-            <w:tcW w:type="dxa" w:w="792"/>
-          </w:tcPr>
-          <w:p>
-            <w:pPr>
-              <w:pStyle w:val="Compact"/>
-              <w:keepNext/>
-              <w:spacing w:before="20" w:after="20" w:line="240" w:lineRule="auto"/>
-              <w:jc w:val="center"/>
-            </w:pPr>
-            <w:r>
-              <w:rPr>
-                <w:rFonts w:ascii="Times New Roman" w:hAnsi="Times New Roman"/>
-                <w:sz w:val="18"/>
-              </w:rPr>
-              <w:t xml:space="preserve">×</w:t>
-            </w:r>
-          </w:p>
-        </w:tc>
-        <w:tc>
-          <w:tcPr>
-            <w:tcW w:type="dxa" w:w="648"/>
-          </w:tcPr>
-          <w:p>
-            <w:pPr>
-              <w:pStyle w:val="Compact"/>
-              <w:keepNext/>
-              <w:spacing w:before="20" w:after="20" w:line="240" w:lineRule="auto"/>
-              <w:jc w:val="center"/>
-            </w:pPr>
-            <w:r>
-              <w:rPr>
-                <w:rFonts w:ascii="Times New Roman" w:hAnsi="Times New Roman"/>
-                <w:sz w:val="18"/>
-              </w:rPr>
-              <w:t xml:space="preserve">×</w:t>
+              <w:t xml:space="preserve">n.r.</w:t>
             </w:r>
           </w:p>
         </w:tc>
@@ -1101,7 +1101,7 @@
                 <w:rFonts w:ascii="Times New Roman" w:hAnsi="Times New Roman"/>
                 <w:sz w:val="18"/>
               </w:rPr>
-              <w:t xml:space="preserve">Gupta [11]</w:t>
+              <w:t xml:space="preserve">Wang [12]</w:t>
             </w:r>
           </w:p>
         </w:tc>
@@ -1121,7 +1121,7 @@
                 <w:rFonts w:ascii="Times New Roman" w:hAnsi="Times New Roman"/>
                 <w:sz w:val="18"/>
               </w:rPr>
-              <w:t xml:space="preserve">Cost-sensitive deep ensemble</w:t>
+              <w:t xml:space="preserve">SHAP explanations</w:t>
             </w:r>
           </w:p>
         </w:tc>
@@ -1141,7 +1141,7 @@
                 <w:rFonts w:ascii="Times New Roman" w:hAnsi="Times New Roman"/>
                 <w:sz w:val="18"/>
               </w:rPr>
-              <w:t xml:space="preserve">NSL-KDD + 2 others</w:t>
+              <w:t xml:space="preserve">NSL-KDD</w:t>
             </w:r>
           </w:p>
         </w:tc>
@@ -1161,12 +1161,52 @@
                 <w:rFonts w:ascii="Times New Roman" w:hAnsi="Times New Roman"/>
                 <w:sz w:val="18"/>
               </w:rPr>
+              <w:t xml:space="preserve">×</w:t>
+            </w:r>
+          </w:p>
+        </w:tc>
+        <w:tc>
+          <w:tcPr>
+            <w:tcW w:type="dxa" w:w="648"/>
+          </w:tcPr>
+          <w:p>
+            <w:pPr>
+              <w:pStyle w:val="Compact"/>
+              <w:keepNext/>
+              <w:spacing w:before="20" w:after="20" w:line="240" w:lineRule="auto"/>
+              <w:jc w:val="center"/>
+            </w:pPr>
+            <w:r>
+              <w:rPr>
+                <w:rFonts w:ascii="Times New Roman" w:hAnsi="Times New Roman"/>
+                <w:sz w:val="18"/>
+              </w:rPr>
               <w:t xml:space="preserve">(✓)</w:t>
             </w:r>
           </w:p>
         </w:tc>
         <w:tc>
           <w:tcPr>
+            <w:tcW w:type="dxa" w:w="792"/>
+          </w:tcPr>
+          <w:p>
+            <w:pPr>
+              <w:pStyle w:val="Compact"/>
+              <w:keepNext/>
+              <w:spacing w:before="20" w:after="20" w:line="240" w:lineRule="auto"/>
+              <w:jc w:val="center"/>
+            </w:pPr>
+            <w:r>
+              <w:rPr>
+                <w:rFonts w:ascii="Times New Roman" w:hAnsi="Times New Roman"/>
+                <w:sz w:val="18"/>
+              </w:rPr>
+              <w:t xml:space="preserve">×</w:t>
+            </w:r>
+          </w:p>
+        </w:tc>
+        <w:tc>
+          <w:tcPr>
             <w:tcW w:type="dxa" w:w="648"/>
           </w:tcPr>
           <w:p>
@@ -1182,46 +1222,6 @@
                 <w:sz w:val="18"/>
               </w:rPr>
               <w:t xml:space="preserve">×</w:t>
-            </w:r>
-          </w:p>
-        </w:tc>
-        <w:tc>
-          <w:tcPr>
-            <w:tcW w:type="dxa" w:w="792"/>
-          </w:tcPr>
-          <w:p>
-            <w:pPr>
-              <w:pStyle w:val="Compact"/>
-              <w:keepNext/>
-              <w:spacing w:before="20" w:after="20" w:line="240" w:lineRule="auto"/>
-              <w:jc w:val="center"/>
-            </w:pPr>
-            <w:r>
-              <w:rPr>
-                <w:rFonts w:ascii="Times New Roman" w:hAnsi="Times New Roman"/>
-                <w:sz w:val="18"/>
-              </w:rPr>
-              <w:t xml:space="preserve">×</w:t>
-            </w:r>
-          </w:p>
-        </w:tc>
-        <w:tc>
-          <w:tcPr>
-            <w:tcW w:type="dxa" w:w="648"/>
-          </w:tcPr>
-          <w:p>
-            <w:pPr>
-              <w:pStyle w:val="Compact"/>
-              <w:keepNext/>
-              <w:spacing w:before="20" w:after="20" w:line="240" w:lineRule="auto"/>
-              <w:jc w:val="center"/>
-            </w:pPr>
-            <w:r>
-              <w:rPr>
-                <w:rFonts w:ascii="Times New Roman" w:hAnsi="Times New Roman"/>
-                <w:sz w:val="18"/>
-              </w:rPr>
-              <w:t xml:space="preserve">n.r.</w:t>
             </w:r>
           </w:p>
         </w:tc>
@@ -1246,7 +1246,7 @@
                 <w:rFonts w:ascii="Times New Roman" w:hAnsi="Times New Roman"/>
                 <w:sz w:val="18"/>
               </w:rPr>
-              <w:t xml:space="preserve">Telikani [12]</w:t>
+              <w:t xml:space="preserve">Wang [9]</w:t>
             </w:r>
           </w:p>
         </w:tc>
@@ -1266,7 +1266,7 @@
                 <w:rFonts w:ascii="Times New Roman" w:hAnsi="Times New Roman"/>
                 <w:sz w:val="18"/>
               </w:rPr>
-              <w:t xml:space="preserve">Cost-sensitive autoencoder + SVM</w:t>
+              <w:t xml:space="preserve">Reinforcement-learning ranking</w:t>
             </w:r>
           </w:p>
         </w:tc>
@@ -1286,7 +1286,7 @@
                 <w:rFonts w:ascii="Times New Roman" w:hAnsi="Times New Roman"/>
                 <w:sz w:val="18"/>
               </w:rPr>
-              <w:t xml:space="preserve">UNSW-NB15, BoT-IoT</w:t>
+              <w:t xml:space="preserve">5 multi-step sets</w:t>
             </w:r>
           </w:p>
         </w:tc>
@@ -1306,47 +1306,47 @@
                 <w:rFonts w:ascii="Times New Roman" w:hAnsi="Times New Roman"/>
                 <w:sz w:val="18"/>
               </w:rPr>
+              <w:t xml:space="preserve">×</w:t>
+            </w:r>
+          </w:p>
+        </w:tc>
+        <w:tc>
+          <w:tcPr>
+            <w:tcW w:type="dxa" w:w="648"/>
+          </w:tcPr>
+          <w:p>
+            <w:pPr>
+              <w:pStyle w:val="Compact"/>
+              <w:keepNext/>
+              <w:spacing w:before="20" w:after="20" w:line="240" w:lineRule="auto"/>
+              <w:jc w:val="center"/>
+            </w:pPr>
+            <w:r>
+              <w:rPr>
+                <w:rFonts w:ascii="Times New Roman" w:hAnsi="Times New Roman"/>
+                <w:sz w:val="18"/>
+              </w:rPr>
+              <w:t xml:space="preserve">×</w:t>
+            </w:r>
+          </w:p>
+        </w:tc>
+        <w:tc>
+          <w:tcPr>
+            <w:tcW w:type="dxa" w:w="792"/>
+          </w:tcPr>
+          <w:p>
+            <w:pPr>
+              <w:pStyle w:val="Compact"/>
+              <w:keepNext/>
+              <w:spacing w:before="20" w:after="20" w:line="240" w:lineRule="auto"/>
+              <w:jc w:val="center"/>
+            </w:pPr>
+            <w:r>
+              <w:rPr>
+                <w:rFonts w:ascii="Times New Roman" w:hAnsi="Times New Roman"/>
+                <w:sz w:val="18"/>
+              </w:rPr>
               <w:t xml:space="preserve">(✓)</w:t>
-            </w:r>
-          </w:p>
-        </w:tc>
-        <w:tc>
-          <w:tcPr>
-            <w:tcW w:type="dxa" w:w="648"/>
-          </w:tcPr>
-          <w:p>
-            <w:pPr>
-              <w:pStyle w:val="Compact"/>
-              <w:keepNext/>
-              <w:spacing w:before="20" w:after="20" w:line="240" w:lineRule="auto"/>
-              <w:jc w:val="center"/>
-            </w:pPr>
-            <w:r>
-              <w:rPr>
-                <w:rFonts w:ascii="Times New Roman" w:hAnsi="Times New Roman"/>
-                <w:sz w:val="18"/>
-              </w:rPr>
-              <w:t xml:space="preserve">×</w:t>
-            </w:r>
-          </w:p>
-        </w:tc>
-        <w:tc>
-          <w:tcPr>
-            <w:tcW w:type="dxa" w:w="792"/>
-          </w:tcPr>
-          <w:p>
-            <w:pPr>
-              <w:pStyle w:val="Compact"/>
-              <w:keepNext/>
-              <w:spacing w:before="20" w:after="20" w:line="240" w:lineRule="auto"/>
-              <w:jc w:val="center"/>
-            </w:pPr>
-            <w:r>
-              <w:rPr>
-                <w:rFonts w:ascii="Times New Roman" w:hAnsi="Times New Roman"/>
-                <w:sz w:val="18"/>
-              </w:rPr>
-              <w:t xml:space="preserve">×</w:t>
             </w:r>
           </w:p>
         </w:tc>
@@ -1391,7 +1391,7 @@
                 <w:rFonts w:ascii="Times New Roman" w:hAnsi="Times New Roman"/>
                 <w:sz w:val="18"/>
               </w:rPr>
-              <w:t xml:space="preserve">Wang [13]</w:t>
+              <w:t xml:space="preserve">Bag [13]</w:t>
             </w:r>
           </w:p>
         </w:tc>
@@ -1411,7 +1411,7 @@
                 <w:rFonts w:ascii="Times New Roman" w:hAnsi="Times New Roman"/>
                 <w:sz w:val="18"/>
               </w:rPr>
-              <w:t xml:space="preserve">SHAP explanations</w:t>
+              <w:t xml:space="preserve">Knowledge-graph decision support</w:t>
             </w:r>
           </w:p>
         </w:tc>
@@ -1431,7 +1431,7 @@
                 <w:rFonts w:ascii="Times New Roman" w:hAnsi="Times New Roman"/>
                 <w:sz w:val="18"/>
               </w:rPr>
-              <w:t xml:space="preserve">NSL-KDD</w:t>
+              <w:t xml:space="preserve">190 firms + 4 sets</w:t>
             </w:r>
           </w:p>
         </w:tc>
@@ -1511,7 +1511,7 @@
                 <w:rFonts w:ascii="Times New Roman" w:hAnsi="Times New Roman"/>
                 <w:sz w:val="18"/>
               </w:rPr>
-              <w:t xml:space="preserve">×</w:t>
+              <w:t xml:space="preserve">✓</w:t>
             </w:r>
           </w:p>
         </w:tc>
@@ -1523,441 +1523,6 @@
         <w:tc>
           <w:tcPr>
             <w:tcW w:type="dxa" w:w="1656"/>
-          </w:tcPr>
-          <w:p>
-            <w:pPr>
-              <w:pStyle w:val="Compact"/>
-              <w:keepNext/>
-              <w:spacing w:before="20" w:after="20" w:line="240" w:lineRule="auto"/>
-              <w:jc w:val="left"/>
-            </w:pPr>
-            <w:r>
-              <w:rPr>
-                <w:rFonts w:ascii="Times New Roman" w:hAnsi="Times New Roman"/>
-                <w:sz w:val="18"/>
-              </w:rPr>
-              <w:t xml:space="preserve">Alabbadi [14]</w:t>
-            </w:r>
-          </w:p>
-        </w:tc>
-        <w:tc>
-          <w:tcPr>
-            <w:tcW w:type="dxa" w:w="2808"/>
-          </w:tcPr>
-          <w:p>
-            <w:pPr>
-              <w:pStyle w:val="Compact"/>
-              <w:keepNext/>
-              <w:spacing w:before="20" w:after="20" w:line="240" w:lineRule="auto"/>
-              <w:jc w:val="left"/>
-            </w:pPr>
-            <w:r>
-              <w:rPr>
-                <w:rFonts w:ascii="Times New Roman" w:hAnsi="Times New Roman"/>
-                <w:sz w:val="18"/>
-              </w:rPr>
-              <w:t xml:space="preserve">Deep models + XAI</w:t>
-            </w:r>
-          </w:p>
-        </w:tc>
-        <w:tc>
-          <w:tcPr>
-            <w:tcW w:type="dxa" w:w="2088"/>
-          </w:tcPr>
-          <w:p>
-            <w:pPr>
-              <w:pStyle w:val="Compact"/>
-              <w:keepNext/>
-              <w:spacing w:before="20" w:after="20" w:line="240" w:lineRule="auto"/>
-              <w:jc w:val="left"/>
-            </w:pPr>
-            <w:r>
-              <w:rPr>
-                <w:rFonts w:ascii="Times New Roman" w:hAnsi="Times New Roman"/>
-                <w:sz w:val="18"/>
-              </w:rPr>
-              <w:t xml:space="preserve">TON_IoT</w:t>
-            </w:r>
-          </w:p>
-        </w:tc>
-        <w:tc>
-          <w:tcPr>
-            <w:tcW w:type="dxa" w:w="648"/>
-          </w:tcPr>
-          <w:p>
-            <w:pPr>
-              <w:pStyle w:val="Compact"/>
-              <w:keepNext/>
-              <w:spacing w:before="20" w:after="20" w:line="240" w:lineRule="auto"/>
-              <w:jc w:val="center"/>
-            </w:pPr>
-            <w:r>
-              <w:rPr>
-                <w:rFonts w:ascii="Times New Roman" w:hAnsi="Times New Roman"/>
-                <w:sz w:val="18"/>
-              </w:rPr>
-              <w:t xml:space="preserve">×</w:t>
-            </w:r>
-          </w:p>
-        </w:tc>
-        <w:tc>
-          <w:tcPr>
-            <w:tcW w:type="dxa" w:w="648"/>
-          </w:tcPr>
-          <w:p>
-            <w:pPr>
-              <w:pStyle w:val="Compact"/>
-              <w:keepNext/>
-              <w:spacing w:before="20" w:after="20" w:line="240" w:lineRule="auto"/>
-              <w:jc w:val="center"/>
-            </w:pPr>
-            <w:r>
-              <w:rPr>
-                <w:rFonts w:ascii="Times New Roman" w:hAnsi="Times New Roman"/>
-                <w:sz w:val="18"/>
-              </w:rPr>
-              <w:t xml:space="preserve">(✓)</w:t>
-            </w:r>
-          </w:p>
-        </w:tc>
-        <w:tc>
-          <w:tcPr>
-            <w:tcW w:type="dxa" w:w="792"/>
-          </w:tcPr>
-          <w:p>
-            <w:pPr>
-              <w:pStyle w:val="Compact"/>
-              <w:keepNext/>
-              <w:spacing w:before="20" w:after="20" w:line="240" w:lineRule="auto"/>
-              <w:jc w:val="center"/>
-            </w:pPr>
-            <w:r>
-              <w:rPr>
-                <w:rFonts w:ascii="Times New Roman" w:hAnsi="Times New Roman"/>
-                <w:sz w:val="18"/>
-              </w:rPr>
-              <w:t xml:space="preserve">×</w:t>
-            </w:r>
-          </w:p>
-        </w:tc>
-        <w:tc>
-          <w:tcPr>
-            <w:tcW w:type="dxa" w:w="648"/>
-          </w:tcPr>
-          <w:p>
-            <w:pPr>
-              <w:pStyle w:val="Compact"/>
-              <w:keepNext/>
-              <w:spacing w:before="20" w:after="20" w:line="240" w:lineRule="auto"/>
-              <w:jc w:val="center"/>
-            </w:pPr>
-            <w:r>
-              <w:rPr>
-                <w:rFonts w:ascii="Times New Roman" w:hAnsi="Times New Roman"/>
-                <w:sz w:val="18"/>
-              </w:rPr>
-              <w:t xml:space="preserve">n.r.</w:t>
-            </w:r>
-          </w:p>
-        </w:tc>
-      </w:tr>
-      <w:tr>
-        <w:trPr>
-          <w:cantSplit/>
-        </w:trPr>
-        <w:tc>
-          <w:tcPr>
-            <w:tcW w:type="dxa" w:w="1656"/>
-          </w:tcPr>
-          <w:p>
-            <w:pPr>
-              <w:pStyle w:val="Compact"/>
-              <w:keepNext/>
-              <w:spacing w:before="20" w:after="20" w:line="240" w:lineRule="auto"/>
-              <w:jc w:val="left"/>
-            </w:pPr>
-            <w:r>
-              <w:rPr>
-                <w:rFonts w:ascii="Times New Roman" w:hAnsi="Times New Roman"/>
-                <w:sz w:val="18"/>
-              </w:rPr>
-              <w:t xml:space="preserve">Wang [9]</w:t>
-            </w:r>
-          </w:p>
-        </w:tc>
-        <w:tc>
-          <w:tcPr>
-            <w:tcW w:type="dxa" w:w="2808"/>
-          </w:tcPr>
-          <w:p>
-            <w:pPr>
-              <w:pStyle w:val="Compact"/>
-              <w:keepNext/>
-              <w:spacing w:before="20" w:after="20" w:line="240" w:lineRule="auto"/>
-              <w:jc w:val="left"/>
-            </w:pPr>
-            <w:r>
-              <w:rPr>
-                <w:rFonts w:ascii="Times New Roman" w:hAnsi="Times New Roman"/>
-                <w:sz w:val="18"/>
-              </w:rPr>
-              <w:t xml:space="preserve">Reinforcement-learning ranking</w:t>
-            </w:r>
-          </w:p>
-        </w:tc>
-        <w:tc>
-          <w:tcPr>
-            <w:tcW w:type="dxa" w:w="2088"/>
-          </w:tcPr>
-          <w:p>
-            <w:pPr>
-              <w:pStyle w:val="Compact"/>
-              <w:keepNext/>
-              <w:spacing w:before="20" w:after="20" w:line="240" w:lineRule="auto"/>
-              <w:jc w:val="left"/>
-            </w:pPr>
-            <w:r>
-              <w:rPr>
-                <w:rFonts w:ascii="Times New Roman" w:hAnsi="Times New Roman"/>
-                <w:sz w:val="18"/>
-              </w:rPr>
-              <w:t xml:space="preserve">5 multi-step sets</w:t>
-            </w:r>
-          </w:p>
-        </w:tc>
-        <w:tc>
-          <w:tcPr>
-            <w:tcW w:type="dxa" w:w="648"/>
-          </w:tcPr>
-          <w:p>
-            <w:pPr>
-              <w:pStyle w:val="Compact"/>
-              <w:keepNext/>
-              <w:spacing w:before="20" w:after="20" w:line="240" w:lineRule="auto"/>
-              <w:jc w:val="center"/>
-            </w:pPr>
-            <w:r>
-              <w:rPr>
-                <w:rFonts w:ascii="Times New Roman" w:hAnsi="Times New Roman"/>
-                <w:sz w:val="18"/>
-              </w:rPr>
-              <w:t xml:space="preserve">×</w:t>
-            </w:r>
-          </w:p>
-        </w:tc>
-        <w:tc>
-          <w:tcPr>
-            <w:tcW w:type="dxa" w:w="648"/>
-          </w:tcPr>
-          <w:p>
-            <w:pPr>
-              <w:pStyle w:val="Compact"/>
-              <w:keepNext/>
-              <w:spacing w:before="20" w:after="20" w:line="240" w:lineRule="auto"/>
-              <w:jc w:val="center"/>
-            </w:pPr>
-            <w:r>
-              <w:rPr>
-                <w:rFonts w:ascii="Times New Roman" w:hAnsi="Times New Roman"/>
-                <w:sz w:val="18"/>
-              </w:rPr>
-              <w:t xml:space="preserve">×</w:t>
-            </w:r>
-          </w:p>
-        </w:tc>
-        <w:tc>
-          <w:tcPr>
-            <w:tcW w:type="dxa" w:w="792"/>
-          </w:tcPr>
-          <w:p>
-            <w:pPr>
-              <w:pStyle w:val="Compact"/>
-              <w:keepNext/>
-              <w:spacing w:before="20" w:after="20" w:line="240" w:lineRule="auto"/>
-              <w:jc w:val="center"/>
-            </w:pPr>
-            <w:r>
-              <w:rPr>
-                <w:rFonts w:ascii="Times New Roman" w:hAnsi="Times New Roman"/>
-                <w:sz w:val="18"/>
-              </w:rPr>
-              <w:t xml:space="preserve">(✓)</w:t>
-            </w:r>
-          </w:p>
-        </w:tc>
-        <w:tc>
-          <w:tcPr>
-            <w:tcW w:type="dxa" w:w="648"/>
-          </w:tcPr>
-          <w:p>
-            <w:pPr>
-              <w:pStyle w:val="Compact"/>
-              <w:keepNext/>
-              <w:spacing w:before="20" w:after="20" w:line="240" w:lineRule="auto"/>
-              <w:jc w:val="center"/>
-            </w:pPr>
-            <w:r>
-              <w:rPr>
-                <w:rFonts w:ascii="Times New Roman" w:hAnsi="Times New Roman"/>
-                <w:sz w:val="18"/>
-              </w:rPr>
-              <w:t xml:space="preserve">n.r.</w:t>
-            </w:r>
-          </w:p>
-        </w:tc>
-      </w:tr>
-      <w:tr>
-        <w:trPr>
-          <w:cantSplit/>
-        </w:trPr>
-        <w:tc>
-          <w:tcPr>
-            <w:tcW w:type="dxa" w:w="1656"/>
-          </w:tcPr>
-          <w:p>
-            <w:pPr>
-              <w:pStyle w:val="Compact"/>
-              <w:keepNext/>
-              <w:spacing w:before="20" w:after="20" w:line="240" w:lineRule="auto"/>
-              <w:jc w:val="left"/>
-            </w:pPr>
-            <w:r>
-              <w:rPr>
-                <w:rFonts w:ascii="Times New Roman" w:hAnsi="Times New Roman"/>
-                <w:sz w:val="18"/>
-              </w:rPr>
-              <w:t xml:space="preserve">Bag [15]</w:t>
-            </w:r>
-          </w:p>
-        </w:tc>
-        <w:tc>
-          <w:tcPr>
-            <w:tcW w:type="dxa" w:w="2808"/>
-          </w:tcPr>
-          <w:p>
-            <w:pPr>
-              <w:pStyle w:val="Compact"/>
-              <w:keepNext/>
-              <w:spacing w:before="20" w:after="20" w:line="240" w:lineRule="auto"/>
-              <w:jc w:val="left"/>
-            </w:pPr>
-            <w:r>
-              <w:rPr>
-                <w:rFonts w:ascii="Times New Roman" w:hAnsi="Times New Roman"/>
-                <w:sz w:val="18"/>
-              </w:rPr>
-              <w:t xml:space="preserve">Knowledge-graph decision support</w:t>
-            </w:r>
-          </w:p>
-        </w:tc>
-        <w:tc>
-          <w:tcPr>
-            <w:tcW w:type="dxa" w:w="2088"/>
-          </w:tcPr>
-          <w:p>
-            <w:pPr>
-              <w:pStyle w:val="Compact"/>
-              <w:keepNext/>
-              <w:spacing w:before="20" w:after="20" w:line="240" w:lineRule="auto"/>
-              <w:jc w:val="left"/>
-            </w:pPr>
-            <w:r>
-              <w:rPr>
-                <w:rFonts w:ascii="Times New Roman" w:hAnsi="Times New Roman"/>
-                <w:sz w:val="18"/>
-              </w:rPr>
-              <w:t xml:space="preserve">190 firms + 4 sets</w:t>
-            </w:r>
-          </w:p>
-        </w:tc>
-        <w:tc>
-          <w:tcPr>
-            <w:tcW w:type="dxa" w:w="648"/>
-          </w:tcPr>
-          <w:p>
-            <w:pPr>
-              <w:pStyle w:val="Compact"/>
-              <w:keepNext/>
-              <w:spacing w:before="20" w:after="20" w:line="240" w:lineRule="auto"/>
-              <w:jc w:val="center"/>
-            </w:pPr>
-            <w:r>
-              <w:rPr>
-                <w:rFonts w:ascii="Times New Roman" w:hAnsi="Times New Roman"/>
-                <w:sz w:val="18"/>
-              </w:rPr>
-              <w:t xml:space="preserve">×</w:t>
-            </w:r>
-          </w:p>
-        </w:tc>
-        <w:tc>
-          <w:tcPr>
-            <w:tcW w:type="dxa" w:w="648"/>
-          </w:tcPr>
-          <w:p>
-            <w:pPr>
-              <w:pStyle w:val="Compact"/>
-              <w:keepNext/>
-              <w:spacing w:before="20" w:after="20" w:line="240" w:lineRule="auto"/>
-              <w:jc w:val="center"/>
-            </w:pPr>
-            <w:r>
-              <w:rPr>
-                <w:rFonts w:ascii="Times New Roman" w:hAnsi="Times New Roman"/>
-                <w:sz w:val="18"/>
-              </w:rPr>
-              <w:t xml:space="preserve">(✓)</w:t>
-            </w:r>
-          </w:p>
-        </w:tc>
-        <w:tc>
-          <w:tcPr>
-            <w:tcW w:type="dxa" w:w="792"/>
-          </w:tcPr>
-          <w:p>
-            <w:pPr>
-              <w:pStyle w:val="Compact"/>
-              <w:keepNext/>
-              <w:spacing w:before="20" w:after="20" w:line="240" w:lineRule="auto"/>
-              <w:jc w:val="center"/>
-            </w:pPr>
-            <w:r>
-              <w:rPr>
-                <w:rFonts w:ascii="Times New Roman" w:hAnsi="Times New Roman"/>
-                <w:sz w:val="18"/>
-              </w:rPr>
-              <w:t xml:space="preserve">×</w:t>
-            </w:r>
-          </w:p>
-        </w:tc>
-        <w:tc>
-          <w:tcPr>
-            <w:tcW w:type="dxa" w:w="648"/>
-          </w:tcPr>
-          <w:p>
-            <w:pPr>
-              <w:pStyle w:val="Compact"/>
-              <w:keepNext/>
-              <w:spacing w:before="20" w:after="20" w:line="240" w:lineRule="auto"/>
-              <w:jc w:val="center"/>
-            </w:pPr>
-            <w:r>
-              <w:rPr>
-                <w:rFonts w:ascii="Times New Roman" w:hAnsi="Times New Roman"/>
-                <w:sz w:val="18"/>
-              </w:rPr>
-              <w:t xml:space="preserve">✓</w:t>
-            </w:r>
-          </w:p>
-        </w:tc>
-      </w:tr>
-      <w:tr>
-        <w:trPr>
-          <w:cantSplit/>
-        </w:trPr>
-        <w:tc>
-          <w:tcPr>
-            <w:tcW w:type="dxa" w:w="1656"/>
             <w:tcBorders>
               <w:top w:val="single" w:sz="6" w:space="0" w:color="000000"/>
             </w:tcBorders>
@@ -2189,7 +1754,7 @@
         <w:pStyle w:val="TableNote"/>
       </w:pPr>
       <w:r>
-        <w:t xml:space="preserve">Cost: actions chosen under an explicit cost model. Rules: readable decision logic. Graded: more than two actions. Tests: significance tests or confidence intervals. ✓ present, (✓) partial, × absent, n.r. not reported. LSTM: long short-term memory; SHAP: Shapley additive explanations; SVM: support vector machine.</w:t>
+        <w:t xml:space="preserve">Cost: actions chosen under an explicit cost model. Rules: readable decision logic. Graded: more than two actions. Tests: significance tests or confidence intervals. ✓ present, (✓) partial, × absent, n.r. not reported. SHAP: Shapley additive explanations; SVM: support vector machine.</w:t>
       </w:r>
     </w:p>
     <w:p>
@@ -2197,15 +1762,7 @@
         <w:pStyle w:val="BodyText"/>
       </w:pPr>
       <w:r>
-        <w:t xml:space="preserve">Fuzzy and neuro-fuzzy systems suit this decision step, because they express learned evidence as linguistic rules that operators can read and audit [16,17]. As Table 1 shows, existing studies use these strengths for other purposes. Fuzzy intrusion detectors use rules to improve accuracy, but they still output a binary alarm [3,4,10]. Cost-sensitive learning [18] enters intrusion detection mainly through weighted training losses [11,12], so the cost model shapes the classifier but does not choose the action. Post hoc explainable artificial intelligence (XAI) methods, such as Shapley additive explanations, explain a score after it has been produced [13,14,19]. Reinforcement learning can rank alerts by priority, yet the ranking does not assign an action [9]. The closest designs to ours defer uncertain cases. Three-way decision models assign each case to acceptance, rejection or deferment, with thresholds derived from loss functions [7], and Jalalvand et al. [8] learn when to defer alerts from analyst feedback. Neither assigns graded SOC actions through a readable fuzzy rule base driven by a learned score. Knowledge-based decision support has shown the value of explicit domain knowledge in cyber-risk assessment [15]. However, to our knowledge none of these studies combines an action-cost model, readable rules and graded responses in one triage layer.</w:t>
-      </w:r>
-    </w:p>
-    <w:p>
-      <w:pPr>
-        <w:pStyle w:val="BodyText"/>
-      </w:pPr>
-      <w:r>
-        <w:t xml:space="preserve">This Short Communication addresses that gap with three contributions. It proposes a knowledge-based layer that maps neural attack propensity to fuzzy risk bands and then to SOC actions through explicit rules (Section 2). It evaluates the layer by the quality of its decisions, using paired tests, repeated runs and sensitivity analyses (Sections 3 and 4). Finally, ablations show where the gain comes from and where it ends.</w:t>
+        <w:t xml:space="preserve">Fuzzy systems suit this step, because they express learned evidence as linguistic rules that operators can read and audit [14,15], but existing studies use them for other purposes (Table 1). Fuzzy intrusion detectors use rules to improve accuracy but still output a binary alarm [3,4,16]. Cost-sensitive learning [17] enters intrusion detection through weighted training losses [10,11], so costs shape the classifier rather than the action. Post hoc explainable artificial intelligence (XAI) explains a score after it has been produced [12,18,19], and knowledge-based decision support has shown the value of explicit domain knowledge in cyber-risk assessment [13]. To our knowledge, no study combines an action-cost model, readable rules and graded responses in one triage layer. This Short Communication proposes such a layer and evaluates it by the quality of its decisions.</w:t>
       </w:r>
     </w:p>
     <w:bookmarkEnd w:id="10"/>
@@ -2233,7 +1790,7 @@
         <w:t xml:space="preserve"> </w:t>
       </w:r>
       <w:r>
-        <w:t xml:space="preserve">Each alert</w:t>
+        <w:t xml:space="preserve">Alert</w:t>
       </w:r>
       <w:r>
         <w:t xml:space="preserve"> </w:t>
@@ -2247,7 +1804,7 @@
         <w:t xml:space="preserve"> </w:t>
       </w:r>
       <w:r>
-        <w:t xml:space="preserve">has a feature vector</w:t>
+        <w:t xml:space="preserve">has features</w:t>
       </w:r>
       <w:r>
         <w:t xml:space="preserve"> </w:t>
@@ -2270,7 +1827,7 @@
         <w:t xml:space="preserve"> </w:t>
       </w:r>
       <w:r>
-        <w:t xml:space="preserve">and a label</w:t>
+        <w:t xml:space="preserve">and label</w:t>
       </w:r>
       <w:r>
         <w:t xml:space="preserve"> </w:t>
@@ -2320,7 +1877,7 @@
         </m:r>
       </m:oMath>
       <w:r>
-        <w:t xml:space="preserve">, where 1 denotes an attack. The 38 numeric NSL-KDD fields are standardised, and the protocol, service and flag fields are one-hot encoded. An MLP</w:t>
+        <w:t xml:space="preserve">, with 1 for an attack. The 38 numeric NSL-KDD fields are standardised, and the protocol, service and flag fields are one-hot encoded. An MLP</w:t>
       </w:r>
       <w:r>
         <w:t xml:space="preserve"> </w:t>
@@ -2343,7 +1900,7 @@
         <w:t xml:space="preserve"> </w:t>
       </w:r>
       <w:r>
-        <w:t xml:space="preserve">with two ReLU layers of width 128 and 64, a dropout rate of 0.2 and a single logit output estimates the attack propensity:</w:t>
+        <w:t xml:space="preserve">with ReLU layers of width 128 and 64, dropout 0.2 and one logit output estimates the attack propensity:</w:t>
       </w:r>
     </w:p>
     <w:p>
@@ -2823,34 +2380,7 @@
         <w:t xml:space="preserve"> </w:t>
       </w:r>
       <w:r>
-        <w:t xml:space="preserve">are the numbers of normal and attack training records, so that</w:t>
-      </w:r>
-      <w:r>
-        <w:t xml:space="preserve"> </w:t>
-      </w:r>
-      <m:oMath>
-        <m:sSub>
-          <m:e>
-            <m:r>
-              <m:t>w</m:t>
-            </m:r>
-          </m:e>
-          <m:sub>
-            <m:r>
-              <m:rPr>
-                <m:nor/>
-                <m:sty m:val="p"/>
-              </m:rPr>
-              <m:t>+</m:t>
-            </m:r>
-          </m:sub>
-        </m:sSub>
-      </m:oMath>
-      <w:r>
-        <w:t xml:space="preserve"> </w:t>
-      </w:r>
-      <w:r>
-        <w:t xml:space="preserve">offsets the class imbalance. The network is trained with Adam at a learning rate of</w:t>
+        <w:t xml:space="preserve">count normal and attack training records. Training uses Adam (learning rate</w:t>
       </w:r>
       <w:r>
         <w:t xml:space="preserve"> </w:t>
@@ -2876,10 +2406,7 @@
         </m:sSup>
       </m:oMath>
       <w:r>
-        <w:t xml:space="preserve"> </w:t>
-      </w:r>
-      <w:r>
-        <w:t xml:space="preserve">and a batch size of 512 for 20 epochs, and the epoch with the best validation ROC-AUC is kept.</w:t>
+        <w:t xml:space="preserve">, batch size 512) for 20 epochs and keeps the epoch with the best validation ROC-AUC.</w:t>
       </w:r>
     </w:p>
     <w:p>
@@ -2897,7 +2424,7 @@
         <w:t xml:space="preserve"> </w:t>
       </w:r>
       <w:r>
-        <w:t xml:space="preserve">Two shoulder functions and one triangular function map the propensity to three linguistic risk bands [16]. With the clipping operator</w:t>
+        <w:t xml:space="preserve">Two shoulder functions and one triangular function [14] map the propensity to three risk bands. With</w:t>
       </w:r>
       <w:r>
         <w:t xml:space="preserve"> </w:t>
@@ -3522,7 +3049,7 @@
         <w:pStyle w:val="FirstParagraph"/>
       </w:pPr>
       <w:r>
-        <w:t xml:space="preserve">The knowledge layer is the production-rule base</w:t>
+        <w:t xml:space="preserve">The rule base</w:t>
       </w:r>
       <w:r>
         <w:t xml:space="preserve"> </w:t>
@@ -3603,13 +3130,14 @@
         </m:r>
       </m:oMath>
       <w:r>
-        <w:t xml:space="preserve">:</w:t>
-      </w:r>
-    </w:p>
-    <w:p>
-      <w:pPr>
-        <w:pStyle w:val="Rule"/>
-      </w:pPr>
+        <w:t xml:space="preserve"> </w:t>
+      </w:r>
+      <w:r>
+        <w:t xml:space="preserve">reads:</w:t>
+      </w:r>
+      <w:r>
+        <w:t xml:space="preserve"> </w:t>
+      </w:r>
       <m:oMath>
         <m:sSub>
           <m:e>
@@ -3625,13 +3153,11 @@
         </m:sSub>
       </m:oMath>
       <w:r>
-        <w:t xml:space="preserve">: IF risk IS Low THEN Monitor: log the alert without intervention.</w:t>
-      </w:r>
-    </w:p>
-    <w:p>
-      <w:pPr>
-        <w:pStyle w:val="Rule"/>
-      </w:pPr>
+        <w:t xml:space="preserve">, IF risk IS Low THEN Monitor (log the alert without intervention);</w:t>
+      </w:r>
+      <w:r>
+        <w:t xml:space="preserve"> </w:t>
+      </w:r>
       <m:oMath>
         <m:sSub>
           <m:e>
@@ -3647,13 +3173,11 @@
         </m:sSub>
       </m:oMath>
       <w:r>
-        <w:t xml:space="preserve">: IF risk IS Medium THEN Soft-block: apply automatic containment.</w:t>
-      </w:r>
-    </w:p>
-    <w:p>
-      <w:pPr>
-        <w:pStyle w:val="Rule"/>
-      </w:pPr>
+        <w:t xml:space="preserve">, IF risk IS Medium THEN Soft-block (apply automatic containment); and</w:t>
+      </w:r>
+      <w:r>
+        <w:t xml:space="preserve"> </w:t>
+      </w:r>
       <m:oMath>
         <m:sSub>
           <m:e>
@@ -3669,15 +3193,7 @@
         </m:sSub>
       </m:oMath>
       <w:r>
-        <w:t xml:space="preserve">: IF risk IS High THEN Escalate: hand the alert to a human analyst.</w:t>
-      </w:r>
-    </w:p>
-    <w:p>
-      <w:pPr>
-        <w:pStyle w:val="BodyText"/>
-      </w:pPr>
-      <w:r>
-        <w:t xml:space="preserve">Each rule</w:t>
+        <w:t xml:space="preserve">, IF risk IS High THEN Escalate (hand the alert to a human analyst). Each rule</w:t>
       </w:r>
       <w:r>
         <w:t xml:space="preserve"> </w:t>
@@ -3744,7 +3260,7 @@
         </m:r>
       </m:oMath>
       <w:r>
-        <w:t xml:space="preserve">. The strongest rule determines the action, and a tie goes to the less severe action:</w:t>
+        <w:t xml:space="preserve">. The strongest rule sets the action, and ties go to the less severe action:</w:t>
       </w:r>
     </w:p>
     <w:p>
@@ -4025,7 +3541,7 @@
         <w:t xml:space="preserve"> </w:t>
       </w:r>
       <w:r>
-        <w:t xml:space="preserve">to Monitor, Soft-block and Escalate. The firing strengths are logged with every decision and serve as its explanation. For example, an alert with</w:t>
+        <w:t xml:space="preserve">to Monitor, Soft-block and Escalate. Logged firing strengths explain each decision: an alert with</w:t>
       </w:r>
       <w:r>
         <w:t xml:space="preserve"> </w:t>
@@ -4048,10 +3564,7 @@
         <w:t xml:space="preserve"> </w:t>
       </w:r>
       <w:r>
-        <w:t xml:space="preserve">has</w:t>
-      </w:r>
-      <w:r>
-        <w:t xml:space="preserve"> </w:t>
+        <w:t xml:space="preserve">(</w:t>
       </w:r>
       <m:oMath>
         <m:sSub>
@@ -4077,10 +3590,7 @@
         </m:r>
       </m:oMath>
       <w:r>
-        <w:t xml:space="preserve"> </w:t>
-      </w:r>
-      <w:r>
-        <w:t xml:space="preserve">and</w:t>
+        <w:t xml:space="preserve">,</w:t>
       </w:r>
       <w:r>
         <w:t xml:space="preserve"> </w:t>
@@ -4109,7 +3619,86 @@
         </m:r>
       </m:oMath>
       <w:r>
-        <w:t xml:space="preserve">, so it is soft-blocked. Solving</w:t>
+        <w:t xml:space="preserve">) is soft-blocked. Actions switch at</w:t>
+      </w:r>
+      <w:r>
+        <w:t xml:space="preserve"> </w:t>
+      </w:r>
+      <m:oMath>
+        <m:r>
+          <m:t>p</m:t>
+        </m:r>
+        <m:r>
+          <m:rPr>
+            <m:sty m:val="p"/>
+          </m:rPr>
+          <m:t>=</m:t>
+        </m:r>
+        <m:r>
+          <m:t>9</m:t>
+        </m:r>
+        <m:r>
+          <m:rPr>
+            <m:sty m:val="p"/>
+          </m:rPr>
+          <m:t>/</m:t>
+        </m:r>
+        <m:r>
+          <m:t>32</m:t>
+        </m:r>
+        <m:r>
+          <m:rPr>
+            <m:sty m:val="p"/>
+          </m:rPr>
+          <m:t>=</m:t>
+        </m:r>
+        <m:r>
+          <m:t>0.281</m:t>
+        </m:r>
+      </m:oMath>
+      <w:r>
+        <w:t xml:space="preserve"> </w:t>
+      </w:r>
+      <w:r>
+        <w:t xml:space="preserve">and</w:t>
+      </w:r>
+      <w:r>
+        <w:t xml:space="preserve"> </w:t>
+      </w:r>
+      <m:oMath>
+        <m:r>
+          <m:t>p</m:t>
+        </m:r>
+        <m:r>
+          <m:rPr>
+            <m:sty m:val="p"/>
+          </m:rPr>
+          <m:t>=</m:t>
+        </m:r>
+        <m:r>
+          <m:t>23</m:t>
+        </m:r>
+        <m:r>
+          <m:rPr>
+            <m:sty m:val="p"/>
+          </m:rPr>
+          <m:t>/</m:t>
+        </m:r>
+        <m:r>
+          <m:t>32</m:t>
+        </m:r>
+        <m:r>
+          <m:rPr>
+            <m:sty m:val="p"/>
+          </m:rPr>
+          <m:t>=</m:t>
+        </m:r>
+        <m:r>
+          <m:t>0.719</m:t>
+        </m:r>
+      </m:oMath>
+      <w:r>
+        <w:t xml:space="preserve">, where</w:t>
       </w:r>
       <w:r>
         <w:t xml:space="preserve"> </w:t>
@@ -4191,88 +3780,6 @@
         <w:t xml:space="preserve"> </w:t>
       </w:r>
       <w:r>
-        <w:t xml:space="preserve">shows that the rule base switches action at</w:t>
-      </w:r>
-      <w:r>
-        <w:t xml:space="preserve"> </w:t>
-      </w:r>
-      <m:oMath>
-        <m:r>
-          <m:t>p</m:t>
-        </m:r>
-        <m:r>
-          <m:rPr>
-            <m:sty m:val="p"/>
-          </m:rPr>
-          <m:t>=</m:t>
-        </m:r>
-        <m:r>
-          <m:t>9</m:t>
-        </m:r>
-        <m:r>
-          <m:rPr>
-            <m:sty m:val="p"/>
-          </m:rPr>
-          <m:t>/</m:t>
-        </m:r>
-        <m:r>
-          <m:t>32</m:t>
-        </m:r>
-        <m:r>
-          <m:rPr>
-            <m:sty m:val="p"/>
-          </m:rPr>
-          <m:t>=</m:t>
-        </m:r>
-        <m:r>
-          <m:t>0.281</m:t>
-        </m:r>
-      </m:oMath>
-      <w:r>
-        <w:t xml:space="preserve"> </w:t>
-      </w:r>
-      <w:r>
-        <w:t xml:space="preserve">and</w:t>
-      </w:r>
-      <w:r>
-        <w:t xml:space="preserve"> </w:t>
-      </w:r>
-      <m:oMath>
-        <m:r>
-          <m:t>p</m:t>
-        </m:r>
-        <m:r>
-          <m:rPr>
-            <m:sty m:val="p"/>
-          </m:rPr>
-          <m:t>=</m:t>
-        </m:r>
-        <m:r>
-          <m:t>23</m:t>
-        </m:r>
-        <m:r>
-          <m:rPr>
-            <m:sty m:val="p"/>
-          </m:rPr>
-          <m:t>/</m:t>
-        </m:r>
-        <m:r>
-          <m:t>32</m:t>
-        </m:r>
-        <m:r>
-          <m:rPr>
-            <m:sty m:val="p"/>
-          </m:rPr>
-          <m:t>=</m:t>
-        </m:r>
-        <m:r>
-          <m:t>0.719</m:t>
-        </m:r>
-      </m:oMath>
-      <w:r>
-        <w:t xml:space="preserve"> </w:t>
-      </w:r>
-      <w:r>
         <w:t xml:space="preserve">(Fig. 1). The breakpoints were set by expert judgement before the test data were examined.</w:t>
       </w:r>
     </w:p>
@@ -4283,9 +3790,9 @@
       <w:r>
         <w:drawing>
           <wp:inline>
-            <wp:extent cx="5943600" cy="3123939"/>
+            <wp:extent cx="5943600" cy="2829802"/>
             <wp:effectExtent b="0" l="0" r="0" t="0"/>
-            <wp:docPr descr="Fig. 1. Fuzzy mapping from attack propensity to action on the seed-42 test set. The membership functions of Eqs. (2)–(4) and rules R1–R3 switch action at p = 9/32 and p = 23/32 (dotted lines). Dashed: Bayes soft-block threshold p = 2/11. The Soft-block band holds only 776 alerts (3.9%), yet it produces the entire cost gain over the 0.5 threshold." title="" id="12" name="Picture"/>
+            <wp:docPr descr="Fig. 1. Fuzzy mapping from attack propensity to action (seed-42 test set). Rules R1–R3 switch action at p = 9/32 and 23/32 (dotted); dashed: Bayes soft-block threshold p = 2/11. The Soft-block band (776 alerts, 3.9%) yields the entire cost gain over the 0.5 threshold." title="" id="12" name="Picture"/>
             <a:graphic>
               <a:graphicData uri="http://schemas.openxmlformats.org/drawingml/2006/picture">
                 <pic:pic>
@@ -4304,7 +3811,7 @@
                   <pic:spPr bwMode="auto">
                     <a:xfrm>
                       <a:off x="0" y="0"/>
-                      <a:ext cx="5943600" cy="3123939"/>
+                      <a:ext cx="5943600" cy="2829802"/>
                     </a:xfrm>
                     <a:prstGeom prst="rect">
                       <a:avLst/>
@@ -4338,7 +3845,7 @@
         <w:t xml:space="preserve"> </w:t>
       </w:r>
       <w:r>
-        <w:t xml:space="preserve">Fuzzy mapping from attack propensity to action on the seed-42 test set. The membership functions of Eqs. (2)–(4) and rules</w:t>
+        <w:t xml:space="preserve">Fuzzy mapping from attack propensity to action (seed-42 test set). Rules</w:t>
       </w:r>
       <w:r>
         <w:t xml:space="preserve"> </w:t>
@@ -4392,7 +3899,7 @@
         <w:t xml:space="preserve"> </w:t>
       </w:r>
       <w:r>
-        <w:t xml:space="preserve">= 9/32 and</w:t>
+        <w:t xml:space="preserve">= 9/32 and 23/32 (dotted); dashed: Bayes soft-block threshold</w:t>
       </w:r>
       <w:r>
         <w:t xml:space="preserve"> </w:t>
@@ -4408,23 +3915,7 @@
         <w:t xml:space="preserve"> </w:t>
       </w:r>
       <w:r>
-        <w:t xml:space="preserve">= 23/32 (dotted lines). Dashed: Bayes soft-block threshold</w:t>
-      </w:r>
-      <w:r>
-        <w:t xml:space="preserve"> </w:t>
-      </w:r>
-      <w:r>
-        <w:rPr>
-          <w:i/>
-          <w:iCs/>
-        </w:rPr>
-        <w:t xml:space="preserve">p</w:t>
-      </w:r>
-      <w:r>
-        <w:t xml:space="preserve"> </w:t>
-      </w:r>
-      <w:r>
-        <w:t xml:space="preserve">= 2/11. The Soft-block band holds only 776 alerts (3.9%), yet it produces the entire cost gain over the 0.5 threshold.</w:t>
+        <w:t xml:space="preserve">= 2/11. The Soft-block band (776 alerts, 3.9%) yields the entire cost gain over the 0.5 threshold.</w:t>
       </w:r>
     </w:p>
     <w:p>
@@ -4442,7 +3933,7 @@
         <w:t xml:space="preserve"> </w:t>
       </w:r>
       <w:r>
-        <w:t xml:space="preserve">Each action is scored with the relative cost matrix</w:t>
+        <w:t xml:space="preserve">Actions are scored with the relative cost matrix</w:t>
       </w:r>
     </w:p>
     <w:p>
@@ -4761,7 +4252,7 @@
         <w:pStyle w:val="FirstParagraph"/>
       </w:pPr>
       <w:r>
-        <w:t xml:space="preserve">Each policy is evaluated on three metrics. The mean triage cost is</w:t>
+        <w:t xml:space="preserve">Policies are compared by the mean triage cost</w:t>
       </w:r>
       <w:r>
         <w:t xml:space="preserve"> </w:t>
@@ -4874,7 +4365,7 @@
         </m:r>
       </m:oMath>
       <w:r>
-        <w:t xml:space="preserve">. The attack coverage,</w:t>
+        <w:t xml:space="preserve">, the attack coverage</w:t>
       </w:r>
       <w:r>
         <w:t xml:space="preserve"> </w:t>
@@ -4998,7 +4489,10 @@
         </m:nary>
       </m:oMath>
       <w:r>
-        <w:t xml:space="preserve">, is the share of attacks that receive any action other than Monitor. The third metric counts unnecessary escalations (UE), which are benign alerts sent to an analyst. As a reference, we also report the plug-in Bayes cost rule</w:t>
+        <w:t xml:space="preserve"> </w:t>
+      </w:r>
+      <w:r>
+        <w:t xml:space="preserve">and the number of unnecessary escalations (UE), that is, benign alerts sent to an analyst. As a reference, we report the plug-in Bayes cost rule</w:t>
       </w:r>
     </w:p>
     <w:p>
@@ -5210,7 +4704,7 @@
         <w:pStyle w:val="FirstParagraph"/>
       </w:pPr>
       <w:r>
-        <w:t xml:space="preserve">This rule treats</w:t>
+        <w:t xml:space="preserve">which treats</w:t>
       </w:r>
       <w:r>
         <w:t xml:space="preserve"> </w:t>
@@ -5233,7 +4727,7 @@
         <w:t xml:space="preserve"> </w:t>
       </w:r>
       <w:r>
-        <w:t xml:space="preserve">as a calibrated probability, although deep-model scores do not guarantee calibration [20]. Because soft-blocking costs less than escalation for both classes, the Bayes rule never escalates. Instead, it soft-blocks every alert with</w:t>
+        <w:t xml:space="preserve">as calibrated, although deep-model scores do not guarantee calibration [20]. Because soft-blocking is cheaper than escalation for both classes, this rule never escalates and soft-blocks every alert with</w:t>
       </w:r>
       <w:r>
         <w:t xml:space="preserve"> </w:t>
@@ -5299,7 +4793,7 @@
         <w:t xml:space="preserve"> </w:t>
       </w:r>
       <w:r>
-        <w:t xml:space="preserve">The experiments used the NSL-KDD benchmark [21]. For reproducibility on a standard CPU, we sampled 40,000 training records and split them, with stratification, into 34,000 training and 6,000 validation records. The scaler and encoder were fitted on the training split only. The test set was capped at 20,000 records with an attack rate of 0.568. Because it contains attack types absent from training, the evaluation includes a realistic distribution shift.</w:t>
+        <w:t xml:space="preserve">We used the NSL-KDD benchmark [21]. 40,000 training records were sampled and split, with stratification, into 34,000 training and 6,000 validation records, and the scaler and encoder were fitted on the training split only. The test set was capped at 20,000 records (attack rate 0.568) and contains attack types absent from training.</w:t>
       </w:r>
     </w:p>
     <w:p>
@@ -5317,7 +4811,7 @@
         <w:t xml:space="preserve"> </w:t>
       </w:r>
       <w:r>
-        <w:t xml:space="preserve">Three detectors were compared: class-balanced logistic regression, gradient boosting (GB) [22] with scikit-learn defaults, and the MLP alone. The proposed policy uses the MLP propensity, so any benefit must come from better decisions rather than better scores. Three decision baselines acted on the same scores. The first escalates every alert scored above 0.5 and monitors the rest. The second tunes this threshold on validation data to minimise cost, a form of threshold moving [18]. The third escalates the 20% highest-scored alerts, mimicking a fixed analyst capacity. Learned prioritisation policies, such as reinforcement learning [9], were excluded because they need interaction or logged decision data with outcome feedback, which the benchmark lacks.</w:t>
+        <w:t xml:space="preserve">The detectors were class-balanced logistic regression, gradient boosting (GB) [22] with scikit-learn defaults, and the MLP alone. The proposed policy uses the MLP propensity, so any benefit comes from better decisions rather than better scores. Three decision baselines acted on the same scores: a 0.5 threshold that escalates alerts above it and monitors the rest, the same threshold tuned on validation data to minimise cost (threshold moving [17]), and escalation of the 20% highest-scored alerts, which mimics a fixed analyst capacity.</w:t>
       </w:r>
     </w:p>
     <w:p>
@@ -5335,7 +4829,7 @@
         <w:t xml:space="preserve"> </w:t>
       </w:r>
       <w:r>
-        <w:t xml:space="preserve">On the seed-42 test set, we report percentile 95% confidence intervals (CIs) from 2,000 paired bootstrap resamples of alerts [23]. Per-alert cost differences were tested with the two-sided Wilcoxon signed-rank test [24], which treats alerts as independent. The full pipeline was repeated for seeds 42–51, and the seed-level costs were compared with a paired Wilcoxon test. Two sweeps varied the missed-attack cost</w:t>
+        <w:t xml:space="preserve">On the seed-42 test set, percentile 95% confidence intervals (CIs) come from 2,000 paired bootstrap resamples [23], and per-alert cost differences were tested with the two-sided Wilcoxon signed-rank test [24], which treats alerts as independent. The pipeline was repeated for seeds 42–51, with seed-level costs compared by a paired Wilcoxon test. Sensitivity sweeps varied</w:t>
       </w:r>
       <w:r>
         <w:t xml:space="preserve"> </w:t>
@@ -5361,7 +4855,7 @@
         <w:t xml:space="preserve"> </w:t>
       </w:r>
       <w:r>
-        <w:t xml:space="preserve">from 2 to 30 and the half-width of the Medium band from 0.25 to 0.45.</w:t>
+        <w:t xml:space="preserve">and the Medium half-width.</w:t>
       </w:r>
     </w:p>
     <w:bookmarkEnd w:id="15"/>
@@ -5402,51 +4896,14 @@
         <w:t xml:space="preserve"> </w:t>
       </w:r>
       <w:r>
-        <w:t xml:space="preserve">= 20,000 alerts). Brackets: paired bootstrap 95% CIs.</w:t>
-      </w:r>
-      <w:r>
-        <w:t xml:space="preserve"> </w:t>
-      </w:r>
-      <m:oMath>
-        <m:r>
-          <m:rPr>
-            <m:sty m:val="p"/>
-          </m:rPr>
-          <m:t>Δ</m:t>
-        </m:r>
-        <m:bar>
-          <m:barPr>
-            <m:pos m:val="top"/>
-          </m:barPr>
-          <m:e>
-            <m:r>
-              <m:t>C</m:t>
-            </m:r>
-          </m:e>
-        </m:bar>
-      </m:oMath>
-      <w:r>
-        <w:t xml:space="preserve">: cost difference from the proposed policy.</w:t>
-      </w:r>
-      <w:r>
-        <w:t xml:space="preserve"> </w:t>
-      </w:r>
-      <w:r>
-        <w:rPr>
-          <w:i/>
-          <w:iCs/>
-        </w:rPr>
-        <w:t xml:space="preserve">p</w:t>
-      </w:r>
-      <w:r>
-        <w:t xml:space="preserve">: two-sided Wilcoxon signed-rank test on per-alert costs. 10 seeds: mean ± SD over seeds 42–51. Bold: best value in Panels A and B1.</w:t>
+        <w:t xml:space="preserve">= 20,000 alerts).</w:t>
       </w:r>
     </w:p>
     <w:tbl>
       <w:tblPr>
         <w:tblLayout w:type="fixed"/>
         <w:tblLook w:firstRow="1" w:lastRow="0" w:firstColumn="0" w:lastColumn="0" w:noHBand="0" w:noVBand="0" w:val="0020"/>
-        <w:tblCaption w:val="Table 2. Main results on the seed-42 test set (N = 20,000 alerts). Brackets: paired bootstrap 95% CIs. \Delta\overline{C}: cost difference from the proposed policy. p: two-sided Wilcoxon signed-rank test on per-alert costs. 10 seeds: mean ± SD over seeds 42–51. Bold: best value in Panels A and B1."/>
+        <w:tblCaption w:val="Table 2. Main results on the seed-42 test set (N = 20,000 alerts)."/>
         <w:tblW w:w="9360" w:type="dxa"/>
         <w:tblCellMar>
           <w:left w:w="60" w:type="dxa"/>
@@ -6173,7 +5630,7 @@
                 <w:iCs/>
                 <w:sz w:val="17"/>
               </w:rPr>
-              <w:t xml:space="preserve">Panel B1. Decision policies on identical MLP scores</w:t>
+              <w:t xml:space="preserve">Panel B. Decision policies on identical MLP scores</w:t>
             </w:r>
           </w:p>
         </w:tc>
@@ -6800,7 +6257,7 @@
           <w:p>
             <w:pPr>
               <w:pStyle w:val="Compact"/>
-              <w:keepNext/>
+              <w:keepNext w:val="0"/>
               <w:spacing w:before="20" w:after="20" w:line="240" w:lineRule="auto"/>
               <w:jc w:val="left"/>
             </w:pPr>
@@ -6822,7 +6279,7 @@
           <w:p>
             <w:pPr>
               <w:pStyle w:val="Compact"/>
-              <w:keepNext/>
+              <w:keepNext w:val="0"/>
               <w:spacing w:before="20" w:after="20" w:line="240" w:lineRule="auto"/>
               <w:jc w:val="center"/>
             </w:pPr>
@@ -6842,7 +6299,7 @@
           <w:p>
             <w:pPr>
               <w:pStyle w:val="Compact"/>
-              <w:keepNext/>
+              <w:keepNext w:val="0"/>
               <w:spacing w:before="20" w:after="20" w:line="240" w:lineRule="auto"/>
               <w:jc w:val="center"/>
             </w:pPr>
@@ -6871,7 +6328,7 @@
           <w:p>
             <w:pPr>
               <w:pStyle w:val="Compact"/>
-              <w:keepNext/>
+              <w:keepNext w:val="0"/>
               <w:spacing w:before="20" w:after="20" w:line="240" w:lineRule="auto"/>
               <w:jc w:val="center"/>
             </w:pPr>
@@ -6900,7 +6357,7 @@
           <w:p>
             <w:pPr>
               <w:pStyle w:val="Compact"/>
-              <w:keepNext/>
+              <w:keepNext w:val="0"/>
               <w:spacing w:before="20" w:after="20" w:line="240" w:lineRule="auto"/>
               <w:jc w:val="center"/>
             </w:pPr>
@@ -6920,7 +6377,7 @@
           <w:p>
             <w:pPr>
               <w:pStyle w:val="Compact"/>
-              <w:keepNext/>
+              <w:keepNext w:val="0"/>
               <w:spacing w:before="20" w:after="20" w:line="240" w:lineRule="auto"/>
               <w:jc w:val="center"/>
             </w:pPr>
@@ -6940,7 +6397,7 @@
           <w:p>
             <w:pPr>
               <w:pStyle w:val="Compact"/>
-              <w:keepNext/>
+              <w:keepNext w:val="0"/>
               <w:spacing w:before="20" w:after="20" w:line="240" w:lineRule="auto"/>
               <w:jc w:val="center"/>
             </w:pPr>
@@ -6960,7 +6417,7 @@
           <w:p>
             <w:pPr>
               <w:pStyle w:val="Compact"/>
-              <w:keepNext/>
+              <w:keepNext w:val="0"/>
               <w:spacing w:before="20" w:after="20" w:line="240" w:lineRule="auto"/>
               <w:jc w:val="center"/>
             </w:pPr>
@@ -6976,900 +6433,50 @@
           </w:p>
         </w:tc>
       </w:tr>
-      <w:tr>
-        <w:trPr>
-          <w:cantSplit/>
-        </w:trPr>
-        <w:tc>
-          <w:tcPr>
-            <w:tcW w:type="dxa" w:w="9360"/>
-            <w:gridSpan w:val="8"/>
-            <w:tcBorders>
-              <w:top w:val="single" w:sz="6" w:space="0" w:color="000000"/>
-            </w:tcBorders>
-          </w:tcPr>
-          <w:p>
-            <w:pPr>
-              <w:pStyle w:val="Compact"/>
-              <w:keepNext/>
-              <w:spacing w:before="20" w:after="20" w:line="240" w:lineRule="auto"/>
-              <w:jc w:val="left"/>
-            </w:pPr>
-            <w:r>
-              <w:rPr>
-                <w:rFonts w:ascii="Times New Roman" w:hAnsi="Times New Roman"/>
-                <w:b w:val="0"/>
-                <w:i/>
-                <w:iCs/>
-                <w:sz w:val="17"/>
-              </w:rPr>
-              <w:t xml:space="preserve">Panel B2. Ablations and references</w:t>
-            </w:r>
-          </w:p>
-        </w:tc>
-      </w:tr>
-      <w:tr>
-        <w:trPr>
-          <w:cantSplit/>
-        </w:trPr>
-        <w:tc>
-          <w:tcPr>
-            <w:tcW w:type="dxa" w:w="2016"/>
-          </w:tcPr>
-          <w:p>
-            <w:pPr>
-              <w:pStyle w:val="Compact"/>
-              <w:keepNext/>
-              <w:spacing w:before="20" w:after="20" w:line="240" w:lineRule="auto"/>
-              <w:jc w:val="left"/>
-            </w:pPr>
-            <w:r>
-              <w:rPr>
-                <w:rFonts w:ascii="Times New Roman" w:hAnsi="Times New Roman"/>
-                <w:sz w:val="17"/>
-              </w:rPr>
-              <w:t xml:space="preserve">Crisp bands at 9/32, 23/32</w:t>
-            </w:r>
-          </w:p>
-        </w:tc>
-        <w:tc>
-          <w:tcPr>
-            <w:tcW w:type="dxa" w:w="749"/>
-          </w:tcPr>
-          <w:p>
-            <w:pPr>
-              <w:pStyle w:val="Compact"/>
-              <w:keepNext/>
-              <w:spacing w:before="20" w:after="20" w:line="240" w:lineRule="auto"/>
-              <w:jc w:val="center"/>
-            </w:pPr>
-            <w:r>
-              <w:rPr>
-                <w:rFonts w:ascii="Times New Roman" w:hAnsi="Times New Roman"/>
-                <w:sz w:val="17"/>
-              </w:rPr>
-              <w:t xml:space="preserve">MLP</w:t>
-            </w:r>
-          </w:p>
-        </w:tc>
-        <w:tc>
-          <w:tcPr>
-            <w:tcW w:type="dxa" w:w="1224"/>
-          </w:tcPr>
-          <w:p>
-            <w:pPr>
-              <w:pStyle w:val="Compact"/>
-              <w:keepNext/>
-              <w:spacing w:before="20" w:after="20" w:line="240" w:lineRule="auto"/>
-              <w:jc w:val="center"/>
-            </w:pPr>
-            <w:r>
-              <w:rPr>
-                <w:rFonts w:ascii="Times New Roman" w:hAnsi="Times New Roman"/>
-                <w:sz w:val="17"/>
-              </w:rPr>
-              <w:t xml:space="preserve">3.068</w:t>
-            </w:r>
-          </w:p>
-        </w:tc>
-        <w:tc>
-          <w:tcPr>
-            <w:tcW w:type="dxa" w:w="1224"/>
-          </w:tcPr>
-          <w:p>
-            <w:pPr>
-              <w:pStyle w:val="Compact"/>
-              <w:keepNext/>
-              <w:spacing w:before="20" w:after="20" w:line="240" w:lineRule="auto"/>
-              <w:jc w:val="center"/>
-            </w:pPr>
-            <w:r>
-              <w:rPr>
-                <w:rFonts w:ascii="Times New Roman" w:hAnsi="Times New Roman"/>
-                <w:sz w:val="17"/>
-              </w:rPr>
-              <w:t xml:space="preserve">0.686</w:t>
-            </w:r>
-          </w:p>
-        </w:tc>
-        <w:tc>
-          <w:tcPr>
-            <w:tcW w:type="dxa" w:w="979"/>
-          </w:tcPr>
-          <w:p>
-            <w:pPr>
-              <w:pStyle w:val="Compact"/>
-              <w:keepNext/>
-              <w:spacing w:before="20" w:after="20" w:line="240" w:lineRule="auto"/>
-              <w:jc w:val="center"/>
-            </w:pPr>
-            <w:r>
-              <w:rPr>
-                <w:rFonts w:ascii="Times New Roman" w:hAnsi="Times New Roman"/>
-                <w:sz w:val="17"/>
-              </w:rPr>
-              <w:t xml:space="preserve">603</w:t>
-            </w:r>
-          </w:p>
-        </w:tc>
-        <w:tc>
-          <w:tcPr>
-            <w:tcW w:type="dxa" w:w="1037"/>
-          </w:tcPr>
-          <w:p>
-            <w:pPr>
-              <w:pStyle w:val="Compact"/>
-              <w:keepNext/>
-              <w:spacing w:before="20" w:after="20" w:line="240" w:lineRule="auto"/>
-              <w:jc w:val="center"/>
-            </w:pPr>
-            <w:r>
-              <w:rPr>
-                <w:rFonts w:ascii="Times New Roman" w:hAnsi="Times New Roman"/>
-                <w:sz w:val="17"/>
-              </w:rPr>
-              <w:t xml:space="preserve">0</w:t>
-            </w:r>
-          </w:p>
-        </w:tc>
-        <w:tc>
-          <w:tcPr>
-            <w:tcW w:type="dxa" w:w="893"/>
-          </w:tcPr>
-          <w:p>
-            <w:pPr>
-              <w:pStyle w:val="Compact"/>
-              <w:keepNext/>
-              <w:spacing w:before="20" w:after="20" w:line="240" w:lineRule="auto"/>
-              <w:jc w:val="center"/>
-            </w:pPr>
-            <w:r>
-              <w:rPr>
-                <w:rFonts w:ascii="Times New Roman" w:hAnsi="Times New Roman"/>
-                <w:sz w:val="17"/>
-              </w:rPr>
-              <w:t xml:space="preserve">–</w:t>
-            </w:r>
-          </w:p>
-        </w:tc>
-        <w:tc>
-          <w:tcPr>
-            <w:tcW w:type="dxa" w:w="1238"/>
-          </w:tcPr>
-          <w:p>
-            <w:pPr>
-              <w:pStyle w:val="Compact"/>
-              <w:keepNext/>
-              <w:spacing w:before="20" w:after="20" w:line="240" w:lineRule="auto"/>
-              <w:jc w:val="center"/>
-            </w:pPr>
-            <w:r>
-              <w:rPr>
-                <w:rFonts w:ascii="Times New Roman" w:hAnsi="Times New Roman"/>
-                <w:sz w:val="17"/>
-              </w:rPr>
-              <w:t xml:space="preserve">–</w:t>
-            </w:r>
-          </w:p>
-        </w:tc>
-      </w:tr>
-      <w:tr>
-        <w:trPr>
-          <w:cantSplit/>
-        </w:trPr>
-        <w:tc>
-          <w:tcPr>
-            <w:tcW w:type="dxa" w:w="2016"/>
-          </w:tcPr>
-          <w:p>
-            <w:pPr>
-              <w:pStyle w:val="Compact"/>
-              <w:keepNext/>
-              <w:spacing w:before="20" w:after="20" w:line="240" w:lineRule="auto"/>
-              <w:jc w:val="left"/>
-            </w:pPr>
-            <w:r>
-              <w:rPr>
-                <w:rFonts w:ascii="Times New Roman" w:hAnsi="Times New Roman"/>
-                <w:sz w:val="17"/>
-              </w:rPr>
-              <w:t xml:space="preserve">Validation-tuned threshold</w:t>
-            </w:r>
-            <w:r>
-              <w:rPr>
-                <w:rFonts w:ascii="Times New Roman" w:hAnsi="Times New Roman"/>
-                <w:sz w:val="17"/>
-              </w:rPr>
-              <w:t xml:space="preserve"> </w:t>
-            </w:r>
-            <w:r>
-              <w:rPr>
-                <w:rFonts w:ascii="Times New Roman" w:hAnsi="Times New Roman"/>
-                <w:i/>
-                <w:iCs/>
-                <w:sz w:val="17"/>
-              </w:rPr>
-              <w:t xml:space="preserve">t</w:t>
-            </w:r>
-            <w:r>
-              <w:rPr>
-                <w:rFonts w:ascii="Times New Roman" w:hAnsi="Times New Roman"/>
-                <w:sz w:val="17"/>
-              </w:rPr>
-              <w:t xml:space="preserve"> </w:t>
-            </w:r>
-            <w:r>
-              <w:rPr>
-                <w:rFonts w:ascii="Times New Roman" w:hAnsi="Times New Roman"/>
-                <w:sz w:val="17"/>
-              </w:rPr>
-              <w:t xml:space="preserve">= 0.53</w:t>
-            </w:r>
-          </w:p>
-        </w:tc>
-        <w:tc>
-          <w:tcPr>
-            <w:tcW w:type="dxa" w:w="749"/>
-          </w:tcPr>
-          <w:p>
-            <w:pPr>
-              <w:pStyle w:val="Compact"/>
-              <w:keepNext/>
-              <w:spacing w:before="20" w:after="20" w:line="240" w:lineRule="auto"/>
-              <w:jc w:val="center"/>
-            </w:pPr>
-            <w:r>
-              <w:rPr>
-                <w:rFonts w:ascii="Times New Roman" w:hAnsi="Times New Roman"/>
-                <w:sz w:val="17"/>
-              </w:rPr>
-              <w:t xml:space="preserve">MLP</w:t>
-            </w:r>
-          </w:p>
-        </w:tc>
-        <w:tc>
-          <w:tcPr>
-            <w:tcW w:type="dxa" w:w="1224"/>
-          </w:tcPr>
-          <w:p>
-            <w:pPr>
-              <w:pStyle w:val="Compact"/>
-              <w:keepNext/>
-              <w:spacing w:before="20" w:after="20" w:line="240" w:lineRule="auto"/>
-              <w:jc w:val="center"/>
-            </w:pPr>
-            <w:r>
-              <w:rPr>
-                <w:rFonts w:ascii="Times New Roman" w:hAnsi="Times New Roman"/>
-                <w:sz w:val="17"/>
-              </w:rPr>
-              <w:t xml:space="preserve">3.278</w:t>
-            </w:r>
-          </w:p>
-        </w:tc>
-        <w:tc>
-          <w:tcPr>
-            <w:tcW w:type="dxa" w:w="1224"/>
-          </w:tcPr>
-          <w:p>
-            <w:pPr>
-              <w:pStyle w:val="Compact"/>
-              <w:keepNext/>
-              <w:spacing w:before="20" w:after="20" w:line="240" w:lineRule="auto"/>
-              <w:jc w:val="center"/>
-            </w:pPr>
-            <w:r>
-              <w:rPr>
-                <w:rFonts w:ascii="Times New Roman" w:hAnsi="Times New Roman"/>
-                <w:sz w:val="17"/>
-              </w:rPr>
-              <w:t xml:space="preserve">0.651</w:t>
-            </w:r>
-          </w:p>
-        </w:tc>
-        <w:tc>
-          <w:tcPr>
-            <w:tcW w:type="dxa" w:w="979"/>
-          </w:tcPr>
-          <w:p>
-            <w:pPr>
-              <w:pStyle w:val="Compact"/>
-              <w:keepNext/>
-              <w:spacing w:before="20" w:after="20" w:line="240" w:lineRule="auto"/>
-              <w:jc w:val="center"/>
-            </w:pPr>
-            <w:r>
-              <w:rPr>
-                <w:rFonts w:ascii="Times New Roman" w:hAnsi="Times New Roman"/>
-                <w:sz w:val="17"/>
-              </w:rPr>
-              <w:t xml:space="preserve">617</w:t>
-            </w:r>
-          </w:p>
-        </w:tc>
-        <w:tc>
-          <w:tcPr>
-            <w:tcW w:type="dxa" w:w="1037"/>
-          </w:tcPr>
-          <w:p>
-            <w:pPr>
-              <w:pStyle w:val="Compact"/>
-              <w:keepNext/>
-              <w:spacing w:before="20" w:after="20" w:line="240" w:lineRule="auto"/>
-              <w:jc w:val="center"/>
-            </w:pPr>
-            <w:r>
-              <w:rPr>
-                <w:rFonts w:ascii="Times New Roman" w:hAnsi="Times New Roman"/>
-                <w:sz w:val="17"/>
-              </w:rPr>
-              <w:t xml:space="preserve">+0.210</w:t>
-            </w:r>
-          </w:p>
-        </w:tc>
-        <w:tc>
-          <w:tcPr>
-            <w:tcW w:type="dxa" w:w="893"/>
-          </w:tcPr>
-          <w:p>
-            <w:pPr>
-              <w:pStyle w:val="Compact"/>
-              <w:keepNext/>
-              <w:spacing w:before="20" w:after="20" w:line="240" w:lineRule="auto"/>
-              <w:jc w:val="center"/>
-            </w:pPr>
-            <w:r>
-              <w:rPr>
-                <w:rFonts w:ascii="Times New Roman" w:hAnsi="Times New Roman"/>
-                <w:sz w:val="17"/>
-              </w:rPr>
-              <w:t xml:space="preserve">2.3×10⁻¹²³</w:t>
-            </w:r>
-          </w:p>
-        </w:tc>
-        <w:tc>
-          <w:tcPr>
-            <w:tcW w:type="dxa" w:w="1238"/>
-          </w:tcPr>
-          <w:p>
-            <w:pPr>
-              <w:pStyle w:val="Compact"/>
-              <w:keepNext/>
-              <w:spacing w:before="20" w:after="20" w:line="240" w:lineRule="auto"/>
-              <w:jc w:val="center"/>
-            </w:pPr>
-            <w:r>
-              <w:rPr>
-                <w:rFonts w:ascii="Times New Roman" w:hAnsi="Times New Roman"/>
-                <w:sz w:val="17"/>
-              </w:rPr>
-              <w:t xml:space="preserve">–</w:t>
-            </w:r>
-          </w:p>
-        </w:tc>
-      </w:tr>
-      <w:tr>
-        <w:trPr>
-          <w:cantSplit/>
-        </w:trPr>
-        <w:tc>
-          <w:tcPr>
-            <w:tcW w:type="dxa" w:w="2016"/>
-          </w:tcPr>
-          <w:p>
-            <w:pPr>
-              <w:pStyle w:val="Compact"/>
-              <w:keepNext/>
-              <w:spacing w:before="20" w:after="20" w:line="240" w:lineRule="auto"/>
-              <w:jc w:val="left"/>
-            </w:pPr>
-            <w:r>
-              <w:rPr>
-                <w:rFonts w:ascii="Times New Roman" w:hAnsi="Times New Roman"/>
-                <w:sz w:val="17"/>
-              </w:rPr>
-              <w:t xml:space="preserve">Fuzzy rule policy</w:t>
-            </w:r>
-          </w:p>
-        </w:tc>
-        <w:tc>
-          <w:tcPr>
-            <w:tcW w:type="dxa" w:w="749"/>
-          </w:tcPr>
-          <w:p>
-            <w:pPr>
-              <w:pStyle w:val="Compact"/>
-              <w:keepNext/>
-              <w:spacing w:before="20" w:after="20" w:line="240" w:lineRule="auto"/>
-              <w:jc w:val="center"/>
-            </w:pPr>
-            <w:r>
-              <w:rPr>
-                <w:rFonts w:ascii="Times New Roman" w:hAnsi="Times New Roman"/>
-                <w:sz w:val="17"/>
-              </w:rPr>
-              <w:t xml:space="preserve">GB</w:t>
-            </w:r>
-          </w:p>
-        </w:tc>
-        <w:tc>
-          <w:tcPr>
-            <w:tcW w:type="dxa" w:w="1224"/>
-          </w:tcPr>
-          <w:p>
-            <w:pPr>
-              <w:pStyle w:val="Compact"/>
-              <w:keepNext/>
-              <w:spacing w:before="20" w:after="20" w:line="240" w:lineRule="auto"/>
-              <w:jc w:val="center"/>
-            </w:pPr>
-            <w:r>
-              <w:rPr>
-                <w:rFonts w:ascii="Times New Roman" w:hAnsi="Times New Roman"/>
-                <w:sz w:val="17"/>
-              </w:rPr>
-              <w:t xml:space="preserve">3.004</w:t>
-            </w:r>
-          </w:p>
-        </w:tc>
-        <w:tc>
-          <w:tcPr>
-            <w:tcW w:type="dxa" w:w="1224"/>
-          </w:tcPr>
-          <w:p>
-            <w:pPr>
-              <w:pStyle w:val="Compact"/>
-              <w:keepNext/>
-              <w:spacing w:before="20" w:after="20" w:line="240" w:lineRule="auto"/>
-              <w:jc w:val="center"/>
-            </w:pPr>
-            <w:r>
-              <w:rPr>
-                <w:rFonts w:ascii="Times New Roman" w:hAnsi="Times New Roman"/>
-                <w:sz w:val="17"/>
-              </w:rPr>
-              <w:t xml:space="preserve">0.676</w:t>
-            </w:r>
-          </w:p>
-        </w:tc>
-        <w:tc>
-          <w:tcPr>
-            <w:tcW w:type="dxa" w:w="979"/>
-          </w:tcPr>
-          <w:p>
-            <w:pPr>
-              <w:pStyle w:val="Compact"/>
-              <w:keepNext/>
-              <w:spacing w:before="20" w:after="20" w:line="240" w:lineRule="auto"/>
-              <w:jc w:val="center"/>
-            </w:pPr>
-            <w:r>
-              <w:rPr>
-                <w:rFonts w:ascii="Times New Roman" w:hAnsi="Times New Roman"/>
-                <w:sz w:val="17"/>
-              </w:rPr>
-              <w:t xml:space="preserve">222</w:t>
-            </w:r>
-          </w:p>
-        </w:tc>
-        <w:tc>
-          <w:tcPr>
-            <w:tcW w:type="dxa" w:w="1037"/>
-          </w:tcPr>
-          <w:p>
-            <w:pPr>
-              <w:pStyle w:val="Compact"/>
-              <w:keepNext/>
-              <w:spacing w:before="20" w:after="20" w:line="240" w:lineRule="auto"/>
-              <w:jc w:val="center"/>
-            </w:pPr>
-            <w:r>
-              <w:rPr>
-                <w:rFonts w:ascii="Times New Roman" w:hAnsi="Times New Roman"/>
-                <w:sz w:val="17"/>
-              </w:rPr>
-              <w:t xml:space="preserve">−0.064</w:t>
-            </w:r>
-          </w:p>
-        </w:tc>
-        <w:tc>
-          <w:tcPr>
-            <w:tcW w:type="dxa" w:w="893"/>
-          </w:tcPr>
-          <w:p>
-            <w:pPr>
-              <w:pStyle w:val="Compact"/>
-              <w:keepNext/>
-              <w:spacing w:before="20" w:after="20" w:line="240" w:lineRule="auto"/>
-              <w:jc w:val="center"/>
-            </w:pPr>
-            <w:r>
-              <w:rPr>
-                <w:rFonts w:ascii="Times New Roman" w:hAnsi="Times New Roman"/>
-                <w:sz w:val="17"/>
-              </w:rPr>
-              <w:t xml:space="preserve">0.017</w:t>
-            </w:r>
-          </w:p>
-        </w:tc>
-        <w:tc>
-          <w:tcPr>
-            <w:tcW w:type="dxa" w:w="1238"/>
-          </w:tcPr>
-          <w:p>
-            <w:pPr>
-              <w:pStyle w:val="Compact"/>
-              <w:keepNext/>
-              <w:spacing w:before="20" w:after="20" w:line="240" w:lineRule="auto"/>
-              <w:jc w:val="center"/>
-            </w:pPr>
-            <w:r>
-              <w:rPr>
-                <w:rFonts w:ascii="Times New Roman" w:hAnsi="Times New Roman"/>
-                <w:sz w:val="17"/>
-              </w:rPr>
-              <w:t xml:space="preserve">2.967 ± 0.100</w:t>
-            </w:r>
-          </w:p>
-        </w:tc>
-      </w:tr>
-      <w:tr>
-        <w:trPr>
-          <w:cantSplit/>
-        </w:trPr>
-        <w:tc>
-          <w:tcPr>
-            <w:tcW w:type="dxa" w:w="2016"/>
-          </w:tcPr>
-          <w:p>
-            <w:pPr>
-              <w:pStyle w:val="Compact"/>
-              <w:keepNext/>
-              <w:spacing w:before="20" w:after="20" w:line="240" w:lineRule="auto"/>
-              <w:jc w:val="left"/>
-            </w:pPr>
-            <w:r>
-              <w:rPr>
-                <w:rFonts w:ascii="Times New Roman" w:hAnsi="Times New Roman"/>
-                <w:sz w:val="17"/>
-              </w:rPr>
-              <w:t xml:space="preserve">Threshold 0.5</w:t>
-            </w:r>
-          </w:p>
-        </w:tc>
-        <w:tc>
-          <w:tcPr>
-            <w:tcW w:type="dxa" w:w="749"/>
-          </w:tcPr>
-          <w:p>
-            <w:pPr>
-              <w:pStyle w:val="Compact"/>
-              <w:keepNext/>
-              <w:spacing w:before="20" w:after="20" w:line="240" w:lineRule="auto"/>
-              <w:jc w:val="center"/>
-            </w:pPr>
-            <w:r>
-              <w:rPr>
-                <w:rFonts w:ascii="Times New Roman" w:hAnsi="Times New Roman"/>
-                <w:sz w:val="17"/>
-              </w:rPr>
-              <w:t xml:space="preserve">GB</w:t>
-            </w:r>
-          </w:p>
-        </w:tc>
-        <w:tc>
-          <w:tcPr>
-            <w:tcW w:type="dxa" w:w="1224"/>
-          </w:tcPr>
-          <w:p>
-            <w:pPr>
-              <w:pStyle w:val="Compact"/>
-              <w:keepNext/>
-              <w:spacing w:before="20" w:after="20" w:line="240" w:lineRule="auto"/>
-              <w:jc w:val="center"/>
-            </w:pPr>
-            <w:r>
-              <w:rPr>
-                <w:rFonts w:ascii="Times New Roman" w:hAnsi="Times New Roman"/>
-                <w:sz w:val="17"/>
-              </w:rPr>
-              <w:t xml:space="preserve">3.189</w:t>
-            </w:r>
-          </w:p>
-        </w:tc>
-        <w:tc>
-          <w:tcPr>
-            <w:tcW w:type="dxa" w:w="1224"/>
-          </w:tcPr>
-          <w:p>
-            <w:pPr>
-              <w:pStyle w:val="Compact"/>
-              <w:keepNext/>
-              <w:spacing w:before="20" w:after="20" w:line="240" w:lineRule="auto"/>
-              <w:jc w:val="center"/>
-            </w:pPr>
-            <w:r>
-              <w:rPr>
-                <w:rFonts w:ascii="Times New Roman" w:hAnsi="Times New Roman"/>
-                <w:sz w:val="17"/>
-              </w:rPr>
-              <w:t xml:space="preserve">0.644</w:t>
-            </w:r>
-          </w:p>
-        </w:tc>
-        <w:tc>
-          <w:tcPr>
-            <w:tcW w:type="dxa" w:w="979"/>
-          </w:tcPr>
-          <w:p>
-            <w:pPr>
-              <w:pStyle w:val="Compact"/>
-              <w:keepNext/>
-              <w:spacing w:before="20" w:after="20" w:line="240" w:lineRule="auto"/>
-              <w:jc w:val="center"/>
-            </w:pPr>
-            <w:r>
-              <w:rPr>
-                <w:rFonts w:ascii="Times New Roman" w:hAnsi="Times New Roman"/>
-                <w:sz w:val="17"/>
-              </w:rPr>
-              <w:t xml:space="preserve">241</w:t>
-            </w:r>
-          </w:p>
-        </w:tc>
-        <w:tc>
-          <w:tcPr>
-            <w:tcW w:type="dxa" w:w="1037"/>
-          </w:tcPr>
-          <w:p>
-            <w:pPr>
-              <w:pStyle w:val="Compact"/>
-              <w:keepNext/>
-              <w:spacing w:before="20" w:after="20" w:line="240" w:lineRule="auto"/>
-              <w:jc w:val="center"/>
-            </w:pPr>
-            <w:r>
-              <w:rPr>
-                <w:rFonts w:ascii="Times New Roman" w:hAnsi="Times New Roman"/>
-                <w:sz w:val="17"/>
-              </w:rPr>
-              <w:t xml:space="preserve">+0.122</w:t>
-            </w:r>
-          </w:p>
-        </w:tc>
-        <w:tc>
-          <w:tcPr>
-            <w:tcW w:type="dxa" w:w="893"/>
-          </w:tcPr>
-          <w:p>
-            <w:pPr>
-              <w:pStyle w:val="Compact"/>
-              <w:keepNext/>
-              <w:spacing w:before="20" w:after="20" w:line="240" w:lineRule="auto"/>
-              <w:jc w:val="center"/>
-            </w:pPr>
-            <w:r>
-              <w:rPr>
-                <w:rFonts w:ascii="Times New Roman" w:hAnsi="Times New Roman"/>
-                <w:sz w:val="17"/>
-              </w:rPr>
-              <w:t xml:space="preserve">6.4×10⁻⁴⁰</w:t>
-            </w:r>
-          </w:p>
-        </w:tc>
-        <w:tc>
-          <w:tcPr>
-            <w:tcW w:type="dxa" w:w="1238"/>
-          </w:tcPr>
-          <w:p>
-            <w:pPr>
-              <w:pStyle w:val="Compact"/>
-              <w:keepNext/>
-              <w:spacing w:before="20" w:after="20" w:line="240" w:lineRule="auto"/>
-              <w:jc w:val="center"/>
-            </w:pPr>
-            <w:r>
-              <w:rPr>
-                <w:rFonts w:ascii="Times New Roman" w:hAnsi="Times New Roman"/>
-                <w:sz w:val="17"/>
-              </w:rPr>
-              <w:t xml:space="preserve">–</w:t>
-            </w:r>
-          </w:p>
-        </w:tc>
-      </w:tr>
-      <w:tr>
-        <w:trPr>
-          <w:cantSplit/>
-        </w:trPr>
-        <w:tc>
-          <w:tcPr>
-            <w:tcW w:type="dxa" w:w="2016"/>
-          </w:tcPr>
-          <w:p>
-            <w:pPr>
-              <w:pStyle w:val="Compact"/>
-              <w:keepNext w:val="0"/>
-              <w:spacing w:before="20" w:after="20" w:line="240" w:lineRule="auto"/>
-              <w:jc w:val="left"/>
-            </w:pPr>
-            <w:r>
-              <w:rPr>
-                <w:rFonts w:ascii="Times New Roman" w:hAnsi="Times New Roman"/>
-                <w:sz w:val="17"/>
-              </w:rPr>
-              <w:t xml:space="preserve">Bayes cost rule (reference)</w:t>
-            </w:r>
-          </w:p>
-        </w:tc>
-        <w:tc>
-          <w:tcPr>
-            <w:tcW w:type="dxa" w:w="749"/>
-          </w:tcPr>
-          <w:p>
-            <w:pPr>
-              <w:pStyle w:val="Compact"/>
-              <w:keepNext w:val="0"/>
-              <w:spacing w:before="20" w:after="20" w:line="240" w:lineRule="auto"/>
-              <w:jc w:val="center"/>
-            </w:pPr>
-            <w:r>
-              <w:rPr>
-                <w:rFonts w:ascii="Times New Roman" w:hAnsi="Times New Roman"/>
-                <w:sz w:val="17"/>
-              </w:rPr>
-              <w:t xml:space="preserve">MLP</w:t>
-            </w:r>
-          </w:p>
-        </w:tc>
-        <w:tc>
-          <w:tcPr>
-            <w:tcW w:type="dxa" w:w="1224"/>
-          </w:tcPr>
-          <w:p>
-            <w:pPr>
-              <w:pStyle w:val="Compact"/>
-              <w:keepNext w:val="0"/>
-              <w:spacing w:before="20" w:after="20" w:line="240" w:lineRule="auto"/>
-              <w:jc w:val="center"/>
-            </w:pPr>
-            <w:r>
-              <w:rPr>
-                <w:rFonts w:ascii="Times New Roman" w:hAnsi="Times New Roman"/>
-                <w:sz w:val="17"/>
-              </w:rPr>
-              <w:t xml:space="preserve">2.164</w:t>
-            </w:r>
-          </w:p>
-        </w:tc>
-        <w:tc>
-          <w:tcPr>
-            <w:tcW w:type="dxa" w:w="1224"/>
-          </w:tcPr>
-          <w:p>
-            <w:pPr>
-              <w:pStyle w:val="Compact"/>
-              <w:keepNext w:val="0"/>
-              <w:spacing w:before="20" w:after="20" w:line="240" w:lineRule="auto"/>
-              <w:jc w:val="center"/>
-            </w:pPr>
-            <w:r>
-              <w:rPr>
-                <w:rFonts w:ascii="Times New Roman" w:hAnsi="Times New Roman"/>
-                <w:sz w:val="17"/>
-              </w:rPr>
-              <w:t xml:space="preserve">0.701</w:t>
-            </w:r>
-          </w:p>
-        </w:tc>
-        <w:tc>
-          <w:tcPr>
-            <w:tcW w:type="dxa" w:w="979"/>
-          </w:tcPr>
-          <w:p>
-            <w:pPr>
-              <w:pStyle w:val="Compact"/>
-              <w:keepNext w:val="0"/>
-              <w:spacing w:before="20" w:after="20" w:line="240" w:lineRule="auto"/>
-              <w:jc w:val="center"/>
-            </w:pPr>
-            <w:r>
-              <w:rPr>
-                <w:rFonts w:ascii="Times New Roman" w:hAnsi="Times New Roman"/>
-                <w:sz w:val="17"/>
-              </w:rPr>
-              <w:t xml:space="preserve">0</w:t>
-            </w:r>
-          </w:p>
-        </w:tc>
-        <w:tc>
-          <w:tcPr>
-            <w:tcW w:type="dxa" w:w="1037"/>
-          </w:tcPr>
-          <w:p>
-            <w:pPr>
-              <w:pStyle w:val="Compact"/>
-              <w:keepNext w:val="0"/>
-              <w:spacing w:before="20" w:after="20" w:line="240" w:lineRule="auto"/>
-              <w:jc w:val="center"/>
-            </w:pPr>
-            <w:r>
-              <w:rPr>
-                <w:rFonts w:ascii="Times New Roman" w:hAnsi="Times New Roman"/>
-                <w:sz w:val="17"/>
-              </w:rPr>
-              <w:t xml:space="preserve">−0.903</w:t>
-            </w:r>
-          </w:p>
-        </w:tc>
-        <w:tc>
-          <w:tcPr>
-            <w:tcW w:type="dxa" w:w="893"/>
-          </w:tcPr>
-          <w:p>
-            <w:pPr>
-              <w:pStyle w:val="Compact"/>
-              <w:keepNext w:val="0"/>
-              <w:spacing w:before="20" w:after="20" w:line="240" w:lineRule="auto"/>
-              <w:jc w:val="center"/>
-            </w:pPr>
-            <w:r>
-              <w:rPr>
-                <w:rFonts w:ascii="Times New Roman" w:hAnsi="Times New Roman"/>
-                <w:sz w:val="17"/>
-              </w:rPr>
-              <w:t xml:space="preserve">&lt; 10⁻³⁰⁰</w:t>
-            </w:r>
-          </w:p>
-        </w:tc>
-        <w:tc>
-          <w:tcPr>
-            <w:tcW w:type="dxa" w:w="1238"/>
-          </w:tcPr>
-          <w:p>
-            <w:pPr>
-              <w:pStyle w:val="Compact"/>
-              <w:keepNext w:val="0"/>
-              <w:spacing w:before="20" w:after="20" w:line="240" w:lineRule="auto"/>
-              <w:jc w:val="center"/>
-            </w:pPr>
-            <w:r>
-              <w:rPr>
-                <w:rFonts w:ascii="Times New Roman" w:hAnsi="Times New Roman"/>
-                <w:sz w:val="17"/>
-              </w:rPr>
-              <w:t xml:space="preserve">2.207 ± 0.100</w:t>
-            </w:r>
-          </w:p>
-        </w:tc>
-      </w:tr>
     </w:tbl>
     <w:p>
       <w:pPr>
         <w:pStyle w:val="TableNote"/>
       </w:pPr>
       <w:r>
-        <w:t xml:space="preserve">PR-AUC: area under the precision–recall curve.</w:t>
+        <w:t xml:space="preserve">Brackets: paired bootstrap 95% CIs.</w:t>
+      </w:r>
+      <w:r>
+        <w:t xml:space="preserve"> </w:t>
+      </w:r>
+      <m:oMath>
+        <m:r>
+          <m:rPr>
+            <m:sty m:val="p"/>
+          </m:rPr>
+          <m:t>Δ</m:t>
+        </m:r>
+        <m:bar>
+          <m:barPr>
+            <m:pos m:val="top"/>
+          </m:barPr>
+          <m:e>
+            <m:r>
+              <m:t>C</m:t>
+            </m:r>
+          </m:e>
+        </m:bar>
+      </m:oMath>
+      <w:r>
+        <w:t xml:space="preserve">: cost difference from the proposed policy.</w:t>
+      </w:r>
+      <w:r>
+        <w:t xml:space="preserve"> </w:t>
+      </w:r>
+      <w:r>
+        <w:rPr>
+          <w:i/>
+          <w:iCs/>
+        </w:rPr>
+        <w:t xml:space="preserve">p</w:t>
+      </w:r>
+      <w:r>
+        <w:t xml:space="preserve">: two-sided Wilcoxon signed-rank test on per-alert costs. 10 seeds: mean ± SD over seeds 42–51. Bold: best in each panel. PR-AUC: area under the precision–recall curve.</w:t>
       </w:r>
       <w:r>
         <w:t xml:space="preserve"> </w:t>
@@ -7887,7 +6494,7 @@
         </m:bar>
       </m:oMath>
       <w:r>
-        <w:t xml:space="preserve">: mean triage cost, Eq. (6). UE: unnecessary escalations. Panel B2 CIs: Supplementary Material (</w:t>
+        <w:t xml:space="preserve">: mean triage cost, Eq. (6). UE: unnecessary escalations. Ablation and reference policies, with CIs: Supplementary Material (</w:t>
       </w:r>
       <w:r>
         <w:rPr>
@@ -7914,7 +6521,7 @@
         <w:t xml:space="preserve"> </w:t>
       </w:r>
       <w:r>
-        <w:t xml:space="preserve">Gradient boosting is the best detector on every metric (Table 2, Panel A), and it beats the MLP in ROC-AUC in all ten seeds, so this study makes no claim about detection. On identical MLP scores, however, the rule base lowers the mean triage cost by 0.196 per alert relative to the 0.5 threshold and by 1.242 relative to top-20% escalation (Panel B1). It also raises coverage by 0.031 relative to the threshold (95% CI [0.028, 0.034]). The rule base and the threshold differ only on the 776 Medium-band alerts, which the rule base contains instead of monitoring or escalating them. This small band saves about 3,900 cost units per 20,000 alerts and sends 387 fewer alerts to analysts. Top-20% escalation yields the fewest unnecessary escalations (47), but it covers only 0.348 of attacks.</w:t>
+        <w:t xml:space="preserve">Gradient boosting is the best detector on every metric and beats the MLP in ROC-AUC in all ten seeds (Table 2, Panel A), so we make no claim about detection. On identical MLP scores, however, the rule base lowers the mean triage cost by 0.196 per alert relative to the 0.5 threshold and by 1.242 relative to top-20% escalation, and it raises coverage by 0.031 over the threshold (95% CI [0.028, 0.034]; Panel B). The two policies differ only on the 776 Medium-band alerts, which are contained instead of monitored or escalated, saving about 3,900 cost units per 20,000 alerts and sending 387 fewer alerts to analysts.</w:t>
       </w:r>
     </w:p>
     <w:p>
@@ -7924,9 +6531,9 @@
       <w:r>
         <w:drawing>
           <wp:inline>
-            <wp:extent cx="5943600" cy="3518185"/>
+            <wp:extent cx="5943600" cy="3363597"/>
             <wp:effectExtent b="0" l="0" r="0" t="0"/>
-            <wp:docPr descr="Fig. 2. Mean triage cost as a function of the missed-attack cost CFN (seed 42). The fuzzy rule policy is cheaper than the 0.5 threshold at every tested value from 2 to 30. Top-20% escalation is cheaper only for CFN ≤ 3 (shaded region). Error bars show paired bootstrap 95% CIs at the default CFN = 10 (dotted line). Log axis; dashed: Bayes reference." title="" id="17" name="Picture"/>
+            <wp:docPr descr="Fig. 2. Mean triage cost against the missed-attack cost CFN (seed 42, log axis). Top-20% escalation is cheaper than the fuzzy rule policy only for CFN ≤ 3 (shaded). Error bars: paired bootstrap 95% CIs at the default CFN = 10 (dotted); dashed: Bayes reference." title="" id="17" name="Picture"/>
             <a:graphic>
               <a:graphicData uri="http://schemas.openxmlformats.org/drawingml/2006/picture">
                 <pic:pic>
@@ -7945,7 +6552,7 @@
                   <pic:spPr bwMode="auto">
                     <a:xfrm>
                       <a:off x="0" y="0"/>
-                      <a:ext cx="5943600" cy="3518185"/>
+                      <a:ext cx="5943600" cy="3363597"/>
                     </a:xfrm>
                     <a:prstGeom prst="rect">
                       <a:avLst/>
@@ -7979,7 +6586,7 @@
         <w:t xml:space="preserve"> </w:t>
       </w:r>
       <w:r>
-        <w:t xml:space="preserve">Mean triage cost as a function of the missed-attack cost</w:t>
+        <w:t xml:space="preserve">Mean triage cost against the missed-attack cost</w:t>
       </w:r>
       <w:r>
         <w:t xml:space="preserve"> </w:t>
@@ -8001,7 +6608,7 @@
         <w:t xml:space="preserve"> </w:t>
       </w:r>
       <w:r>
-        <w:t xml:space="preserve">(seed 42). The fuzzy rule policy is cheaper than the 0.5 threshold at every tested value from 2 to 30. Top-20% escalation is cheaper only for</w:t>
+        <w:t xml:space="preserve">(seed 42, log axis). Top-20% escalation is cheaper than the fuzzy rule policy only for</w:t>
       </w:r>
       <w:r>
         <w:t xml:space="preserve"> </w:t>
@@ -8023,7 +6630,7 @@
         <w:t xml:space="preserve"> </w:t>
       </w:r>
       <w:r>
-        <w:t xml:space="preserve">≤ 3 (shaded region). Error bars show paired bootstrap 95% CIs at the default</w:t>
+        <w:t xml:space="preserve">≤ 3 (shaded). Error bars: paired bootstrap 95% CIs at the default</w:t>
       </w:r>
       <w:r>
         <w:t xml:space="preserve"> </w:t>
@@ -8045,7 +6652,7 @@
         <w:t xml:space="preserve"> </w:t>
       </w:r>
       <w:r>
-        <w:t xml:space="preserve">= 10 (dotted line). Log axis; dashed: Bayes reference.</w:t>
+        <w:t xml:space="preserve">= 10 (dotted); dashed: Bayes reference.</w:t>
       </w:r>
     </w:p>
     <w:p>
@@ -8063,73 +6670,7 @@
         <w:t xml:space="preserve"> </w:t>
       </w:r>
       <w:r>
-        <w:t xml:space="preserve">These gains are stable across repeated runs and cost settings. Over ten seeds, the rule base has a mean cost of</w:t>
-      </w:r>
-      <w:r>
-        <w:t xml:space="preserve"> </w:t>
-      </w:r>
-      <m:oMath>
-        <m:r>
-          <m:t>3.088</m:t>
-        </m:r>
-        <m:r>
-          <m:rPr>
-            <m:sty m:val="p"/>
-          </m:rPr>
-          <m:t>±</m:t>
-        </m:r>
-        <m:r>
-          <m:t>0.081</m:t>
-        </m:r>
-      </m:oMath>
-      <w:r>
-        <w:t xml:space="preserve">, compared with</w:t>
-      </w:r>
-      <w:r>
-        <w:t xml:space="preserve"> </w:t>
-      </w:r>
-      <m:oMath>
-        <m:r>
-          <m:t>3.246</m:t>
-        </m:r>
-        <m:r>
-          <m:rPr>
-            <m:sty m:val="p"/>
-          </m:rPr>
-          <m:t>±</m:t>
-        </m:r>
-        <m:r>
-          <m:t>0.076</m:t>
-        </m:r>
-      </m:oMath>
-      <w:r>
-        <w:t xml:space="preserve"> </w:t>
-      </w:r>
-      <w:r>
-        <w:t xml:space="preserve">for the threshold and</w:t>
-      </w:r>
-      <w:r>
-        <w:t xml:space="preserve"> </w:t>
-      </w:r>
-      <m:oMath>
-        <m:r>
-          <m:t>4.318</m:t>
-        </m:r>
-        <m:r>
-          <m:rPr>
-            <m:sty m:val="p"/>
-          </m:rPr>
-          <m:t>±</m:t>
-        </m:r>
-        <m:r>
-          <m:t>0.009</m:t>
-        </m:r>
-      </m:oMath>
-      <w:r>
-        <w:t xml:space="preserve"> </w:t>
-      </w:r>
-      <w:r>
-        <w:t xml:space="preserve">for top-20% escalation. It is cheaper than both crisp rules in every seed (Wilcoxon</w:t>
+        <w:t xml:space="preserve">The rule base is cheaper than both crisp rules in every seed (Wilcoxon</w:t>
       </w:r>
       <w:r>
         <w:t xml:space="preserve"> </w:t>
@@ -8152,7 +6693,7 @@
         <w:t xml:space="preserve"> </w:t>
       </w:r>
       <w:r>
-        <w:t xml:space="preserve">for both), and its coverage exceeds that of the threshold in every seed. Its advantage over the threshold grows from 0.055 at</w:t>
+        <w:t xml:space="preserve">for both; means in Table 2), and its coverage exceeds that of the threshold in every seed. Its advantage over the threshold grows from 0.055 at</w:t>
       </w:r>
       <w:r>
         <w:t xml:space="preserve"> </w:t>
@@ -8222,7 +6763,7 @@
         <w:t xml:space="preserve"> </w:t>
       </w:r>
       <w:r>
-        <w:t xml:space="preserve">(Fig. 2). Top-20% escalation is cheaper only when</w:t>
+        <w:t xml:space="preserve">(Fig. 2), whereas top-20% escalation is cheaper only when</w:t>
       </w:r>
       <w:r>
         <w:t xml:space="preserve"> </w:t>
@@ -8254,7 +6795,10 @@
         </m:r>
       </m:oMath>
       <w:r>
-        <w:t xml:space="preserve">, for example 1.347 against 1.640 at</w:t>
+        <w:t xml:space="preserve"> </w:t>
+      </w:r>
+      <w:r>
+        <w:t xml:space="preserve">(1.347 against 1.640 at</w:t>
       </w:r>
       <w:r>
         <w:t xml:space="preserve"> </w:t>
@@ -8286,7 +6830,7 @@
         </m:r>
       </m:oMath>
       <w:r>
-        <w:t xml:space="preserve">, because acting on fewer alerts pays off when missed attacks are cheap. Widening the Medium half-width from 0.25 to 0.45 enlarges the Soft-block band from 646 to 900 alerts and lowers the cost steadily from 3.101 to 3.034. Every width beats both crisp rules.</w:t>
+        <w:t xml:space="preserve">). Widening the Medium half-width from 0.25 to 0.45 enlarges the Soft-block band from 646 to 900 alerts and lowers the cost from 3.101 to 3.034, and every width beats both crisp rules.</w:t>
       </w:r>
     </w:p>
     <w:p>
@@ -8359,7 +6903,7 @@
         <w:t xml:space="preserve"> </w:t>
       </w:r>
       <w:r>
-        <w:t xml:space="preserve">reproduce every action of the rule base (Panel B2), so the benefit comes from the intermediate containment band rather than from fuzziness as such. What fuzziness adds is a graded explanation of each decision. The rule base is also not cost-optimal. The Bayes cost rule is 0.903 cheaper per alert, because soft-blocking dominates escalation under Eq. (6), and it therefore soft-blocks 8,631 alerts, or 43% of all traffic. This is the Bayesian minimum-risk procedure from which decision-theoretic three-way decisions derive their loss-based thresholds [7]. Threshold tuning does not match the rule base either. Validation tuning moves the threshold only to</w:t>
+        <w:t xml:space="preserve">reproduce every action of the rule base (ablations in the Supplementary Material), so the gain comes from the intermediate containment band, while fuzziness adds a graded explanation of each decision. The rule base is not cost-optimal: the Bayes cost rule soft-blocks 8,631 alerts (43% of traffic) and is 0.903 cheaper per alert. Validation tuning moves the threshold only to</w:t>
       </w:r>
       <w:r>
         <w:t xml:space="preserve"> </w:t>
@@ -8379,7 +6923,10 @@
         </m:r>
       </m:oMath>
       <w:r>
-        <w:t xml:space="preserve">, at a cost of 3.278, presumably because unseen attack types shift the test scores. Only an oracle threshold of 0.10 or lower, chosen on the test set, would win, with a minimum cost of 2.929 at</w:t>
+        <w:t xml:space="preserve"> </w:t>
+      </w:r>
+      <w:r>
+        <w:t xml:space="preserve">(cost 3.278), and only an oracle threshold of 0.10 or lower, chosen on the test set, would beat the rule base (2.929 at</w:t>
       </w:r>
       <w:r>
         <w:t xml:space="preserve"> </w:t>
@@ -8399,7 +6946,7 @@
         </m:r>
       </m:oMath>
       <w:r>
-        <w:t xml:space="preserve">. This agrees with threshold moving in cost-sensitive learning, where unequal error costs shift the decision cut-off away from 0.5 [18]. Finally, the layer transfers to another detector. On GB scores, the same rules cost 3.004, which is lower than on MLP scores (</w:t>
+        <w:t xml:space="preserve">). On GB scores, the same rules cost 3.004, lower than on MLP scores (</w:t>
       </w:r>
       <m:oMath>
         <m:r>
@@ -8416,7 +6963,7 @@
         </m:r>
       </m:oMath>
       <w:r>
-        <w:t xml:space="preserve">), and they cut unnecessary escalations from 603 to 222.</w:t>
+        <w:t xml:space="preserve">), and cut unnecessary escalations from 603 to 222.</w:t>
       </w:r>
     </w:p>
     <w:p>
@@ -8434,17 +6981,35 @@
         <w:t xml:space="preserve"> </w:t>
       </w:r>
       <w:r>
-        <w:t xml:space="preserve">Detectors should be judged by the decisions they enable, since the action rule alone changed the cost by up to 1.242 per alert. Because the cost matrix sets the mix of actions, organisations should price false containment before automating Soft-block. Unlike a deferral band that hands uncertain alerts to analysts [8], the Soft-block band acts automatically, so the 387 alerts it keeps from the analyst queue carry an explicit price for false containment (Eq. (6)). Conformal classification with a reject option [25] instead abstains on uncertain cases under distribution-free error-rate guarantees rather than a cost matrix, and combining the two is a natural extension. The band boundaries give managers a workload lever that needs no retraining, which matters because NIDS alert streams are reported to be dominated by false positives [2]. Named rules with logged firing strengths give each action an audit trail that post hoc attributions lack [13,14], which supports compliance review and analyst oversight.</w:t>
+        <w:t xml:space="preserve">Detectors should be judged by the decisions they enable: the action rule alone changed the cost by up to 1.242 per alert. Unlike a deferral band [8], Soft-block acts without an analyst, so false containment must be priced before it is automated. The band boundaries give managers a workload lever without retraining, useful when false positives dominate alert streams [2], and logged firing strengths give each action an audit trail that post hoc attributions lack [12,19].</w:t>
+      </w:r>
+    </w:p>
+    <w:p>
+      <w:pPr>
+        <w:pStyle w:val="BodyText"/>
+      </w:pPr>
+      <w:r>
+        <w:rPr>
+          <w:i/>
+          <w:iCs/>
+        </w:rPr>
+        <w:t xml:space="preserve">Limitations.</w:t>
+      </w:r>
+      <w:r>
+        <w:t xml:space="preserve"> </w:t>
+      </w:r>
+      <w:r>
+        <w:t xml:space="preserve">The study has four limitations. First, fixed bands respond to the distribution of the scores, not only to their ranking. Seed 48, the weakest replicate (cost 3.282, coverage 0.626), has a typical ROC-AUC of 0.900 but the lowest accuracy at the 0.5 threshold (0.757). Second, NSL-KDD is a laboratory benchmark released in 2009 [21] that predates modern enterprise and cloud traffic, and it was subsampled under a single protocol. Third, the cost matrix is illustrative rather than elicited from a real SOC, and coverage counts containment as covering an attack. Fourth, there was no deployment, drift analysis or user study.</w:t>
       </w:r>
     </w:p>
     <w:bookmarkEnd w:id="19"/>
-    <w:bookmarkStart w:id="20" w:name="limitations"/>
+    <w:bookmarkStart w:id="20" w:name="conclusion"/>
     <w:p>
       <w:pPr>
         <w:pStyle w:val="Heading1"/>
       </w:pPr>
       <w:r>
-        <w:t xml:space="preserve">5. Limitations</w:t>
+        <w:t xml:space="preserve">5. Conclusion</w:t>
       </w:r>
     </w:p>
     <w:p>
@@ -8452,49 +7017,43 @@
         <w:pStyle w:val="FirstParagraph"/>
       </w:pPr>
       <w:r>
-        <w:t xml:space="preserve">The study has four main limitations. First, fixed bands respond to the distribution of the scores, not only to their ranking. Seed 48, the weakest replicate (cost 3.282, coverage 0.626), has a typical ROC-AUC of 0.900 but the lowest accuracy at the 0.5 threshold (0.757). Adaptive neuro-fuzzy tuning of the breakpoints, or bands derived from the cost matrix, could reduce this sensitivity and narrow the gap to the Bayes rule. Second, NSL-KDD is a laboratory benchmark released in 2009 [21], so its traffic predates modern enterprise, cloud and Internet of Things networks, and the data were subsampled under a single protocol. Third, the cost matrix is illustrative rather than elicited from a real SOC, and the coverage metric counts containment as covering an attack. Fourth, the study involved no deployment, drift analysis or user study.</w:t>
+        <w:t xml:space="preserve">A fuzzy–neural rule base can serve as a knowledge-based decision layer for alert triage: on NSL-KDD, it achieved lower cost and higher coverage than crisp threshold and capacity rules across seeds, cost ratios and band widths, through its intermediate containment band. Future work will elicit real SOC costs, test the layer in live operation and bound automatic-action errors by conformal classification with a reject option [25].</w:t>
       </w:r>
     </w:p>
     <w:bookmarkEnd w:id="20"/>
-    <w:bookmarkStart w:id="21" w:name="conclusion"/>
+    <w:bookmarkStart w:id="23" w:name="data-availability"/>
     <w:p>
       <w:pPr>
         <w:pStyle w:val="Heading1"/>
       </w:pPr>
       <w:r>
-        <w:t xml:space="preserve">6. Conclusion</w:t>
+        <w:t xml:space="preserve">Data availability</w:t>
       </w:r>
     </w:p>
     <w:p>
       <w:pPr>
         <w:pStyle w:val="FirstParagraph"/>
-      </w:pPr>
-      <w:r>
-        <w:t xml:space="preserve">In conclusion, a fuzzy–neural rule base can serve as a knowledge-based decision layer for alert triage. On NSL-KDD, it achieved lower cost and higher coverage than crisp threshold and capacity rules across seeds, cost ratios and band widths, and its gain comes from the intermediate containment band. Future work will derive the bands from costs elicited in real SOCs and validate the layer in live operation. It will also add distribution-free error guarantees for the automatic actions through conformal classification with a reject option [25].</w:t>
-      </w:r>
-    </w:p>
-    <w:bookmarkEnd w:id="21"/>
-    <w:bookmarkStart w:id="24" w:name="data-availability"/>
-    <w:p>
-      <w:pPr>
-        <w:pStyle w:val="Heading1"/>
-      </w:pPr>
-      <w:r>
-        <w:t xml:space="preserve">Data availability</w:t>
-      </w:r>
-    </w:p>
-    <w:p>
-      <w:pPr>
-        <w:pStyle w:val="FirstParagraph"/>
         <w:jc w:val="left"/>
       </w:pPr>
       <w:r>
-        <w:t xml:space="preserve">The code, result tables and figure-generation scripts are publicly available at</w:t>
-      </w:r>
-      <w:r>
-        <w:t xml:space="preserve"> </w:t>
-      </w:r>
-      <w:hyperlink r:id="rId22">
+        <w:t xml:space="preserve">The code, results (with the ablations in</w:t>
+      </w:r>
+      <w:r>
+        <w:t xml:space="preserve"> </w:t>
+      </w:r>
+      <w:r>
+        <w:rPr>
+          <w:rStyle w:val="VerbatimChar"/>
+        </w:rPr>
+        <w:t xml:space="preserve">table2_decision.csv</w:t>
+      </w:r>
+      <w:r>
+        <w:t xml:space="preserve">) and figure scripts are in the Supplementary Material and at</w:t>
+      </w:r>
+      <w:r>
+        <w:t xml:space="preserve"> </w:t>
+      </w:r>
+      <w:hyperlink r:id="rId21">
         <w:r>
           <w:rPr>
             <w:rStyle w:val="Hyperlink"/>
@@ -8508,7 +7067,7 @@
       <w:r>
         <w:t xml:space="preserve"> </w:t>
       </w:r>
-      <w:hyperlink r:id="rId23">
+      <w:hyperlink r:id="rId22">
         <w:r>
           <w:rPr>
             <w:rStyle w:val="Hyperlink"/>
@@ -8520,29 +7079,35 @@
         <w:t xml:space="preserve"> </w:t>
       </w:r>
       <w:r>
-        <w:t xml:space="preserve">[21]. The Supplementary Material contains the same code, the result files (including the Panel B2 confidence intervals of Table 2 in</w:t>
-      </w:r>
-      <w:r>
-        <w:t xml:space="preserve"> </w:t>
-      </w:r>
-      <w:r>
-        <w:rPr>
-          <w:rStyle w:val="VerbatimChar"/>
-        </w:rPr>
-        <w:t xml:space="preserve">table2_decision.csv</w:t>
-      </w:r>
-      <w:r>
-        <w:t xml:space="preserve">), both figures as vector files and a graphical abstract.</w:t>
+        <w:t xml:space="preserve">[21].</w:t>
+      </w:r>
+    </w:p>
+    <w:bookmarkEnd w:id="23"/>
+    <w:bookmarkStart w:id="24" w:name="declaration-of-competing-interest"/>
+    <w:p>
+      <w:pPr>
+        <w:pStyle w:val="Heading1"/>
+      </w:pPr>
+      <w:r>
+        <w:t xml:space="preserve">Declaration of competing interest</w:t>
+      </w:r>
+    </w:p>
+    <w:p>
+      <w:pPr>
+        <w:pStyle w:val="FirstParagraph"/>
+      </w:pPr>
+      <w:r>
+        <w:t xml:space="preserve">The author declares no known competing financial interests or personal relationships that could have appeared to influence the work reported in this paper.</w:t>
       </w:r>
     </w:p>
     <w:bookmarkEnd w:id="24"/>
-    <w:bookmarkStart w:id="25" w:name="declaration-of-competing-interest"/>
+    <w:bookmarkStart w:id="25" w:name="X1f74eb43af444059c7518034463b6c89b1cacf4"/>
     <w:p>
       <w:pPr>
         <w:pStyle w:val="Heading1"/>
       </w:pPr>
       <w:r>
-        <w:t xml:space="preserve">Declaration of competing interest</w:t>
+        <w:t xml:space="preserve">Declaration of generative AI and AI-assisted technologies in the manuscript preparation process</w:t>
       </w:r>
     </w:p>
     <w:p>
@@ -8550,17 +7115,17 @@
         <w:pStyle w:val="FirstParagraph"/>
       </w:pPr>
       <w:r>
-        <w:t xml:space="preserve">The author declares no known competing financial interests or personal relationships that could have appeared to influence the work reported in this paper.</w:t>
+        <w:t xml:space="preserve">During the preparation of this work the author used Grok Bot, an AI-assisted writing and coding tool, to help with language editing, code refactoring, reference checking and formatting. After using this tool, the author reviewed and edited the content as needed and takes full responsibility for the content of the published article.</w:t>
       </w:r>
     </w:p>
     <w:bookmarkEnd w:id="25"/>
-    <w:bookmarkStart w:id="26" w:name="X1f74eb43af444059c7518034463b6c89b1cacf4"/>
+    <w:bookmarkStart w:id="26" w:name="funding"/>
     <w:p>
       <w:pPr>
         <w:pStyle w:val="Heading1"/>
       </w:pPr>
       <w:r>
-        <w:t xml:space="preserve">Declaration of generative AI and AI-assisted technologies in the manuscript preparation process</w:t>
+        <w:t xml:space="preserve">Funding</w:t>
       </w:r>
     </w:p>
     <w:p>
@@ -8568,29 +7133,11 @@
         <w:pStyle w:val="FirstParagraph"/>
       </w:pPr>
       <w:r>
-        <w:t xml:space="preserve">During the preparation of this work the author used Grok Bot, an AI-assisted writing and coding tool, to help with language editing, code refactoring, reference checking and formatting. After using this tool, the author reviewed and edited the content as needed and takes full responsibility for the content of the published article. All results, tables and figures were generated by the author’s executable code from the public dataset; no figure was created with generative AI.</w:t>
+        <w:t xml:space="preserve">This research did not receive any specific grant from funding agencies in the public, commercial, or not-for-profit sectors.</w:t>
       </w:r>
     </w:p>
     <w:bookmarkEnd w:id="26"/>
-    <w:bookmarkStart w:id="27" w:name="funding"/>
-    <w:p>
-      <w:pPr>
-        <w:pStyle w:val="Heading1"/>
-      </w:pPr>
-      <w:r>
-        <w:t xml:space="preserve">Funding</w:t>
-      </w:r>
-    </w:p>
-    <w:p>
-      <w:pPr>
-        <w:pStyle w:val="FirstParagraph"/>
-      </w:pPr>
-      <w:r>
-        <w:t xml:space="preserve">This research did not receive any specific grant from funding agencies in the public, commercial, or not-for-profit sectors.</w:t>
-      </w:r>
-    </w:p>
-    <w:bookmarkEnd w:id="27"/>
-    <w:bookmarkStart w:id="28" w:name="credit-authorship-contribution-statement"/>
+    <w:bookmarkStart w:id="27" w:name="credit-authorship-contribution-statement"/>
     <w:p>
       <w:pPr>
         <w:pStyle w:val="Heading1"/>
@@ -8617,8 +7164,8 @@
         <w:t xml:space="preserve">Conceptualization, Methodology, Software, Validation, Formal analysis, Investigation, Data curation, Visualization, Writing – original draft, Writing – review &amp; editing.</w:t>
       </w:r>
     </w:p>
-    <w:bookmarkEnd w:id="28"/>
-    <w:bookmarkStart w:id="29" w:name="references"/>
+    <w:bookmarkEnd w:id="27"/>
+    <w:bookmarkStart w:id="28" w:name="references"/>
     <w:p>
       <w:pPr>
         <w:pStyle w:val="Heading1"/>
@@ -8704,7 +7251,7 @@
         <w:pStyle w:val="Reference"/>
       </w:pPr>
       <w:r>
-        <w:t xml:space="preserve">[10] M. Alalhareth, S.-C. Hong, An adaptive intrusion detection system in the Internet of Medical Things using fuzzy-based learning, Sensors 23 (22) (2023) 9247. https://doi.org/10.3390/s23229247.</w:t>
+        <w:t xml:space="preserve">[10] N. Gupta, V. Jindal, P. Bedi, CSE-IDS: Using cost-sensitive deep learning and ensemble algorithms to handle class imbalance in network-based intrusion detection systems, Comput. Secur. 112 (2022) 102499. https://doi.org/10.1016/j.cose.2021.102499.</w:t>
       </w:r>
     </w:p>
     <w:p>
@@ -8712,7 +7259,7 @@
         <w:pStyle w:val="Reference"/>
       </w:pPr>
       <w:r>
-        <w:t xml:space="preserve">[11] N. Gupta, V. Jindal, P. Bedi, CSE-IDS: Using cost-sensitive deep learning and ensemble algorithms to handle class imbalance in network-based intrusion detection systems, Comput. Secur. 112 (2022) 102499. https://doi.org/10.1016/j.cose.2021.102499.</w:t>
+        <w:t xml:space="preserve">[11] A. Telikani, N. E. Rudbardeh, S. Soleymanpour, A. Shahbahrami, J. Shen, G. Gaydadjiev, R. Hassanpour, A cost-sensitive machine learning model with multitask learning for intrusion detection in IoT, IEEE Trans. Ind. Inform. 20 (3) (2024) 3880–3890. https://doi.org/10.1109/TII.2023.3314208.</w:t>
       </w:r>
     </w:p>
     <w:p>
@@ -8720,7 +7267,7 @@
         <w:pStyle w:val="Reference"/>
       </w:pPr>
       <w:r>
-        <w:t xml:space="preserve">[12] A. Telikani, N. E. Rudbardeh, S. Soleymanpour, A. Shahbahrami, J. Shen, G. Gaydadjiev, R. Hassanpour, A cost-sensitive machine learning model with multitask learning for intrusion detection in IoT, IEEE Trans. Ind. Inform. 20 (3) (2024) 3880–3890. https://doi.org/10.1109/TII.2023.3314208.</w:t>
+        <w:t xml:space="preserve">[12] M. Wang, K. Zheng, Y. Yang, X. Wang, An explainable machine learning framework for intrusion detection systems, IEEE Access 8 (2020) 73127–73141. https://doi.org/10.1109/ACCESS.2020.2988359.</w:t>
       </w:r>
     </w:p>
     <w:p>
@@ -8728,7 +7275,7 @@
         <w:pStyle w:val="Reference"/>
       </w:pPr>
       <w:r>
-        <w:t xml:space="preserve">[13] M. Wang, K. Zheng, Y. Yang, X. Wang, An explainable machine learning framework for intrusion detection systems, IEEE Access 8 (2020) 73127–73141. https://doi.org/10.1109/ACCESS.2020.2988359.</w:t>
+        <w:t xml:space="preserve">[13] S. Bag, S. Sarkar, I. Bose, Enhancing cybersecurity risk assessment using temporal knowledge graph-based explainable decision support system, Decis. Support Syst. 198 (2025) 114526. https://doi.org/10.1016/j.dss.2025.114526.</w:t>
       </w:r>
     </w:p>
     <w:p>
@@ -8736,7 +7283,7 @@
         <w:pStyle w:val="Reference"/>
       </w:pPr>
       <w:r>
-        <w:t xml:space="preserve">[14] A. Alabbadi, F. Bajaber, An intrusion detection system over the IoT data streams using eXplainable Artificial Intelligence (XAI), Sensors 25 (3) (2025) 847. https://doi.org/10.3390/s25030847.</w:t>
+        <w:t xml:space="preserve">[14] L. A. Zadeh, Fuzzy sets, Inf. Control 8 (3) (1965) 338–353. https://doi.org/10.1016/S0019-9958(65)90241-X.</w:t>
       </w:r>
     </w:p>
     <w:p>
@@ -8744,7 +7291,7 @@
         <w:pStyle w:val="Reference"/>
       </w:pPr>
       <w:r>
-        <w:t xml:space="preserve">[15] S. Bag, S. Sarkar, I. Bose, Enhancing cybersecurity risk assessment using temporal knowledge graph-based explainable decision support system, Decis. Support Syst. 198 (2025) 114526. https://doi.org/10.1016/j.dss.2025.114526.</w:t>
+        <w:t xml:space="preserve">[15] A. Fernández, F. Herrera, O. Cordón, M. J. del Jesus, F. Marcelloni, Evolutionary fuzzy systems for explainable artificial intelligence: Why, when, what for, and where to?, IEEE Comput. Intell. Mag. 14 (1) (2019) 69–81. https://doi.org/10.1109/MCI.2018.2881645.</w:t>
       </w:r>
     </w:p>
     <w:p>
@@ -8752,7 +7299,7 @@
         <w:pStyle w:val="Reference"/>
       </w:pPr>
       <w:r>
-        <w:t xml:space="preserve">[16] L. A. Zadeh, Fuzzy sets, Inf. Control 8 (3) (1965) 338–353. https://doi.org/10.1016/S0019-9958(65)90241-X.</w:t>
+        <w:t xml:space="preserve">[16] M. Alalhareth, S.-C. Hong, An adaptive intrusion detection system in the Internet of Medical Things using fuzzy-based learning, Sensors 23 (22) (2023) 9247. https://doi.org/10.3390/s23229247.</w:t>
       </w:r>
     </w:p>
     <w:p>
@@ -8760,7 +7307,7 @@
         <w:pStyle w:val="Reference"/>
       </w:pPr>
       <w:r>
-        <w:t xml:space="preserve">[17] A. Fernández, F. Herrera, O. Cordón, M. J. del Jesus, F. Marcelloni, Evolutionary fuzzy systems for explainable artificial intelligence: Why, when, what for, and where to?, IEEE Comput. Intell. Mag. 14 (1) (2019) 69–81. https://doi.org/10.1109/MCI.2018.2881645.</w:t>
+        <w:t xml:space="preserve">[17] Z.-H. Zhou, X.-Y. Liu, Training cost-sensitive neural networks with methods addressing the class imbalance problem, IEEE Trans. Knowl. Data Eng. 18 (1) (2006) 63–77. https://doi.org/10.1109/TKDE.2006.17.</w:t>
       </w:r>
     </w:p>
     <w:p>
@@ -8768,7 +7315,7 @@
         <w:pStyle w:val="Reference"/>
       </w:pPr>
       <w:r>
-        <w:t xml:space="preserve">[18] Z.-H. Zhou, X.-Y. Liu, Training cost-sensitive neural networks with methods addressing the class imbalance problem, IEEE Trans. Knowl. Data Eng. 18 (1) (2006) 63–77. https://doi.org/10.1109/TKDE.2006.17.</w:t>
+        <w:t xml:space="preserve">[18] A. Barredo Arrieta, N. Díaz-Rodríguez, J. Del Ser, A. Bennetot, S. Tabik, A. Barbado, S. Garcia, S. Gil-Lopez, D. Molina, R. Benjamins, R. Chatila, F. Herrera, Explainable artificial intelligence (XAI): Concepts, taxonomies, opportunities and challenges toward responsible AI, Inf. Fusion 58 (2020) 82–115. https://doi.org/10.1016/j.inffus.2019.12.012.</w:t>
       </w:r>
     </w:p>
     <w:p>
@@ -8776,7 +7323,7 @@
         <w:pStyle w:val="Reference"/>
       </w:pPr>
       <w:r>
-        <w:t xml:space="preserve">[19] A. Barredo Arrieta, N. Díaz-Rodríguez, J. Del Ser, A. Bennetot, S. Tabik, A. Barbado, S. Garcia, S. Gil-Lopez, D. Molina, R. Benjamins, R. Chatila, F. Herrera, Explainable artificial intelligence (XAI): Concepts, taxonomies, opportunities and challenges toward responsible AI, Inf. Fusion 58 (2020) 82–115. https://doi.org/10.1016/j.inffus.2019.12.012.</w:t>
+        <w:t xml:space="preserve">[19] A. Alabbadi, F. Bajaber, An intrusion detection system over the IoT data streams using eXplainable Artificial Intelligence (XAI), Sensors 25 (3) (2025) 847. https://doi.org/10.3390/s25030847.</w:t>
       </w:r>
     </w:p>
     <w:p>
@@ -8827,7 +7374,7 @@
         <w:t xml:space="preserve">[25] J. Hallberg Szabadváry, T. Löfström, U. Johansson, C. Sönströd, E. Ahlberg, L. Carlsson, Classification with reject option: Distribution-free error guarantees via conformal prediction, Mach. Learn. Appl. 20 (2025) 100664. https://doi.org/10.1016/j.mlwa.2025.100664.</w:t>
       </w:r>
     </w:p>
-    <w:bookmarkEnd w:id="29"/>
+    <w:bookmarkEnd w:id="28"/>
     <w:sectPr>
       <w:footerReference w:type="default" r:id="rId9"/>
       <w:footnotePr>

</xml_diff>